<commit_message>
avance tesis modelo extendido
</commit_message>
<xml_diff>
--- a/DESARROLLO DE TITULACIÓN II/TESIS/ARCHIVO/Kushiro_Proyecto_de_Investigación.docx
+++ b/DESARROLLO DE TITULACIÓN II/TESIS/ARCHIVO/Kushiro_Proyecto_de_Investigación.docx
@@ -2631,7 +2631,7 @@
             </w:rPr>
             <w:fldChar w:fldCharType="separate"/>
           </w:r>
-          <w:hyperlink w:anchor="_Toc208785237" w:history="1">
+          <w:hyperlink w:anchor="_Toc208863928" w:history="1">
             <w:r>
               <w:rPr>
                 <w:rStyle w:val="Hipervnculo"/>
@@ -2659,7 +2659,7 @@
                 <w:noProof/>
                 <w:webHidden/>
               </w:rPr>
-              <w:instrText xml:space="preserve"> PAGEREF _Toc208785237 \h </w:instrText>
+              <w:instrText xml:space="preserve"> PAGEREF _Toc208863928 \h </w:instrText>
             </w:r>
             <w:r>
               <w:rPr>
@@ -2700,7 +2700,7 @@
               <w:lang w:eastAsia="es-EC"/>
             </w:rPr>
           </w:pPr>
-          <w:hyperlink w:anchor="_Toc208785238" w:history="1">
+          <w:hyperlink w:anchor="_Toc208863929" w:history="1">
             <w:r>
               <w:rPr>
                 <w:rStyle w:val="Hipervnculo"/>
@@ -2728,7 +2728,7 @@
                 <w:noProof/>
                 <w:webHidden/>
               </w:rPr>
-              <w:instrText xml:space="preserve"> PAGEREF _Toc208785238 \h </w:instrText>
+              <w:instrText xml:space="preserve"> PAGEREF _Toc208863929 \h </w:instrText>
             </w:r>
             <w:r>
               <w:rPr>
@@ -2769,7 +2769,7 @@
               <w:lang w:eastAsia="es-EC"/>
             </w:rPr>
           </w:pPr>
-          <w:hyperlink w:anchor="_Toc208785239" w:history="1">
+          <w:hyperlink w:anchor="_Toc208863930" w:history="1">
             <w:r>
               <w:rPr>
                 <w:rStyle w:val="Hipervnculo"/>
@@ -2796,7 +2796,7 @@
                 <w:noProof/>
                 <w:webHidden/>
               </w:rPr>
-              <w:instrText xml:space="preserve"> PAGEREF _Toc208785239 \h </w:instrText>
+              <w:instrText xml:space="preserve"> PAGEREF _Toc208863930 \h </w:instrText>
             </w:r>
             <w:r>
               <w:rPr>
@@ -2837,7 +2837,7 @@
               <w:lang w:eastAsia="es-EC"/>
             </w:rPr>
           </w:pPr>
-          <w:hyperlink w:anchor="_Toc208785240" w:history="1">
+          <w:hyperlink w:anchor="_Toc208863931" w:history="1">
             <w:r>
               <w:rPr>
                 <w:rStyle w:val="Hipervnculo"/>
@@ -2864,7 +2864,7 @@
                 <w:noProof/>
                 <w:webHidden/>
               </w:rPr>
-              <w:instrText xml:space="preserve"> PAGEREF _Toc208785240 \h </w:instrText>
+              <w:instrText xml:space="preserve"> PAGEREF _Toc208863931 \h </w:instrText>
             </w:r>
             <w:r>
               <w:rPr>
@@ -2905,7 +2905,7 @@
               <w:lang w:eastAsia="es-EC"/>
             </w:rPr>
           </w:pPr>
-          <w:hyperlink w:anchor="_Toc208785241" w:history="1">
+          <w:hyperlink w:anchor="_Toc208863932" w:history="1">
             <w:r>
               <w:rPr>
                 <w:rStyle w:val="Hipervnculo"/>
@@ -2932,7 +2932,7 @@
                 <w:noProof/>
                 <w:webHidden/>
               </w:rPr>
-              <w:instrText xml:space="preserve"> PAGEREF _Toc208785241 \h </w:instrText>
+              <w:instrText xml:space="preserve"> PAGEREF _Toc208863932 \h </w:instrText>
             </w:r>
             <w:r>
               <w:rPr>
@@ -2977,7 +2977,7 @@
               <w:lang w:eastAsia="es-EC"/>
             </w:rPr>
           </w:pPr>
-          <w:hyperlink w:anchor="_Toc208785242" w:history="1">
+          <w:hyperlink w:anchor="_Toc208863933" w:history="1">
             <w:r>
               <w:rPr>
                 <w:rStyle w:val="Hipervnculo"/>
@@ -3020,7 +3020,7 @@
                 <w:noProof/>
                 <w:webHidden/>
               </w:rPr>
-              <w:instrText xml:space="preserve"> PAGEREF _Toc208785242 \h </w:instrText>
+              <w:instrText xml:space="preserve"> PAGEREF _Toc208863933 \h </w:instrText>
             </w:r>
             <w:r>
               <w:rPr>
@@ -3065,7 +3065,7 @@
               <w:lang w:eastAsia="es-EC"/>
             </w:rPr>
           </w:pPr>
-          <w:hyperlink w:anchor="_Toc208785243" w:history="1">
+          <w:hyperlink w:anchor="_Toc208863934" w:history="1">
             <w:r>
               <w:rPr>
                 <w:rStyle w:val="Hipervnculo"/>
@@ -3108,7 +3108,7 @@
                 <w:noProof/>
                 <w:webHidden/>
               </w:rPr>
-              <w:instrText xml:space="preserve"> PAGEREF _Toc208785243 \h </w:instrText>
+              <w:instrText xml:space="preserve"> PAGEREF _Toc208863934 \h </w:instrText>
             </w:r>
             <w:r>
               <w:rPr>
@@ -3153,7 +3153,7 @@
               <w:lang w:eastAsia="es-EC"/>
             </w:rPr>
           </w:pPr>
-          <w:hyperlink w:anchor="_Toc208785244" w:history="1">
+          <w:hyperlink w:anchor="_Toc208863935" w:history="1">
             <w:r>
               <w:rPr>
                 <w:rStyle w:val="Hipervnculo"/>
@@ -3196,7 +3196,7 @@
                 <w:noProof/>
                 <w:webHidden/>
               </w:rPr>
-              <w:instrText xml:space="preserve"> PAGEREF _Toc208785244 \h </w:instrText>
+              <w:instrText xml:space="preserve"> PAGEREF _Toc208863935 \h </w:instrText>
             </w:r>
             <w:r>
               <w:rPr>
@@ -3241,7 +3241,7 @@
               <w:lang w:eastAsia="es-EC"/>
             </w:rPr>
           </w:pPr>
-          <w:hyperlink w:anchor="_Toc208785245" w:history="1">
+          <w:hyperlink w:anchor="_Toc208863936" w:history="1">
             <w:r>
               <w:rPr>
                 <w:rStyle w:val="Hipervnculo"/>
@@ -3284,7 +3284,7 @@
                 <w:noProof/>
                 <w:webHidden/>
               </w:rPr>
-              <w:instrText xml:space="preserve"> PAGEREF _Toc208785245 \h </w:instrText>
+              <w:instrText xml:space="preserve"> PAGEREF _Toc208863936 \h </w:instrText>
             </w:r>
             <w:r>
               <w:rPr>
@@ -3329,7 +3329,7 @@
               <w:lang w:eastAsia="es-EC"/>
             </w:rPr>
           </w:pPr>
-          <w:hyperlink w:anchor="_Toc208785246" w:history="1">
+          <w:hyperlink w:anchor="_Toc208863937" w:history="1">
             <w:r>
               <w:rPr>
                 <w:rStyle w:val="Hipervnculo"/>
@@ -3372,7 +3372,7 @@
                 <w:noProof/>
                 <w:webHidden/>
               </w:rPr>
-              <w:instrText xml:space="preserve"> PAGEREF _Toc208785246 \h </w:instrText>
+              <w:instrText xml:space="preserve"> PAGEREF _Toc208863937 \h </w:instrText>
             </w:r>
             <w:r>
               <w:rPr>
@@ -3417,7 +3417,7 @@
               <w:lang w:eastAsia="es-EC"/>
             </w:rPr>
           </w:pPr>
-          <w:hyperlink w:anchor="_Toc208785247" w:history="1">
+          <w:hyperlink w:anchor="_Toc208863938" w:history="1">
             <w:r>
               <w:rPr>
                 <w:rStyle w:val="Hipervnculo"/>
@@ -3460,7 +3460,7 @@
                 <w:noProof/>
                 <w:webHidden/>
               </w:rPr>
-              <w:instrText xml:space="preserve"> PAGEREF _Toc208785247 \h </w:instrText>
+              <w:instrText xml:space="preserve"> PAGEREF _Toc208863938 \h </w:instrText>
             </w:r>
             <w:r>
               <w:rPr>
@@ -3505,7 +3505,7 @@
               <w:lang w:eastAsia="es-EC"/>
             </w:rPr>
           </w:pPr>
-          <w:hyperlink w:anchor="_Toc208785248" w:history="1">
+          <w:hyperlink w:anchor="_Toc208863939" w:history="1">
             <w:r>
               <w:rPr>
                 <w:rStyle w:val="Hipervnculo"/>
@@ -3548,7 +3548,7 @@
                 <w:noProof/>
                 <w:webHidden/>
               </w:rPr>
-              <w:instrText xml:space="preserve"> PAGEREF _Toc208785248 \h </w:instrText>
+              <w:instrText xml:space="preserve"> PAGEREF _Toc208863939 \h </w:instrText>
             </w:r>
             <w:r>
               <w:rPr>
@@ -3593,7 +3593,7 @@
               <w:lang w:eastAsia="es-EC"/>
             </w:rPr>
           </w:pPr>
-          <w:hyperlink w:anchor="_Toc208785249" w:history="1">
+          <w:hyperlink w:anchor="_Toc208863940" w:history="1">
             <w:r>
               <w:rPr>
                 <w:rStyle w:val="Hipervnculo"/>
@@ -3636,7 +3636,7 @@
                 <w:noProof/>
                 <w:webHidden/>
               </w:rPr>
-              <w:instrText xml:space="preserve"> PAGEREF _Toc208785249 \h </w:instrText>
+              <w:instrText xml:space="preserve"> PAGEREF _Toc208863940 \h </w:instrText>
             </w:r>
             <w:r>
               <w:rPr>
@@ -3681,7 +3681,7 @@
               <w:lang w:eastAsia="es-EC"/>
             </w:rPr>
           </w:pPr>
-          <w:hyperlink w:anchor="_Toc208785250" w:history="1">
+          <w:hyperlink w:anchor="_Toc208863941" w:history="1">
             <w:r>
               <w:rPr>
                 <w:rStyle w:val="Hipervnculo"/>
@@ -3724,7 +3724,7 @@
                 <w:noProof/>
                 <w:webHidden/>
               </w:rPr>
-              <w:instrText xml:space="preserve"> PAGEREF _Toc208785250 \h </w:instrText>
+              <w:instrText xml:space="preserve"> PAGEREF _Toc208863941 \h </w:instrText>
             </w:r>
             <w:r>
               <w:rPr>
@@ -3769,7 +3769,7 @@
               <w:lang w:eastAsia="es-EC"/>
             </w:rPr>
           </w:pPr>
-          <w:hyperlink w:anchor="_Toc208785251" w:history="1">
+          <w:hyperlink w:anchor="_Toc208863942" w:history="1">
             <w:r>
               <w:rPr>
                 <w:rStyle w:val="Hipervnculo"/>
@@ -3812,7 +3812,7 @@
                 <w:noProof/>
                 <w:webHidden/>
               </w:rPr>
-              <w:instrText xml:space="preserve"> PAGEREF _Toc208785251 \h </w:instrText>
+              <w:instrText xml:space="preserve"> PAGEREF _Toc208863942 \h </w:instrText>
             </w:r>
             <w:r>
               <w:rPr>
@@ -3853,7 +3853,7 @@
               <w:lang w:eastAsia="es-EC"/>
             </w:rPr>
           </w:pPr>
-          <w:hyperlink w:anchor="_Toc208785252" w:history="1">
+          <w:hyperlink w:anchor="_Toc208863943" w:history="1">
             <w:r>
               <w:rPr>
                 <w:rStyle w:val="Hipervnculo"/>
@@ -3880,7 +3880,7 @@
                 <w:noProof/>
                 <w:webHidden/>
               </w:rPr>
-              <w:instrText xml:space="preserve"> PAGEREF _Toc208785252 \h </w:instrText>
+              <w:instrText xml:space="preserve"> PAGEREF _Toc208863943 \h </w:instrText>
             </w:r>
             <w:r>
               <w:rPr>
@@ -3921,7 +3921,7 @@
               <w:lang w:eastAsia="es-EC"/>
             </w:rPr>
           </w:pPr>
-          <w:hyperlink w:anchor="_Toc208785253" w:history="1">
+          <w:hyperlink w:anchor="_Toc208863944" w:history="1">
             <w:r>
               <w:rPr>
                 <w:rStyle w:val="Hipervnculo"/>
@@ -3948,7 +3948,7 @@
                 <w:noProof/>
                 <w:webHidden/>
               </w:rPr>
-              <w:instrText xml:space="preserve"> PAGEREF _Toc208785253 \h </w:instrText>
+              <w:instrText xml:space="preserve"> PAGEREF _Toc208863944 \h </w:instrText>
             </w:r>
             <w:r>
               <w:rPr>
@@ -3992,7 +3992,7 @@
               <w:lang w:eastAsia="es-EC"/>
             </w:rPr>
           </w:pPr>
-          <w:hyperlink w:anchor="_Toc208785254" w:history="1">
+          <w:hyperlink w:anchor="_Toc208863945" w:history="1">
             <w:r>
               <w:rPr>
                 <w:rStyle w:val="Hipervnculo"/>
@@ -4019,7 +4019,7 @@
                 <w:noProof/>
                 <w:webHidden/>
               </w:rPr>
-              <w:instrText xml:space="preserve"> PAGEREF _Toc208785254 \h </w:instrText>
+              <w:instrText xml:space="preserve"> PAGEREF _Toc208863945 \h </w:instrText>
             </w:r>
             <w:r>
               <w:rPr>
@@ -4063,7 +4063,7 @@
               <w:lang w:eastAsia="es-EC"/>
             </w:rPr>
           </w:pPr>
-          <w:hyperlink w:anchor="_Toc208785255" w:history="1">
+          <w:hyperlink w:anchor="_Toc208863946" w:history="1">
             <w:r>
               <w:rPr>
                 <w:rStyle w:val="Hipervnculo"/>
@@ -4090,7 +4090,7 @@
                 <w:noProof/>
                 <w:webHidden/>
               </w:rPr>
-              <w:instrText xml:space="preserve"> PAGEREF _Toc208785255 \h </w:instrText>
+              <w:instrText xml:space="preserve"> PAGEREF _Toc208863946 \h </w:instrText>
             </w:r>
             <w:r>
               <w:rPr>
@@ -4134,7 +4134,7 @@
               <w:lang w:eastAsia="es-EC"/>
             </w:rPr>
           </w:pPr>
-          <w:hyperlink w:anchor="_Toc208785256" w:history="1">
+          <w:hyperlink w:anchor="_Toc208863947" w:history="1">
             <w:r>
               <w:rPr>
                 <w:rStyle w:val="Hipervnculo"/>
@@ -4161,7 +4161,7 @@
                 <w:noProof/>
                 <w:webHidden/>
               </w:rPr>
-              <w:instrText xml:space="preserve"> PAGEREF _Toc208785256 \h </w:instrText>
+              <w:instrText xml:space="preserve"> PAGEREF _Toc208863947 \h </w:instrText>
             </w:r>
             <w:r>
               <w:rPr>
@@ -4205,7 +4205,7 @@
               <w:lang w:eastAsia="es-EC"/>
             </w:rPr>
           </w:pPr>
-          <w:hyperlink w:anchor="_Toc208785257" w:history="1">
+          <w:hyperlink w:anchor="_Toc208863948" w:history="1">
             <w:r>
               <w:rPr>
                 <w:rStyle w:val="Hipervnculo"/>
@@ -4232,7 +4232,7 @@
                 <w:noProof/>
                 <w:webHidden/>
               </w:rPr>
-              <w:instrText xml:space="preserve"> PAGEREF _Toc208785257 \h </w:instrText>
+              <w:instrText xml:space="preserve"> PAGEREF _Toc208863948 \h </w:instrText>
             </w:r>
             <w:r>
               <w:rPr>
@@ -4276,7 +4276,7 @@
               <w:lang w:eastAsia="es-EC"/>
             </w:rPr>
           </w:pPr>
-          <w:hyperlink w:anchor="_Toc208785258" w:history="1">
+          <w:hyperlink w:anchor="_Toc208863949" w:history="1">
             <w:r>
               <w:rPr>
                 <w:rStyle w:val="Hipervnculo"/>
@@ -4303,7 +4303,7 @@
                 <w:noProof/>
                 <w:webHidden/>
               </w:rPr>
-              <w:instrText xml:space="preserve"> PAGEREF _Toc208785258 \h </w:instrText>
+              <w:instrText xml:space="preserve"> PAGEREF _Toc208863949 \h </w:instrText>
             </w:r>
             <w:r>
               <w:rPr>
@@ -4347,7 +4347,7 @@
               <w:lang w:eastAsia="es-EC"/>
             </w:rPr>
           </w:pPr>
-          <w:hyperlink w:anchor="_Toc208785259" w:history="1">
+          <w:hyperlink w:anchor="_Toc208863950" w:history="1">
             <w:r>
               <w:rPr>
                 <w:rStyle w:val="Hipervnculo"/>
@@ -4374,7 +4374,7 @@
                 <w:noProof/>
                 <w:webHidden/>
               </w:rPr>
-              <w:instrText xml:space="preserve"> PAGEREF _Toc208785259 \h </w:instrText>
+              <w:instrText xml:space="preserve"> PAGEREF _Toc208863950 \h </w:instrText>
             </w:r>
             <w:r>
               <w:rPr>
@@ -4418,7 +4418,7 @@
               <w:lang w:eastAsia="es-EC"/>
             </w:rPr>
           </w:pPr>
-          <w:hyperlink w:anchor="_Toc208785260" w:history="1">
+          <w:hyperlink w:anchor="_Toc208863951" w:history="1">
             <w:r>
               <w:rPr>
                 <w:rStyle w:val="Hipervnculo"/>
@@ -4445,7 +4445,7 @@
                 <w:noProof/>
                 <w:webHidden/>
               </w:rPr>
-              <w:instrText xml:space="preserve"> PAGEREF _Toc208785260 \h </w:instrText>
+              <w:instrText xml:space="preserve"> PAGEREF _Toc208863951 \h </w:instrText>
             </w:r>
             <w:r>
               <w:rPr>
@@ -4489,7 +4489,7 @@
               <w:lang w:eastAsia="es-EC"/>
             </w:rPr>
           </w:pPr>
-          <w:hyperlink w:anchor="_Toc208785261" w:history="1">
+          <w:hyperlink w:anchor="_Toc208863952" w:history="1">
             <w:r>
               <w:rPr>
                 <w:rStyle w:val="Hipervnculo"/>
@@ -4516,7 +4516,7 @@
                 <w:noProof/>
                 <w:webHidden/>
               </w:rPr>
-              <w:instrText xml:space="preserve"> PAGEREF _Toc208785261 \h </w:instrText>
+              <w:instrText xml:space="preserve"> PAGEREF _Toc208863952 \h </w:instrText>
             </w:r>
             <w:r>
               <w:rPr>
@@ -4560,7 +4560,7 @@
               <w:lang w:eastAsia="es-EC"/>
             </w:rPr>
           </w:pPr>
-          <w:hyperlink w:anchor="_Toc208785262" w:history="1">
+          <w:hyperlink w:anchor="_Toc208863953" w:history="1">
             <w:r>
               <w:rPr>
                 <w:rStyle w:val="Hipervnculo"/>
@@ -4587,7 +4587,7 @@
                 <w:noProof/>
                 <w:webHidden/>
               </w:rPr>
-              <w:instrText xml:space="preserve"> PAGEREF _Toc208785262 \h </w:instrText>
+              <w:instrText xml:space="preserve"> PAGEREF _Toc208863953 \h </w:instrText>
             </w:r>
             <w:r>
               <w:rPr>
@@ -4631,7 +4631,7 @@
               <w:lang w:eastAsia="es-EC"/>
             </w:rPr>
           </w:pPr>
-          <w:hyperlink w:anchor="_Toc208785263" w:history="1">
+          <w:hyperlink w:anchor="_Toc208863954" w:history="1">
             <w:r>
               <w:rPr>
                 <w:rStyle w:val="Hipervnculo"/>
@@ -4658,7 +4658,7 @@
                 <w:noProof/>
                 <w:webHidden/>
               </w:rPr>
-              <w:instrText xml:space="preserve"> PAGEREF _Toc208785263 \h </w:instrText>
+              <w:instrText xml:space="preserve"> PAGEREF _Toc208863954 \h </w:instrText>
             </w:r>
             <w:r>
               <w:rPr>
@@ -4702,7 +4702,7 @@
               <w:lang w:eastAsia="es-EC"/>
             </w:rPr>
           </w:pPr>
-          <w:hyperlink w:anchor="_Toc208785264" w:history="1">
+          <w:hyperlink w:anchor="_Toc208863955" w:history="1">
             <w:r>
               <w:rPr>
                 <w:rStyle w:val="Hipervnculo"/>
@@ -4729,7 +4729,7 @@
                 <w:noProof/>
                 <w:webHidden/>
               </w:rPr>
-              <w:instrText xml:space="preserve"> PAGEREF _Toc208785264 \h </w:instrText>
+              <w:instrText xml:space="preserve"> PAGEREF _Toc208863955 \h </w:instrText>
             </w:r>
             <w:r>
               <w:rPr>
@@ -4773,7 +4773,7 @@
               <w:lang w:eastAsia="es-EC"/>
             </w:rPr>
           </w:pPr>
-          <w:hyperlink w:anchor="_Toc208785265" w:history="1">
+          <w:hyperlink w:anchor="_Toc208863956" w:history="1">
             <w:r>
               <w:rPr>
                 <w:rStyle w:val="Hipervnculo"/>
@@ -4800,7 +4800,7 @@
                 <w:noProof/>
                 <w:webHidden/>
               </w:rPr>
-              <w:instrText xml:space="preserve"> PAGEREF _Toc208785265 \h </w:instrText>
+              <w:instrText xml:space="preserve"> PAGEREF _Toc208863956 \h </w:instrText>
             </w:r>
             <w:r>
               <w:rPr>
@@ -4844,7 +4844,7 @@
               <w:lang w:eastAsia="es-EC"/>
             </w:rPr>
           </w:pPr>
-          <w:hyperlink w:anchor="_Toc208785266" w:history="1">
+          <w:hyperlink w:anchor="_Toc208863957" w:history="1">
             <w:r>
               <w:rPr>
                 <w:rStyle w:val="Hipervnculo"/>
@@ -4872,7 +4872,7 @@
                 <w:noProof/>
                 <w:webHidden/>
               </w:rPr>
-              <w:instrText xml:space="preserve"> PAGEREF _Toc208785266 \h </w:instrText>
+              <w:instrText xml:space="preserve"> PAGEREF _Toc208863957 \h </w:instrText>
             </w:r>
             <w:r>
               <w:rPr>
@@ -4916,7 +4916,7 @@
               <w:lang w:eastAsia="es-EC"/>
             </w:rPr>
           </w:pPr>
-          <w:hyperlink w:anchor="_Toc208785267" w:history="1">
+          <w:hyperlink w:anchor="_Toc208863958" w:history="1">
             <w:r>
               <w:rPr>
                 <w:rStyle w:val="Hipervnculo"/>
@@ -4943,7 +4943,7 @@
                 <w:noProof/>
                 <w:webHidden/>
               </w:rPr>
-              <w:instrText xml:space="preserve"> PAGEREF _Toc208785267 \h </w:instrText>
+              <w:instrText xml:space="preserve"> PAGEREF _Toc208863958 \h </w:instrText>
             </w:r>
             <w:r>
               <w:rPr>
@@ -4987,7 +4987,7 @@
               <w:lang w:eastAsia="es-EC"/>
             </w:rPr>
           </w:pPr>
-          <w:hyperlink w:anchor="_Toc208785268" w:history="1">
+          <w:hyperlink w:anchor="_Toc208863959" w:history="1">
             <w:r>
               <w:rPr>
                 <w:rStyle w:val="Hipervnculo"/>
@@ -5014,7 +5014,7 @@
                 <w:noProof/>
                 <w:webHidden/>
               </w:rPr>
-              <w:instrText xml:space="preserve"> PAGEREF _Toc208785268 \h </w:instrText>
+              <w:instrText xml:space="preserve"> PAGEREF _Toc208863959 \h </w:instrText>
             </w:r>
             <w:r>
               <w:rPr>
@@ -5058,7 +5058,7 @@
               <w:lang w:eastAsia="es-EC"/>
             </w:rPr>
           </w:pPr>
-          <w:hyperlink w:anchor="_Toc208785269" w:history="1">
+          <w:hyperlink w:anchor="_Toc208863960" w:history="1">
             <w:r>
               <w:rPr>
                 <w:rStyle w:val="Hipervnculo"/>
@@ -5085,7 +5085,7 @@
                 <w:noProof/>
                 <w:webHidden/>
               </w:rPr>
-              <w:instrText xml:space="preserve"> PAGEREF _Toc208785269 \h </w:instrText>
+              <w:instrText xml:space="preserve"> PAGEREF _Toc208863960 \h </w:instrText>
             </w:r>
             <w:r>
               <w:rPr>
@@ -5129,7 +5129,7 @@
               <w:lang w:eastAsia="es-EC"/>
             </w:rPr>
           </w:pPr>
-          <w:hyperlink w:anchor="_Toc208785270" w:history="1">
+          <w:hyperlink w:anchor="_Toc208863961" w:history="1">
             <w:r>
               <w:rPr>
                 <w:rStyle w:val="Hipervnculo"/>
@@ -5156,7 +5156,7 @@
                 <w:noProof/>
                 <w:webHidden/>
               </w:rPr>
-              <w:instrText xml:space="preserve"> PAGEREF _Toc208785270 \h </w:instrText>
+              <w:instrText xml:space="preserve"> PAGEREF _Toc208863961 \h </w:instrText>
             </w:r>
             <w:r>
               <w:rPr>
@@ -5200,7 +5200,7 @@
               <w:lang w:eastAsia="es-EC"/>
             </w:rPr>
           </w:pPr>
-          <w:hyperlink w:anchor="_Toc208785271" w:history="1">
+          <w:hyperlink w:anchor="_Toc208863962" w:history="1">
             <w:r>
               <w:rPr>
                 <w:rStyle w:val="Hipervnculo"/>
@@ -5227,7 +5227,7 @@
                 <w:noProof/>
                 <w:webHidden/>
               </w:rPr>
-              <w:instrText xml:space="preserve"> PAGEREF _Toc208785271 \h </w:instrText>
+              <w:instrText xml:space="preserve"> PAGEREF _Toc208863962 \h </w:instrText>
             </w:r>
             <w:r>
               <w:rPr>
@@ -5271,7 +5271,7 @@
               <w:lang w:eastAsia="es-EC"/>
             </w:rPr>
           </w:pPr>
-          <w:hyperlink w:anchor="_Toc208785272" w:history="1">
+          <w:hyperlink w:anchor="_Toc208863963" w:history="1">
             <w:r>
               <w:rPr>
                 <w:rStyle w:val="Hipervnculo"/>
@@ -5298,7 +5298,7 @@
                 <w:noProof/>
                 <w:webHidden/>
               </w:rPr>
-              <w:instrText xml:space="preserve"> PAGEREF _Toc208785272 \h </w:instrText>
+              <w:instrText xml:space="preserve"> PAGEREF _Toc208863963 \h </w:instrText>
             </w:r>
             <w:r>
               <w:rPr>
@@ -5342,7 +5342,7 @@
               <w:lang w:eastAsia="es-EC"/>
             </w:rPr>
           </w:pPr>
-          <w:hyperlink w:anchor="_Toc208785273" w:history="1">
+          <w:hyperlink w:anchor="_Toc208863964" w:history="1">
             <w:r>
               <w:rPr>
                 <w:rStyle w:val="Hipervnculo"/>
@@ -5369,7 +5369,7 @@
                 <w:noProof/>
                 <w:webHidden/>
               </w:rPr>
-              <w:instrText xml:space="preserve"> PAGEREF _Toc208785273 \h </w:instrText>
+              <w:instrText xml:space="preserve"> PAGEREF _Toc208863964 \h </w:instrText>
             </w:r>
             <w:r>
               <w:rPr>
@@ -5410,7 +5410,7 @@
               <w:lang w:eastAsia="es-EC"/>
             </w:rPr>
           </w:pPr>
-          <w:hyperlink w:anchor="_Toc208785274" w:history="1">
+          <w:hyperlink w:anchor="_Toc208863965" w:history="1">
             <w:r>
               <w:rPr>
                 <w:rStyle w:val="Hipervnculo"/>
@@ -5437,7 +5437,7 @@
                 <w:noProof/>
                 <w:webHidden/>
               </w:rPr>
-              <w:instrText xml:space="preserve"> PAGEREF _Toc208785274 \h </w:instrText>
+              <w:instrText xml:space="preserve"> PAGEREF _Toc208863965 \h </w:instrText>
             </w:r>
             <w:r>
               <w:rPr>
@@ -5478,7 +5478,7 @@
               <w:lang w:eastAsia="es-EC"/>
             </w:rPr>
           </w:pPr>
-          <w:hyperlink w:anchor="_Toc208785275" w:history="1">
+          <w:hyperlink w:anchor="_Toc208863966" w:history="1">
             <w:r>
               <w:rPr>
                 <w:rStyle w:val="Hipervnculo"/>
@@ -5505,7 +5505,7 @@
                 <w:noProof/>
                 <w:webHidden/>
               </w:rPr>
-              <w:instrText xml:space="preserve"> PAGEREF _Toc208785275 \h </w:instrText>
+              <w:instrText xml:space="preserve"> PAGEREF _Toc208863966 \h </w:instrText>
             </w:r>
             <w:r>
               <w:rPr>
@@ -5549,7 +5549,7 @@
               <w:lang w:eastAsia="es-EC"/>
             </w:rPr>
           </w:pPr>
-          <w:hyperlink w:anchor="_Toc208785276" w:history="1">
+          <w:hyperlink w:anchor="_Toc208863967" w:history="1">
             <w:r>
               <w:rPr>
                 <w:rStyle w:val="Hipervnculo"/>
@@ -5576,7 +5576,7 @@
                 <w:noProof/>
                 <w:webHidden/>
               </w:rPr>
-              <w:instrText xml:space="preserve"> PAGEREF _Toc208785276 \h </w:instrText>
+              <w:instrText xml:space="preserve"> PAGEREF _Toc208863967 \h </w:instrText>
             </w:r>
             <w:r>
               <w:rPr>
@@ -5620,7 +5620,7 @@
               <w:lang w:eastAsia="es-EC"/>
             </w:rPr>
           </w:pPr>
-          <w:hyperlink w:anchor="_Toc208785277" w:history="1">
+          <w:hyperlink w:anchor="_Toc208863968" w:history="1">
             <w:r>
               <w:rPr>
                 <w:rStyle w:val="Hipervnculo"/>
@@ -5647,7 +5647,7 @@
                 <w:noProof/>
                 <w:webHidden/>
               </w:rPr>
-              <w:instrText xml:space="preserve"> PAGEREF _Toc208785277 \h </w:instrText>
+              <w:instrText xml:space="preserve"> PAGEREF _Toc208863968 \h </w:instrText>
             </w:r>
             <w:r>
               <w:rPr>
@@ -5691,7 +5691,7 @@
               <w:lang w:eastAsia="es-EC"/>
             </w:rPr>
           </w:pPr>
-          <w:hyperlink w:anchor="_Toc208785278" w:history="1">
+          <w:hyperlink w:anchor="_Toc208863969" w:history="1">
             <w:r>
               <w:rPr>
                 <w:rStyle w:val="Hipervnculo"/>
@@ -5718,7 +5718,7 @@
                 <w:noProof/>
                 <w:webHidden/>
               </w:rPr>
-              <w:instrText xml:space="preserve"> PAGEREF _Toc208785278 \h </w:instrText>
+              <w:instrText xml:space="preserve"> PAGEREF _Toc208863969 \h </w:instrText>
             </w:r>
             <w:r>
               <w:rPr>
@@ -5762,7 +5762,7 @@
               <w:lang w:eastAsia="es-EC"/>
             </w:rPr>
           </w:pPr>
-          <w:hyperlink w:anchor="_Toc208785279" w:history="1">
+          <w:hyperlink w:anchor="_Toc208863970" w:history="1">
             <w:r>
               <w:rPr>
                 <w:rStyle w:val="Hipervnculo"/>
@@ -5789,7 +5789,7 @@
                 <w:noProof/>
                 <w:webHidden/>
               </w:rPr>
-              <w:instrText xml:space="preserve"> PAGEREF _Toc208785279 \h </w:instrText>
+              <w:instrText xml:space="preserve"> PAGEREF _Toc208863970 \h </w:instrText>
             </w:r>
             <w:r>
               <w:rPr>
@@ -5833,7 +5833,7 @@
               <w:lang w:eastAsia="es-EC"/>
             </w:rPr>
           </w:pPr>
-          <w:hyperlink w:anchor="_Toc208785280" w:history="1">
+          <w:hyperlink w:anchor="_Toc208863971" w:history="1">
             <w:r>
               <w:rPr>
                 <w:rStyle w:val="Hipervnculo"/>
@@ -5860,7 +5860,7 @@
                 <w:noProof/>
                 <w:webHidden/>
               </w:rPr>
-              <w:instrText xml:space="preserve"> PAGEREF _Toc208785280 \h </w:instrText>
+              <w:instrText xml:space="preserve"> PAGEREF _Toc208863971 \h </w:instrText>
             </w:r>
             <w:r>
               <w:rPr>
@@ -5904,7 +5904,7 @@
               <w:lang w:eastAsia="es-EC"/>
             </w:rPr>
           </w:pPr>
-          <w:hyperlink w:anchor="_Toc208785281" w:history="1">
+          <w:hyperlink w:anchor="_Toc208863972" w:history="1">
             <w:r>
               <w:rPr>
                 <w:rStyle w:val="Hipervnculo"/>
@@ -5931,7 +5931,7 @@
                 <w:noProof/>
                 <w:webHidden/>
               </w:rPr>
-              <w:instrText xml:space="preserve"> PAGEREF _Toc208785281 \h </w:instrText>
+              <w:instrText xml:space="preserve"> PAGEREF _Toc208863972 \h </w:instrText>
             </w:r>
             <w:r>
               <w:rPr>
@@ -5975,7 +5975,7 @@
               <w:lang w:eastAsia="es-EC"/>
             </w:rPr>
           </w:pPr>
-          <w:hyperlink w:anchor="_Toc208785282" w:history="1">
+          <w:hyperlink w:anchor="_Toc208863973" w:history="1">
             <w:r>
               <w:rPr>
                 <w:rStyle w:val="Hipervnculo"/>
@@ -6002,7 +6002,7 @@
                 <w:noProof/>
                 <w:webHidden/>
               </w:rPr>
-              <w:instrText xml:space="preserve"> PAGEREF _Toc208785282 \h </w:instrText>
+              <w:instrText xml:space="preserve"> PAGEREF _Toc208863973 \h </w:instrText>
             </w:r>
             <w:r>
               <w:rPr>
@@ -6046,7 +6046,7 @@
               <w:lang w:eastAsia="es-EC"/>
             </w:rPr>
           </w:pPr>
-          <w:hyperlink w:anchor="_Toc208785283" w:history="1">
+          <w:hyperlink w:anchor="_Toc208863974" w:history="1">
             <w:r>
               <w:rPr>
                 <w:rStyle w:val="Hipervnculo"/>
@@ -6073,7 +6073,7 @@
                 <w:noProof/>
                 <w:webHidden/>
               </w:rPr>
-              <w:instrText xml:space="preserve"> PAGEREF _Toc208785283 \h </w:instrText>
+              <w:instrText xml:space="preserve"> PAGEREF _Toc208863974 \h </w:instrText>
             </w:r>
             <w:r>
               <w:rPr>
@@ -6117,7 +6117,7 @@
               <w:lang w:eastAsia="es-EC"/>
             </w:rPr>
           </w:pPr>
-          <w:hyperlink w:anchor="_Toc208785284" w:history="1">
+          <w:hyperlink w:anchor="_Toc208863975" w:history="1">
             <w:r>
               <w:rPr>
                 <w:rStyle w:val="Hipervnculo"/>
@@ -6144,7 +6144,7 @@
                 <w:noProof/>
                 <w:webHidden/>
               </w:rPr>
-              <w:instrText xml:space="preserve"> PAGEREF _Toc208785284 \h </w:instrText>
+              <w:instrText xml:space="preserve"> PAGEREF _Toc208863975 \h </w:instrText>
             </w:r>
             <w:r>
               <w:rPr>
@@ -6188,7 +6188,7 @@
               <w:lang w:eastAsia="es-EC"/>
             </w:rPr>
           </w:pPr>
-          <w:hyperlink w:anchor="_Toc208785285" w:history="1">
+          <w:hyperlink w:anchor="_Toc208863976" w:history="1">
             <w:r>
               <w:rPr>
                 <w:rStyle w:val="Hipervnculo"/>
@@ -6215,7 +6215,7 @@
                 <w:noProof/>
                 <w:webHidden/>
               </w:rPr>
-              <w:instrText xml:space="preserve"> PAGEREF _Toc208785285 \h </w:instrText>
+              <w:instrText xml:space="preserve"> PAGEREF _Toc208863976 \h </w:instrText>
             </w:r>
             <w:r>
               <w:rPr>
@@ -6259,7 +6259,7 @@
               <w:lang w:eastAsia="es-EC"/>
             </w:rPr>
           </w:pPr>
-          <w:hyperlink w:anchor="_Toc208785286" w:history="1">
+          <w:hyperlink w:anchor="_Toc208863977" w:history="1">
             <w:r>
               <w:rPr>
                 <w:rStyle w:val="Hipervnculo"/>
@@ -6286,7 +6286,7 @@
                 <w:noProof/>
                 <w:webHidden/>
               </w:rPr>
-              <w:instrText xml:space="preserve"> PAGEREF _Toc208785286 \h </w:instrText>
+              <w:instrText xml:space="preserve"> PAGEREF _Toc208863977 \h </w:instrText>
             </w:r>
             <w:r>
               <w:rPr>
@@ -6330,7 +6330,7 @@
               <w:lang w:eastAsia="es-EC"/>
             </w:rPr>
           </w:pPr>
-          <w:hyperlink w:anchor="_Toc208785287" w:history="1">
+          <w:hyperlink w:anchor="_Toc208863978" w:history="1">
             <w:r>
               <w:rPr>
                 <w:rStyle w:val="Hipervnculo"/>
@@ -6357,7 +6357,7 @@
                 <w:noProof/>
                 <w:webHidden/>
               </w:rPr>
-              <w:instrText xml:space="preserve"> PAGEREF _Toc208785287 \h </w:instrText>
+              <w:instrText xml:space="preserve"> PAGEREF _Toc208863978 \h </w:instrText>
             </w:r>
             <w:r>
               <w:rPr>
@@ -6401,7 +6401,7 @@
               <w:lang w:eastAsia="es-EC"/>
             </w:rPr>
           </w:pPr>
-          <w:hyperlink w:anchor="_Toc208785288" w:history="1">
+          <w:hyperlink w:anchor="_Toc208863979" w:history="1">
             <w:r>
               <w:rPr>
                 <w:rStyle w:val="Hipervnculo"/>
@@ -6428,7 +6428,7 @@
                 <w:noProof/>
                 <w:webHidden/>
               </w:rPr>
-              <w:instrText xml:space="preserve"> PAGEREF _Toc208785288 \h </w:instrText>
+              <w:instrText xml:space="preserve"> PAGEREF _Toc208863979 \h </w:instrText>
             </w:r>
             <w:r>
               <w:rPr>
@@ -6472,7 +6472,7 @@
               <w:lang w:eastAsia="es-EC"/>
             </w:rPr>
           </w:pPr>
-          <w:hyperlink w:anchor="_Toc208785289" w:history="1">
+          <w:hyperlink w:anchor="_Toc208863980" w:history="1">
             <w:r>
               <w:rPr>
                 <w:rStyle w:val="Hipervnculo"/>
@@ -6499,7 +6499,7 @@
                 <w:noProof/>
                 <w:webHidden/>
               </w:rPr>
-              <w:instrText xml:space="preserve"> PAGEREF _Toc208785289 \h </w:instrText>
+              <w:instrText xml:space="preserve"> PAGEREF _Toc208863980 \h </w:instrText>
             </w:r>
             <w:r>
               <w:rPr>
@@ -6540,7 +6540,7 @@
               <w:lang w:eastAsia="es-EC"/>
             </w:rPr>
           </w:pPr>
-          <w:hyperlink w:anchor="_Toc208785290" w:history="1">
+          <w:hyperlink w:anchor="_Toc208863981" w:history="1">
             <w:r>
               <w:rPr>
                 <w:rStyle w:val="Hipervnculo"/>
@@ -6567,7 +6567,7 @@
                 <w:noProof/>
                 <w:webHidden/>
               </w:rPr>
-              <w:instrText xml:space="preserve"> PAGEREF _Toc208785290 \h </w:instrText>
+              <w:instrText xml:space="preserve"> PAGEREF _Toc208863981 \h </w:instrText>
             </w:r>
             <w:r>
               <w:rPr>
@@ -6587,7 +6587,7 @@
                 <w:noProof/>
                 <w:webHidden/>
               </w:rPr>
-              <w:t>21</w:t>
+              <w:t>22</w:t>
             </w:r>
             <w:r>
               <w:rPr>
@@ -6608,7 +6608,7 @@
               <w:lang w:eastAsia="es-EC"/>
             </w:rPr>
           </w:pPr>
-          <w:hyperlink w:anchor="_Toc208785291" w:history="1">
+          <w:hyperlink w:anchor="_Toc208863982" w:history="1">
             <w:r>
               <w:rPr>
                 <w:rStyle w:val="Hipervnculo"/>
@@ -6635,7 +6635,7 @@
                 <w:noProof/>
                 <w:webHidden/>
               </w:rPr>
-              <w:instrText xml:space="preserve"> PAGEREF _Toc208785291 \h </w:instrText>
+              <w:instrText xml:space="preserve"> PAGEREF _Toc208863982 \h </w:instrText>
             </w:r>
             <w:r>
               <w:rPr>
@@ -6655,7 +6655,7 @@
                 <w:noProof/>
                 <w:webHidden/>
               </w:rPr>
-              <w:t>21</w:t>
+              <w:t>22</w:t>
             </w:r>
             <w:r>
               <w:rPr>
@@ -6679,7 +6679,7 @@
               <w:lang w:eastAsia="es-EC"/>
             </w:rPr>
           </w:pPr>
-          <w:hyperlink w:anchor="_Toc208785292" w:history="1">
+          <w:hyperlink w:anchor="_Toc208863983" w:history="1">
             <w:r>
               <w:rPr>
                 <w:rStyle w:val="Hipervnculo"/>
@@ -6707,7 +6707,7 @@
                 <w:noProof/>
                 <w:webHidden/>
               </w:rPr>
-              <w:instrText xml:space="preserve"> PAGEREF _Toc208785292 \h </w:instrText>
+              <w:instrText xml:space="preserve"> PAGEREF _Toc208863983 \h </w:instrText>
             </w:r>
             <w:r>
               <w:rPr>
@@ -6727,7 +6727,7 @@
                 <w:noProof/>
                 <w:webHidden/>
               </w:rPr>
-              <w:t>22</w:t>
+              <w:t>23</w:t>
             </w:r>
             <w:r>
               <w:rPr>
@@ -6751,7 +6751,7 @@
               <w:lang w:eastAsia="es-EC"/>
             </w:rPr>
           </w:pPr>
-          <w:hyperlink w:anchor="_Toc208785293" w:history="1">
+          <w:hyperlink w:anchor="_Toc208863984" w:history="1">
             <w:r>
               <w:rPr>
                 <w:rStyle w:val="Hipervnculo"/>
@@ -6778,7 +6778,7 @@
                 <w:noProof/>
                 <w:webHidden/>
               </w:rPr>
-              <w:instrText xml:space="preserve"> PAGEREF _Toc208785293 \h </w:instrText>
+              <w:instrText xml:space="preserve"> PAGEREF _Toc208863984 \h </w:instrText>
             </w:r>
             <w:r>
               <w:rPr>
@@ -6798,7 +6798,7 @@
                 <w:noProof/>
                 <w:webHidden/>
               </w:rPr>
-              <w:t>22</w:t>
+              <w:t>23</w:t>
             </w:r>
             <w:r>
               <w:rPr>
@@ -6822,13 +6822,27 @@
               <w:lang w:eastAsia="es-EC"/>
             </w:rPr>
           </w:pPr>
-          <w:hyperlink w:anchor="_Toc208785294" w:history="1">
+          <w:hyperlink w:anchor="_Toc208863985" w:history="1">
             <w:r>
               <w:rPr>
                 <w:rStyle w:val="Hipervnculo"/>
                 <w:noProof/>
               </w:rPr>
-              <w:t>4.1.2. Arquitectura y componentes del modelo</w:t>
+              <w:t>4.1.2. Arquitectura y</w:t>
+            </w:r>
+            <w:r>
+              <w:rPr>
+                <w:rStyle w:val="Hipervnculo"/>
+                <w:noProof/>
+              </w:rPr>
+              <w:t xml:space="preserve"> </w:t>
+            </w:r>
+            <w:r>
+              <w:rPr>
+                <w:rStyle w:val="Hipervnculo"/>
+                <w:noProof/>
+              </w:rPr>
+              <w:t>componentes del modelo</w:t>
             </w:r>
             <w:r>
               <w:rPr>
@@ -6849,7 +6863,7 @@
                 <w:noProof/>
                 <w:webHidden/>
               </w:rPr>
-              <w:instrText xml:space="preserve"> PAGEREF _Toc208785294 \h </w:instrText>
+              <w:instrText xml:space="preserve"> PAGEREF _Toc208863985 \h </w:instrText>
             </w:r>
             <w:r>
               <w:rPr>
@@ -6869,7 +6883,7 @@
                 <w:noProof/>
                 <w:webHidden/>
               </w:rPr>
-              <w:t>23</w:t>
+              <w:t>25</w:t>
             </w:r>
             <w:r>
               <w:rPr>
@@ -6893,7 +6907,7 @@
               <w:lang w:eastAsia="es-EC"/>
             </w:rPr>
           </w:pPr>
-          <w:hyperlink w:anchor="_Toc208785295" w:history="1">
+          <w:hyperlink w:anchor="_Toc208863986" w:history="1">
             <w:r>
               <w:rPr>
                 <w:rStyle w:val="Hipervnculo"/>
@@ -6920,7 +6934,7 @@
                 <w:noProof/>
                 <w:webHidden/>
               </w:rPr>
-              <w:instrText xml:space="preserve"> PAGEREF _Toc208785295 \h </w:instrText>
+              <w:instrText xml:space="preserve"> PAGEREF _Toc208863986 \h </w:instrText>
             </w:r>
             <w:r>
               <w:rPr>
@@ -6940,7 +6954,7 @@
                 <w:noProof/>
                 <w:webHidden/>
               </w:rPr>
-              <w:t>27</w:t>
+              <w:t>30</w:t>
             </w:r>
             <w:r>
               <w:rPr>
@@ -6964,7 +6978,7 @@
               <w:lang w:eastAsia="es-EC"/>
             </w:rPr>
           </w:pPr>
-          <w:hyperlink w:anchor="_Toc208785296" w:history="1">
+          <w:hyperlink w:anchor="_Toc208863987" w:history="1">
             <w:r>
               <w:rPr>
                 <w:rStyle w:val="Hipervnculo"/>
@@ -6991,7 +7005,7 @@
                 <w:noProof/>
                 <w:webHidden/>
               </w:rPr>
-              <w:instrText xml:space="preserve"> PAGEREF _Toc208785296 \h </w:instrText>
+              <w:instrText xml:space="preserve"> PAGEREF _Toc208863987 \h </w:instrText>
             </w:r>
             <w:r>
               <w:rPr>
@@ -7011,7 +7025,7 @@
                 <w:noProof/>
                 <w:webHidden/>
               </w:rPr>
-              <w:t>28</w:t>
+              <w:t>30</w:t>
             </w:r>
             <w:r>
               <w:rPr>
@@ -7035,7 +7049,7 @@
               <w:lang w:eastAsia="es-EC"/>
             </w:rPr>
           </w:pPr>
-          <w:hyperlink w:anchor="_Toc208785297" w:history="1">
+          <w:hyperlink w:anchor="_Toc208863988" w:history="1">
             <w:r>
               <w:rPr>
                 <w:rStyle w:val="Hipervnculo"/>
@@ -7062,7 +7076,7 @@
                 <w:noProof/>
                 <w:webHidden/>
               </w:rPr>
-              <w:instrText xml:space="preserve"> PAGEREF _Toc208785297 \h </w:instrText>
+              <w:instrText xml:space="preserve"> PAGEREF _Toc208863988 \h </w:instrText>
             </w:r>
             <w:r>
               <w:rPr>
@@ -7082,7 +7096,7 @@
                 <w:noProof/>
                 <w:webHidden/>
               </w:rPr>
-              <w:t>30</w:t>
+              <w:t>33</w:t>
             </w:r>
             <w:r>
               <w:rPr>
@@ -7106,7 +7120,7 @@
               <w:lang w:eastAsia="es-EC"/>
             </w:rPr>
           </w:pPr>
-          <w:hyperlink w:anchor="_Toc208785298" w:history="1">
+          <w:hyperlink w:anchor="_Toc208863989" w:history="1">
             <w:r>
               <w:rPr>
                 <w:rStyle w:val="Hipervnculo"/>
@@ -7133,7 +7147,7 @@
                 <w:noProof/>
                 <w:webHidden/>
               </w:rPr>
-              <w:instrText xml:space="preserve"> PAGEREF _Toc208785298 \h </w:instrText>
+              <w:instrText xml:space="preserve"> PAGEREF _Toc208863989 \h </w:instrText>
             </w:r>
             <w:r>
               <w:rPr>
@@ -7153,7 +7167,7 @@
                 <w:noProof/>
                 <w:webHidden/>
               </w:rPr>
-              <w:t>33</w:t>
+              <w:t>36</w:t>
             </w:r>
             <w:r>
               <w:rPr>
@@ -7174,7 +7188,7 @@
               <w:lang w:eastAsia="es-EC"/>
             </w:rPr>
           </w:pPr>
-          <w:hyperlink w:anchor="_Toc208785299" w:history="1">
+          <w:hyperlink w:anchor="_Toc208863990" w:history="1">
             <w:r>
               <w:rPr>
                 <w:rStyle w:val="Hipervnculo"/>
@@ -7201,7 +7215,7 @@
                 <w:noProof/>
                 <w:webHidden/>
               </w:rPr>
-              <w:instrText xml:space="preserve"> PAGEREF _Toc208785299 \h </w:instrText>
+              <w:instrText xml:space="preserve"> PAGEREF _Toc208863990 \h </w:instrText>
             </w:r>
             <w:r>
               <w:rPr>
@@ -7221,7 +7235,7 @@
                 <w:noProof/>
                 <w:webHidden/>
               </w:rPr>
-              <w:t>39</w:t>
+              <w:t>42</w:t>
             </w:r>
             <w:r>
               <w:rPr>
@@ -7242,7 +7256,7 @@
               <w:lang w:eastAsia="es-EC"/>
             </w:rPr>
           </w:pPr>
-          <w:hyperlink w:anchor="_Toc208785300" w:history="1">
+          <w:hyperlink w:anchor="_Toc208863991" w:history="1">
             <w:r>
               <w:rPr>
                 <w:rStyle w:val="Hipervnculo"/>
@@ -7269,7 +7283,7 @@
                 <w:noProof/>
                 <w:webHidden/>
               </w:rPr>
-              <w:instrText xml:space="preserve"> PAGEREF _Toc208785300 \h </w:instrText>
+              <w:instrText xml:space="preserve"> PAGEREF _Toc208863991 \h </w:instrText>
             </w:r>
             <w:r>
               <w:rPr>
@@ -7289,7 +7303,7 @@
                 <w:noProof/>
                 <w:webHidden/>
               </w:rPr>
-              <w:t>39</w:t>
+              <w:t>42</w:t>
             </w:r>
             <w:r>
               <w:rPr>
@@ -7313,7 +7327,7 @@
               <w:lang w:eastAsia="es-EC"/>
             </w:rPr>
           </w:pPr>
-          <w:hyperlink w:anchor="_Toc208785301" w:history="1">
+          <w:hyperlink w:anchor="_Toc208863992" w:history="1">
             <w:r>
               <w:rPr>
                 <w:rStyle w:val="Hipervnculo"/>
@@ -7340,7 +7354,7 @@
                 <w:noProof/>
                 <w:webHidden/>
               </w:rPr>
-              <w:instrText xml:space="preserve"> PAGEREF _Toc208785301 \h </w:instrText>
+              <w:instrText xml:space="preserve"> PAGEREF _Toc208863992 \h </w:instrText>
             </w:r>
             <w:r>
               <w:rPr>
@@ -7360,7 +7374,7 @@
                 <w:noProof/>
                 <w:webHidden/>
               </w:rPr>
-              <w:t>40</w:t>
+              <w:t>43</w:t>
             </w:r>
             <w:r>
               <w:rPr>
@@ -7384,7 +7398,7 @@
               <w:lang w:eastAsia="es-EC"/>
             </w:rPr>
           </w:pPr>
-          <w:hyperlink w:anchor="_Toc208785302" w:history="1">
+          <w:hyperlink w:anchor="_Toc208863993" w:history="1">
             <w:r>
               <w:rPr>
                 <w:rStyle w:val="Hipervnculo"/>
@@ -7411,7 +7425,7 @@
                 <w:noProof/>
                 <w:webHidden/>
               </w:rPr>
-              <w:instrText xml:space="preserve"> PAGEREF _Toc208785302 \h </w:instrText>
+              <w:instrText xml:space="preserve"> PAGEREF _Toc208863993 \h </w:instrText>
             </w:r>
             <w:r>
               <w:rPr>
@@ -7431,7 +7445,7 @@
                 <w:noProof/>
                 <w:webHidden/>
               </w:rPr>
-              <w:t>40</w:t>
+              <w:t>43</w:t>
             </w:r>
             <w:r>
               <w:rPr>
@@ -7452,7 +7466,7 @@
               <w:lang w:eastAsia="es-EC"/>
             </w:rPr>
           </w:pPr>
-          <w:hyperlink w:anchor="_Toc208785303" w:history="1">
+          <w:hyperlink w:anchor="_Toc208863994" w:history="1">
             <w:r>
               <w:rPr>
                 <w:rStyle w:val="Hipervnculo"/>
@@ -7479,7 +7493,7 @@
                 <w:noProof/>
                 <w:webHidden/>
               </w:rPr>
-              <w:instrText xml:space="preserve"> PAGEREF _Toc208785303 \h </w:instrText>
+              <w:instrText xml:space="preserve"> PAGEREF _Toc208863994 \h </w:instrText>
             </w:r>
             <w:r>
               <w:rPr>
@@ -7499,7 +7513,7 @@
                 <w:noProof/>
                 <w:webHidden/>
               </w:rPr>
-              <w:t>41</w:t>
+              <w:t>44</w:t>
             </w:r>
             <w:r>
               <w:rPr>
@@ -7520,7 +7534,7 @@
               <w:lang w:eastAsia="es-EC"/>
             </w:rPr>
           </w:pPr>
-          <w:hyperlink w:anchor="_Toc208785304" w:history="1">
+          <w:hyperlink w:anchor="_Toc208863995" w:history="1">
             <w:r>
               <w:rPr>
                 <w:rStyle w:val="Hipervnculo"/>
@@ -7548,7 +7562,7 @@
                 <w:noProof/>
                 <w:webHidden/>
               </w:rPr>
-              <w:instrText xml:space="preserve"> PAGEREF _Toc208785304 \h </w:instrText>
+              <w:instrText xml:space="preserve"> PAGEREF _Toc208863995 \h </w:instrText>
             </w:r>
             <w:r>
               <w:rPr>
@@ -7568,7 +7582,7 @@
                 <w:noProof/>
                 <w:webHidden/>
               </w:rPr>
-              <w:t>41</w:t>
+              <w:t>44</w:t>
             </w:r>
             <w:r>
               <w:rPr>
@@ -7589,7 +7603,7 @@
               <w:lang w:eastAsia="es-EC"/>
             </w:rPr>
           </w:pPr>
-          <w:hyperlink w:anchor="_Toc208785305" w:history="1">
+          <w:hyperlink w:anchor="_Toc208863996" w:history="1">
             <w:r>
               <w:rPr>
                 <w:rStyle w:val="Hipervnculo"/>
@@ -7616,7 +7630,7 @@
                 <w:noProof/>
                 <w:webHidden/>
               </w:rPr>
-              <w:instrText xml:space="preserve"> PAGEREF _Toc208785305 \h </w:instrText>
+              <w:instrText xml:space="preserve"> PAGEREF _Toc208863996 \h </w:instrText>
             </w:r>
             <w:r>
               <w:rPr>
@@ -7636,7 +7650,7 @@
                 <w:noProof/>
                 <w:webHidden/>
               </w:rPr>
-              <w:t>47</w:t>
+              <w:t>51</w:t>
             </w:r>
             <w:r>
               <w:rPr>
@@ -7657,7 +7671,7 @@
               <w:lang w:eastAsia="es-EC"/>
             </w:rPr>
           </w:pPr>
-          <w:hyperlink w:anchor="_Toc208785306" w:history="1">
+          <w:hyperlink w:anchor="_Toc208863997" w:history="1">
             <w:r>
               <w:rPr>
                 <w:rStyle w:val="Hipervnculo"/>
@@ -7684,7 +7698,7 @@
                 <w:noProof/>
                 <w:webHidden/>
               </w:rPr>
-              <w:instrText xml:space="preserve"> PAGEREF _Toc208785306 \h </w:instrText>
+              <w:instrText xml:space="preserve"> PAGEREF _Toc208863997 \h </w:instrText>
             </w:r>
             <w:r>
               <w:rPr>
@@ -7704,7 +7718,7 @@
                 <w:noProof/>
                 <w:webHidden/>
               </w:rPr>
-              <w:t>47</w:t>
+              <w:t>51</w:t>
             </w:r>
             <w:r>
               <w:rPr>
@@ -7769,7 +7783,7 @@
           <w:noProof/>
         </w:rPr>
       </w:pPr>
-      <w:bookmarkStart w:id="2" w:name="_Toc208785237"/>
+      <w:bookmarkStart w:id="2" w:name="_Toc208863928"/>
       <w:r>
         <w:rPr>
           <w:lang w:val="es-ES"/>
@@ -7866,7 +7880,7 @@
             <w:noProof/>
             <w:webHidden/>
           </w:rPr>
-          <w:t>22</w:t>
+          <w:t>23</w:t>
         </w:r>
         <w:r>
           <w:rPr>
@@ -7946,7 +7960,7 @@
             <w:noProof/>
             <w:webHidden/>
           </w:rPr>
-          <w:t>24</w:t>
+          <w:t>26</w:t>
         </w:r>
         <w:r>
           <w:rPr>
@@ -8026,7 +8040,7 @@
             <w:noProof/>
             <w:webHidden/>
           </w:rPr>
-          <w:t>25</w:t>
+          <w:t>27</w:t>
         </w:r>
         <w:r>
           <w:rPr>
@@ -8106,7 +8120,7 @@
             <w:noProof/>
             <w:webHidden/>
           </w:rPr>
-          <w:t>26</w:t>
+          <w:t>29</w:t>
         </w:r>
         <w:r>
           <w:rPr>
@@ -8186,7 +8200,7 @@
             <w:noProof/>
             <w:webHidden/>
           </w:rPr>
-          <w:t>27</w:t>
+          <w:t>30</w:t>
         </w:r>
         <w:r>
           <w:rPr>
@@ -8266,7 +8280,7 @@
             <w:noProof/>
             <w:webHidden/>
           </w:rPr>
-          <w:t>28</w:t>
+          <w:t>31</w:t>
         </w:r>
         <w:r>
           <w:rPr>
@@ -8346,7 +8360,7 @@
             <w:noProof/>
             <w:webHidden/>
           </w:rPr>
-          <w:t>29</w:t>
+          <w:t>32</w:t>
         </w:r>
         <w:r>
           <w:rPr>
@@ -8426,7 +8440,7 @@
             <w:noProof/>
             <w:webHidden/>
           </w:rPr>
-          <w:t>29</w:t>
+          <w:t>32</w:t>
         </w:r>
         <w:r>
           <w:rPr>
@@ -8506,7 +8520,7 @@
             <w:noProof/>
             <w:webHidden/>
           </w:rPr>
-          <w:t>30</w:t>
+          <w:t>33</w:t>
         </w:r>
         <w:r>
           <w:rPr>
@@ -8586,7 +8600,7 @@
             <w:noProof/>
             <w:webHidden/>
           </w:rPr>
-          <w:t>31</w:t>
+          <w:t>34</w:t>
         </w:r>
         <w:r>
           <w:rPr>
@@ -8666,7 +8680,7 @@
             <w:noProof/>
             <w:webHidden/>
           </w:rPr>
-          <w:t>32</w:t>
+          <w:t>35</w:t>
         </w:r>
         <w:r>
           <w:rPr>
@@ -8746,7 +8760,7 @@
             <w:noProof/>
             <w:webHidden/>
           </w:rPr>
-          <w:t>32</w:t>
+          <w:t>35</w:t>
         </w:r>
         <w:r>
           <w:rPr>
@@ -8826,7 +8840,7 @@
             <w:noProof/>
             <w:webHidden/>
           </w:rPr>
-          <w:t>33</w:t>
+          <w:t>36</w:t>
         </w:r>
         <w:r>
           <w:rPr>
@@ -8906,7 +8920,7 @@
             <w:noProof/>
             <w:webHidden/>
           </w:rPr>
-          <w:t>34</w:t>
+          <w:t>37</w:t>
         </w:r>
         <w:r>
           <w:rPr>
@@ -8956,7 +8970,7 @@
           <w:lang w:val="es-ES"/>
         </w:rPr>
       </w:pPr>
-      <w:bookmarkStart w:id="3" w:name="_Toc208785238"/>
+      <w:bookmarkStart w:id="3" w:name="_Toc208863929"/>
       <w:r>
         <w:rPr>
           <w:lang w:val="es-ES"/>
@@ -9109,7 +9123,7 @@
       <w:pPr>
         <w:pStyle w:val="Ttulo1"/>
       </w:pPr>
-      <w:bookmarkStart w:id="4" w:name="_Toc208785239"/>
+      <w:bookmarkStart w:id="4" w:name="_Toc208863930"/>
       <w:r>
         <w:lastRenderedPageBreak/>
         <w:t>INTRODUCCIÓN</w:t>
@@ -9321,7 +9335,7 @@
           <w:rPr>
             <w:color w:val="000000"/>
           </w:rPr>
-          <w:tag w:val="MENDELEY_CITATION_v3_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"/>
+          <w:tag w:val="MENDELEY_CITATION_v3_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"/>
           <w:id w:val="1532695438"/>
           <w:placeholder>
             <w:docPart w:val="DefaultPlaceholder_-1854013440"/>
@@ -9512,7 +9526,7 @@
       <w:pPr>
         <w:pStyle w:val="Ttulo1"/>
       </w:pPr>
-      <w:bookmarkStart w:id="5" w:name="_Toc208785240"/>
+      <w:bookmarkStart w:id="5" w:name="_Toc208863931"/>
       <w:r>
         <w:t>CAPÍTULO I</w:t>
       </w:r>
@@ -9522,7 +9536,7 @@
       <w:pPr>
         <w:pStyle w:val="Ttulo1"/>
       </w:pPr>
-      <w:bookmarkStart w:id="6" w:name="_Toc208785241"/>
+      <w:bookmarkStart w:id="6" w:name="_Toc208863932"/>
       <w:r>
         <w:t>CONTEXTUALIZACIÓN DE LA INVESTIGACIÓN</w:t>
       </w:r>
@@ -9619,7 +9633,7 @@
           <w:numId w:val="19"/>
         </w:numPr>
       </w:pPr>
-      <w:bookmarkStart w:id="7" w:name="_Toc208785242"/>
+      <w:bookmarkStart w:id="7" w:name="_Toc208863933"/>
       <w:r>
         <w:lastRenderedPageBreak/>
         <w:t xml:space="preserve">Problema de </w:t>
@@ -9637,7 +9651,7 @@
           <w:numId w:val="19"/>
         </w:numPr>
       </w:pPr>
-      <w:bookmarkStart w:id="8" w:name="_Toc208785243"/>
+      <w:bookmarkStart w:id="8" w:name="_Toc208863934"/>
       <w:r>
         <w:t>Planteamiento del problema</w:t>
       </w:r>
@@ -9783,7 +9797,7 @@
           <w:numId w:val="19"/>
         </w:numPr>
       </w:pPr>
-      <w:bookmarkStart w:id="9" w:name="_Toc208785244"/>
+      <w:bookmarkStart w:id="9" w:name="_Toc208863935"/>
       <w:r>
         <w:lastRenderedPageBreak/>
         <w:t>Diagnóstico</w:t>
@@ -9844,7 +9858,7 @@
           <w:numId w:val="19"/>
         </w:numPr>
       </w:pPr>
-      <w:bookmarkStart w:id="10" w:name="_Toc208785245"/>
+      <w:bookmarkStart w:id="10" w:name="_Toc208863936"/>
       <w:r>
         <w:t>Pronóstico</w:t>
       </w:r>
@@ -9877,7 +9891,7 @@
           <w:numId w:val="19"/>
         </w:numPr>
       </w:pPr>
-      <w:bookmarkStart w:id="11" w:name="_Toc208785246"/>
+      <w:bookmarkStart w:id="11" w:name="_Toc208863937"/>
       <w:r>
         <w:t>Formulación del problema</w:t>
       </w:r>
@@ -9920,7 +9934,7 @@
           <w:numId w:val="19"/>
         </w:numPr>
       </w:pPr>
-      <w:bookmarkStart w:id="12" w:name="_Toc208785247"/>
+      <w:bookmarkStart w:id="12" w:name="_Toc208863938"/>
       <w:r>
         <w:lastRenderedPageBreak/>
         <w:t>Sistematización</w:t>
@@ -9989,7 +10003,7 @@
           <w:numId w:val="19"/>
         </w:numPr>
       </w:pPr>
-      <w:bookmarkStart w:id="13" w:name="_Toc208785248"/>
+      <w:bookmarkStart w:id="13" w:name="_Toc208863939"/>
       <w:r>
         <w:t>O</w:t>
       </w:r>
@@ -10006,7 +10020,7 @@
           <w:numId w:val="19"/>
         </w:numPr>
       </w:pPr>
-      <w:bookmarkStart w:id="14" w:name="_Toc208785249"/>
+      <w:bookmarkStart w:id="14" w:name="_Toc208863940"/>
       <w:r>
         <w:t>Objetivo General:</w:t>
       </w:r>
@@ -10044,7 +10058,7 @@
           <w:numId w:val="19"/>
         </w:numPr>
       </w:pPr>
-      <w:bookmarkStart w:id="17" w:name="_Toc208785250"/>
+      <w:bookmarkStart w:id="17" w:name="_Toc208863941"/>
       <w:bookmarkEnd w:id="15"/>
       <w:r>
         <w:t>Objetivos Específicos:</w:t>
@@ -10133,7 +10147,7 @@
           <w:numId w:val="19"/>
         </w:numPr>
       </w:pPr>
-      <w:bookmarkStart w:id="24" w:name="_Toc208785251"/>
+      <w:bookmarkStart w:id="24" w:name="_Toc208863942"/>
       <w:bookmarkEnd w:id="22"/>
       <w:r>
         <w:t>JUSTIFICACIÓN</w:t>
@@ -10277,7 +10291,7 @@
         <w:pStyle w:val="Ttulo1"/>
       </w:pPr>
       <w:bookmarkStart w:id="25" w:name="_Ref208765427"/>
-      <w:bookmarkStart w:id="26" w:name="_Toc208785252"/>
+      <w:bookmarkStart w:id="26" w:name="_Toc208863943"/>
       <w:r>
         <w:t>CAPÍTULO II</w:t>
       </w:r>
@@ -10288,7 +10302,7 @@
       <w:pPr>
         <w:pStyle w:val="Ttulo1"/>
       </w:pPr>
-      <w:bookmarkStart w:id="27" w:name="_Toc208785253"/>
+      <w:bookmarkStart w:id="27" w:name="_Toc208863944"/>
       <w:r>
         <w:t>FUNDAMENTACIÓN TEÓRICA DE LA INVESTIGACIÓN</w:t>
       </w:r>
@@ -10310,7 +10324,7 @@
       <w:pPr>
         <w:pStyle w:val="Ttulo2"/>
       </w:pPr>
-      <w:bookmarkStart w:id="28" w:name="_Toc208785254"/>
+      <w:bookmarkStart w:id="28" w:name="_Toc208863945"/>
       <w:r>
         <w:lastRenderedPageBreak/>
         <w:t>2.1.</w:t>
@@ -10332,7 +10346,7 @@
       <w:pPr>
         <w:pStyle w:val="Ttulo3"/>
       </w:pPr>
-      <w:bookmarkStart w:id="29" w:name="_Toc208785255"/>
+      <w:bookmarkStart w:id="29" w:name="_Toc208863946"/>
       <w:r>
         <w:t xml:space="preserve">2.1.1. Modelo </w:t>
       </w:r>
@@ -10570,7 +10584,7 @@
       <w:pPr>
         <w:pStyle w:val="Ttulo3"/>
       </w:pPr>
-      <w:bookmarkStart w:id="30" w:name="_Toc208785256"/>
+      <w:bookmarkStart w:id="30" w:name="_Toc208863947"/>
       <w:r>
         <w:lastRenderedPageBreak/>
         <w:t xml:space="preserve">2.1.2. Inteligencia </w:t>
@@ -10632,7 +10646,7 @@
       <w:pPr>
         <w:pStyle w:val="Ttulo3"/>
       </w:pPr>
-      <w:bookmarkStart w:id="31" w:name="_Toc208785257"/>
+      <w:bookmarkStart w:id="31" w:name="_Toc208863948"/>
       <w:r>
         <w:t>2.1.3. Diseño de interfaces educativas</w:t>
       </w:r>
@@ -10716,7 +10730,7 @@
       <w:pPr>
         <w:pStyle w:val="Ttulo3"/>
       </w:pPr>
-      <w:bookmarkStart w:id="32" w:name="_Toc208785258"/>
+      <w:bookmarkStart w:id="32" w:name="_Toc208863949"/>
       <w:r>
         <w:t>2.1.4. Trigonometría</w:t>
       </w:r>
@@ -10757,7 +10771,7 @@
       <w:pPr>
         <w:pStyle w:val="Ttulo3"/>
       </w:pPr>
-      <w:bookmarkStart w:id="33" w:name="_Toc208785259"/>
+      <w:bookmarkStart w:id="33" w:name="_Toc208863950"/>
       <w:r>
         <w:lastRenderedPageBreak/>
         <w:t>2.1.5. A</w:t>
@@ -10851,7 +10865,7 @@
       <w:pPr>
         <w:pStyle w:val="Ttulo3"/>
       </w:pPr>
-      <w:bookmarkStart w:id="34" w:name="_Toc208785260"/>
+      <w:bookmarkStart w:id="34" w:name="_Toc208863951"/>
       <w:r>
         <w:t>2.1.6. Software educativo</w:t>
       </w:r>
@@ -10923,7 +10937,7 @@
       <w:pPr>
         <w:pStyle w:val="Ttulo3"/>
       </w:pPr>
-      <w:bookmarkStart w:id="35" w:name="_Toc208785261"/>
+      <w:bookmarkStart w:id="35" w:name="_Toc208863952"/>
       <w:r>
         <w:t xml:space="preserve">2.1.7. </w:t>
       </w:r>
@@ -11028,7 +11042,7 @@
       <w:pPr>
         <w:pStyle w:val="Ttulo3"/>
       </w:pPr>
-      <w:bookmarkStart w:id="36" w:name="_Toc208785262"/>
+      <w:bookmarkStart w:id="36" w:name="_Toc208863953"/>
       <w:r>
         <w:lastRenderedPageBreak/>
         <w:t xml:space="preserve">2.1.8. </w:t>
@@ -11076,7 +11090,7 @@
           <w:rPr>
             <w:color w:val="000000"/>
           </w:rPr>
-          <w:tag w:val="MENDELEY_CITATION_v3_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"/>
+          <w:tag w:val="MENDELEY_CITATION_v3_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"/>
           <w:id w:val="-801298641"/>
           <w:placeholder>
             <w:docPart w:val="DefaultPlaceholder_-1854013440"/>
@@ -11107,7 +11121,7 @@
           <w:rPr>
             <w:color w:val="000000"/>
           </w:rPr>
-          <w:tag w:val="MENDELEY_CITATION_v3_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"/>
+          <w:tag w:val="MENDELEY_CITATION_v3_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"/>
           <w:id w:val="-770779530"/>
           <w:placeholder>
             <w:docPart w:val="DefaultPlaceholder_-1854013440"/>
@@ -11133,7 +11147,7 @@
           <w:rPr>
             <w:color w:val="000000"/>
           </w:rPr>
-          <w:tag w:val="MENDELEY_CITATION_v3_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"/>
+          <w:tag w:val="MENDELEY_CITATION_v3_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"/>
           <w:id w:val="368342075"/>
           <w:placeholder>
             <w:docPart w:val="DefaultPlaceholder_-1854013440"/>
@@ -11156,7 +11170,7 @@
       <w:pPr>
         <w:pStyle w:val="Ttulo3"/>
       </w:pPr>
-      <w:bookmarkStart w:id="37" w:name="_Toc208785263"/>
+      <w:bookmarkStart w:id="37" w:name="_Toc208863954"/>
       <w:r>
         <w:t xml:space="preserve">2.1.9. </w:t>
       </w:r>
@@ -11250,7 +11264,7 @@
       <w:pPr>
         <w:pStyle w:val="Ttulo3"/>
       </w:pPr>
-      <w:bookmarkStart w:id="38" w:name="_Toc208785264"/>
+      <w:bookmarkStart w:id="38" w:name="_Toc208863955"/>
       <w:r>
         <w:lastRenderedPageBreak/>
         <w:t xml:space="preserve">2.1.10. </w:t>
@@ -11295,7 +11309,7 @@
           <w:bCs/>
         </w:rPr>
       </w:pPr>
-      <w:bookmarkStart w:id="39" w:name="_Toc208785265"/>
+      <w:bookmarkStart w:id="39" w:name="_Toc208863956"/>
       <w:r>
         <w:t xml:space="preserve">2.2. </w:t>
       </w:r>
@@ -11311,7 +11325,7 @@
           <w:rFonts w:eastAsia="Times New Roman"/>
         </w:rPr>
       </w:pPr>
-      <w:bookmarkStart w:id="40" w:name="_Toc208785266"/>
+      <w:bookmarkStart w:id="40" w:name="_Toc208863957"/>
       <w:r>
         <w:rPr>
           <w:rFonts w:eastAsia="Times New Roman"/>
@@ -11397,7 +11411,7 @@
       <w:pPr>
         <w:pStyle w:val="Ttulo3"/>
       </w:pPr>
-      <w:bookmarkStart w:id="41" w:name="_Toc208785267"/>
+      <w:bookmarkStart w:id="41" w:name="_Toc208863958"/>
       <w:r>
         <w:lastRenderedPageBreak/>
         <w:t xml:space="preserve">2.2.2. </w:t>
@@ -11498,7 +11512,7 @@
       <w:pPr>
         <w:pStyle w:val="Ttulo3"/>
       </w:pPr>
-      <w:bookmarkStart w:id="42" w:name="_Toc208785268"/>
+      <w:bookmarkStart w:id="42" w:name="_Toc208863959"/>
       <w:r>
         <w:lastRenderedPageBreak/>
         <w:t>2.2.</w:t>
@@ -11599,7 +11613,7 @@
       <w:pPr>
         <w:pStyle w:val="Ttulo2"/>
       </w:pPr>
-      <w:bookmarkStart w:id="43" w:name="_Toc208785269"/>
+      <w:bookmarkStart w:id="43" w:name="_Toc208863960"/>
       <w:r>
         <w:t>2.3. Marco legal</w:t>
       </w:r>
@@ -11614,7 +11628,7 @@
       <w:pPr>
         <w:pStyle w:val="Ttulo3"/>
       </w:pPr>
-      <w:bookmarkStart w:id="44" w:name="_Toc208785270"/>
+      <w:bookmarkStart w:id="44" w:name="_Toc208863961"/>
       <w:r>
         <w:t xml:space="preserve">2.3.1. </w:t>
       </w:r>
@@ -11726,7 +11740,7 @@
       <w:pPr>
         <w:pStyle w:val="Ttulo3"/>
       </w:pPr>
-      <w:bookmarkStart w:id="45" w:name="_Toc208785271"/>
+      <w:bookmarkStart w:id="45" w:name="_Toc208863962"/>
       <w:r>
         <w:t xml:space="preserve">2.3.2. </w:t>
       </w:r>
@@ -11821,7 +11835,7 @@
       <w:pPr>
         <w:pStyle w:val="Ttulo3"/>
       </w:pPr>
-      <w:bookmarkStart w:id="46" w:name="_Toc208785272"/>
+      <w:bookmarkStart w:id="46" w:name="_Toc208863963"/>
       <w:r>
         <w:lastRenderedPageBreak/>
         <w:t xml:space="preserve">2.3.3. </w:t>
@@ -11904,7 +11918,7 @@
       <w:pPr>
         <w:pStyle w:val="Ttulo3"/>
       </w:pPr>
-      <w:bookmarkStart w:id="47" w:name="_Toc208785273"/>
+      <w:bookmarkStart w:id="47" w:name="_Toc208863964"/>
       <w:r>
         <w:t xml:space="preserve">2.3.4. </w:t>
       </w:r>
@@ -12056,7 +12070,7 @@
       <w:pPr>
         <w:pStyle w:val="Ttulo1"/>
       </w:pPr>
-      <w:bookmarkStart w:id="48" w:name="_Toc208785274"/>
+      <w:bookmarkStart w:id="48" w:name="_Toc208863965"/>
       <w:r>
         <w:t>CAPÍTULO III</w:t>
       </w:r>
@@ -12066,7 +12080,7 @@
       <w:pPr>
         <w:pStyle w:val="Ttulo1"/>
       </w:pPr>
-      <w:bookmarkStart w:id="49" w:name="_Toc208785275"/>
+      <w:bookmarkStart w:id="49" w:name="_Toc208863966"/>
       <w:r>
         <w:t>METODOLOGÍA DE LA INVESTIGACIÓN</w:t>
       </w:r>
@@ -12088,7 +12102,7 @@
       <w:pPr>
         <w:pStyle w:val="Ttulo2"/>
       </w:pPr>
-      <w:bookmarkStart w:id="50" w:name="_Toc208785276"/>
+      <w:bookmarkStart w:id="50" w:name="_Toc208863967"/>
       <w:r>
         <w:lastRenderedPageBreak/>
         <w:t>3.1. Localización</w:t>
@@ -12100,7 +12114,7 @@
       <w:pPr>
         <w:pStyle w:val="Ttulo2"/>
       </w:pPr>
-      <w:bookmarkStart w:id="51" w:name="_Toc208785277"/>
+      <w:bookmarkStart w:id="51" w:name="_Toc208863968"/>
       <w:r>
         <w:t xml:space="preserve">3.2. </w:t>
       </w:r>
@@ -12124,7 +12138,7 @@
       <w:pPr>
         <w:pStyle w:val="Ttulo3"/>
       </w:pPr>
-      <w:bookmarkStart w:id="52" w:name="_Toc208785278"/>
+      <w:bookmarkStart w:id="52" w:name="_Toc208863969"/>
       <w:r>
         <w:t xml:space="preserve">3.2.1. </w:t>
       </w:r>
@@ -12148,7 +12162,7 @@
       <w:pPr>
         <w:pStyle w:val="Ttulo3"/>
       </w:pPr>
-      <w:bookmarkStart w:id="53" w:name="_Toc208785279"/>
+      <w:bookmarkStart w:id="53" w:name="_Toc208863970"/>
       <w:r>
         <w:t xml:space="preserve">3.2.2. </w:t>
       </w:r>
@@ -12166,7 +12180,7 @@
       <w:pPr>
         <w:pStyle w:val="Ttulo2"/>
       </w:pPr>
-      <w:bookmarkStart w:id="54" w:name="_Toc208785280"/>
+      <w:bookmarkStart w:id="54" w:name="_Toc208863971"/>
       <w:r>
         <w:t>3.3.</w:t>
       </w:r>
@@ -12182,7 +12196,7 @@
       <w:pPr>
         <w:pStyle w:val="Ttulo3"/>
       </w:pPr>
-      <w:bookmarkStart w:id="55" w:name="_Toc208785281"/>
+      <w:bookmarkStart w:id="55" w:name="_Toc208863972"/>
       <w:r>
         <w:t xml:space="preserve">3.3.1. </w:t>
       </w:r>
@@ -12224,7 +12238,7 @@
       <w:pPr>
         <w:pStyle w:val="Ttulo3"/>
       </w:pPr>
-      <w:bookmarkStart w:id="56" w:name="_Toc208785282"/>
+      <w:bookmarkStart w:id="56" w:name="_Toc208863973"/>
       <w:r>
         <w:t xml:space="preserve">3.3.2. </w:t>
       </w:r>
@@ -12245,7 +12259,7 @@
       <w:pPr>
         <w:pStyle w:val="Ttulo2"/>
       </w:pPr>
-      <w:bookmarkStart w:id="57" w:name="_Toc208785283"/>
+      <w:bookmarkStart w:id="57" w:name="_Toc208863974"/>
       <w:r>
         <w:t xml:space="preserve">3.4. </w:t>
       </w:r>
@@ -12296,7 +12310,7 @@
       <w:pPr>
         <w:pStyle w:val="Ttulo2"/>
       </w:pPr>
-      <w:bookmarkStart w:id="58" w:name="_Toc208785284"/>
+      <w:bookmarkStart w:id="58" w:name="_Toc208863975"/>
       <w:r>
         <w:lastRenderedPageBreak/>
         <w:t xml:space="preserve">3.5. </w:t>
@@ -12310,7 +12324,7 @@
       <w:pPr>
         <w:pStyle w:val="Ttulo3"/>
       </w:pPr>
-      <w:bookmarkStart w:id="59" w:name="_Toc208785285"/>
+      <w:bookmarkStart w:id="59" w:name="_Toc208863976"/>
       <w:r>
         <w:t xml:space="preserve">3.5.1. </w:t>
       </w:r>
@@ -12328,7 +12342,7 @@
       <w:pPr>
         <w:pStyle w:val="Ttulo3"/>
       </w:pPr>
-      <w:bookmarkStart w:id="60" w:name="_Toc208785286"/>
+      <w:bookmarkStart w:id="60" w:name="_Toc208863977"/>
       <w:r>
         <w:t xml:space="preserve">3.5.2. </w:t>
       </w:r>
@@ -12347,7 +12361,7 @@
         <w:pStyle w:val="Ttulo3"/>
       </w:pPr>
       <w:bookmarkStart w:id="61" w:name="_Toc205489160"/>
-      <w:bookmarkStart w:id="62" w:name="_Toc208785287"/>
+      <w:bookmarkStart w:id="62" w:name="_Toc208863978"/>
       <w:r>
         <w:t>3.5.3. Participantes</w:t>
       </w:r>
@@ -12355,12 +12369,14 @@
       <w:bookmarkEnd w:id="62"/>
     </w:p>
     <w:p/>
+    <w:p/>
+    <w:p/>
     <w:p>
       <w:pPr>
         <w:pStyle w:val="Ttulo3"/>
       </w:pPr>
       <w:bookmarkStart w:id="63" w:name="_Toc205489161"/>
-      <w:bookmarkStart w:id="64" w:name="_Toc208785288"/>
+      <w:bookmarkStart w:id="64" w:name="_Toc208863979"/>
       <w:r>
         <w:t>3.</w:t>
       </w:r>
@@ -12406,12 +12422,16 @@
         <w:t xml:space="preserve"> Correspondiendo al segundo objetivo específico, esta fase traduce el modelo conceptual en un producto funcional: la aplicación web para la enseñanza de la trigonometría. El diseño se orienta a la implementación de una interfaz accesible y adaptativa que integre eficazmente la API de la inteligencia artificial generativa. Durante esta etapa, se realizan pruebas internas de funcionalidad y se verifica el cumplimiento de principios de usabilidad reconocidos, como las heurísticas de Nielsen, para asegurar que la herramienta ofrezca una experiencia de usuario óptima antes de su validación con los estudiantes.</w:t>
       </w:r>
     </w:p>
+    <w:p/>
+    <w:p/>
+    <w:p/>
     <w:p>
       <w:r>
         <w:rPr>
           <w:b/>
           <w:bCs/>
         </w:rPr>
+        <w:lastRenderedPageBreak/>
         <w:t>Fase III: Validación Empírica y Evaluación.</w:t>
       </w:r>
       <w:r>
@@ -12477,11 +12497,7 @@
         <w:t xml:space="preserve"> (PSSUQ), a una muestra de estudiantes de educación básica superior. El análisis de estos datos permite describir la experiencia del usuario y evaluar la efectividad del modelo cualitativo implementado. La</w:t>
       </w:r>
       <w:r>
-        <w:t xml:space="preserve"> retroalimentación obtenida es crucial para refinar la </w:t>
-      </w:r>
-      <w:r>
-        <w:lastRenderedPageBreak/>
-        <w:t>herramienta y validar la pertinencia de la solución tecnológica en un contexto de aprendizaje real.</w:t>
+        <w:t xml:space="preserve"> retroalimentación obtenida es crucial para refinar la herramienta y validar la pertinencia de la solución tecnológica en un contexto de aprendizaje real.</w:t>
       </w:r>
     </w:p>
     <w:p>
@@ -12499,7 +12515,7 @@
       <w:pPr>
         <w:pStyle w:val="Ttulo2"/>
       </w:pPr>
-      <w:bookmarkStart w:id="65" w:name="_Toc208785289"/>
+      <w:bookmarkStart w:id="65" w:name="_Toc208863980"/>
       <w:r>
         <w:t xml:space="preserve">3.6. </w:t>
       </w:r>
@@ -12675,7 +12691,7 @@
       <w:pPr>
         <w:pStyle w:val="Ttulo1"/>
       </w:pPr>
-      <w:bookmarkStart w:id="66" w:name="_Toc208785290"/>
+      <w:bookmarkStart w:id="66" w:name="_Toc208863981"/>
       <w:r>
         <w:t>CAPÍTULO IV</w:t>
       </w:r>
@@ -12685,7 +12701,7 @@
       <w:pPr>
         <w:pStyle w:val="Ttulo1"/>
       </w:pPr>
-      <w:bookmarkStart w:id="67" w:name="_Toc208785291"/>
+      <w:bookmarkStart w:id="67" w:name="_Toc208863982"/>
       <w:r>
         <w:t>RESULTADOS Y DISCUCIÓN</w:t>
       </w:r>
@@ -12711,7 +12727,7 @@
           <w:bCs/>
         </w:rPr>
       </w:pPr>
-      <w:bookmarkStart w:id="68" w:name="_Toc208785292"/>
+      <w:bookmarkStart w:id="68" w:name="_Toc208863983"/>
       <w:r>
         <w:rPr>
           <w:bCs/>
@@ -12761,7 +12777,7 @@
       <w:pPr>
         <w:pStyle w:val="Ttulo3"/>
       </w:pPr>
-      <w:bookmarkStart w:id="69" w:name="_Toc208785293"/>
+      <w:bookmarkStart w:id="69" w:name="_Toc208863984"/>
       <w:r>
         <w:t xml:space="preserve">4.1.1. </w:t>
       </w:r>
@@ -12794,8 +12810,8 @@
           <w:szCs w:val="24"/>
         </w:rPr>
       </w:pPr>
-      <w:bookmarkStart w:id="70" w:name="_Ref208760870"/>
-      <w:bookmarkStart w:id="71" w:name="_Toc208785322"/>
+      <w:bookmarkStart w:id="70" w:name="_Toc208785322"/>
+      <w:bookmarkStart w:id="71" w:name="_Ref208760870"/>
       <w:r>
         <w:rPr>
           <w:b/>
@@ -12881,7 +12897,7 @@
         </w:rPr>
         <w:fldChar w:fldCharType="end"/>
       </w:r>
-      <w:bookmarkEnd w:id="70"/>
+      <w:bookmarkEnd w:id="71"/>
       <w:r>
         <w:rPr>
           <w:b/>
@@ -12915,7 +12931,7 @@
         <w:br/>
         <w:t>Esbozo del modelo cualitativo.</w:t>
       </w:r>
-      <w:bookmarkEnd w:id="71"/>
+      <w:bookmarkEnd w:id="70"/>
     </w:p>
     <w:p>
       <w:pPr>
@@ -12926,10 +12942,10 @@
           <w:noProof/>
         </w:rPr>
         <w:drawing>
-          <wp:inline distT="0" distB="0" distL="0" distR="0" wp14:anchorId="26D509DF" wp14:editId="462ABAAD">
-            <wp:extent cx="4077336" cy="4320000"/>
-            <wp:effectExtent l="0" t="0" r="0" b="4445"/>
-            <wp:docPr id="2046897443" name="Imagen 3"/>
+          <wp:inline distT="0" distB="0" distL="0" distR="0" wp14:anchorId="044A890A" wp14:editId="48ADF780">
+            <wp:extent cx="4130543" cy="4680000"/>
+            <wp:effectExtent l="0" t="0" r="0" b="0"/>
+            <wp:docPr id="1137654329" name="Imagen 6"/>
             <wp:cNvGraphicFramePr>
               <a:graphicFrameLocks xmlns:a="http://schemas.openxmlformats.org/drawingml/2006/main" noChangeAspect="1"/>
             </wp:cNvGraphicFramePr>
@@ -12937,12 +12953,12 @@
               <a:graphicData uri="http://schemas.openxmlformats.org/drawingml/2006/picture">
                 <pic:pic xmlns:pic="http://schemas.openxmlformats.org/drawingml/2006/picture">
                   <pic:nvPicPr>
-                    <pic:cNvPr id="0" name="Picture 2"/>
+                    <pic:cNvPr id="0" name="Picture 3"/>
                     <pic:cNvPicPr>
                       <a:picLocks noChangeAspect="1" noChangeArrowheads="1"/>
                     </pic:cNvPicPr>
                   </pic:nvPicPr>
-                  <pic:blipFill rotWithShape="1">
+                  <pic:blipFill>
                     <a:blip r:embed="rId21">
                       <a:extLst>
                         <a:ext uri="{28A0092B-C50C-407E-A947-70E740481C1C}">
@@ -12950,7 +12966,7 @@
                         </a:ext>
                       </a:extLst>
                     </a:blip>
-                    <a:srcRect l="5545" t="3529" r="3342" b="4334"/>
+                    <a:srcRect/>
                     <a:stretch>
                       <a:fillRect/>
                     </a:stretch>
@@ -12958,7 +12974,7 @@
                   <pic:spPr bwMode="auto">
                     <a:xfrm>
                       <a:off x="0" y="0"/>
-                      <a:ext cx="4077336" cy="4320000"/>
+                      <a:ext cx="4130543" cy="4680000"/>
                     </a:xfrm>
                     <a:prstGeom prst="rect">
                       <a:avLst/>
@@ -12967,11 +12983,6 @@
                     <a:ln>
                       <a:noFill/>
                     </a:ln>
-                    <a:extLst>
-                      <a:ext uri="{53640926-AAD7-44D8-BBD7-CCE9431645EC}">
-                        <a14:shadowObscured xmlns:a14="http://schemas.microsoft.com/office/drawing/2010/main"/>
-                      </a:ext>
-                    </a:extLst>
                   </pic:spPr>
                 </pic:pic>
               </a:graphicData>
@@ -13009,11 +13020,6 @@
       </w:pPr>
     </w:p>
     <w:p>
-      <w:pPr>
-        <w:jc w:val="center"/>
-      </w:pPr>
-    </w:p>
-    <w:p>
       <w:r>
         <w:lastRenderedPageBreak/>
         <w:t>La concepción de este modelo se articuló sobre la síntesis de tres componentes fundamentales. En primer lugar, se definió que el modelo requería de una pedagogía adecuada para gobernar la estructura y la secuencia de la experiencia de aprendizaje del usuario</w:t>
@@ -13026,7 +13032,7 @@
           <w:rPr>
             <w:color w:val="000000"/>
           </w:rPr>
-          <w:tag w:val="MENDELEY_CITATION_v3_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"/>
+          <w:tag w:val="MENDELEY_CITATION_v3_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"/>
           <w:id w:val="-485862830"/>
           <w:placeholder>
             <w:docPart w:val="DefaultPlaceholder_-1854013440"/>
@@ -13060,7 +13066,7 @@
           <w:rPr>
             <w:color w:val="000000"/>
           </w:rPr>
-          <w:tag w:val="MENDELEY_CITATION_v3_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"/>
+          <w:tag w:val="MENDELEY_CITATION_v3_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"/>
           <w:id w:val="318009106"/>
           <w:placeholder>
             <w:docPart w:val="DefaultPlaceholder_-1854013440"/>
@@ -13080,11 +13086,53 @@
       </w:r>
     </w:p>
     <w:p>
+      <w:r>
+        <w:t>La arquitectura del modelo se representa visualmente mediante una codificación de colores que distingue los flujos lógicos y funcionales del sistema. Esta diferenciación cromática permite comprender cómo las distintas operaciones se organizan en rutas de datos independientes que, a su vez, convergen en componentes tecnológicos compartidos, garantizando un procesamiento ordenado y coherente de la información.</w:t>
+      </w:r>
+    </w:p>
+    <w:p>
+      <w:r>
+        <w:t xml:space="preserve">Los componentes en </w:t>
+      </w:r>
+      <w:r>
+        <w:t xml:space="preserve">amarillo, con su correspondiente </w:t>
+      </w:r>
+      <w:r>
+        <w:t>flujo en naranja</w:t>
+      </w:r>
+      <w:r>
+        <w:t>, representa el bucle de validación. Este circuito opera como un mecanismo de control inicial, cuya única finalidad es verificar la pertinencia de la consulta del usuario. La ruta, marcada por estos colores, gestiona exclusivamente la comunicación de bajo coste computacional destinada a filtrar las entradas antes de activar el proceso principal de generación de contenido.</w:t>
+      </w:r>
+    </w:p>
+    <w:p>
+      <w:r>
+        <w:t>Por otro lado, el flujo de color azul simboliza la ruta principal de generación de contenido. Este camino se activa únicamente después de que una consulta ha superado con éxito el filtro de validación. El color azul traza el recorrido de la instrucción pedagógica, desde su construcción programática hasta la recepción de la respuesta estructurada que contiene el material educativo.</w:t>
+      </w:r>
+    </w:p>
+    <w:p>
+      <w:r>
+        <w:t>Finalmente, los colores púrpura y verde identifican los componentes centrales y compartidos del sistema</w:t>
+      </w:r>
+      <w:r>
+        <w:t>,</w:t>
+      </w:r>
+      <w:r>
+        <w:t xml:space="preserve"> la Puerta de Enlace de API y el LLM, respectivamente. Su colorimetría distinta resalta su rol como el núcleo tecnológico al que acceden tanto el bucle de validación como el flujo principal de generación, actuando como el motor de inteligencia artificial que sirve a ambas operaciones. Las flechas negras, a su vez, indican el flujo estándar de interacción</w:t>
+      </w:r>
+      <w:r>
+        <w:t xml:space="preserve"> dentro del flujo</w:t>
+      </w:r>
+      <w:r>
+        <w:t>.</w:t>
+      </w:r>
+    </w:p>
+    <w:p>
       <w:pPr>
         <w:pStyle w:val="Ttulo3"/>
       </w:pPr>
-      <w:bookmarkStart w:id="72" w:name="_Toc208785294"/>
-      <w:r>
+      <w:bookmarkStart w:id="72" w:name="_Toc208863985"/>
+      <w:r>
+        <w:lastRenderedPageBreak/>
         <w:t>4.1.2. Arquitectura y componentes del modelo</w:t>
       </w:r>
       <w:bookmarkEnd w:id="72"/>
@@ -13115,13 +13163,13 @@
           <w:b/>
           <w:bCs/>
         </w:rPr>
+        <w:instrText xml:space="preserve"> \* MERGEFORMAT </w:instrText>
       </w:r>
       <w:r>
         <w:rPr>
           <w:b/>
           <w:bCs/>
         </w:rPr>
-        <w:instrText xml:space="preserve"> \* MERGEFORMAT </w:instrText>
       </w:r>
       <w:r>
         <w:rPr>
@@ -13163,8 +13211,6 @@
         <w:rPr>
           <w:b/>
           <w:bCs/>
-          <w:i/>
-          <w:iCs/>
         </w:rPr>
         <w:t>Figura</w:t>
       </w:r>
@@ -13172,8 +13218,6 @@
         <w:rPr>
           <w:b/>
           <w:bCs/>
-          <w:i/>
-          <w:iCs/>
         </w:rPr>
         <w:t xml:space="preserve"> </w:t>
       </w:r>
@@ -13195,11 +13239,16 @@
       </w:r>
     </w:p>
     <w:p>
-      <w:r>
-        <w:rPr>
-          <w:b/>
-          <w:bCs/>
-        </w:rPr>
+      <w:pPr>
+        <w:pStyle w:val="Ttulo4"/>
+      </w:pPr>
+      <w:r>
+        <w:t>4.1.2.</w:t>
+      </w:r>
+      <w:r>
+        <w:t xml:space="preserve">1. </w:t>
+      </w:r>
+      <w:r>
         <w:t>Punto de interacción: el usuario y la interfaz</w:t>
       </w:r>
     </w:p>
@@ -13236,72 +13285,140 @@
     </w:p>
     <w:p>
       <w:pPr>
+        <w:pStyle w:val="Ttulo4"/>
+      </w:pPr>
+      <w:r>
+        <w:t>4.1.2.</w:t>
+      </w:r>
+      <w:r>
+        <w:t>2</w:t>
+      </w:r>
+      <w:r>
+        <w:t>.</w:t>
+      </w:r>
+      <w:r>
+        <w:t xml:space="preserve"> </w:t>
+      </w:r>
+      <w:r>
+        <w:t xml:space="preserve">Mecanismo de </w:t>
+      </w:r>
+      <w:r>
+        <w:t>c</w:t>
+      </w:r>
+      <w:r>
+        <w:t xml:space="preserve">ontrol: El </w:t>
+      </w:r>
+      <w:r>
+        <w:t>b</w:t>
+      </w:r>
+      <w:r>
+        <w:t xml:space="preserve">ucle de </w:t>
+      </w:r>
+      <w:r>
+        <w:t>v</w:t>
+      </w:r>
+      <w:r>
+        <w:t>alidación</w:t>
+      </w:r>
+    </w:p>
+    <w:p>
+      <w:r>
+        <w:t>Para garantizar la integridad académica y la relevancia del contenido, el modelo implementa un mecanismo de control preventivo</w:t>
+      </w:r>
+      <w:r>
+        <w:t>, el</w:t>
+      </w:r>
+      <w:r>
+        <w:t xml:space="preserve"> bucle de validación</w:t>
+      </w:r>
+      <w:r>
+        <w:t xml:space="preserve"> visualizado en la </w:t>
+      </w:r>
+      <w:r>
+        <w:fldChar w:fldCharType="begin"/>
+      </w:r>
+      <w:r>
+        <w:instrText xml:space="preserve"> REF _Ref208864549 \h </w:instrText>
+      </w:r>
+      <w:r>
+        <w:fldChar w:fldCharType="separate"/>
+      </w:r>
+      <w:r>
         <w:rPr>
           <w:b/>
           <w:bCs/>
         </w:rPr>
-      </w:pPr>
+        <w:t>Figura</w:t>
+      </w:r>
       <w:r>
         <w:rPr>
           <w:b/>
           <w:bCs/>
         </w:rPr>
-        <w:t xml:space="preserve">Mecanismo de </w:t>
+        <w:t xml:space="preserve"> </w:t>
       </w:r>
       <w:r>
         <w:rPr>
           <w:b/>
           <w:bCs/>
-        </w:rPr>
-        <w:t>c</w:t>
-      </w:r>
-      <w:r>
-        <w:rPr>
-          <w:b/>
-          <w:bCs/>
-        </w:rPr>
-        <w:t xml:space="preserve">ontrol: El </w:t>
-      </w:r>
-      <w:r>
-        <w:rPr>
-          <w:b/>
-          <w:bCs/>
-        </w:rPr>
-        <w:t>b</w:t>
-      </w:r>
-      <w:r>
-        <w:rPr>
-          <w:b/>
-          <w:bCs/>
-        </w:rPr>
-        <w:t xml:space="preserve">ucle de </w:t>
-      </w:r>
-      <w:r>
-        <w:rPr>
-          <w:b/>
-          <w:bCs/>
-        </w:rPr>
-        <w:t>v</w:t>
-      </w:r>
-      <w:r>
-        <w:rPr>
-          <w:b/>
-          <w:bCs/>
-        </w:rPr>
-        <w:t>alidación</w:t>
-      </w:r>
-    </w:p>
-    <w:p>
-      <w:r>
-        <w:t>Para garantizar la integridad académica y la relevancia del contenido, el modelo implementa un mecanismo de control preventivo</w:t>
-      </w:r>
-      <w:r>
-        <w:t>, el</w:t>
-      </w:r>
-      <w:r>
-        <w:t xml:space="preserve"> bucle de validación. Este sistema actúa como un primer filtro inteligente, cuya función principal es asegurar que únicamente las consultas pertinentes al dominio temático establecido sean procesadas para la generación de contenido. </w:t>
-      </w:r>
-    </w:p>
+          <w:noProof/>
+        </w:rPr>
+        <w:t>2</w:t>
+      </w:r>
+      <w:r>
+        <w:fldChar w:fldCharType="end"/>
+      </w:r>
+      <w:r>
+        <w:t xml:space="preserve">. Este sistema actúa como un primer filtro inteligente, cuya función principal es asegurar que únicamente las consultas pertinentes al dominio temático establecido sean procesadas para la generación de contenido. </w:t>
+      </w:r>
+    </w:p>
+    <w:p>
+      <w:r>
+        <w:t xml:space="preserve">El proceso de validación inicia en el momento en que un usuario ingresa su consulta en la interfaz. En lugar de procesar directamente esta entrada, la consulta es interceptada por el generador de consulta de validación. Este componente especializado construye un </w:t>
+      </w:r>
+      <w:proofErr w:type="spellStart"/>
+      <w:r>
+        <w:t>prompt</w:t>
+      </w:r>
+      <w:proofErr w:type="spellEnd"/>
+      <w:r>
+        <w:t xml:space="preserve"> específico y de bajo coste computacional</w:t>
+      </w:r>
+      <w:r>
+        <w:t xml:space="preserve"> </w:t>
+      </w:r>
+      <w:sdt>
+        <w:sdtPr>
+          <w:rPr>
+            <w:color w:val="000000"/>
+          </w:rPr>
+          <w:tag w:val="MENDELEY_CITATION_v3_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"/>
+          <w:id w:val="-408626695"/>
+          <w:placeholder>
+            <w:docPart w:val="59E09FEC2F714AB5BD29990743C23B65"/>
+          </w:placeholder>
+        </w:sdtPr>
+        <w:sdtContent>
+          <w:r>
+            <w:rPr>
+              <w:color w:val="000000"/>
+            </w:rPr>
+            <w:t>[40]</w:t>
+          </w:r>
+        </w:sdtContent>
+      </w:sdt>
+      <w:r>
+        <w:t>, diseñado con la única finalidad de interrogar al LLM sobre la pertinencia del tópico propuesto. Esta consulta focalizada se envía a través de</w:t>
+      </w:r>
+      <w:r>
+        <w:t xml:space="preserve"> la puerta de enlace de API </w:t>
+      </w:r>
+      <w:r>
+        <w:t>hacia el LLM, el cual devuelve una respuesta estructurada con un indicador claro sobre la relevancia del tema.</w:t>
+      </w:r>
+    </w:p>
+    <w:p/>
+    <w:p/>
     <w:p>
       <w:pPr>
         <w:pStyle w:val="Descripcin"/>
@@ -13314,6 +13431,7 @@
         </w:rPr>
       </w:pPr>
       <w:bookmarkStart w:id="73" w:name="_Toc208785323"/>
+      <w:bookmarkStart w:id="74" w:name="_Ref208864549"/>
       <w:r>
         <w:rPr>
           <w:b/>
@@ -13386,6 +13504,7 @@
         </w:rPr>
         <w:fldChar w:fldCharType="end"/>
       </w:r>
+      <w:bookmarkEnd w:id="74"/>
       <w:r>
         <w:rPr>
           <w:b/>
@@ -13425,10 +13544,10 @@
           <w:noProof/>
         </w:rPr>
         <w:drawing>
-          <wp:inline distT="0" distB="0" distL="0" distR="0" wp14:anchorId="779D325A" wp14:editId="1CEC7DD7">
-            <wp:extent cx="3293567" cy="2880000"/>
+          <wp:inline distT="0" distB="0" distL="0" distR="0" wp14:anchorId="6E87854D" wp14:editId="7431F582">
+            <wp:extent cx="4209897" cy="4680000"/>
             <wp:effectExtent l="0" t="0" r="0" b="0"/>
-            <wp:docPr id="449054870" name="Imagen 4"/>
+            <wp:docPr id="688950802" name="Imagen 7"/>
             <wp:cNvGraphicFramePr>
               <a:graphicFrameLocks xmlns:a="http://schemas.openxmlformats.org/drawingml/2006/main" noChangeAspect="1"/>
             </wp:cNvGraphicFramePr>
@@ -13436,7 +13555,7 @@
               <a:graphicData uri="http://schemas.openxmlformats.org/drawingml/2006/picture">
                 <pic:pic xmlns:pic="http://schemas.openxmlformats.org/drawingml/2006/picture">
                   <pic:nvPicPr>
-                    <pic:cNvPr id="0" name="Picture 3"/>
+                    <pic:cNvPr id="0" name="Picture 4"/>
                     <pic:cNvPicPr>
                       <a:picLocks noChangeAspect="1" noChangeArrowheads="1"/>
                     </pic:cNvPicPr>
@@ -13457,7 +13576,7 @@
                   <pic:spPr bwMode="auto">
                     <a:xfrm>
                       <a:off x="0" y="0"/>
-                      <a:ext cx="3293567" cy="2880000"/>
+                      <a:ext cx="4209897" cy="4680000"/>
                     </a:xfrm>
                     <a:prstGeom prst="rect">
                       <a:avLst/>
@@ -13499,15 +13618,13 @@
     </w:p>
     <w:p>
       <w:r>
-        <w:t xml:space="preserve">El proceso de validación inicia en el momento en que un usuario ingresa su consulta en la interfaz. En lugar de procesar directamente esta entrada, la consulta es interceptada por el generador de consulta de validación. Este componente especializado construye un </w:t>
-      </w:r>
-      <w:proofErr w:type="spellStart"/>
-      <w:r>
-        <w:t>prompt</w:t>
-      </w:r>
-      <w:proofErr w:type="spellEnd"/>
-      <w:r>
-        <w:t xml:space="preserve"> específico y de bajo coste computacional</w:t>
+        <w:t xml:space="preserve">Dicha respuesta es recibida por el filtro de relevancia, que actúa como el núcleo lógico del bucle. Su función es interpretar de manera programática la respuesta del </w:t>
+      </w:r>
+      <w:r>
+        <w:t xml:space="preserve">LLM </w:t>
+      </w:r>
+      <w:r>
+        <w:t>y ejecutar la bifurcación del flujo de manera determinista. Si la respuesta confirma la pertinencia del tema, el filtro autoriza el paso a la siguiente fase del modelo. En caso contrario, el flujo se desvía hacia el motor de sugerencias, componente que se activa para proporcionar al usuario una retroalimentación constructiva y proponerle temas alternativos, funcionando como un andamio conversacional que lo guía de vuelta al dominio temático establecido</w:t>
       </w:r>
       <w:r>
         <w:t xml:space="preserve"> </w:t>
@@ -13517,58 +13634,7 @@
           <w:rPr>
             <w:color w:val="000000"/>
           </w:rPr>
-          <w:tag w:val="MENDELEY_CITATION_v3_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"/>
-          <w:id w:val="-408626695"/>
-          <w:placeholder>
-            <w:docPart w:val="DefaultPlaceholder_-1854013440"/>
-          </w:placeholder>
-        </w:sdtPr>
-        <w:sdtContent>
-          <w:r>
-            <w:rPr>
-              <w:color w:val="000000"/>
-            </w:rPr>
-            <w:t>[40]</w:t>
-          </w:r>
-        </w:sdtContent>
-      </w:sdt>
-      <w:r>
-        <w:t xml:space="preserve">, diseñado con la única finalidad de interrogar al LLM sobre la pertinencia del tópico propuesto. Esta consulta focalizada se envía a través del api </w:t>
-      </w:r>
-      <w:proofErr w:type="spellStart"/>
-      <w:r>
-        <w:t>gateway</w:t>
-      </w:r>
-      <w:proofErr w:type="spellEnd"/>
-      <w:r>
-        <w:t xml:space="preserve"> hacia el </w:t>
-      </w:r>
-      <w:r>
-        <w:t>LLM</w:t>
-      </w:r>
-      <w:r>
-        <w:t>, el cual devuelve una respuesta estructurada con un indicador claro sobre la relevancia del tema.</w:t>
-      </w:r>
-    </w:p>
-    <w:p>
-      <w:r>
-        <w:t xml:space="preserve">Dicha respuesta es recibida por el filtro de relevancia, que actúa como el núcleo lógico del bucle. Su función es interpretar de manera programática la respuesta del </w:t>
-      </w:r>
-      <w:r>
-        <w:t xml:space="preserve">LLM </w:t>
-      </w:r>
-      <w:r>
-        <w:t>y ejecutar la bifurcación del flujo de manera determinista. Si la respuesta confirma la pertinencia del tema, el filtro autoriza el paso a la siguiente fase del modelo. En caso contrario, el flujo se desvía hacia el motor de sugerencias, componente que se activa para proporcionar al usuario una retroalimentación constructiva y proponerle temas alternativos, funcionando como un andamio conversacional que lo guía de vuelta al dominio temático establecido</w:t>
-      </w:r>
-      <w:r>
-        <w:t xml:space="preserve"> </w:t>
-      </w:r>
-      <w:sdt>
-        <w:sdtPr>
-          <w:rPr>
-            <w:color w:val="000000"/>
-          </w:rPr>
-          <w:tag w:val="MENDELEY_CITATION_v3_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"/>
+          <w:tag w:val="MENDELEY_CITATION_v3_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"/>
           <w:id w:val="-1201940869"/>
           <w:placeholder>
             <w:docPart w:val="DefaultPlaceholder_-1854013440"/>
@@ -13589,42 +13655,95 @@
     </w:p>
     <w:p/>
     <w:p/>
-    <w:p/>
-    <w:p>
+    <w:p>
+      <w:pPr>
+        <w:pStyle w:val="Ttulo4"/>
+      </w:pPr>
+      <w:r>
+        <w:lastRenderedPageBreak/>
+        <w:t>4.1.2.</w:t>
+      </w:r>
+      <w:r>
+        <w:t>3</w:t>
+      </w:r>
+      <w:r>
+        <w:t>.</w:t>
+      </w:r>
+      <w:r>
+        <w:t xml:space="preserve"> </w:t>
+      </w:r>
+      <w:r>
+        <w:t xml:space="preserve">Núcleo de Generación: La </w:t>
+      </w:r>
+      <w:r>
+        <w:t>i</w:t>
+      </w:r>
+      <w:r>
+        <w:t>nteracción con la IA</w:t>
+      </w:r>
+    </w:p>
+    <w:p>
+      <w:r>
+        <w:t xml:space="preserve">Una vez superada la fase de validación, el flujo de interacción avanza hacia el núcleo de generación, cuyo componente central es el constructor de </w:t>
+      </w:r>
+      <w:proofErr w:type="spellStart"/>
+      <w:r>
+        <w:t>prompt</w:t>
+      </w:r>
+      <w:proofErr w:type="spellEnd"/>
+      <w:r>
+        <w:t xml:space="preserve"> que se visualiza en la </w:t>
+      </w:r>
+      <w:r>
+        <w:fldChar w:fldCharType="begin"/>
+      </w:r>
+      <w:r>
+        <w:instrText xml:space="preserve"> REF _Ref208864938 \h </w:instrText>
+      </w:r>
+      <w:r>
+        <w:fldChar w:fldCharType="separate"/>
+      </w:r>
       <w:r>
         <w:rPr>
           <w:b/>
           <w:bCs/>
         </w:rPr>
-        <w:lastRenderedPageBreak/>
-        <w:t xml:space="preserve">Núcleo de Generación: La </w:t>
+        <w:t>Figura</w:t>
       </w:r>
       <w:r>
         <w:rPr>
           <w:b/>
           <w:bCs/>
         </w:rPr>
-        <w:t>i</w:t>
+        <w:t xml:space="preserve"> </w:t>
       </w:r>
       <w:r>
         <w:rPr>
           <w:b/>
           <w:bCs/>
-        </w:rPr>
-        <w:t>nteracción con la IA</w:t>
-      </w:r>
-    </w:p>
-    <w:p>
-      <w:r>
-        <w:t xml:space="preserve">Una vez superada la fase de validación, el flujo de interacción avanza hacia el núcleo de generación, cuyo componente central es el constructor de </w:t>
-      </w:r>
-      <w:proofErr w:type="spellStart"/>
-      <w:r>
-        <w:t>prompt</w:t>
-      </w:r>
-      <w:proofErr w:type="spellEnd"/>
-      <w:r>
-        <w:t xml:space="preserve">. El diseño de este núcleo parte de una premisa fundamental: la consulta directa de un usuario en lenguaje natural es insuficiente para garantizar un resultado pedagógicamente válido y estructuralmente consistente. Para mitigar riesgos como el sesgo algorítmico y la generación de contenido irrelevante, el modelo interpone este componente como un traductor programático entre la intención validada del estudiante y la capacidad creativa del </w:t>
+          <w:i/>
+          <w:iCs/>
+          <w:noProof/>
+        </w:rPr>
+        <w:t>3</w:t>
+      </w:r>
+      <w:r>
+        <w:fldChar w:fldCharType="end"/>
+      </w:r>
+      <w:r>
+        <w:t>. El diseño de este núcleo parte de</w:t>
+      </w:r>
+      <w:r>
+        <w:t xml:space="preserve"> la</w:t>
+      </w:r>
+      <w:r>
+        <w:t xml:space="preserve"> premisa fundamental </w:t>
+      </w:r>
+      <w:r>
+        <w:t xml:space="preserve">de que </w:t>
+      </w:r>
+      <w:r>
+        <w:t xml:space="preserve">la consulta directa de un usuario en lenguaje natural es insuficiente para garantizar un resultado pedagógicamente válido y estructuralmente consistente. Para mitigar riesgos como el sesgo algorítmico y la generación de contenido irrelevante, el modelo interpone este componente como un traductor programático entre la intención validada del estudiante y la capacidad creativa del </w:t>
       </w:r>
       <w:r>
         <w:t>LLM</w:t>
@@ -13646,7 +13765,8 @@
           <w:szCs w:val="24"/>
         </w:rPr>
       </w:pPr>
-      <w:bookmarkStart w:id="74" w:name="_Toc208785324"/>
+      <w:bookmarkStart w:id="75" w:name="_Toc208785324"/>
+      <w:bookmarkStart w:id="76" w:name="_Ref208864938"/>
       <w:r>
         <w:rPr>
           <w:b/>
@@ -13732,6 +13852,7 @@
         </w:rPr>
         <w:fldChar w:fldCharType="end"/>
       </w:r>
+      <w:bookmarkEnd w:id="76"/>
       <w:r>
         <w:rPr>
           <w:b/>
@@ -13766,7 +13887,7 @@
         </w:rPr>
         <w:t>Núcleo de Generación.</w:t>
       </w:r>
-      <w:bookmarkEnd w:id="74"/>
+      <w:bookmarkEnd w:id="75"/>
     </w:p>
     <w:p>
       <w:pPr>
@@ -13777,10 +13898,10 @@
           <w:noProof/>
         </w:rPr>
         <w:drawing>
-          <wp:inline distT="0" distB="0" distL="0" distR="0" wp14:anchorId="60AF49DB" wp14:editId="53A529AC">
-            <wp:extent cx="5040000" cy="2702593"/>
+          <wp:inline distT="0" distB="0" distL="0" distR="0" wp14:anchorId="3889E61E" wp14:editId="05BA7C6F">
+            <wp:extent cx="5040000" cy="2542400"/>
             <wp:effectExtent l="0" t="0" r="0" b="0"/>
-            <wp:docPr id="1442338073" name="Imagen 5"/>
+            <wp:docPr id="336930120" name="Imagen 8"/>
             <wp:cNvGraphicFramePr>
               <a:graphicFrameLocks xmlns:a="http://schemas.openxmlformats.org/drawingml/2006/main" noChangeAspect="1"/>
             </wp:cNvGraphicFramePr>
@@ -13788,13 +13909,13 @@
               <a:graphicData uri="http://schemas.openxmlformats.org/drawingml/2006/picture">
                 <pic:pic xmlns:pic="http://schemas.openxmlformats.org/drawingml/2006/picture">
                   <pic:nvPicPr>
-                    <pic:cNvPr id="0" name="Picture 4"/>
+                    <pic:cNvPr id="0" name="Picture 5"/>
                     <pic:cNvPicPr>
                       <a:picLocks noChangeAspect="1" noChangeArrowheads="1"/>
                     </pic:cNvPicPr>
                   </pic:nvPicPr>
                   <pic:blipFill>
-                    <a:blip r:embed="rId23">
+                    <a:blip r:embed="rId23" cstate="print">
                       <a:extLst>
                         <a:ext uri="{28A0092B-C50C-407E-A947-70E740481C1C}">
                           <a14:useLocalDpi xmlns:a14="http://schemas.microsoft.com/office/drawing/2010/main" val="0"/>
@@ -13809,7 +13930,7 @@
                   <pic:spPr bwMode="auto">
                     <a:xfrm>
                       <a:off x="0" y="0"/>
-                      <a:ext cx="5040000" cy="2702593"/>
+                      <a:ext cx="5040000" cy="2542400"/>
                     </a:xfrm>
                     <a:prstGeom prst="rect">
                       <a:avLst/>
@@ -13851,7 +13972,7 @@
     </w:p>
     <w:p>
       <w:r>
-        <w:t xml:space="preserve">Aquí es donde se materializa la ingeniería de </w:t>
+        <w:t xml:space="preserve">Es en este componente donde se materializa la ingeniería de </w:t>
       </w:r>
       <w:proofErr w:type="spellStart"/>
       <w:r>
@@ -13859,7 +13980,21 @@
       </w:r>
       <w:proofErr w:type="spellEnd"/>
       <w:r>
-        <w:t xml:space="preserve"> como disciplina central del modelo. La tarea del constructor no es simplemente reenviar el tema del usuario, sino inyectarlo dentro de una plantilla de instrucción robusta y predefinida. Esta plantilla, diseñada con base en las necesidades pedagógicas de la herramienta, es la responsable de dictar las reglas, el formato y el contenido deseado. Es en este componente donde se personaliza el tipo de enseñanza, definiendo el tono del tutor, la estructura de la lección y, de manera crítica, el esquema exacto de la respuesta estructurada que se espera del modelo.</w:t>
+        <w:t xml:space="preserve"> como la disciplina central del modelo, transformando la intención pedagógica en una instrucción ejecutable por la inteligencia artificial. La tarea del constructor de </w:t>
+      </w:r>
+      <w:proofErr w:type="spellStart"/>
+      <w:r>
+        <w:t>prompts</w:t>
+      </w:r>
+      <w:proofErr w:type="spellEnd"/>
+      <w:r>
+        <w:t xml:space="preserve"> va más allá de simplemente reenviar el tema validado por el usuario</w:t>
+      </w:r>
+      <w:r>
+        <w:t>,</w:t>
+      </w:r>
+      <w:r>
+        <w:t xml:space="preserve"> su función es inyectar dicho tema dentro de una plantilla de instrucción robusta y predefinida. Esta plantilla es el núcleo donde se codifica la estrategia pedagógica completa, dictando con precisión las reglas, el formato y, fundamentalmente, la estructura didáctica del contenido que se desea generar.</w:t>
       </w:r>
     </w:p>
     <w:p/>
@@ -13867,29 +14002,377 @@
     <w:p>
       <w:r>
         <w:lastRenderedPageBreak/>
-        <w:t xml:space="preserve">Una vez ensamblada esta instrucción programática y detallada, se envía a través del api </w:t>
+        <w:t xml:space="preserve">A través del </w:t>
       </w:r>
       <w:proofErr w:type="spellStart"/>
       <w:r>
-        <w:t>gateway</w:t>
+        <w:t>prompt</w:t>
       </w:r>
       <w:proofErr w:type="spellEnd"/>
       <w:r>
-        <w:t xml:space="preserve">. Este actúa como el puente de comunicación estandarizado que, como define la teoría, permite diseñar e integrar el software de las aplicaciones, conectando la lógica del modelo con el servicio externo. Finalmente, la instrucción llega al </w:t>
-      </w:r>
-      <w:r>
-        <w:t>LLM</w:t>
-      </w:r>
-      <w:r>
-        <w:t>, el motor de inteligencia artificial generativa, que ahora tiene la tarea de producir el contenido solicitado, no a partir de una pregunta ambigua, sino de un conjunto de directrices claras y precisas.</w:t>
-      </w:r>
-    </w:p>
-    <w:p>
+        <w:t>, se</w:t>
+      </w:r>
+      <w:r>
+        <w:t xml:space="preserve"> controla</w:t>
+      </w:r>
+      <w:r>
+        <w:t xml:space="preserve"> la forma en que se presentará el conocimiento. Se define el rol que debe adoptar la IA</w:t>
+      </w:r>
+      <w:r>
+        <w:t xml:space="preserve"> </w:t>
+      </w:r>
+      <w:r>
+        <w:t xml:space="preserve">y se establece el marco didáctico que debe seguir cada lección. Esto asegura que el contenido se organice de una manera lógica y progresiva, diseñada para ser funcional y facilitar una auténtica asimilación del conocimiento por parte del usuario. De esta manera, el </w:t>
+      </w:r>
+      <w:proofErr w:type="spellStart"/>
+      <w:r>
+        <w:t>prompt</w:t>
+      </w:r>
+      <w:proofErr w:type="spellEnd"/>
+      <w:r>
+        <w:t xml:space="preserve"> garantiza que, sin importar el tema, el contenido generado sea siempre coherente y siga un camino de aprendizaje eficaz.</w:t>
+      </w:r>
+    </w:p>
+    <w:p>
+      <w:r>
+        <w:t xml:space="preserve">Además, </w:t>
+      </w:r>
+      <w:r>
+        <w:t xml:space="preserve">el modelo </w:t>
+      </w:r>
+      <w:r>
+        <w:t>está</w:t>
+      </w:r>
+      <w:r>
+        <w:t xml:space="preserve"> diseñado para</w:t>
+      </w:r>
+      <w:r>
+        <w:t xml:space="preserve"> para ser dinámic</w:t>
+      </w:r>
+      <w:r>
+        <w:t>o</w:t>
+      </w:r>
+      <w:r>
+        <w:t xml:space="preserve"> y adaptativ</w:t>
+      </w:r>
+      <w:r>
+        <w:t>o</w:t>
+      </w:r>
+      <w:r>
+        <w:t xml:space="preserve">. Dependiendo de la naturaleza del tema tratado, el </w:t>
+      </w:r>
+      <w:proofErr w:type="spellStart"/>
+      <w:r>
+        <w:t>prompt</w:t>
+      </w:r>
+      <w:proofErr w:type="spellEnd"/>
+      <w:r>
+        <w:t xml:space="preserve"> se puede enriquecer para solicitar elementos específicos. Para tópicos de índole conceptual, la instrucción se enfocará en generar explicaciones teóricas. En cambio, para temas de carácter procedimental o aplicado, el </w:t>
+      </w:r>
+      <w:proofErr w:type="spellStart"/>
+      <w:r>
+        <w:t>prompt</w:t>
+      </w:r>
+      <w:proofErr w:type="spellEnd"/>
+      <w:r>
+        <w:t xml:space="preserve"> se estructura no solo para solicitar la teoría, sino también para demandar la creación de ejercicios de práctica, especificando que estos deben incluir mecanismos de evaluación y retroalimentación detallada. Es en este componente donde se personaliza el tipo de enseñanza y, de manera crítica, se exige un esquema de respuesta predefinido que se espera del modelo, garantizando así la fiabilidad y consistencia del sistema</w:t>
+      </w:r>
+      <w:r>
+        <w:t xml:space="preserve"> </w:t>
+      </w:r>
+      <w:sdt>
+        <w:sdtPr>
+          <w:rPr>
+            <w:color w:val="000000"/>
+          </w:rPr>
+          <w:tag w:val="MENDELEY_CITATION_v3_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"/>
+          <w:id w:val="-594930195"/>
+          <w:placeholder>
+            <w:docPart w:val="DefaultPlaceholder_-1854013440"/>
+          </w:placeholder>
+        </w:sdtPr>
+        <w:sdtContent>
+          <w:r>
+            <w:rPr>
+              <w:color w:val="000000"/>
+            </w:rPr>
+            <w:t>[42]</w:t>
+          </w:r>
+        </w:sdtContent>
+      </w:sdt>
+      <w:r>
+        <w:t>.</w:t>
+      </w:r>
+    </w:p>
+    <w:p>
+      <w:pPr>
+        <w:pStyle w:val="Descripcin"/>
+        <w:keepNext/>
+        <w:jc w:val="center"/>
+        <w:rPr>
+          <w:i w:val="0"/>
+          <w:iCs w:val="0"/>
+          <w:color w:val="auto"/>
+          <w:sz w:val="24"/>
+          <w:szCs w:val="24"/>
+        </w:rPr>
+      </w:pPr>
       <w:r>
         <w:rPr>
           <w:b/>
           <w:bCs/>
-        </w:rPr>
+          <w:i w:val="0"/>
+          <w:iCs w:val="0"/>
+          <w:color w:val="auto"/>
+          <w:sz w:val="24"/>
+          <w:szCs w:val="24"/>
+        </w:rPr>
+        <w:t xml:space="preserve">Ilustración </w:t>
+      </w:r>
+      <w:r>
+        <w:rPr>
+          <w:b/>
+          <w:bCs/>
+          <w:i w:val="0"/>
+          <w:iCs w:val="0"/>
+          <w:color w:val="auto"/>
+          <w:sz w:val="24"/>
+          <w:szCs w:val="24"/>
+        </w:rPr>
+        <w:fldChar w:fldCharType="begin"/>
+      </w:r>
+      <w:r>
+        <w:rPr>
+          <w:b/>
+          <w:bCs/>
+          <w:i w:val="0"/>
+          <w:iCs w:val="0"/>
+          <w:color w:val="auto"/>
+          <w:sz w:val="24"/>
+          <w:szCs w:val="24"/>
+        </w:rPr>
+        <w:instrText xml:space="preserve"> SEQ Ilustración \* ARABIC </w:instrText>
+      </w:r>
+      <w:r>
+        <w:rPr>
+          <w:b/>
+          <w:bCs/>
+          <w:i w:val="0"/>
+          <w:iCs w:val="0"/>
+          <w:color w:val="auto"/>
+          <w:sz w:val="24"/>
+          <w:szCs w:val="24"/>
+        </w:rPr>
+        <w:fldChar w:fldCharType="separate"/>
+      </w:r>
+      <w:r>
+        <w:rPr>
+          <w:b/>
+          <w:bCs/>
+          <w:i w:val="0"/>
+          <w:iCs w:val="0"/>
+          <w:noProof/>
+          <w:color w:val="auto"/>
+          <w:sz w:val="24"/>
+          <w:szCs w:val="24"/>
+        </w:rPr>
+        <w:t>4</w:t>
+      </w:r>
+      <w:r>
+        <w:rPr>
+          <w:b/>
+          <w:bCs/>
+          <w:i w:val="0"/>
+          <w:iCs w:val="0"/>
+          <w:color w:val="auto"/>
+          <w:sz w:val="24"/>
+          <w:szCs w:val="24"/>
+        </w:rPr>
+        <w:fldChar w:fldCharType="end"/>
+      </w:r>
+      <w:r>
+        <w:rPr>
+          <w:b/>
+          <w:bCs/>
+          <w:i w:val="0"/>
+          <w:iCs w:val="0"/>
+          <w:color w:val="auto"/>
+          <w:sz w:val="24"/>
+          <w:szCs w:val="24"/>
+        </w:rPr>
+        <w:t xml:space="preserve">. </w:t>
+      </w:r>
+      <w:r>
+        <w:rPr>
+          <w:b/>
+          <w:bCs/>
+          <w:i w:val="0"/>
+          <w:iCs w:val="0"/>
+          <w:color w:val="auto"/>
+          <w:sz w:val="24"/>
+          <w:szCs w:val="24"/>
+        </w:rPr>
+        <w:br/>
+      </w:r>
+      <w:r>
+        <w:rPr>
+          <w:i w:val="0"/>
+          <w:iCs w:val="0"/>
+          <w:color w:val="auto"/>
+          <w:sz w:val="24"/>
+          <w:szCs w:val="24"/>
+        </w:rPr>
+        <w:t xml:space="preserve">Constructor de </w:t>
+      </w:r>
+      <w:proofErr w:type="spellStart"/>
+      <w:r>
+        <w:rPr>
+          <w:i w:val="0"/>
+          <w:iCs w:val="0"/>
+          <w:color w:val="auto"/>
+          <w:sz w:val="24"/>
+          <w:szCs w:val="24"/>
+        </w:rPr>
+        <w:t>prompt</w:t>
+      </w:r>
+      <w:proofErr w:type="spellEnd"/>
+      <w:r>
+        <w:rPr>
+          <w:i w:val="0"/>
+          <w:iCs w:val="0"/>
+          <w:color w:val="auto"/>
+          <w:sz w:val="24"/>
+          <w:szCs w:val="24"/>
+        </w:rPr>
+        <w:t>.</w:t>
+      </w:r>
+    </w:p>
+    <w:p>
+      <w:pPr>
+        <w:jc w:val="center"/>
+      </w:pPr>
+      <w:r>
+        <w:rPr>
+          <w:noProof/>
+        </w:rPr>
+        <w:drawing>
+          <wp:inline distT="0" distB="0" distL="0" distR="0" wp14:anchorId="1C41007C" wp14:editId="0F02FB91">
+            <wp:extent cx="5040000" cy="2094218"/>
+            <wp:effectExtent l="0" t="0" r="0" b="0"/>
+            <wp:docPr id="433362380" name="Imagen 10"/>
+            <wp:cNvGraphicFramePr>
+              <a:graphicFrameLocks xmlns:a="http://schemas.openxmlformats.org/drawingml/2006/main" noChangeAspect="1"/>
+            </wp:cNvGraphicFramePr>
+            <a:graphic xmlns:a="http://schemas.openxmlformats.org/drawingml/2006/main">
+              <a:graphicData uri="http://schemas.openxmlformats.org/drawingml/2006/picture">
+                <pic:pic xmlns:pic="http://schemas.openxmlformats.org/drawingml/2006/picture">
+                  <pic:nvPicPr>
+                    <pic:cNvPr id="0" name="Picture 7"/>
+                    <pic:cNvPicPr>
+                      <a:picLocks noChangeAspect="1" noChangeArrowheads="1"/>
+                    </pic:cNvPicPr>
+                  </pic:nvPicPr>
+                  <pic:blipFill>
+                    <a:blip r:embed="rId24" cstate="print">
+                      <a:extLst>
+                        <a:ext uri="{28A0092B-C50C-407E-A947-70E740481C1C}">
+                          <a14:useLocalDpi xmlns:a14="http://schemas.microsoft.com/office/drawing/2010/main" val="0"/>
+                        </a:ext>
+                      </a:extLst>
+                    </a:blip>
+                    <a:srcRect/>
+                    <a:stretch>
+                      <a:fillRect/>
+                    </a:stretch>
+                  </pic:blipFill>
+                  <pic:spPr bwMode="auto">
+                    <a:xfrm>
+                      <a:off x="0" y="0"/>
+                      <a:ext cx="5040000" cy="2094218"/>
+                    </a:xfrm>
+                    <a:prstGeom prst="rect">
+                      <a:avLst/>
+                    </a:prstGeom>
+                    <a:noFill/>
+                    <a:ln>
+                      <a:noFill/>
+                    </a:ln>
+                  </pic:spPr>
+                </pic:pic>
+              </a:graphicData>
+            </a:graphic>
+          </wp:inline>
+        </w:drawing>
+      </w:r>
+    </w:p>
+    <w:p>
+      <w:pPr>
+        <w:tabs>
+          <w:tab w:val="left" w:pos="6300"/>
+        </w:tabs>
+        <w:spacing w:before="240"/>
+        <w:rPr>
+          <w:i/>
+          <w:iCs/>
+        </w:rPr>
+      </w:pPr>
+      <w:r>
+        <w:rPr>
+          <w:i/>
+          <w:iCs/>
+        </w:rPr>
+        <w:t xml:space="preserve">Elaborado por: </w:t>
+      </w:r>
+      <w:r>
+        <w:rPr>
+          <w:i/>
+          <w:iCs/>
+        </w:rPr>
+        <w:t>Miyako Morales</w:t>
+      </w:r>
+      <w:r>
+        <w:rPr>
+          <w:i/>
+          <w:iCs/>
+        </w:rPr>
+        <w:tab/>
+      </w:r>
+    </w:p>
+    <w:p>
+      <w:r>
+        <w:t>Una vez ensamblada esta instrucción programática y detallada, se envía a través de</w:t>
+      </w:r>
+      <w:r>
+        <w:t xml:space="preserve"> la puerta de enlace de API</w:t>
+      </w:r>
+      <w:r>
+        <w:t xml:space="preserve">. Este actúa como el puente de comunicación estandarizado que, como define la teoría, permite diseñar e integrar el software de las aplicaciones, conectando la lógica del modelo con el servicio externo. Finalmente, la instrucción llega al </w:t>
+      </w:r>
+      <w:r>
+        <w:t>LLM</w:t>
+      </w:r>
+      <w:r>
+        <w:t>, el motor de inteligencia artificial generativa, que tiene la tarea de producir el contenido solicitado, no a partir de una pregunta ambigua, sino de un conjunto de directrices claras y precisas.</w:t>
+      </w:r>
+    </w:p>
+    <w:p>
+      <w:pPr>
+        <w:pStyle w:val="Ttulo4"/>
+      </w:pPr>
+      <w:r>
+        <w:lastRenderedPageBreak/>
+        <w:t>4.1.2.</w:t>
+      </w:r>
+      <w:r>
+        <w:t>5</w:t>
+      </w:r>
+      <w:r>
+        <w:t>.</w:t>
+      </w:r>
+      <w:r>
+        <w:t xml:space="preserve"> </w:t>
+      </w:r>
+      <w:r>
         <w:t>Procesamiento de Salida: La Presentación del Contenido</w:t>
       </w:r>
     </w:p>
@@ -13929,7 +14412,7 @@
           <w:szCs w:val="24"/>
         </w:rPr>
       </w:pPr>
-      <w:bookmarkStart w:id="75" w:name="_Toc208785325"/>
+      <w:bookmarkStart w:id="77" w:name="_Toc208785325"/>
       <w:r>
         <w:rPr>
           <w:b/>
@@ -14001,7 +14484,7 @@
           <w:sz w:val="24"/>
           <w:szCs w:val="24"/>
         </w:rPr>
-        <w:t>4</w:t>
+        <w:t>5</w:t>
       </w:r>
       <w:r>
         <w:rPr>
@@ -14049,7 +14532,7 @@
         </w:rPr>
         <w:t xml:space="preserve"> Procesamiento de Salida.</w:t>
       </w:r>
-      <w:bookmarkEnd w:id="75"/>
+      <w:bookmarkEnd w:id="77"/>
     </w:p>
     <w:p>
       <w:pPr>
@@ -14060,7 +14543,7 @@
           <w:noProof/>
         </w:rPr>
         <w:drawing>
-          <wp:inline distT="0" distB="0" distL="0" distR="0" wp14:anchorId="406843DA" wp14:editId="4A7B3895">
+          <wp:inline distT="0" distB="0" distL="0" distR="0" wp14:anchorId="406843DA" wp14:editId="2F06E2F4">
             <wp:extent cx="2706370" cy="3456709"/>
             <wp:effectExtent l="0" t="0" r="0" b="0"/>
             <wp:docPr id="1461322428" name="Imagen 6"/>
@@ -14077,7 +14560,7 @@
                     </pic:cNvPicPr>
                   </pic:nvPicPr>
                   <pic:blipFill rotWithShape="1">
-                    <a:blip r:embed="rId24" cstate="print">
+                    <a:blip r:embed="rId25" cstate="print">
                       <a:extLst>
                         <a:ext uri="{28A0092B-C50C-407E-A947-70E740481C1C}">
                           <a14:useLocalDpi xmlns:a14="http://schemas.microsoft.com/office/drawing/2010/main" val="0"/>
@@ -14138,62 +14621,57 @@
       </w:r>
     </w:p>
     <w:p>
-      <w:pPr>
-        <w:jc w:val="center"/>
-      </w:pPr>
-    </w:p>
-    <w:p>
+      <w:r>
+        <w:t xml:space="preserve">Esta división del trabajo es lo que permite que el sistema sea robusto y modular. Una vez recibida la respuesta, el componente </w:t>
+      </w:r>
+      <w:proofErr w:type="spellStart"/>
+      <w:r>
+        <w:t>renderizador</w:t>
+      </w:r>
+      <w:proofErr w:type="spellEnd"/>
+      <w:r>
+        <w:t xml:space="preserve"> de vista se encarga de procesar estos datos estructurados. Su función es traducir el contenido crudo, organizado según el contrato, en una lección visualmente coherente y pedagógicamente efectiva. Este último paso transforma los datos en una experiencia de aprendizaje organizada y de fácil consumo para el estudiante, completando el ciclo de interacción del modelo y cumpliendo el objetivo de una interfaz educativa eficaz.</w:t>
+      </w:r>
+    </w:p>
+    <w:p>
+      <w:pPr>
+        <w:pStyle w:val="Ttulo2"/>
+      </w:pPr>
+      <w:bookmarkStart w:id="78" w:name="_Toc208863986"/>
       <w:r>
         <w:lastRenderedPageBreak/>
-        <w:t xml:space="preserve">Esta división deliberada del trabajo es lo que permite que el sistema sea robusto y modular. Una vez recibida la respuesta, el componente </w:t>
+        <w:t>4.</w:t>
+      </w:r>
+      <w:r>
+        <w:t>2</w:t>
+      </w:r>
+      <w:r>
+        <w:t xml:space="preserve">. </w:t>
+      </w:r>
+      <w:r>
+        <w:t xml:space="preserve">Construcción de la </w:t>
+      </w:r>
+      <w:r>
+        <w:t>a</w:t>
+      </w:r>
+      <w:r>
+        <w:t xml:space="preserve">plicación </w:t>
+      </w:r>
+      <w:r>
+        <w:t>w</w:t>
+      </w:r>
+      <w:r>
+        <w:t xml:space="preserve">eb </w:t>
       </w:r>
       <w:proofErr w:type="spellStart"/>
       <w:r>
-        <w:t>renderizador</w:t>
+        <w:t>TrigTutor</w:t>
       </w:r>
       <w:proofErr w:type="spellEnd"/>
       <w:r>
-        <w:t xml:space="preserve"> de vista se encarga de procesar estos datos estructurados. Su función es traducir el contenido crudo, organizado según el contrato, en una lección visualmente coherente y pedagógicamente efectiva. Este último paso transforma los datos en una experiencia de aprendizaje organizada y de fácil consumo para el estudiante, completando el ciclo de interacción del modelo y cumpliendo el objetivo de una interfaz educativa eficaz.</w:t>
-      </w:r>
-    </w:p>
-    <w:p>
-      <w:pPr>
-        <w:pStyle w:val="Ttulo2"/>
-      </w:pPr>
-      <w:bookmarkStart w:id="76" w:name="_Toc208785295"/>
-      <w:r>
-        <w:t>4.</w:t>
-      </w:r>
-      <w:r>
-        <w:t>2</w:t>
-      </w:r>
-      <w:r>
-        <w:t xml:space="preserve">. </w:t>
-      </w:r>
-      <w:r>
-        <w:t xml:space="preserve">Construcción de la </w:t>
-      </w:r>
-      <w:r>
-        <w:t>a</w:t>
-      </w:r>
-      <w:r>
-        <w:t xml:space="preserve">plicación </w:t>
-      </w:r>
-      <w:r>
-        <w:t>w</w:t>
-      </w:r>
-      <w:r>
-        <w:t xml:space="preserve">eb </w:t>
-      </w:r>
-      <w:proofErr w:type="spellStart"/>
-      <w:r>
-        <w:t>TrigTutor</w:t>
-      </w:r>
-      <w:proofErr w:type="spellEnd"/>
-      <w:r>
         <w:t xml:space="preserve"> IA</w:t>
       </w:r>
-      <w:bookmarkEnd w:id="76"/>
+      <w:bookmarkEnd w:id="78"/>
     </w:p>
     <w:p>
       <w:r>
@@ -14221,7 +14699,7 @@
           <w:rPr>
             <w:color w:val="000000"/>
           </w:rPr>
-          <w:tag w:val="MENDELEY_CITATION_v3_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"/>
+          <w:tag w:val="MENDELEY_CITATION_v3_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"/>
           <w:id w:val="1101540904"/>
           <w:placeholder>
             <w:docPart w:val="DefaultPlaceholder_-1854013440"/>
@@ -14232,7 +14710,7 @@
             <w:rPr>
               <w:color w:val="000000"/>
             </w:rPr>
-            <w:t>[42]</w:t>
+            <w:t>[43]</w:t>
           </w:r>
         </w:sdtContent>
       </w:sdt>
@@ -14261,7 +14739,7 @@
           <w:szCs w:val="24"/>
         </w:rPr>
       </w:pPr>
-      <w:bookmarkStart w:id="77" w:name="_Toc208785326"/>
+      <w:bookmarkStart w:id="79" w:name="_Toc208785326"/>
       <w:r>
         <w:rPr>
           <w:b/>
@@ -14333,7 +14811,7 @@
           <w:sz w:val="24"/>
           <w:szCs w:val="24"/>
         </w:rPr>
-        <w:t>5</w:t>
+        <w:t>6</w:t>
       </w:r>
       <w:r>
         <w:rPr>
@@ -14403,7 +14881,7 @@
         </w:rPr>
         <w:t xml:space="preserve"> IA.</w:t>
       </w:r>
-      <w:bookmarkEnd w:id="77"/>
+      <w:bookmarkEnd w:id="79"/>
     </w:p>
     <w:p>
       <w:pPr>
@@ -14431,7 +14909,7 @@
                     </pic:cNvPicPr>
                   </pic:nvPicPr>
                   <pic:blipFill>
-                    <a:blip r:embed="rId25">
+                    <a:blip r:embed="rId26">
                       <a:extLst>
                         <a:ext uri="{28A0092B-C50C-407E-A947-70E740481C1C}">
                           <a14:useLocalDpi xmlns:a14="http://schemas.microsoft.com/office/drawing/2010/main" val="0"/>
@@ -14491,9 +14969,8 @@
       <w:pPr>
         <w:pStyle w:val="Ttulo3"/>
       </w:pPr>
-      <w:bookmarkStart w:id="78" w:name="_Toc208785296"/>
-      <w:r>
-        <w:lastRenderedPageBreak/>
+      <w:bookmarkStart w:id="80" w:name="_Toc208863987"/>
+      <w:r>
         <w:t>4.</w:t>
       </w:r>
       <w:r>
@@ -14505,7 +14982,7 @@
       <w:r>
         <w:t>Aplicación del Flujo de Interacción del Modelo Cualitativo</w:t>
       </w:r>
-      <w:bookmarkEnd w:id="78"/>
+      <w:bookmarkEnd w:id="80"/>
     </w:p>
     <w:p>
       <w:r>
@@ -14527,8 +15004,6 @@
         <w:rPr>
           <w:b/>
           <w:bCs/>
-          <w:i/>
-          <w:iCs/>
         </w:rPr>
         <w:t>Figura</w:t>
       </w:r>
@@ -14536,8 +15011,6 @@
         <w:rPr>
           <w:b/>
           <w:bCs/>
-          <w:i/>
-          <w:iCs/>
         </w:rPr>
         <w:t xml:space="preserve"> </w:t>
       </w:r>
@@ -14602,13 +15075,17 @@
           <w:noProof/>
           <w:color w:val="auto"/>
         </w:rPr>
-        <w:t>6</w:t>
+        <w:t>7</w:t>
       </w:r>
       <w:r>
         <w:fldChar w:fldCharType="end"/>
       </w:r>
       <w:r>
-        <w:t>. El diseño minimalista de esta pantalla cumple una función deliberada: centrar la atención del usuario en la acción principal de "Entrada del Usuario". Es en este campo donde se captura la consulta inicial en lenguaje natural, constituyendo el primer paso fundamental del modelo de interacción.</w:t>
+        <w:t xml:space="preserve">. El diseño minimalista de esta pantalla cumple una función deliberada: centrar la atención del usuario en la acción principal de "Entrada del Usuario". Es en este campo donde </w:t>
+      </w:r>
+      <w:r>
+        <w:lastRenderedPageBreak/>
+        <w:t>se captura la consulta inicial en lenguaje natural, constituyendo el primer paso fundamental del modelo de interacción.</w:t>
       </w:r>
     </w:p>
     <w:p>
@@ -14624,8 +15101,8 @@
           <w:szCs w:val="24"/>
         </w:rPr>
       </w:pPr>
-      <w:bookmarkStart w:id="79" w:name="_Ref208155913"/>
-      <w:bookmarkStart w:id="80" w:name="_Toc208785327"/>
+      <w:bookmarkStart w:id="81" w:name="_Toc208785327"/>
+      <w:bookmarkStart w:id="82" w:name="_Ref208155913"/>
       <w:r>
         <w:rPr>
           <w:b/>
@@ -14697,7 +15174,7 @@
           <w:sz w:val="24"/>
           <w:szCs w:val="24"/>
         </w:rPr>
-        <w:t>6</w:t>
+        <w:t>7</w:t>
       </w:r>
       <w:r>
         <w:rPr>
@@ -14711,7 +15188,7 @@
         </w:rPr>
         <w:fldChar w:fldCharType="end"/>
       </w:r>
-      <w:bookmarkEnd w:id="79"/>
+      <w:bookmarkEnd w:id="82"/>
       <w:r>
         <w:rPr>
           <w:b/>
@@ -14754,7 +15231,7 @@
         </w:rPr>
         <w:t>Interfaz de bienvenida y entrada de usuario.</w:t>
       </w:r>
-      <w:bookmarkEnd w:id="80"/>
+      <w:bookmarkEnd w:id="81"/>
     </w:p>
     <w:p>
       <w:pPr>
@@ -14782,7 +15259,7 @@
                     </pic:cNvPicPr>
                   </pic:nvPicPr>
                   <pic:blipFill>
-                    <a:blip r:embed="rId26" cstate="print">
+                    <a:blip r:embed="rId27" cstate="print">
                       <a:extLst>
                         <a:ext uri="{28A0092B-C50C-407E-A947-70E740481C1C}">
                           <a14:useLocalDpi xmlns:a14="http://schemas.microsoft.com/office/drawing/2010/main" val="0"/>
@@ -14878,7 +15355,7 @@
           <w:noProof/>
           <w:color w:val="auto"/>
         </w:rPr>
-        <w:t>7</w:t>
+        <w:t>8</w:t>
       </w:r>
       <w:r>
         <w:fldChar w:fldCharType="end"/>
@@ -14914,8 +15391,8 @@
           <w:szCs w:val="24"/>
         </w:rPr>
       </w:pPr>
-      <w:bookmarkStart w:id="81" w:name="_Ref208156145"/>
-      <w:bookmarkStart w:id="82" w:name="_Toc208785328"/>
+      <w:bookmarkStart w:id="83" w:name="_Toc208785328"/>
+      <w:bookmarkStart w:id="84" w:name="_Ref208156145"/>
       <w:r>
         <w:rPr>
           <w:b/>
@@ -14988,7 +15465,7 @@
           <w:sz w:val="24"/>
           <w:szCs w:val="24"/>
         </w:rPr>
-        <w:t>7</w:t>
+        <w:t>8</w:t>
       </w:r>
       <w:r>
         <w:rPr>
@@ -15002,7 +15479,7 @@
         </w:rPr>
         <w:fldChar w:fldCharType="end"/>
       </w:r>
-      <w:bookmarkEnd w:id="81"/>
+      <w:bookmarkEnd w:id="84"/>
       <w:r>
         <w:rPr>
           <w:b/>
@@ -15045,7 +15522,7 @@
         </w:rPr>
         <w:t>Validación de relevancia del tema en la interfaz de chat.</w:t>
       </w:r>
-      <w:bookmarkEnd w:id="82"/>
+      <w:bookmarkEnd w:id="83"/>
     </w:p>
     <w:p>
       <w:pPr>
@@ -15056,7 +15533,7 @@
           <w:noProof/>
         </w:rPr>
         <w:drawing>
-          <wp:inline distT="0" distB="0" distL="0" distR="0" wp14:anchorId="0F9F6776" wp14:editId="739E2BFB">
+          <wp:inline distT="0" distB="0" distL="0" distR="0" wp14:anchorId="0F9F6776" wp14:editId="2B0D0F0B">
             <wp:extent cx="3346898" cy="2520000"/>
             <wp:effectExtent l="0" t="0" r="6350" b="0"/>
             <wp:docPr id="1543190260" name="Imagen 4"/>
@@ -15073,7 +15550,7 @@
                     </pic:cNvPicPr>
                   </pic:nvPicPr>
                   <pic:blipFill>
-                    <a:blip r:embed="rId27" cstate="print">
+                    <a:blip r:embed="rId28" cstate="print">
                       <a:extLst>
                         <a:ext uri="{28A0092B-C50C-407E-A947-70E740481C1C}">
                           <a14:useLocalDpi xmlns:a14="http://schemas.microsoft.com/office/drawing/2010/main" val="0"/>
@@ -15169,7 +15646,7 @@
           <w:noProof/>
           <w:color w:val="auto"/>
         </w:rPr>
-        <w:t>8</w:t>
+        <w:t>9</w:t>
       </w:r>
       <w:r>
         <w:fldChar w:fldCharType="end"/>
@@ -15226,8 +15703,8 @@
           <w:szCs w:val="24"/>
         </w:rPr>
       </w:pPr>
-      <w:bookmarkStart w:id="83" w:name="_Ref208156313"/>
-      <w:bookmarkStart w:id="84" w:name="_Toc208785329"/>
+      <w:bookmarkStart w:id="85" w:name="_Toc208785329"/>
+      <w:bookmarkStart w:id="86" w:name="_Ref208156313"/>
       <w:r>
         <w:rPr>
           <w:b/>
@@ -15299,7 +15776,7 @@
           <w:sz w:val="24"/>
           <w:szCs w:val="24"/>
         </w:rPr>
-        <w:t>8</w:t>
+        <w:t>9</w:t>
       </w:r>
       <w:r>
         <w:rPr>
@@ -15313,7 +15790,7 @@
         </w:rPr>
         <w:fldChar w:fldCharType="end"/>
       </w:r>
-      <w:bookmarkEnd w:id="83"/>
+      <w:bookmarkEnd w:id="86"/>
       <w:r>
         <w:rPr>
           <w:b/>
@@ -15356,7 +15833,7 @@
         </w:rPr>
         <w:t>Renderización del contenido generado por la IA en la vista de contenido.</w:t>
       </w:r>
-      <w:bookmarkEnd w:id="84"/>
+      <w:bookmarkEnd w:id="85"/>
     </w:p>
     <w:p>
       <w:pPr>
@@ -15384,7 +15861,7 @@
                     </pic:cNvPicPr>
                   </pic:nvPicPr>
                   <pic:blipFill>
-                    <a:blip r:embed="rId28">
+                    <a:blip r:embed="rId29">
                       <a:extLst>
                         <a:ext uri="{28A0092B-C50C-407E-A947-70E740481C1C}">
                           <a14:useLocalDpi xmlns:a14="http://schemas.microsoft.com/office/drawing/2010/main" val="0"/>
@@ -15443,7 +15920,7 @@
       <w:pPr>
         <w:pStyle w:val="Ttulo3"/>
       </w:pPr>
-      <w:bookmarkStart w:id="85" w:name="_Toc208785297"/>
+      <w:bookmarkStart w:id="87" w:name="_Toc208863988"/>
       <w:r>
         <w:lastRenderedPageBreak/>
         <w:t>4.</w:t>
@@ -15454,7 +15931,7 @@
       <w:r>
         <w:t>.2. Implementación del Andamiaje Pedagógico</w:t>
       </w:r>
-      <w:bookmarkEnd w:id="85"/>
+      <w:bookmarkEnd w:id="87"/>
       <w:r>
         <w:t xml:space="preserve"> </w:t>
       </w:r>
@@ -15521,7 +15998,7 @@
           <w:noProof/>
           <w:color w:val="auto"/>
         </w:rPr>
-        <w:t>9</w:t>
+        <w:t>10</w:t>
       </w:r>
       <w:r>
         <w:fldChar w:fldCharType="end"/>
@@ -15543,8 +16020,8 @@
           <w:szCs w:val="24"/>
         </w:rPr>
       </w:pPr>
-      <w:bookmarkStart w:id="86" w:name="_Ref208158126"/>
-      <w:bookmarkStart w:id="87" w:name="_Toc208785330"/>
+      <w:bookmarkStart w:id="88" w:name="_Toc208785330"/>
+      <w:bookmarkStart w:id="89" w:name="_Ref208158126"/>
       <w:r>
         <w:rPr>
           <w:b/>
@@ -15616,7 +16093,7 @@
           <w:sz w:val="24"/>
           <w:szCs w:val="24"/>
         </w:rPr>
-        <w:t>9</w:t>
+        <w:t>10</w:t>
       </w:r>
       <w:r>
         <w:rPr>
@@ -15630,7 +16107,7 @@
         </w:rPr>
         <w:fldChar w:fldCharType="end"/>
       </w:r>
-      <w:bookmarkEnd w:id="86"/>
+      <w:bookmarkEnd w:id="89"/>
       <w:r>
         <w:rPr>
           <w:b/>
@@ -15673,7 +16150,7 @@
         </w:rPr>
         <w:t>Estructura pedagógica del contenido en el nivel de soporte máximo.</w:t>
       </w:r>
-      <w:bookmarkEnd w:id="87"/>
+      <w:bookmarkEnd w:id="88"/>
     </w:p>
     <w:p>
       <w:pPr>
@@ -15699,7 +16176,7 @@
                     <pic:cNvPicPr/>
                   </pic:nvPicPr>
                   <pic:blipFill>
-                    <a:blip r:embed="rId29"/>
+                    <a:blip r:embed="rId30"/>
                     <a:stretch>
                       <a:fillRect/>
                     </a:stretch>
@@ -15791,7 +16268,7 @@
           <w:noProof/>
           <w:color w:val="auto"/>
         </w:rPr>
-        <w:t>10</w:t>
+        <w:t>11</w:t>
       </w:r>
       <w:r>
         <w:fldChar w:fldCharType="end"/>
@@ -15814,8 +16291,8 @@
           <w:szCs w:val="24"/>
         </w:rPr>
       </w:pPr>
-      <w:bookmarkStart w:id="88" w:name="_Ref208158432"/>
-      <w:bookmarkStart w:id="89" w:name="_Toc208785331"/>
+      <w:bookmarkStart w:id="90" w:name="_Toc208785331"/>
+      <w:bookmarkStart w:id="91" w:name="_Ref208158432"/>
       <w:r>
         <w:rPr>
           <w:b/>
@@ -15887,7 +16364,7 @@
           <w:sz w:val="24"/>
           <w:szCs w:val="24"/>
         </w:rPr>
-        <w:t>10</w:t>
+        <w:t>11</w:t>
       </w:r>
       <w:r>
         <w:rPr>
@@ -15901,7 +16378,7 @@
         </w:rPr>
         <w:fldChar w:fldCharType="end"/>
       </w:r>
-      <w:bookmarkEnd w:id="88"/>
+      <w:bookmarkEnd w:id="91"/>
       <w:r>
         <w:rPr>
           <w:b/>
@@ -15944,7 +16421,7 @@
         </w:rPr>
         <w:t>Práctica guiada con retroalimentación inmediata.</w:t>
       </w:r>
-      <w:bookmarkEnd w:id="89"/>
+      <w:bookmarkEnd w:id="90"/>
     </w:p>
     <w:p>
       <w:pPr>
@@ -15955,7 +16432,7 @@
           <w:noProof/>
         </w:rPr>
         <w:drawing>
-          <wp:inline distT="0" distB="0" distL="0" distR="0" wp14:anchorId="294A606E" wp14:editId="7C661770">
+          <wp:inline distT="0" distB="0" distL="0" distR="0" wp14:anchorId="294A606E" wp14:editId="76F4DE9C">
             <wp:extent cx="4187994" cy="2880000"/>
             <wp:effectExtent l="0" t="0" r="3175" b="0"/>
             <wp:docPr id="1205992716" name="Imagen 10"/>
@@ -15972,7 +16449,7 @@
                     </pic:cNvPicPr>
                   </pic:nvPicPr>
                   <pic:blipFill>
-                    <a:blip r:embed="rId30" cstate="print">
+                    <a:blip r:embed="rId31" cstate="print">
                       <a:extLst>
                         <a:ext uri="{28A0092B-C50C-407E-A947-70E740481C1C}">
                           <a14:useLocalDpi xmlns:a14="http://schemas.microsoft.com/office/drawing/2010/main" val="0"/>
@@ -16068,7 +16545,7 @@
           <w:noProof/>
           <w:color w:val="auto"/>
         </w:rPr>
-        <w:t>11</w:t>
+        <w:t>12</w:t>
       </w:r>
       <w:r>
         <w:fldChar w:fldCharType="end"/>
@@ -16092,8 +16569,8 @@
           <w:szCs w:val="24"/>
         </w:rPr>
       </w:pPr>
-      <w:bookmarkStart w:id="90" w:name="_Ref208158544"/>
-      <w:bookmarkStart w:id="91" w:name="_Toc208785332"/>
+      <w:bookmarkStart w:id="92" w:name="_Toc208785332"/>
+      <w:bookmarkStart w:id="93" w:name="_Ref208158544"/>
       <w:r>
         <w:rPr>
           <w:b/>
@@ -16166,7 +16643,7 @@
           <w:sz w:val="24"/>
           <w:szCs w:val="24"/>
         </w:rPr>
-        <w:t>11</w:t>
+        <w:t>12</w:t>
       </w:r>
       <w:r>
         <w:rPr>
@@ -16180,7 +16657,7 @@
         </w:rPr>
         <w:fldChar w:fldCharType="end"/>
       </w:r>
-      <w:bookmarkEnd w:id="90"/>
+      <w:bookmarkEnd w:id="93"/>
       <w:r>
         <w:rPr>
           <w:b/>
@@ -16223,7 +16700,7 @@
         </w:rPr>
         <w:t>Asistencia contingente como parte del andamiaje en la práctica guiada</w:t>
       </w:r>
-      <w:bookmarkEnd w:id="91"/>
+      <w:bookmarkEnd w:id="92"/>
     </w:p>
     <w:p>
       <w:pPr>
@@ -16234,7 +16711,7 @@
           <w:noProof/>
         </w:rPr>
         <w:drawing>
-          <wp:inline distT="0" distB="0" distL="0" distR="0" wp14:anchorId="76C21A85" wp14:editId="72533005">
+          <wp:inline distT="0" distB="0" distL="0" distR="0" wp14:anchorId="76C21A85" wp14:editId="16E8AB00">
             <wp:extent cx="3713689" cy="2181225"/>
             <wp:effectExtent l="0" t="0" r="1270" b="0"/>
             <wp:docPr id="742031050" name="Imagen 11"/>
@@ -16251,7 +16728,7 @@
                     </pic:cNvPicPr>
                   </pic:nvPicPr>
                   <pic:blipFill rotWithShape="1">
-                    <a:blip r:embed="rId31" cstate="print">
+                    <a:blip r:embed="rId32" cstate="print">
                       <a:extLst>
                         <a:ext uri="{28A0092B-C50C-407E-A947-70E740481C1C}">
                           <a14:useLocalDpi xmlns:a14="http://schemas.microsoft.com/office/drawing/2010/main" val="0"/>
@@ -16352,7 +16829,7 @@
           <w:noProof/>
           <w:color w:val="auto"/>
         </w:rPr>
-        <w:t>12</w:t>
+        <w:t>13</w:t>
       </w:r>
       <w:r>
         <w:fldChar w:fldCharType="end"/>
@@ -16374,8 +16851,8 @@
           <w:szCs w:val="24"/>
         </w:rPr>
       </w:pPr>
-      <w:bookmarkStart w:id="92" w:name="_Ref208159360"/>
-      <w:bookmarkStart w:id="93" w:name="_Toc208785333"/>
+      <w:bookmarkStart w:id="94" w:name="_Toc208785333"/>
+      <w:bookmarkStart w:id="95" w:name="_Ref208159360"/>
       <w:r>
         <w:rPr>
           <w:b/>
@@ -16447,7 +16924,7 @@
           <w:sz w:val="24"/>
           <w:szCs w:val="24"/>
         </w:rPr>
-        <w:t>12</w:t>
+        <w:t>13</w:t>
       </w:r>
       <w:r>
         <w:rPr>
@@ -16461,7 +16938,7 @@
         </w:rPr>
         <w:fldChar w:fldCharType="end"/>
       </w:r>
-      <w:bookmarkEnd w:id="92"/>
+      <w:bookmarkEnd w:id="95"/>
       <w:r>
         <w:rPr>
           <w:b/>
@@ -16494,7 +16971,7 @@
         </w:rPr>
         <w:t>Evaluación para la autonomía con soporte mínimo.</w:t>
       </w:r>
-      <w:bookmarkEnd w:id="93"/>
+      <w:bookmarkEnd w:id="94"/>
     </w:p>
     <w:p>
       <w:pPr>
@@ -16509,7 +16986,7 @@
           <w:noProof/>
         </w:rPr>
         <w:drawing>
-          <wp:inline distT="0" distB="0" distL="0" distR="0" wp14:anchorId="11E6B934" wp14:editId="2653A7A5">
+          <wp:inline distT="0" distB="0" distL="0" distR="0" wp14:anchorId="11E6B934" wp14:editId="527CC043">
             <wp:extent cx="3686175" cy="2409542"/>
             <wp:effectExtent l="0" t="0" r="0" b="0"/>
             <wp:docPr id="264217949" name="Imagen 12"/>
@@ -16526,7 +17003,7 @@
                     </pic:cNvPicPr>
                   </pic:nvPicPr>
                   <pic:blipFill rotWithShape="1">
-                    <a:blip r:embed="rId32" cstate="print">
+                    <a:blip r:embed="rId33" cstate="print">
                       <a:extLst>
                         <a:ext uri="{28A0092B-C50C-407E-A947-70E740481C1C}">
                           <a14:useLocalDpi xmlns:a14="http://schemas.microsoft.com/office/drawing/2010/main" val="0"/>
@@ -16590,7 +17067,7 @@
       <w:pPr>
         <w:pStyle w:val="Ttulo3"/>
       </w:pPr>
-      <w:bookmarkStart w:id="94" w:name="_Toc208785298"/>
+      <w:bookmarkStart w:id="96" w:name="_Toc208863989"/>
       <w:r>
         <w:lastRenderedPageBreak/>
         <w:t>4.</w:t>
@@ -16601,7 +17078,7 @@
       <w:r>
         <w:t>.3. Módulos de Soporte al Aprendizaje</w:t>
       </w:r>
-      <w:bookmarkEnd w:id="94"/>
+      <w:bookmarkEnd w:id="96"/>
     </w:p>
     <w:p>
       <w:r>
@@ -16649,7 +17126,7 @@
           <w:noProof/>
           <w:color w:val="auto"/>
         </w:rPr>
-        <w:t>13</w:t>
+        <w:t>14</w:t>
       </w:r>
       <w:r>
         <w:fldChar w:fldCharType="end"/>
@@ -16671,8 +17148,8 @@
           <w:szCs w:val="24"/>
         </w:rPr>
       </w:pPr>
-      <w:bookmarkStart w:id="95" w:name="_Ref208159346"/>
-      <w:bookmarkStart w:id="96" w:name="_Toc208785334"/>
+      <w:bookmarkStart w:id="97" w:name="_Toc208785334"/>
+      <w:bookmarkStart w:id="98" w:name="_Ref208159346"/>
       <w:r>
         <w:rPr>
           <w:b/>
@@ -16744,7 +17221,7 @@
           <w:sz w:val="24"/>
           <w:szCs w:val="24"/>
         </w:rPr>
-        <w:t>13</w:t>
+        <w:t>14</w:t>
       </w:r>
       <w:r>
         <w:rPr>
@@ -16758,7 +17235,7 @@
         </w:rPr>
         <w:fldChar w:fldCharType="end"/>
       </w:r>
-      <w:bookmarkEnd w:id="95"/>
+      <w:bookmarkEnd w:id="98"/>
       <w:r>
         <w:rPr>
           <w:b/>
@@ -16793,7 +17270,7 @@
         </w:rPr>
         <w:t>Módulo de recursos como herramienta de apoyo estático.</w:t>
       </w:r>
-      <w:bookmarkEnd w:id="96"/>
+      <w:bookmarkEnd w:id="97"/>
     </w:p>
     <w:p>
       <w:pPr>
@@ -16804,7 +17281,7 @@
           <w:noProof/>
         </w:rPr>
         <w:drawing>
-          <wp:inline distT="0" distB="0" distL="0" distR="0" wp14:anchorId="410E79FC" wp14:editId="0010FA01">
+          <wp:inline distT="0" distB="0" distL="0" distR="0" wp14:anchorId="410E79FC" wp14:editId="29B2FC10">
             <wp:extent cx="5220000" cy="2726244"/>
             <wp:effectExtent l="0" t="0" r="0" b="0"/>
             <wp:docPr id="15116929" name="Imagen 13"/>
@@ -16821,7 +17298,7 @@
                     </pic:cNvPicPr>
                   </pic:nvPicPr>
                   <pic:blipFill>
-                    <a:blip r:embed="rId33" cstate="print">
+                    <a:blip r:embed="rId34" cstate="print">
                       <a:extLst>
                         <a:ext uri="{28A0092B-C50C-407E-A947-70E740481C1C}">
                           <a14:useLocalDpi xmlns:a14="http://schemas.microsoft.com/office/drawing/2010/main" val="0"/>
@@ -16917,7 +17394,7 @@
           <w:noProof/>
           <w:color w:val="auto"/>
         </w:rPr>
-        <w:t>14</w:t>
+        <w:t>15</w:t>
       </w:r>
       <w:r>
         <w:fldChar w:fldCharType="end"/>
@@ -16946,8 +17423,8 @@
           <w:szCs w:val="24"/>
         </w:rPr>
       </w:pPr>
-      <w:bookmarkStart w:id="97" w:name="_Ref208159541"/>
-      <w:bookmarkStart w:id="98" w:name="_Toc208785335"/>
+      <w:bookmarkStart w:id="99" w:name="_Toc208785335"/>
+      <w:bookmarkStart w:id="100" w:name="_Ref208159541"/>
       <w:r>
         <w:rPr>
           <w:b/>
@@ -17020,7 +17497,7 @@
           <w:sz w:val="24"/>
           <w:szCs w:val="24"/>
         </w:rPr>
-        <w:t>14</w:t>
+        <w:t>15</w:t>
       </w:r>
       <w:r>
         <w:rPr>
@@ -17034,7 +17511,7 @@
         </w:rPr>
         <w:fldChar w:fldCharType="end"/>
       </w:r>
-      <w:bookmarkEnd w:id="97"/>
+      <w:bookmarkEnd w:id="100"/>
       <w:r>
         <w:rPr>
           <w:b/>
@@ -17069,7 +17546,7 @@
         </w:rPr>
         <w:t>Panel de estadísticas para el fomento de la metacognición.</w:t>
       </w:r>
-      <w:bookmarkEnd w:id="98"/>
+      <w:bookmarkEnd w:id="99"/>
     </w:p>
     <w:p>
       <w:pPr>
@@ -17080,7 +17557,7 @@
           <w:noProof/>
         </w:rPr>
         <w:drawing>
-          <wp:inline distT="0" distB="0" distL="0" distR="0" wp14:anchorId="70B2B2EF" wp14:editId="70441CC7">
+          <wp:inline distT="0" distB="0" distL="0" distR="0" wp14:anchorId="70B2B2EF" wp14:editId="17977D6A">
             <wp:extent cx="5040000" cy="2566880"/>
             <wp:effectExtent l="0" t="0" r="8255" b="5080"/>
             <wp:docPr id="1067747610" name="Imagen 14"/>
@@ -17097,7 +17574,7 @@
                     </pic:cNvPicPr>
                   </pic:nvPicPr>
                   <pic:blipFill rotWithShape="1">
-                    <a:blip r:embed="rId34" cstate="print">
+                    <a:blip r:embed="rId35" cstate="print">
                       <a:extLst>
                         <a:ext uri="{28A0092B-C50C-407E-A947-70E740481C1C}">
                           <a14:useLocalDpi xmlns:a14="http://schemas.microsoft.com/office/drawing/2010/main" val="0"/>
@@ -17338,21 +17815,21 @@
       <w:pPr>
         <w:pStyle w:val="Ttulo1"/>
       </w:pPr>
-      <w:bookmarkStart w:id="99" w:name="_Toc208785299"/>
+      <w:bookmarkStart w:id="101" w:name="_Toc208863990"/>
       <w:r>
         <w:t>CAPÍTULO V</w:t>
       </w:r>
-      <w:bookmarkEnd w:id="99"/>
+      <w:bookmarkEnd w:id="101"/>
     </w:p>
     <w:p>
       <w:pPr>
         <w:pStyle w:val="Ttulo1"/>
       </w:pPr>
-      <w:bookmarkStart w:id="100" w:name="_Toc208785300"/>
+      <w:bookmarkStart w:id="102" w:name="_Toc208863991"/>
       <w:r>
         <w:t>CONCLUSIONES Y RECOMENDACIONES</w:t>
       </w:r>
-      <w:bookmarkEnd w:id="100"/>
+      <w:bookmarkEnd w:id="102"/>
     </w:p>
     <w:p/>
     <w:p/>
@@ -17371,22 +17848,22 @@
       <w:pPr>
         <w:pStyle w:val="Ttulo2"/>
       </w:pPr>
-      <w:bookmarkStart w:id="101" w:name="_Toc208785301"/>
+      <w:bookmarkStart w:id="103" w:name="_Toc208863992"/>
       <w:r>
         <w:lastRenderedPageBreak/>
         <w:t>5.1. Conclusiones</w:t>
       </w:r>
-      <w:bookmarkEnd w:id="101"/>
+      <w:bookmarkEnd w:id="103"/>
     </w:p>
     <w:p>
       <w:pPr>
         <w:pStyle w:val="Ttulo2"/>
       </w:pPr>
-      <w:bookmarkStart w:id="102" w:name="_Toc208785302"/>
+      <w:bookmarkStart w:id="104" w:name="_Toc208863993"/>
       <w:r>
         <w:t>5.2. Recomendaciones</w:t>
       </w:r>
-      <w:bookmarkEnd w:id="102"/>
+      <w:bookmarkEnd w:id="104"/>
     </w:p>
     <w:p/>
     <w:p/>
@@ -17424,11 +17901,11 @@
       <w:pPr>
         <w:pStyle w:val="Ttulo1"/>
       </w:pPr>
-      <w:bookmarkStart w:id="103" w:name="_Toc208785303"/>
+      <w:bookmarkStart w:id="105" w:name="_Toc208863994"/>
       <w:r>
         <w:t>CAPÍTULO VI</w:t>
       </w:r>
-      <w:bookmarkEnd w:id="103"/>
+      <w:bookmarkEnd w:id="105"/>
     </w:p>
     <w:p>
       <w:pPr>
@@ -17437,14 +17914,14 @@
           <w:lang w:val="en-US"/>
         </w:rPr>
       </w:pPr>
-      <w:bookmarkStart w:id="104" w:name="_Toc208785304"/>
+      <w:bookmarkStart w:id="106" w:name="_Toc208863995"/>
       <w:r>
         <w:rPr>
           <w:lang w:val="en-US"/>
         </w:rPr>
         <w:t>BIBLIOGRAFÍA</w:t>
       </w:r>
-      <w:bookmarkEnd w:id="104"/>
+      <w:bookmarkEnd w:id="106"/>
     </w:p>
     <w:p>
       <w:pPr>
@@ -17578,7 +18055,7 @@
             <w:autoSpaceDE w:val="0"/>
             <w:autoSpaceDN w:val="0"/>
             <w:ind w:hanging="640"/>
-            <w:divId w:val="860095057"/>
+            <w:divId w:val="1924365010"/>
             <w:rPr>
               <w:rFonts w:eastAsia="Times New Roman"/>
               <w:kern w:val="0"/>
@@ -17623,7 +18100,7 @@
             <w:autoSpaceDE w:val="0"/>
             <w:autoSpaceDN w:val="0"/>
             <w:ind w:hanging="640"/>
-            <w:divId w:val="1277365757"/>
+            <w:divId w:val="1766606148"/>
             <w:rPr>
               <w:rFonts w:eastAsia="Times New Roman"/>
               <w:lang w:val="en-US"/>
@@ -17698,7 +18175,7 @@
             <w:autoSpaceDE w:val="0"/>
             <w:autoSpaceDN w:val="0"/>
             <w:ind w:hanging="640"/>
-            <w:divId w:val="1383745093"/>
+            <w:divId w:val="129634031"/>
             <w:rPr>
               <w:rFonts w:eastAsia="Times New Roman"/>
             </w:rPr>
@@ -17794,7 +18271,7 @@
             <w:autoSpaceDE w:val="0"/>
             <w:autoSpaceDN w:val="0"/>
             <w:ind w:hanging="640"/>
-            <w:divId w:val="1336373948"/>
+            <w:divId w:val="2087651439"/>
             <w:rPr>
               <w:rFonts w:eastAsia="Times New Roman"/>
               <w:lang w:val="en-US"/>
@@ -17938,7 +18415,7 @@
             <w:autoSpaceDE w:val="0"/>
             <w:autoSpaceDN w:val="0"/>
             <w:ind w:hanging="640"/>
-            <w:divId w:val="998003085"/>
+            <w:divId w:val="1365134198"/>
             <w:rPr>
               <w:rFonts w:eastAsia="Times New Roman"/>
               <w:lang w:val="en-US"/>
@@ -18013,7 +18490,7 @@
             <w:autoSpaceDE w:val="0"/>
             <w:autoSpaceDN w:val="0"/>
             <w:ind w:hanging="640"/>
-            <w:divId w:val="879243135"/>
+            <w:divId w:val="675621587"/>
             <w:rPr>
               <w:rFonts w:eastAsia="Times New Roman"/>
               <w:lang w:val="en-US"/>
@@ -18058,7 +18535,7 @@
             <w:autoSpaceDE w:val="0"/>
             <w:autoSpaceDN w:val="0"/>
             <w:ind w:hanging="640"/>
-            <w:divId w:val="1498231333"/>
+            <w:divId w:val="1275331640"/>
             <w:rPr>
               <w:rFonts w:eastAsia="Times New Roman"/>
               <w:lang w:val="en-US"/>
@@ -18124,7 +18601,7 @@
             <w:autoSpaceDE w:val="0"/>
             <w:autoSpaceDN w:val="0"/>
             <w:ind w:hanging="640"/>
-            <w:divId w:val="746268548"/>
+            <w:divId w:val="2082171984"/>
             <w:rPr>
               <w:rFonts w:eastAsia="Times New Roman"/>
             </w:rPr>
@@ -18190,7 +18667,7 @@
             <w:autoSpaceDE w:val="0"/>
             <w:autoSpaceDN w:val="0"/>
             <w:ind w:hanging="640"/>
-            <w:divId w:val="1695110340"/>
+            <w:divId w:val="301009539"/>
             <w:rPr>
               <w:rFonts w:eastAsia="Times New Roman"/>
             </w:rPr>
@@ -18267,7 +18744,7 @@
             <w:autoSpaceDE w:val="0"/>
             <w:autoSpaceDN w:val="0"/>
             <w:ind w:hanging="640"/>
-            <w:divId w:val="1201819205"/>
+            <w:divId w:val="1265531584"/>
             <w:rPr>
               <w:rFonts w:eastAsia="Times New Roman"/>
             </w:rPr>
@@ -18361,7 +18838,7 @@
             <w:autoSpaceDE w:val="0"/>
             <w:autoSpaceDN w:val="0"/>
             <w:ind w:hanging="640"/>
-            <w:divId w:val="1955861076"/>
+            <w:divId w:val="1931504962"/>
             <w:rPr>
               <w:rFonts w:eastAsia="Times New Roman"/>
               <w:lang w:val="en-US"/>
@@ -18388,7 +18865,7 @@
             <w:autoSpaceDE w:val="0"/>
             <w:autoSpaceDN w:val="0"/>
             <w:ind w:hanging="640"/>
-            <w:divId w:val="1555503174"/>
+            <w:divId w:val="1983198126"/>
             <w:rPr>
               <w:rFonts w:eastAsia="Times New Roman"/>
               <w:lang w:val="en-US"/>
@@ -18448,7 +18925,7 @@
             <w:autoSpaceDE w:val="0"/>
             <w:autoSpaceDN w:val="0"/>
             <w:ind w:hanging="640"/>
-            <w:divId w:val="169679668"/>
+            <w:divId w:val="1684697404"/>
             <w:rPr>
               <w:rFonts w:eastAsia="Times New Roman"/>
               <w:lang w:val="en-US"/>
@@ -18491,7 +18968,7 @@
             <w:autoSpaceDE w:val="0"/>
             <w:autoSpaceDN w:val="0"/>
             <w:ind w:hanging="640"/>
-            <w:divId w:val="383530044"/>
+            <w:divId w:val="1708674551"/>
             <w:rPr>
               <w:rFonts w:eastAsia="Times New Roman"/>
               <w:lang w:val="en-US"/>
@@ -18550,7 +19027,7 @@
             <w:autoSpaceDE w:val="0"/>
             <w:autoSpaceDN w:val="0"/>
             <w:ind w:hanging="640"/>
-            <w:divId w:val="1488595429"/>
+            <w:divId w:val="1097600610"/>
             <w:rPr>
               <w:rFonts w:eastAsia="Times New Roman"/>
               <w:lang w:val="en-US"/>
@@ -18784,7 +19261,7 @@
             <w:autoSpaceDE w:val="0"/>
             <w:autoSpaceDN w:val="0"/>
             <w:ind w:hanging="640"/>
-            <w:divId w:val="1905918175"/>
+            <w:divId w:val="1654869430"/>
             <w:rPr>
               <w:rFonts w:eastAsia="Times New Roman"/>
               <w:lang w:val="en-US"/>
@@ -18876,7 +19353,7 @@
             <w:autoSpaceDE w:val="0"/>
             <w:autoSpaceDN w:val="0"/>
             <w:ind w:hanging="640"/>
-            <w:divId w:val="966203277"/>
+            <w:divId w:val="406728344"/>
             <w:rPr>
               <w:rFonts w:eastAsia="Times New Roman"/>
               <w:lang w:val="en-US"/>
@@ -18936,7 +19413,7 @@
             <w:autoSpaceDE w:val="0"/>
             <w:autoSpaceDN w:val="0"/>
             <w:ind w:hanging="640"/>
-            <w:divId w:val="1991443990"/>
+            <w:divId w:val="151024018"/>
             <w:rPr>
               <w:rFonts w:eastAsia="Times New Roman"/>
               <w:lang w:val="en-US"/>
@@ -19010,7 +19487,7 @@
             <w:autoSpaceDE w:val="0"/>
             <w:autoSpaceDN w:val="0"/>
             <w:ind w:hanging="640"/>
-            <w:divId w:val="989678916"/>
+            <w:divId w:val="1502235807"/>
             <w:rPr>
               <w:rFonts w:eastAsia="Times New Roman"/>
             </w:rPr>
@@ -19093,7 +19570,7 @@
             <w:autoSpaceDE w:val="0"/>
             <w:autoSpaceDN w:val="0"/>
             <w:ind w:hanging="640"/>
-            <w:divId w:val="2145653887"/>
+            <w:divId w:val="1135297908"/>
             <w:rPr>
               <w:rFonts w:eastAsia="Times New Roman"/>
             </w:rPr>
@@ -19173,7 +19650,7 @@
             <w:autoSpaceDE w:val="0"/>
             <w:autoSpaceDN w:val="0"/>
             <w:ind w:hanging="640"/>
-            <w:divId w:val="1324045371"/>
+            <w:divId w:val="152186087"/>
             <w:rPr>
               <w:rFonts w:eastAsia="Times New Roman"/>
               <w:lang w:val="en-US"/>
@@ -19275,7 +19752,7 @@
             <w:autoSpaceDE w:val="0"/>
             <w:autoSpaceDN w:val="0"/>
             <w:ind w:hanging="640"/>
-            <w:divId w:val="797652503"/>
+            <w:divId w:val="777289119"/>
             <w:rPr>
               <w:rFonts w:eastAsia="Times New Roman"/>
             </w:rPr>
@@ -19355,7 +19832,7 @@
             <w:autoSpaceDE w:val="0"/>
             <w:autoSpaceDN w:val="0"/>
             <w:ind w:hanging="640"/>
-            <w:divId w:val="161433779"/>
+            <w:divId w:val="954408587"/>
             <w:rPr>
               <w:rFonts w:eastAsia="Times New Roman"/>
               <w:lang w:val="en-US"/>
@@ -19446,7 +19923,7 @@
             <w:autoSpaceDE w:val="0"/>
             <w:autoSpaceDN w:val="0"/>
             <w:ind w:hanging="640"/>
-            <w:divId w:val="1733114106"/>
+            <w:divId w:val="1961645746"/>
             <w:rPr>
               <w:rFonts w:eastAsia="Times New Roman"/>
               <w:lang w:val="en-US"/>
@@ -19608,7 +20085,7 @@
             <w:autoSpaceDE w:val="0"/>
             <w:autoSpaceDN w:val="0"/>
             <w:ind w:hanging="640"/>
-            <w:divId w:val="189222960"/>
+            <w:divId w:val="317271212"/>
             <w:rPr>
               <w:rFonts w:eastAsia="Times New Roman"/>
               <w:lang w:val="en-US"/>
@@ -19651,7 +20128,7 @@
             <w:autoSpaceDE w:val="0"/>
             <w:autoSpaceDN w:val="0"/>
             <w:ind w:hanging="640"/>
-            <w:divId w:val="875001851"/>
+            <w:divId w:val="1318262658"/>
             <w:rPr>
               <w:rFonts w:eastAsia="Times New Roman"/>
               <w:lang w:val="en-US"/>
@@ -19769,7 +20246,7 @@
             <w:autoSpaceDE w:val="0"/>
             <w:autoSpaceDN w:val="0"/>
             <w:ind w:hanging="640"/>
-            <w:divId w:val="653067658"/>
+            <w:divId w:val="1741176745"/>
             <w:rPr>
               <w:rFonts w:eastAsia="Times New Roman"/>
               <w:lang w:val="en-US"/>
@@ -19788,7 +20265,7 @@
               <w:lang w:val="en-US"/>
             </w:rPr>
             <w:tab/>
-            <w:t>P. Sahoo, A. K. Singh, S. Saha, V. Jain, S. Mondal, and A. Chadha, “A Systematic Survey of Prompt Engineering in Large Language Models: Techniques and Applications”.</w:t>
+            <w:t>P. Sahoo, A. K. Singh, S. Saha, V. Jain, S. Mondal, and A. Chadha, “A Systematic Survey of Prompt Engineering in Large Language Models: Techniques and Applications,” Mar. 2025, Accessed: Aug. 28, 2025. [Online]. Available: http://arxiv.org/abs/2402.07927</w:t>
           </w:r>
         </w:p>
         <w:p>
@@ -19796,7 +20273,7 @@
             <w:autoSpaceDE w:val="0"/>
             <w:autoSpaceDN w:val="0"/>
             <w:ind w:hanging="640"/>
-            <w:divId w:val="304089469"/>
+            <w:divId w:val="99840996"/>
             <w:rPr>
               <w:rFonts w:eastAsia="Times New Roman"/>
               <w:lang w:val="en-US"/>
@@ -19823,7 +20300,7 @@
             <w:autoSpaceDE w:val="0"/>
             <w:autoSpaceDN w:val="0"/>
             <w:ind w:hanging="640"/>
-            <w:divId w:val="1579439260"/>
+            <w:divId w:val="357764"/>
             <w:rPr>
               <w:rFonts w:eastAsia="Times New Roman"/>
               <w:lang w:val="en-US"/>
@@ -19882,7 +20359,7 @@
             <w:autoSpaceDE w:val="0"/>
             <w:autoSpaceDN w:val="0"/>
             <w:ind w:hanging="640"/>
-            <w:divId w:val="445347041"/>
+            <w:divId w:val="556085881"/>
             <w:rPr>
               <w:rFonts w:eastAsia="Times New Roman"/>
             </w:rPr>
@@ -19948,7 +20425,7 @@
             <w:autoSpaceDE w:val="0"/>
             <w:autoSpaceDN w:val="0"/>
             <w:ind w:hanging="640"/>
-            <w:divId w:val="1515269803"/>
+            <w:divId w:val="1190492586"/>
             <w:rPr>
               <w:rFonts w:eastAsia="Times New Roman"/>
             </w:rPr>
@@ -20196,7 +20673,7 @@
             <w:autoSpaceDE w:val="0"/>
             <w:autoSpaceDN w:val="0"/>
             <w:ind w:hanging="640"/>
-            <w:divId w:val="391585716"/>
+            <w:divId w:val="446393119"/>
             <w:rPr>
               <w:rFonts w:eastAsia="Times New Roman"/>
             </w:rPr>
@@ -20444,7 +20921,7 @@
             <w:autoSpaceDE w:val="0"/>
             <w:autoSpaceDN w:val="0"/>
             <w:ind w:hanging="640"/>
-            <w:divId w:val="885918285"/>
+            <w:divId w:val="1699817485"/>
             <w:rPr>
               <w:rFonts w:eastAsia="Times New Roman"/>
             </w:rPr>
@@ -20527,7 +21004,7 @@
             <w:autoSpaceDE w:val="0"/>
             <w:autoSpaceDN w:val="0"/>
             <w:ind w:hanging="640"/>
-            <w:divId w:val="1376851882"/>
+            <w:divId w:val="1363285656"/>
             <w:rPr>
               <w:rFonts w:eastAsia="Times New Roman"/>
               <w:lang w:val="en-US"/>
@@ -20601,7 +21078,7 @@
             <w:autoSpaceDE w:val="0"/>
             <w:autoSpaceDN w:val="0"/>
             <w:ind w:hanging="640"/>
-            <w:divId w:val="2146458807"/>
+            <w:divId w:val="1014262968"/>
             <w:rPr>
               <w:rFonts w:eastAsia="Times New Roman"/>
               <w:lang w:val="en-US"/>
@@ -20661,7 +21138,7 @@
             <w:autoSpaceDE w:val="0"/>
             <w:autoSpaceDN w:val="0"/>
             <w:ind w:hanging="640"/>
-            <w:divId w:val="1941864113"/>
+            <w:divId w:val="2128769741"/>
             <w:rPr>
               <w:rFonts w:eastAsia="Times New Roman"/>
               <w:lang w:val="en-US"/>
@@ -20721,7 +21198,7 @@
             <w:autoSpaceDE w:val="0"/>
             <w:autoSpaceDN w:val="0"/>
             <w:ind w:hanging="640"/>
-            <w:divId w:val="1383359496"/>
+            <w:divId w:val="625044909"/>
             <w:rPr>
               <w:rFonts w:eastAsia="Times New Roman"/>
               <w:lang w:val="en-US"/>
@@ -20781,7 +21258,7 @@
             <w:autoSpaceDE w:val="0"/>
             <w:autoSpaceDN w:val="0"/>
             <w:ind w:hanging="640"/>
-            <w:divId w:val="1674724854"/>
+            <w:divId w:val="177502691"/>
             <w:rPr>
               <w:rFonts w:eastAsia="Times New Roman"/>
               <w:lang w:val="en-US"/>
@@ -20842,7 +21319,7 @@
             <w:autoSpaceDE w:val="0"/>
             <w:autoSpaceDN w:val="0"/>
             <w:ind w:hanging="640"/>
-            <w:divId w:val="42947329"/>
+            <w:divId w:val="1797216395"/>
             <w:rPr>
               <w:rFonts w:eastAsia="Times New Roman"/>
               <w:lang w:val="en-US"/>
@@ -20901,7 +21378,7 @@
             <w:autoSpaceDE w:val="0"/>
             <w:autoSpaceDN w:val="0"/>
             <w:ind w:hanging="640"/>
-            <w:divId w:val="327752296"/>
+            <w:divId w:val="1955280836"/>
             <w:rPr>
               <w:rFonts w:eastAsia="Times New Roman"/>
               <w:lang w:val="en-US"/>
@@ -20976,7 +21453,7 @@
             <w:autoSpaceDE w:val="0"/>
             <w:autoSpaceDN w:val="0"/>
             <w:ind w:hanging="640"/>
-            <w:divId w:val="1745445413"/>
+            <w:divId w:val="1644429574"/>
             <w:rPr>
               <w:rFonts w:eastAsia="Times New Roman"/>
               <w:lang w:val="en-US"/>
@@ -21036,7 +21513,7 @@
             <w:autoSpaceDE w:val="0"/>
             <w:autoSpaceDN w:val="0"/>
             <w:ind w:hanging="640"/>
-            <w:divId w:val="1946764136"/>
+            <w:divId w:val="1109083991"/>
             <w:rPr>
               <w:rFonts w:eastAsia="Times New Roman"/>
               <w:lang w:val="en-US"/>
@@ -21048,6 +21525,65 @@
               <w:lang w:val="en-US"/>
             </w:rPr>
             <w:t>[42]</w:t>
+          </w:r>
+          <w:r>
+            <w:rPr>
+              <w:rFonts w:eastAsia="Times New Roman"/>
+              <w:lang w:val="en-US"/>
+            </w:rPr>
+            <w:tab/>
+            <w:t xml:space="preserve">T. Pangan and F. Sains Dan Teknologi, “FRAMEWORK KARANGTURI UNTUK PROMPT ENGINEERING: ANALISIS KOMPARATIF DENGAN RTF, COT, DAN REACT PADA MODEL AI GENERATIF,” </w:t>
+          </w:r>
+          <w:r>
+            <w:rPr>
+              <w:rFonts w:eastAsia="Times New Roman"/>
+              <w:i/>
+              <w:iCs/>
+              <w:lang w:val="en-US"/>
+            </w:rPr>
+            <w:t>Science Technology and Management Journal</w:t>
+          </w:r>
+          <w:r>
+            <w:rPr>
+              <w:rFonts w:eastAsia="Times New Roman"/>
+              <w:lang w:val="en-US"/>
+            </w:rPr>
+            <w:t xml:space="preserve">, vol. 5, no. 2, pp. 133–138, Aug. 2025, </w:t>
+          </w:r>
+          <w:proofErr w:type="spellStart"/>
+          <w:r>
+            <w:rPr>
+              <w:rFonts w:eastAsia="Times New Roman"/>
+              <w:lang w:val="en-US"/>
+            </w:rPr>
+            <w:t>doi</w:t>
+          </w:r>
+          <w:proofErr w:type="spellEnd"/>
+          <w:r>
+            <w:rPr>
+              <w:rFonts w:eastAsia="Times New Roman"/>
+              <w:lang w:val="en-US"/>
+            </w:rPr>
+            <w:t>: 10.53416/STMJ.V5I2.353.</w:t>
+          </w:r>
+        </w:p>
+        <w:p>
+          <w:pPr>
+            <w:autoSpaceDE w:val="0"/>
+            <w:autoSpaceDN w:val="0"/>
+            <w:ind w:hanging="640"/>
+            <w:divId w:val="1361860188"/>
+            <w:rPr>
+              <w:rFonts w:eastAsia="Times New Roman"/>
+              <w:lang w:val="en-US"/>
+            </w:rPr>
+          </w:pPr>
+          <w:r>
+            <w:rPr>
+              <w:rFonts w:eastAsia="Times New Roman"/>
+              <w:lang w:val="en-US"/>
+            </w:rPr>
+            <w:t>[43]</w:t>
           </w:r>
           <w:r>
             <w:rPr>
@@ -21214,21 +21750,22 @@
       <w:pPr>
         <w:pStyle w:val="Ttulo1"/>
       </w:pPr>
-      <w:bookmarkStart w:id="105" w:name="_Toc208785305"/>
-      <w:r>
+      <w:bookmarkStart w:id="107" w:name="_Toc208863996"/>
+      <w:r>
+        <w:lastRenderedPageBreak/>
         <w:t>CAPÍTULO VII</w:t>
       </w:r>
-      <w:bookmarkEnd w:id="105"/>
+      <w:bookmarkEnd w:id="107"/>
     </w:p>
     <w:p>
       <w:pPr>
         <w:pStyle w:val="Ttulo1"/>
       </w:pPr>
-      <w:bookmarkStart w:id="106" w:name="_Toc208785306"/>
+      <w:bookmarkStart w:id="108" w:name="_Toc208863997"/>
       <w:r>
         <w:t>ANEXOS</w:t>
       </w:r>
-      <w:bookmarkEnd w:id="106"/>
+      <w:bookmarkEnd w:id="108"/>
     </w:p>
     <w:p>
       <w:pPr>
@@ -23500,7 +24037,6 @@
     <w:lvl w:ilvl="2">
       <w:start w:val="1"/>
       <w:numFmt w:val="decimal"/>
-      <w:pStyle w:val="Ttulo4"/>
       <w:isLgl/>
       <w:lvlText w:val="%1.%2.%3."/>
       <w:lvlJc w:val="left"/>
@@ -26509,14 +27045,10 @@
     <w:uiPriority w:val="9"/>
     <w:unhideWhenUsed/>
     <w:qFormat/>
-    <w:rsid w:val="00577E05"/>
+    <w:rsid w:val="00C12682"/>
     <w:pPr>
       <w:keepNext/>
       <w:keepLines/>
-      <w:numPr>
-        <w:ilvl w:val="2"/>
-        <w:numId w:val="4"/>
-      </w:numPr>
       <w:spacing w:before="80" w:after="40"/>
       <w:outlineLvl w:val="3"/>
     </w:pPr>
@@ -27437,6 +27969,35 @@
         </w:p>
       </w:docPartBody>
     </w:docPart>
+    <w:docPart>
+      <w:docPartPr>
+        <w:name w:val="59E09FEC2F714AB5BD29990743C23B65"/>
+        <w:category>
+          <w:name w:val="General"/>
+          <w:gallery w:val="placeholder"/>
+        </w:category>
+        <w:types>
+          <w:type w:val="bbPlcHdr"/>
+        </w:types>
+        <w:behaviors>
+          <w:behavior w:val="content"/>
+        </w:behaviors>
+        <w:guid w:val="{2520A3BD-C306-4466-B6ED-3EA852268690}"/>
+      </w:docPartPr>
+      <w:docPartBody>
+        <w:p>
+          <w:pPr>
+            <w:pStyle w:val="59E09FEC2F714AB5BD29990743C23B65"/>
+          </w:pPr>
+          <w:r>
+            <w:rPr>
+              <w:rStyle w:val="Textodelmarcadordeposicin"/>
+            </w:rPr>
+            <w:t>Haga clic o pulse aquí para escribir texto.</w:t>
+          </w:r>
+        </w:p>
+      </w:docPartBody>
+    </w:docPart>
   </w:docParts>
 </w:glossaryDocument>
 </file>
@@ -27605,9 +28166,11 @@
     <w:rsid w:val="00BC735D"/>
     <w:rsid w:val="00C05C17"/>
     <w:rsid w:val="00C16DD4"/>
+    <w:rsid w:val="00C33F73"/>
     <w:rsid w:val="00C730A1"/>
     <w:rsid w:val="00C8222C"/>
     <w:rsid w:val="00CA16CC"/>
+    <w:rsid w:val="00D2541D"/>
     <w:rsid w:val="00D3193C"/>
     <w:rsid w:val="00D6000C"/>
     <w:rsid w:val="00D6792E"/>
@@ -27618,6 +28181,7 @@
     <w:rsid w:val="00DE6686"/>
     <w:rsid w:val="00E0113C"/>
     <w:rsid w:val="00E01D08"/>
+    <w:rsid w:val="00E05393"/>
     <w:rsid w:val="00E05B0D"/>
     <w:rsid w:val="00E25F49"/>
     <w:rsid w:val="00E3600C"/>
@@ -28090,7 +28654,7 @@
     <w:basedOn w:val="Fuentedeprrafopredeter"/>
     <w:uiPriority w:val="99"/>
     <w:semiHidden/>
-    <w:rsid w:val="00D6000C"/>
+    <w:rsid w:val="00E05393"/>
     <w:rPr>
       <w:color w:val="666666"/>
     </w:rPr>
@@ -28109,6 +28673,28 @@
   <w:style w:type="paragraph" w:customStyle="1" w:styleId="0588BC87E8A948EFB873204B452E1188">
     <w:name w:val="0588BC87E8A948EFB873204B452E1188"/>
     <w:rsid w:val="005151A5"/>
+    <w:pPr>
+      <w:spacing w:line="278" w:lineRule="auto"/>
+    </w:pPr>
+    <w:rPr>
+      <w:sz w:val="24"/>
+      <w:szCs w:val="24"/>
+    </w:rPr>
+  </w:style>
+  <w:style w:type="paragraph" w:customStyle="1" w:styleId="094796401955477A82BD64A38A5B6501">
+    <w:name w:val="094796401955477A82BD64A38A5B6501"/>
+    <w:rsid w:val="00E05393"/>
+    <w:pPr>
+      <w:spacing w:line="278" w:lineRule="auto"/>
+    </w:pPr>
+    <w:rPr>
+      <w:sz w:val="24"/>
+      <w:szCs w:val="24"/>
+    </w:rPr>
+  </w:style>
+  <w:style w:type="paragraph" w:customStyle="1" w:styleId="59E09FEC2F714AB5BD29990743C23B65">
+    <w:name w:val="59E09FEC2F714AB5BD29990743C23B65"/>
+    <w:rsid w:val="00E05393"/>
     <w:pPr>
       <w:spacing w:line="278" w:lineRule="auto"/>
     </w:pPr>
@@ -28424,7 +29010,7 @@
 
 <file path=word/webextensions/taskpanes.xml><?xml version="1.0" encoding="utf-8"?>
 <wetp:taskpanes xmlns:wetp="http://schemas.microsoft.com/office/webextensions/taskpanes/2010/11">
-  <wetp:taskpane dockstate="right" visibility="0" width="441" row="1">
+  <wetp:taskpane dockstate="right" visibility="0" width="438" row="2">
     <wetp:webextensionref xmlns:r="http://schemas.openxmlformats.org/officeDocument/2006/relationships" r:id="rId1"/>
   </wetp:taskpane>
 </wetp:taskpanes>
@@ -28437,7 +29023,9 @@
     <we:reference id="WA104382081" version="1.55.1.0" store="es-ES" storeType="OMEX"/>
   </we:alternateReferences>
   <we:properties>
-    <we:property name="MENDELEY_CITATIONS" value="[{&quot;citationID&quot;:&quot;MENDELEY_CITATION_f28c964d-17bc-458d-a527-1c1e9395ce36&quot;,&quot;properties&quot;:{&quot;noteIndex&quot;:0},&quot;isEdited&quot;:false,&quot;manualOverride&quot;:{&quot;isManuallyOverridden&quot;:false,&quot;citeprocText&quot;:&quot;[1]&quot;,&quot;manualOverrideText&quot;:&quot;&quot;},&quot;citationTag&quot;:&quot;MENDELEY_CITATION_v3_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&quot;,&quot;citationItems&quot;:[{&quot;id&quot;:&quot;c25252e4-a07b-3e36-a85f-416432921fd5&quot;,&quot;itemData&quot;:{&quot;type&quot;:&quot;article-journal&quot;,&quot;id&quot;:&quot;c25252e4-a07b-3e36-a85f-416432921fd5&quot;,&quot;title&quot;:&quot;Artificial Intelligence and the Future of Work: Job Shifting Not Job Loss&quot;,&quot;author&quot;:[{&quot;family&quot;:&quot;George&quot;,&quot;given&quot;:&quot;A Shaji&quot;,&quot;parse-names&quot;:false,&quot;dropping-particle&quot;:&quot;&quot;,&quot;non-dropping-particle&quot;:&quot;&quot;}],&quot;DOI&quot;:&quot;10.5281/zenodo.10936490&quot;,&quot;URL&quot;:&quot;www.puirp.com&quot;,&quot;issued&quot;:{&quot;date-parts&quot;:[[2024]]},&quot;abstract&quot;:&quot;As artificial intelligence (AI) and automation technologies advance fast, substantial discussion remains about their influence on jobs and employment. Some expect enormous job losses and structural unemployment as computers and algorithms replace human workers in a variety of industries. However, the prevailing scholarly viewpoint is that, while AI will revolutionize work, it will not result in long-term job losses. AI is projected to have a net impact of job shifting rather than job loss by increasing productivity, accelerating economic growth, changing the structure of jobs, and allowing sectoral employment transitions. Detailed productivity evaluations show a strong correlation between productivity gains and net job creation. A 2022 meta-analysis of 127 papers indicated that productivity increases consistently improve employment and wages. Additional crosscountry data from the OECD shows this association across a wide range of industrialized and emerging countries. Meanwhile, long-term data reveal that working hours have steadily decreased in recent decades without causing significant job losses, while productivity and earnings have increased in parallel. Integrating AI to automate monotonous jobs and improve human capabilities could fuel this trend. Displaced workers can transfer into new occupational jobs with adequate skilling and transition support rather than facing long periods of unemployment. Sectoral shifts have also characterized historical labor market evolutions following technology disruptions. As innovative industries outcompete legacy ones, economies undergo structural transformations. Current trends show that services are expanding while manufacturing is contracting in most sophisticated countries. AI and automation will most certainly speed the shift of occupations from manual production to skilled service roles, hence facilitating this transition. With appropriate government provisions such as retraining programs and educational expansions, the necessary employment transitions between sectors can occur smoothly rather than disruptively. In summary, while the AI revolution will fundamentally alter labor markets, effective governmental measures can ensure that job shifting outpaces loss. Workers must be supported in regularly adapting their skill sets and transitioning into new roles. Firms should invest in personnel skill development as well as smart technology integration. And governments should develop multiple ways to assist different groups in navigating the transitions, including the extension of social safety nets where appropriate. With coordinated efforts to optimize human-AI collaboration, this technology tsunami does not have to result in negative job impacts, but can instead place people in more rewarding, higher-value jobs. The view remains cautiously encouraging, providing stakeholders focus on boosting human talents to share in the AI-driven productivity windfall rather than simply displacing them.&quot;,&quot;container-title-short&quot;:&quot;&quot;},&quot;isTemporary&quot;:false,&quot;suppress-author&quot;:false,&quot;composite&quot;:false,&quot;author-only&quot;:false}]},{&quot;citationID&quot;:&quot;MENDELEY_CITATION_8dfcf854-6ba4-433d-8326-861463938067&quot;,&quot;properties&quot;:{&quot;noteIndex&quot;:0},&quot;isEdited&quot;:false,&quot;manualOverride&quot;:{&quot;isManuallyOverridden&quot;:false,&quot;citeprocText&quot;:&quot;[2]&quot;,&quot;manualOverrideText&quot;:&quot;&quot;},&quot;citationTag&quot;:&quot;MENDELEY_CITATION_v3_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&quot;,&quot;citationItems&quot;:[{&quot;id&quot;:&quot;fc44d4d6-d406-3b0d-9047-f22566bd0362&quot;,&quot;itemData&quot;:{&quot;type&quot;:&quot;article&quot;,&quot;id&quot;:&quot;fc44d4d6-d406-3b0d-9047-f22566bd0362&quot;,&quot;title&quot;:&quot;DeepSeek and GPT Fall Behind: Claude Leads in Zero-Shot Consumer Complaints Classification&quot;,&quot;author&quot;:[{&quot;family&quot;:&quot;Roumeliotis&quot;,&quot;given&quot;:&quot;Konstantinos I.&quot;,&quot;parse-names&quot;:false,&quot;dropping-particle&quot;:&quot;&quot;,&quot;non-dropping-particle&quot;:&quot;&quot;},{&quot;family&quot;:&quot;Tselikas&quot;,&quot;given&quot;:&quot;Nikolaos D.&quot;,&quot;parse-names&quot;:false,&quot;dropping-particle&quot;:&quot;&quot;,&quot;non-dropping-particle&quot;:&quot;&quot;},{&quot;family&quot;:&quot;Nasiopoulos&quot;,&quot;given&quot;:&quot;Dimitrios K.&quot;,&quot;parse-names&quot;:false,&quot;dropping-particle&quot;:&quot;&quot;,&quot;non-dropping-particle&quot;:&quot;&quot;}],&quot;DOI&quot;:&quot;10.20944/preprints202502.0720.v1&quot;,&quot;URL&quot;:&quot;https://www.preprints.org/manuscript/202502.0720/v1&quot;,&quot;issued&quot;:{&quot;date-parts&quot;:[[2025,2,10]]},&quot;abstract&quot;:&quot;&lt;p&gt;Large language models (LLMs) have demonstrated remarkable capabilities in various natural language processing (NLP) tasks, but their effectiveness in real-world consumer complaint classification without fine-tuning remains uncertain. Zero-shot classification is particularly challenging in finance, where complaint categories often overlap, requiring a deep understanding of nuanced language. In this study, we evaluate the zero-shot classification performance of leading LLMs— DeepSeek-V3, OpenAI’s GPT-4o and GPT-4o mini, and Anthropic’s Claude 3.5 Sonnet and Claude 3.5 Haiku—on consumer complaints submitted to the Consumer Financial Protection Bureau (CFPB). These models were tasked with categorizing complaints into five predefined financial classes based solely on complaint text. Performance was measured using accuracy, precision, recall, F1-score, and heatmaps to identify classification patterns. While DeepSeek Chat and GPT-4o produced competitive results, Claude 3.5 Sonnet consistently outperformed all models, demonstrating superior classification accuracy and efficiency. These findings highlight the relative strengths and limitations of DeepSeek-V3 and other top-tier models in financial text processing, providing valuable insights into their practical applications.&lt;/p&gt;&quot;,&quot;container-title-short&quot;:&quot;&quot;},&quot;isTemporary&quot;:false,&quot;suppress-author&quot;:false,&quot;composite&quot;:false,&quot;author-only&quot;:false}]},{&quot;citationID&quot;:&quot;MENDELEY_CITATION_87b9dfdf-fd2a-44be-8bd3-a3e8e237b739&quot;,&quot;properties&quot;:{&quot;noteIndex&quot;:0},&quot;isEdited&quot;:false,&quot;manualOverride&quot;:{&quot;isManuallyOverridden&quot;:false,&quot;citeprocText&quot;:&quot;[3]&quot;,&quot;manualOverrideText&quot;:&quot;&quot;},&quot;citationTag&quot;:&quot;MENDELEY_CITATION_v3_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&quot;,&quot;citationItems&quot;:[{&quot;id&quot;:&quot;e0330f39-09fd-3be8-8a3f-0989b0c4966c&quot;,&quot;itemData&quot;:{&quot;type&quot;:&quot;article-journal&quot;,&quot;id&quot;:&quot;e0330f39-09fd-3be8-8a3f-0989b0c4966c&quot;,&quot;title&quot;:&quot;Inteligencia Artificial en la Educación: Estado del Arte&quot;,&quot;author&quot;:[{&quot;family&quot;:&quot;Sambola&quot;,&quot;given&quot;:&quot;Dexon-Mckensy&quot;,&quot;parse-names&quot;:false,&quot;dropping-particle&quot;:&quot;&quot;,&quot;non-dropping-particle&quot;:&quot;&quot;}],&quot;container-title&quot;:&quot;Wani&quot;,&quot;DOI&quot;:&quot;10.5377/wani.v39i79.16806&quot;,&quot;ISSN&quot;:&quot;1813-369X&quot;,&quot;issued&quot;:{&quot;date-parts&quot;:[[2023,10,11]]},&quot;abstract&quot;:&quot;La Inteligencia Artificial en la Educación es un campo de investigación científica que ha surgido a lo largo de 3 décadas, está particularmente interesada en el desarrollo de herramientas basadas en IA para apoyar y comprender los procesos educativos. Esta investigación tiene como objetivo presentar el estado de la Inteligencia Artificial en la Educación, utilizando un método de revisión exhaustiva de la literatura. Comprendió 3 etapas principales: selección, clasificación y análisis de la literatura. Esto permitió identificar las aplicaciones, tecnologías, desafíos e implicaciones éticas de la Inteligencia Artificial en la Educación&quot;,&quot;publisher&quot;:&quot;Consejo Nacional de Universidades&quot;,&quot;issue&quot;:&quot;79&quot;,&quot;container-title-short&quot;:&quot;&quot;},&quot;isTemporary&quot;:false}]},{&quot;citationID&quot;:&quot;MENDELEY_CITATION_18ca400e-4fcb-42c5-82bc-033d3d56f058&quot;,&quot;properties&quot;:{&quot;noteIndex&quot;:0},&quot;isEdited&quot;:false,&quot;manualOverride&quot;:{&quot;isManuallyOverridden&quot;:false,&quot;citeprocText&quot;:&quot;[4]&quot;,&quot;manualOverrideText&quot;:&quot;&quot;},&quot;citationTag&quot;:&quot;MENDELEY_CITATION_v3_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&quot;,&quot;citationItems&quot;:[{&quot;id&quot;:&quot;d60509d4-c1c4-3bc5-b29e-e615e26af0d4&quot;,&quot;itemData&quot;:{&quot;type&quot;:&quot;report&quot;,&quot;id&quot;:&quot;d60509d4-c1c4-3bc5-b29e-e615e26af0d4&quot;,&quot;title&quot;:&quot;Um Estudo Acerca do Uso de IA Generativa no Apoio à Aprendizagem de Programação&quot;,&quot;author&quot;:[{&quot;family&quot;:&quot;Almeida de Bem&quot;,&quot;given&quot;:&quot;Rafael&quot;,&quot;parse-names&quot;:false,&quot;dropping-particle&quot;:&quot;&quot;,&quot;non-dropping-particle&quot;:&quot;&quot;},{&quot;family&quot;:&quot;Aparecida Konzen&quot;,&quot;given&quot;:&quot;Andréa&quot;,&quot;parse-names&quot;:false,&quot;dropping-particle&quot;:&quot;&quot;,&quot;non-dropping-particle&quot;:&quot;&quot;}],&quot;URL&quot;:&quot;https://github.com/huggingface/transformers&quot;,&quot;issued&quot;:{&quot;date-parts&quot;:[[2024,6]]},&quot;language&quot;:&quot;portugués&quot;,&quot;abstract&quot;:&quot;Resumo-Avanços recentes em Inteligência Artificial (IA) têm transformado sua aplicação de uma explora-ção teórica para implementação prática, criando novas oportunidades e desafios em ambientes de aprendiza-gem. Este trabalho de conclusão de curso, realizado na Pontifícia Universidade Católica do Rio Grande do Sul, explora como a IA Generativa pode aprimorar experi-ências de aprendizagem na disciplina de Fundamentos da Programação. O sistema desenvolvido utiliza gran-des modelos de linguagem e emprega conceitos-chave como transformers, zero-shot prompting e Retrieval-Augmented Generation para fornecer assistência perso-nalizada aos estudantes, gerando respostas relevantes e sensíveis ao contexto. Os resultados destacam tanto os benefícios quanto as limitações da IA Generativa em âmbitos de aprendizagem. Palavras-chave-Inteligência Artificial Generativa, aprendizado em ciência da computação, grandes mo-delos de linguagem, transformers, Retrieval-Augmented Generation, respostas sensíveis ao contexto. Abstract-Recent advances in artificial intelligence (AI) have transformed its application from theoretical exploration to practical implementation, creating new opportunities and challenges in learning environments. This undergraduate thesis, conducted at the Pontifícia Universidade Católica do Rio Grande do Sul, explores how generative AI can enhance learning experiences in the Fundamentals of Programming course. The developed system utilizes large language models and employs key concepts such as transformers, zero-shot prompting, and Retrieval-Augmented Generation to provide personalized assistance to students, generating relevant and context-aware responses. The results highlight both the benefits and limitations of generative AI in improving learning outcomes.&quot;,&quot;container-title-short&quot;:&quot;&quot;},&quot;isTemporary&quot;:false,&quot;suppress-author&quot;:false,&quot;composite&quot;:false,&quot;author-only&quot;:false}]},{&quot;citationID&quot;:&quot;MENDELEY_CITATION_f29cf598-0c7e-4283-885d-081b23b87f6f&quot;,&quot;properties&quot;:{&quot;noteIndex&quot;:0},&quot;isEdited&quot;:false,&quot;manualOverride&quot;:{&quot;isManuallyOverridden&quot;:false,&quot;citeprocText&quot;:&quot;[5]&quot;,&quot;manualOverrideText&quot;:&quot;&quot;},&quot;citationTag&quot;:&quot;MENDELEY_CITATION_v3_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&quot;,&quot;citationItems&quot;:[{&quot;id&quot;:&quot;3b30d636-f4f6-39fc-9195-d6ac1038d075&quot;,&quot;itemData&quot;:{&quot;type&quot;:&quot;article-journal&quot;,&quot;id&quot;:&quot;3b30d636-f4f6-39fc-9195-d6ac1038d075&quot;,&quot;title&quot;:&quot;Benefits, Challenges, and Methods of Artificial Intelligence (AI) Chatbots in Education: A Systematic Literature Review&quot;,&quot;author&quot;:[{&quot;family&quot;:&quot;Gökçearslan&quot;,&quot;given&quot;:&quot;Şahin&quot;,&quot;parse-names&quot;:false,&quot;dropping-particle&quot;:&quot;&quot;,&quot;non-dropping-particle&quot;:&quot;&quot;},{&quot;family&quot;:&quot;Tosun&quot;,&quot;given&quot;:&quot;Cansel&quot;,&quot;parse-names&quot;:false,&quot;dropping-particle&quot;:&quot;&quot;,&quot;non-dropping-particle&quot;:&quot;&quot;},{&quot;family&quot;:&quot;Erdemir&quot;,&quot;given&quot;:&quot;Zeynep Gizem&quot;,&quot;parse-names&quot;:false,&quot;dropping-particle&quot;:&quot;&quot;,&quot;non-dropping-particle&quot;:&quot;&quot;}],&quot;container-title&quot;:&quot;International Journal of Technology in Education&quot;,&quot;DOI&quot;:&quot;10.46328/ijte.600&quot;,&quot;issued&quot;:{&quot;date-parts&quot;:[[2024,2,4]]},&quot;page&quot;:&quot;19-39&quot;,&quot;abstract&quot;:&quot;In many fields, AI chatbots continue to be popular with new tools and attract the attention of universities, K12 schools, educational organizations, and researchers. The aim of this research is to review the research on AI chatbots by restricting it to the category of education and to examine this research from a methodological point of view. Therefore, we performed a systematic literature review with a sample of 37 SSCI articles published in the educational context. Within the scope of the selected studies, the advantages and disadvantages of AI chatbots in education for students and educators, as well as the types of chatbots used, year, keywords, and method were analyzed. According to the research results, increased motivation to learn and language skill development are advantages for students, while cost-effectiveness and reduced workload are advantages for educators. Limited interaction, misleading answers for learners, originality, and plagiarism are the most common disadvantages for educators. The study also includes research results and recommendations related to the methodological review.&quot;,&quot;publisher&quot;:&quot;ISTES Organization&quot;,&quot;issue&quot;:&quot;1&quot;,&quot;volume&quot;:&quot;7&quot;,&quot;container-title-short&quot;:&quot;&quot;},&quot;isTemporary&quot;:false,&quot;suppress-author&quot;:false,&quot;composite&quot;:false,&quot;author-only&quot;:false}]},{&quot;citationID&quot;:&quot;MENDELEY_CITATION_dbc60ebf-740b-4b00-a6d4-d6aa8fe54c63&quot;,&quot;properties&quot;:{&quot;noteIndex&quot;:0},&quot;isEdited&quot;:false,&quot;manualOverride&quot;:{&quot;isManuallyOverridden&quot;:false,&quot;citeprocText&quot;:&quot;[6]&quot;,&quot;manualOverrideText&quot;:&quot;&quot;},&quot;citationTag&quot;:&quot;MENDELEY_CITATION_v3_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&quot;,&quot;citationItems&quot;:[{&quot;id&quot;:&quot;fdaca172-7bec-3f78-83a1-fe7bc6dc07b5&quot;,&quot;itemData&quot;:{&quot;type&quot;:&quot;webpage&quot;,&quot;id&quot;:&quot;fdaca172-7bec-3f78-83a1-fe7bc6dc07b5&quot;,&quot;title&quot;:&quot;INFORME GENERAL DE PISA-D 2018&quot;,&quot;author&quot;:[{&quot;family&quot;:&quot;Josette Arévalo Gross&quot;,&quot;given&quot;:&quot;&quot;,&quot;parse-names&quot;:false,&quot;dropping-particle&quot;:&quot;&quot;,&quot;non-dropping-particle&quot;:&quot;&quot;}],&quot;accessed&quot;:{&quot;date-parts&quot;:[[2024,12,9]]},&quot;URL&quot;:&quot;https://issuu.com/ineval/docs/cie_informegeneralpisa18_20181123&quot;,&quot;issued&quot;:{&quot;date-parts&quot;:[[2018,12,11]]},&quot;page&quot;:&quot;1-152&quot;,&quot;container-title-short&quot;:&quot;&quot;},&quot;isTemporary&quot;:false,&quot;suppress-author&quot;:false,&quot;composite&quot;:false,&quot;author-only&quot;:false}]},{&quot;citationID&quot;:&quot;MENDELEY_CITATION_66addef9-3cf0-4f6d-a9e4-490c23fdf78c&quot;,&quot;properties&quot;:{&quot;noteIndex&quot;:0},&quot;isEdited&quot;:false,&quot;manualOverride&quot;:{&quot;isManuallyOverridden&quot;:false,&quot;citeprocText&quot;:&quot;[6]&quot;,&quot;manualOverrideText&quot;:&quot;&quot;},&quot;citationTag&quot;:&quot;MENDELEY_CITATION_v3_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&quot;,&quot;citationItems&quot;:[{&quot;id&quot;:&quot;fdaca172-7bec-3f78-83a1-fe7bc6dc07b5&quot;,&quot;itemData&quot;:{&quot;type&quot;:&quot;webpage&quot;,&quot;id&quot;:&quot;fdaca172-7bec-3f78-83a1-fe7bc6dc07b5&quot;,&quot;title&quot;:&quot;INFORME GENERAL DE PISA-D 2018&quot;,&quot;author&quot;:[{&quot;family&quot;:&quot;Josette Arévalo Gross&quot;,&quot;given&quot;:&quot;&quot;,&quot;parse-names&quot;:false,&quot;dropping-particle&quot;:&quot;&quot;,&quot;non-dropping-particle&quot;:&quot;&quot;}],&quot;accessed&quot;:{&quot;date-parts&quot;:[[2024,12,9]]},&quot;URL&quot;:&quot;https://issuu.com/ineval/docs/cie_informegeneralpisa18_20181123&quot;,&quot;issued&quot;:{&quot;date-parts&quot;:[[2018,12,11]]},&quot;page&quot;:&quot;1-152&quot;,&quot;container-title-short&quot;:&quot;&quot;},&quot;isTemporary&quot;:false,&quot;suppress-author&quot;:false,&quot;composite&quot;:false,&quot;author-only&quot;:false}]},{&quot;citationID&quot;:&quot;MENDELEY_CITATION_672db128-b738-439d-9135-a845cbcddc48&quot;,&quot;properties&quot;:{&quot;noteIndex&quot;:0},&quot;isEdited&quot;:false,&quot;manualOverride&quot;:{&quot;isManuallyOverridden&quot;:false,&quot;citeprocText&quot;:&quot;[7]&quot;,&quot;manualOverrideText&quot;:&quot;&quot;},&quot;citationTag&quot;:&quot;MENDELEY_CITATION_v3_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&quot;,&quot;citationItems&quot;:[{&quot;id&quot;:&quot;45374eae-2cc4-3c9b-a601-9e01c15ca3fc&quot;,&quot;itemData&quot;:{&quot;type&quot;:&quot;article-journal&quot;,&quot;id&quot;:&quot;45374eae-2cc4-3c9b-a601-9e01c15ca3fc&quot;,&quot;title&quot;:&quot;Los recursos tecnológicos y su influencia en el desempeño de los docentes&quot;,&quot;author&quot;:[{&quot;family&quot;:&quot;Jama Zambrano&quot;,&quot;given&quot;:&quot;Víctor R.&quot;,&quot;parse-names&quot;:false,&quot;dropping-particle&quot;:&quot;&quot;,&quot;non-dropping-particle&quot;:&quot;&quot;},{&quot;family&quot;:&quot;Cornejo Zambrano&quot;,&quot;given&quot;:&quot;Jeovana K.&quot;,&quot;parse-names&quot;:false,&quot;dropping-particle&quot;:&quot;&quot;,&quot;non-dropping-particle&quot;:&quot;&quot;}],&quot;container-title&quot;:&quot;Dominio de las Ciencias, ISSN-e 2477-8818, Vol. 2, Nº. Extra 3, 2016 (Ejemplar dedicado a: Monográfico de Ciencias de la Salud), págs. 201-219&quot;,&quot;accessed&quot;:{&quot;date-parts&quot;:[[2025,8,28]]},&quot;ISSN&quot;:&quot;2477-8818&quot;,&quot;URL&quot;:&quot;https://dialnet.unirioja.es/servlet/articulo?codigo=6324010&amp;info=resumen&amp;idioma=ENG&quot;,&quot;issued&quot;:{&quot;date-parts&quot;:[[2016]]},&quot;page&quot;:&quot;201-219&quot;,&quot;abstract&quot;:&quot;A quantitative and qualitative, descriptive and transversal study was carried out in the \&quot;Cinco de\nMayo\&quot; Private Education Unit of the city of Chone, an institution attached to the \&quot;Eloy Alfaro\&quot;\nLaica University of Manabí, Ecuador, in a population of 134 students from Basic general higher\neducation and 33 teachers, with a view to demonstrating how technological resources influence the\nperformance of teachers. The results of the series showed that the use of technological resources has\na significant level of importance with respect to the performance of teachers in the development of\ntheir work within the classroom, as demonstrated by the results of the research instruments that were\napplied , Since the percentages showed that the use of technological resources has a positive impact\non the motivation and interest of the student towards teaching and learning therefore contribute to\nimprove the performance of the teacher who applies them in their classes.&quot;,&quot;publisher&quot;:&quot;Polo de Capacitación, Investigación y Publicación (POCAIP)&quot;,&quot;issue&quot;:&quot;3&quot;,&quot;volume&quot;:&quot;2&quot;,&quot;container-title-short&quot;:&quot;&quot;},&quot;isTemporary&quot;:false,&quot;suppress-author&quot;:false,&quot;composite&quot;:false,&quot;author-only&quot;:false}]},{&quot;citationID&quot;:&quot;MENDELEY_CITATION_66e36815-5ffa-4212-9ff7-671e9ed2b041&quot;,&quot;properties&quot;:{&quot;noteIndex&quot;:0},&quot;isEdited&quot;:false,&quot;manualOverride&quot;:{&quot;isManuallyOverridden&quot;:false,&quot;citeprocText&quot;:&quot;[8]&quot;,&quot;manualOverrideText&quot;:&quot;&quot;},&quot;citationTag&quot;:&quot;MENDELEY_CITATION_v3_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&quot;,&quot;citationItems&quot;:[{&quot;id&quot;:&quot;0c91b55a-e2f3-3d74-bf57-be07508860c4&quot;,&quot;itemData&quot;:{&quot;type&quot;:&quot;article-journal&quot;,&quot;id&quot;:&quot;0c91b55a-e2f3-3d74-bf57-be07508860c4&quot;,&quot;title&quot;:&quot;Análisis de la Brecha Digital y el Acceso a Recursos Tecnológicos en las Instituciones de Educación Secundaria en Ecuador&quot;,&quot;author&quot;:[{&quot;family&quot;:&quot;Yanine&quot;,&quot;given&quot;:&quot;Evelin&quot;,&quot;parse-names&quot;:false,&quot;dropping-particle&quot;:&quot;&quot;,&quot;non-dropping-particle&quot;:&quot;&quot;},{&quot;family&quot;:&quot;Olvera&quot;,&quot;given&quot;:&quot;Muñoz&quot;,&quot;parse-names&quot;:false,&quot;dropping-particle&quot;:&quot;&quot;,&quot;non-dropping-particle&quot;:&quot;&quot;},{&quot;family&quot;:&quot;Georgina&quot;,&quot;given&quot;:&quot;Elsa&quot;,&quot;parse-names&quot;:false,&quot;dropping-particle&quot;:&quot;&quot;,&quot;non-dropping-particle&quot;:&quot;&quot;},{&quot;family&quot;:&quot;Bastidas&quot;,&quot;given&quot;:&quot;Jacome&quot;,&quot;parse-names&quot;:false,&quot;dropping-particle&quot;:&quot;&quot;,&quot;non-dropping-particle&quot;:&quot;&quot;},{&quot;family&quot;:&quot;Janet&quot;,&quot;given&quot;:&quot;Guadalupe&quot;,&quot;parse-names&quot;:false,&quot;dropping-particle&quot;:&quot;&quot;,&quot;non-dropping-particle&quot;:&quot;&quot;},{&quot;family&quot;:&quot;Espinoza&quot;,&quot;given&quot;:&quot;Medina&quot;,&quot;parse-names&quot;:false,&quot;dropping-particle&quot;:&quot;&quot;,&quot;non-dropping-particle&quot;:&quot;&quot;}],&quot;container-title&quot;:&quot;Ciencia Latina Revista Científica Multidisciplinar&quot;,&quot;accessed&quot;:{&quot;date-parts&quot;:[[2025,8,28]]},&quot;DOI&quot;:&quot;10.37811/CL_RCM.V8I2.11086&quot;,&quot;ISSN&quot;:&quot;2707-2215&quot;,&quot;URL&quot;:&quot;https://ciencialatina.org/index.php/cienciala/article/view/11086/16273&quot;,&quot;issued&quot;:{&quot;date-parts&quot;:[[2024,5,20]]},&quot;page&quot;:&quot;6698-6719&quot;,&quot;abstract&quot;:&quot;This study aimed to analyze the digital divide and access to technological resources in secondary education institutions in Ecuador. A descriptive and cross-sectional research design was employed, with a mixed approach combining quantitative and qualitative methods. The sample consisted of 360 educational institutions selected through stratified sampling. Structured questionnaires, semi-structured interviews, and documentary analysis were applied to collect data on technological infrastructure, connectivity, available devices, the use of ICT in the teaching-learning process, and factors influencing the digital divide. The results revealed significant differences in access to and use of technological resources between public and private institutions, as well as between urban and rural areas. Challenges related to teacher training, digital competencies, and the effective integration of ICT in the curriculum were identified. Recommendations are proposed to strengthen digital inclusion programs, promote teacher training, and articulate educational policies with digital inclusion policies at the national level. This study contributes to the understanding of the digital divide in Ecuadorian education and provides inputs for the design of public policies aimed at promoting equity and educational quality in the digital era.&quot;,&quot;publisher&quot;:&quot;Asociacion Latinoamericana para el Avance de la Ciencia&quot;,&quot;issue&quot;:&quot;2&quot;,&quot;volume&quot;:&quot;8&quot;,&quot;container-title-short&quot;:&quot;&quot;},&quot;isTemporary&quot;:false,&quot;suppress-author&quot;:false,&quot;composite&quot;:false,&quot;author-only&quot;:false}]},{&quot;citationID&quot;:&quot;MENDELEY_CITATION_f4f2cd47-c4a2-4bbf-a39f-35cb83db892a&quot;,&quot;properties&quot;:{&quot;noteIndex&quot;:0},&quot;isEdited&quot;:false,&quot;manualOverride&quot;:{&quot;isManuallyOverridden&quot;:false,&quot;citeprocText&quot;:&quot;[9]&quot;,&quot;manualOverrideText&quot;:&quot;&quot;},&quot;citationTag&quot;:&quot;MENDELEY_CITATION_v3_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&quot;,&quot;citationItems&quot;:[{&quot;id&quot;:&quot;45f625d5-b48d-33c8-8ac0-a70b15d9caac&quot;,&quot;itemData&quot;:{&quot;type&quot;:&quot;article-journal&quot;,&quot;id&quot;:&quot;45f625d5-b48d-33c8-8ac0-a70b15d9caac&quot;,&quot;title&quot;:&quot;Recursos tecnológicos para el aprendizaje en el marco de la educación inclusiva ecuatoriana&quot;,&quot;author&quot;:[{&quot;family&quot;:&quot;Arteaga-Tuba&quot;,&quot;given&quot;:&quot;Guillermo José&quot;,&quot;parse-names&quot;:false,&quot;dropping-particle&quot;:&quot;&quot;,&quot;non-dropping-particle&quot;:&quot;&quot;},{&quot;family&quot;:&quot;Arteaga-Tuba&quot;,&quot;given&quot;:&quot;Guillermo José&quot;,&quot;parse-names&quot;:false,&quot;dropping-particle&quot;:&quot;&quot;,&quot;non-dropping-particle&quot;:&quot;&quot;}],&quot;container-title&quot;:&quot;Cienciamatria. Revista Interdisciplinaria de Humanidades, Educación, Ciencia y Tecnología&quot;,&quot;accessed&quot;:{&quot;date-parts&quot;:[[2025,8,28]]},&quot;DOI&quot;:&quot;10.35381/CM.V10I18.1272&quot;,&quot;ISSN&quot;:&quot;2542-3029&quot;,&quot;URL&quot;:&quot;http://ve.scielo.org/scielo.php?script=sci_arttext&amp;pid=S2542-30292024000100289&amp;lng=es&amp;nrm=iso&amp;tlng=es&quot;,&quot;issued&quot;:{&quot;date-parts&quot;:[[2024,1,1]]},&quot;page&quot;:&quot;289-312&quot;,&quot;abstract&quot;:&quot;Se expone este artículo con el propósito de indagar cómo se ha dado la educación inclusiva en Ecuador y explorar cómo los recursos tecnológicos aparecen coligados para el fomento del aprendizaje inclusivo. Se corresponde con un estudio de naturaleza documental desarrollado mediante un diseño bibliográfico. A partir de los resultados, se pudo enunciar que Ecuador, muestra avances significativos en la promoción de la educación para todos, ya que, progresivamente ha implementado políticas y programas, aunados a un marco normativo, con el que que busca garantizar el acceso equitativo a la educación, especialmente para aquellos con discapacidades y/o necesidades especiales. Sin embargo, aún enfrenta desafíos importantes en función de lograr una verdadera educación inclusiva y de calidad en todo el sistema educativo.&quot;,&quot;publisher&quot;:&quot;Los autores&quot;,&quot;issue&quot;:&quot;18&quot;,&quot;volume&quot;:&quot;10&quot;,&quot;container-title-short&quot;:&quot;&quot;},&quot;isTemporary&quot;:false,&quot;suppress-author&quot;:false,&quot;composite&quot;:false,&quot;author-only&quot;:false}]},{&quot;citationID&quot;:&quot;MENDELEY_CITATION_a6cee5f9-fd2b-4b70-a86f-908cd824a894&quot;,&quot;properties&quot;:{&quot;noteIndex&quot;:0},&quot;isEdited&quot;:false,&quot;manualOverride&quot;:{&quot;isManuallyOverridden&quot;:false,&quot;citeprocText&quot;:&quot;[6]&quot;,&quot;manualOverrideText&quot;:&quot;&quot;},&quot;citationTag&quot;:&quot;MENDELEY_CITATION_v3_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&quot;,&quot;citationItems&quot;:[{&quot;id&quot;:&quot;fdaca172-7bec-3f78-83a1-fe7bc6dc07b5&quot;,&quot;itemData&quot;:{&quot;type&quot;:&quot;webpage&quot;,&quot;id&quot;:&quot;fdaca172-7bec-3f78-83a1-fe7bc6dc07b5&quot;,&quot;title&quot;:&quot;INFORME GENERAL DE PISA-D 2018&quot;,&quot;author&quot;:[{&quot;family&quot;:&quot;Josette Arévalo Gross&quot;,&quot;given&quot;:&quot;&quot;,&quot;parse-names&quot;:false,&quot;dropping-particle&quot;:&quot;&quot;,&quot;non-dropping-particle&quot;:&quot;&quot;}],&quot;accessed&quot;:{&quot;date-parts&quot;:[[2024,12,9]]},&quot;URL&quot;:&quot;https://issuu.com/ineval/docs/cie_informegeneralpisa18_20181123&quot;,&quot;issued&quot;:{&quot;date-parts&quot;:[[2018,12,11]]},&quot;page&quot;:&quot;1-152&quot;,&quot;container-title-short&quot;:&quot;&quot;},&quot;isTemporary&quot;:false,&quot;suppress-author&quot;:false,&quot;composite&quot;:false,&quot;author-only&quot;:false}]},{&quot;citationID&quot;:&quot;MENDELEY_CITATION_13683c1b-9ea0-41a2-b5d2-93531a6b0129&quot;,&quot;properties&quot;:{&quot;noteIndex&quot;:0},&quot;isEdited&quot;:false,&quot;manualOverride&quot;:{&quot;isManuallyOverridden&quot;:false,&quot;citeprocText&quot;:&quot;[10]&quot;,&quot;manualOverrideText&quot;:&quot;&quot;},&quot;citationTag&quot;:&quot;MENDELEY_CITATION_v3_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&quot;,&quot;citationItems&quot;:[{&quot;id&quot;:&quot;e37207eb-1ea6-3f0f-b3a9-1c64e74925da&quot;,&quot;itemData&quot;:{&quot;type&quot;:&quot;article-journal&quot;,&quot;id&quot;:&quot;e37207eb-1ea6-3f0f-b3a9-1c64e74925da&quot;,&quot;title&quot;:&quot;Plataformas de Aprendizaje Adaptativo: Aprovechando la IA para una Educación Personalizada&quot;,&quot;author&quot;:[{&quot;family&quot;:&quot;Agurto&quot;,&quot;given&quot;:&quot;Stefanie Antonella Torres&quot;,&quot;parse-names&quot;:false,&quot;dropping-particle&quot;:&quot;&quot;,&quot;non-dropping-particle&quot;:&quot;&quot;},{&quot;family&quot;:&quot;Agurto&quot;,&quot;given&quot;:&quot;Stefanie Antonella Torres&quot;,&quot;parse-names&quot;:false,&quot;dropping-particle&quot;:&quot;&quot;,&quot;non-dropping-particle&quot;:&quot;&quot;},{&quot;family&quot;:&quot;Córdova&quot;,&quot;given&quot;:&quot;Nora Raquel González&quot;,&quot;parse-names&quot;:false,&quot;dropping-particle&quot;:&quot;&quot;,&quot;non-dropping-particle&quot;:&quot;&quot;},{&quot;family&quot;:&quot;Pignataro&quot;,&quot;given&quot;:&quot;Daniella Francesa Alvarado&quot;,&quot;parse-names&quot;:false,&quot;dropping-particle&quot;:&quot;&quot;,&quot;non-dropping-particle&quot;:&quot;&quot;},{&quot;family&quot;:&quot;Merchan&quot;,&quot;given&quot;:&quot;Mayra Alejandra Sarmiento&quot;,&quot;parse-names&quot;:false,&quot;dropping-particle&quot;:&quot;&quot;,&quot;non-dropping-particle&quot;:&quot;&quot;}],&quot;container-title&quot;:&quot;Polo del Conocimiento&quot;,&quot;accessed&quot;:{&quot;date-parts&quot;:[[2025,8,28]]},&quot;DOI&quot;:&quot;10.23857/pc.v10i1.8994&quot;,&quot;ISSN&quot;:&quot;2550-682X&quot;,&quot;URL&quot;:&quot;https://www.polodelconocimiento.com/ojs/index.php/es/article/view/8994&quot;,&quot;issued&quot;:{&quot;date-parts&quot;:[[2025,2,22]]},&quot;page&quot;:&quot;2457-2470&quot;,&quot;abstract&quot;:&quot;La formación continua de los educadores no solo mejora su capacidad para utilizar estas herramientas, sino que también fomenta una cultura educativa más inclusiva y adaptativa. La colaboración entre instituciones educativas, desarrolladores de tecnología y responsables políticos será crucial para crear un marco que apoye la integración efectiva de estas innovaciones en el aula. La implementación de políticas que promuevan la equidad en el acceso a la tecnología educativa permitirá cerrar la brecha digital y asegurar que todos los estudiantes, independientemente de su contexto socioeconómico, puedan beneficiarse plenamente de estas oportunidades de aprendizaje.&quot;,&quot;issue&quot;:&quot;1&quot;,&quot;volume&quot;:&quot;10&quot;,&quot;container-title-short&quot;:&quot;&quot;},&quot;isTemporary&quot;:false,&quot;suppress-author&quot;:false,&quot;composite&quot;:false,&quot;author-only&quot;:false}]},{&quot;citationID&quot;:&quot;MENDELEY_CITATION_ff458023-734f-486e-9038-ac3bc0abdd05&quot;,&quot;properties&quot;:{&quot;noteIndex&quot;:0},&quot;isEdited&quot;:false,&quot;manualOverride&quot;:{&quot;isManuallyOverridden&quot;:false,&quot;citeprocText&quot;:&quot;[11]&quot;,&quot;manualOverrideText&quot;:&quot;&quot;},&quot;citationTag&quot;:&quot;MENDELEY_CITATION_v3_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&quot;,&quot;citationItems&quot;:[{&quot;id&quot;:&quot;12296d5e-b4a7-3cd1-88e7-e0d5f4a1a811&quot;,&quot;itemData&quot;:{&quot;type&quot;:&quot;article-journal&quot;,&quot;id&quot;:&quot;12296d5e-b4a7-3cd1-88e7-e0d5f4a1a811&quot;,&quot;title&quot;:&quot;The SAGE Handbook of Qualitative Research&quot;,&quot;accessed&quot;:{&quot;date-parts&quot;:[[2025,7,31]]},&quot;URL&quot;:&quot;https://dl1.cuni.cz/pluginfile.php/1143325/mod_resource/content/1/Norman%20K.%20Denzin%2C%20Yvonna%20S.%20Lincoln%20-%20The%20SAGE%20Handbook%20of%20Qualitative%20Research-SAGE%20Publications%2C%20Inc%20%282017%29.pdf&quot;,&quot;container-title-short&quot;:&quot;&quot;},&quot;isTemporary&quot;:false,&quot;suppress-author&quot;:false,&quot;composite&quot;:false,&quot;author-only&quot;:false}]},{&quot;citationID&quot;:&quot;MENDELEY_CITATION_667abf76-2ba5-4eee-987d-51fa645d8e8c&quot;,&quot;properties&quot;:{&quot;noteIndex&quot;:0},&quot;isEdited&quot;:false,&quot;manualOverride&quot;:{&quot;isManuallyOverridden&quot;:false,&quot;citeprocText&quot;:&quot;[12]&quot;,&quot;manualOverrideText&quot;:&quot;&quot;},&quot;citationTag&quot;:&quot;MENDELEY_CITATION_v3_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&quot;,&quot;citationItems&quot;:[{&quot;id&quot;:&quot;31cef1d1-0961-3c67-9146-6af7b3bdcc9d&quot;,&quot;itemData&quot;:{&quot;type&quot;:&quot;article-journal&quot;,&quot;id&quot;:&quot;31cef1d1-0961-3c67-9146-6af7b3bdcc9d&quot;,&quot;title&quot;:&quot;Introduccion-a-Los-Metodos-Cualitativos-de-Investigacion-Taylor-S-J-Bogdan-R&quot;,&quot;accessed&quot;:{&quot;date-parts&quot;:[[2025,7,31]]},&quot;URL&quot;:&quot;https://pics.unison.mx/maestria/wp-content/uploads/2020/05/Introduccion-a-Los-Metodos-Cualitativos-de-Investigacion-Taylor-S-J-Bogdan-R.pdf&quot;,&quot;container-title-short&quot;:&quot;&quot;},&quot;isTemporary&quot;:false,&quot;suppress-author&quot;:false,&quot;composite&quot;:false,&quot;author-only&quot;:false}]},{&quot;citationID&quot;:&quot;MENDELEY_CITATION_e2bf823c-6f90-4f0e-8e4b-07f1de8753f7&quot;,&quot;properties&quot;:{&quot;noteIndex&quot;:0},&quot;isEdited&quot;:false,&quot;manualOverride&quot;:{&quot;isManuallyOverridden&quot;:false,&quot;citeprocText&quot;:&quot;[13]&quot;,&quot;manualOverrideText&quot;:&quot;&quot;},&quot;citationTag&quot;:&quot;MENDELEY_CITATION_v3_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&quot;,&quot;citationItems&quot;:[{&quot;id&quot;:&quot;c520e764-cfbd-3743-bd8f-3f961907a12c&quot;,&quot;itemData&quot;:{&quot;type&quot;:&quot;article-journal&quot;,&quot;id&quot;:&quot;c520e764-cfbd-3743-bd8f-3f961907a12c&quot;,&quot;title&quot;:&quot;the discovery of gorunded theory&quot;,&quot;container-title-short&quot;:&quot;&quot;},&quot;isTemporary&quot;:false,&quot;suppress-author&quot;:false,&quot;composite&quot;:false,&quot;author-only&quot;:false}]},{&quot;citationID&quot;:&quot;MENDELEY_CITATION_409f9b05-c583-4a8e-b6b2-968fed9d32bd&quot;,&quot;properties&quot;:{&quot;noteIndex&quot;:0},&quot;isEdited&quot;:false,&quot;manualOverride&quot;:{&quot;isManuallyOverridden&quot;:false,&quot;citeprocText&quot;:&quot;[14]&quot;,&quot;manualOverrideText&quot;:&quot;&quot;},&quot;citationTag&quot;:&quot;MENDELEY_CITATION_v3_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&quot;,&quot;citationItems&quot;:[{&quot;id&quot;:&quot;23a4c59b-2580-3d79-aaf9-6703b48fdd48&quot;,&quot;itemData&quot;:{&quot;type&quot;:&quot;article&quot;,&quot;id&quot;:&quot;23a4c59b-2580-3d79-aaf9-6703b48fdd48&quot;,&quot;title&quot;:&quot;Use of Generative Artificial Intelligence, Including Large Language Models Such as ChatGPT, in Scientific Publications: Policies of KJR and Prominent Authorities&quot;,&quot;author&quot;:[{&quot;family&quot;:&quot;Park&quot;,&quot;given&quot;:&quot;Seong Ho&quot;,&quot;parse-names&quot;:false,&quot;dropping-particle&quot;:&quot;&quot;,&quot;non-dropping-particle&quot;:&quot;&quot;}],&quot;container-title&quot;:&quot;Korean Journal of Radiology&quot;,&quot;container-title-short&quot;:&quot;Korean J Radiol&quot;,&quot;accessed&quot;:{&quot;date-parts&quot;:[[2025,8,28]]},&quot;DOI&quot;:&quot;10.3348/kjr.2023.0643&quot;,&quot;ISSN&quot;:&quot;12296929&quot;,&quot;PMID&quot;:&quot;37500572&quot;,&quot;URL&quot;:&quot;https://kjronline.org/Synapse/Data/PDFData/0068KJR/kjr-24-715.pdf&quot;,&quot;issued&quot;:{&quot;date-parts&quot;:[[2023,8,1]]},&quot;page&quot;:&quot;715-718&quot;,&quot;publisher&quot;:&quot;Korean Radiological Society&quot;,&quot;issue&quot;:&quot;8&quot;,&quot;volume&quot;:&quot;24&quot;},&quot;isTemporary&quot;:false,&quot;suppress-author&quot;:false,&quot;composite&quot;:false,&quot;author-only&quot;:false}]},{&quot;citationID&quot;:&quot;MENDELEY_CITATION_58518b0a-68f9-464d-a498-b30f585f718d&quot;,&quot;properties&quot;:{&quot;noteIndex&quot;:0},&quot;isEdited&quot;:false,&quot;manualOverride&quot;:{&quot;isManuallyOverridden&quot;:false,&quot;citeprocText&quot;:&quot;[15]&quot;,&quot;manualOverrideText&quot;:&quot;&quot;},&quot;citationTag&quot;:&quot;MENDELEY_CITATION_v3_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&quot;,&quot;citationItems&quot;:[{&quot;id&quot;:&quot;7c54a495-f93c-36bf-af95-df68fbac9313&quot;,&quot;itemData&quot;:{&quot;type&quot;:&quot;article-journal&quot;,&quot;id&quot;:&quot;7c54a495-f93c-36bf-af95-df68fbac9313&quot;,&quot;title&quot;:&quot;Análisis comparativo de patrones de diseño de interfaz de usuario para el desarrollo de aplicaciones educativas Comparative Analysis of User Interface Design Patterns for Developing Educational Applications&quot;,&quot;author&quot;:[{&quot;family&quot;:&quot;Cortes-Camarillo&quot;,&quot;given&quot;:&quot;Cesar Augusto&quot;,&quot;parse-names&quot;:false,&quot;dropping-particle&quot;:&quot;&quot;,&quot;non-dropping-particle&quot;:&quot;&quot;},{&quot;family&quot;:&quot;Alor-Hernández&quot;,&quot;given&quot;:&quot;Giner&quot;,&quot;parse-names&quot;:false,&quot;dropping-particle&quot;:&quot;&quot;,&quot;non-dropping-particle&quot;:&quot;&quot;},{&quot;family&quot;:&quot;Olivares-Zepahua&quot;,&quot;given&quot;:&quot;Beatriz Alejandra&quot;,&quot;parse-names&quot;:false,&quot;dropping-particle&quot;:&quot;&quot;,&quot;non-dropping-particle&quot;:&quot;&quot;},{&quot;family&quot;:&quot;Rodríguez-Mazahua&quot;,&quot;given&quot;:&quot;Lisbeth&quot;,&quot;parse-names&quot;:false,&quot;dropping-particle&quot;:&quot;&quot;,&quot;non-dropping-particle&quot;:&quot;&quot;},{&quot;family&quot;:&quot;Gustavo Peláez-Camarena&quot;,&quot;given&quot;:&quot;Silvestre&quot;,&quot;parse-names&quot;:false,&quot;dropping-particle&quot;:&quot;&quot;,&quot;non-dropping-particle&quot;:&quot;&quot;}],&quot;container-title&quot;:&quot;Research in Computing Science&quot;,&quot;accessed&quot;:{&quot;date-parts&quot;:[[2025,8,28]]},&quot;URL&quot;:&quot;https://www.rcs.cic.ipn.mx/2016_126/Analisis%20comparativo%20de%20patrones%20de%20diseno%20de%20interfaz%20de%20usuario%20para%20el%20desarrollo.pdf&quot;,&quot;issued&quot;:{&quot;date-parts&quot;:[[2016]]},&quot;page&quot;:&quot;31-41&quot;,&quot;abstract&quot;:&quot;Resumen. En la actualidad las tabletas, teléfonos inteligentes y televisores inteligentes se encuentran al alcance de la mayoría de personas, estos dispositivos tienen diversos usos, por esta razón diseñar aplicaciones se ha vuelto una tarea tediosa y difícil de realizar, debido a los diferentes dispositivos y plataformas existentes en el mercado. Los patrones de diseño de interfaz de usuario permiten facilitar el desarrollo de aplicaciones, debido a que cada plataforma tiene su propia interacción entre el usuario y el dispositivo, porque dependiendo del dispositivo se utiliza un patrón de diseño distinto para su interfaz de usuario. Por esta razón se propone un análisis comparativo de patrones de diseño de interfaz de usuario, para generar contextos de uso orientados al ámbito educativo. Se diseñaron contextos de uso para establecer qué patrones de diseño de interfaz de usuario son recomendables para un dispositivo en específico, facilitando el desarrollo de aplicaciones educativas multi-dispositivos. Palabras clave: Ámbito educativo, contexto de uso, interfaz de usuario, multi-dispositivo, patrones de diseño. Abstract. Actually, most people have at their disposal different devices including tablets, smartphones and smart TVs, for this reason the design of this kind of applications has become a tedious and difficult task to do, by the different devices and platforms that exist in the market. The UIDPs (User Interface Design Patterns) facilitate the development of the kind of applications by, considering that on each platform the user interacts differently with the device because UIDPs 31&quot;,&quot;volume&quot;:&quot;126&quot;,&quot;container-title-short&quot;:&quot;&quot;},&quot;isTemporary&quot;:false,&quot;suppress-author&quot;:false,&quot;composite&quot;:false,&quot;author-only&quot;:false}]},{&quot;citationID&quot;:&quot;MENDELEY_CITATION_ba639e28-cd7d-45a3-9ed6-a0f42c0f6f9a&quot;,&quot;properties&quot;:{&quot;noteIndex&quot;:0},&quot;isEdited&quot;:false,&quot;manualOverride&quot;:{&quot;isManuallyOverridden&quot;:false,&quot;citeprocText&quot;:&quot;[16]&quot;,&quot;manualOverrideText&quot;:&quot;&quot;},&quot;citationTag&quot;:&quot;MENDELEY_CITATION_v3_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&quot;,&quot;citationItems&quot;:[{&quot;id&quot;:&quot;0b3822e3-b914-3e90-860f-5e34fcd0e5a9&quot;,&quot;itemData&quot;:{&quot;type&quot;:&quot;article-journal&quot;,&quot;id&quot;:&quot;0b3822e3-b914-3e90-860f-5e34fcd0e5a9&quot;,&quot;title&quot;:&quot;User Interface Design for E-Learning Software&quot;,&quot;author&quot;:[{&quot;family&quot;:&quot;Faghih&quot;,&quot;given&quot;:&quot;Behnam&quot;,&quot;parse-names&quot;:false,&quot;dropping-particle&quot;:&quot;&quot;,&quot;non-dropping-particle&quot;:&quot;&quot;},{&quot;family&quot;:&quot;Reza Azadehfar&quot;,&quot;given&quot;:&quot;Mohammad&quot;,&quot;parse-names&quot;:false,&quot;dropping-particle&quot;:&quot;&quot;,&quot;non-dropping-particle&quot;:&quot;&quot;},{&quot;family&quot;:&quot;Katebi&quot;,&quot;given&quot;:&quot;S D&quot;,&quot;parse-names&quot;:false,&quot;dropping-particle&quot;:&quot;&quot;,&quot;non-dropping-particle&quot;:&quot;&quot;}],&quot;container-title&quot;:&quot;JSCSE]&quot;,&quot;accessed&quot;:{&quot;date-parts&quot;:[[2025,8,28]]},&quot;DOI&quot;:&quot;10.7321/jscse.v3.n3.119&quot;,&quot;URL&quot;:&quot;https://arxiv.org/pdf/1401.6365&quot;,&quot;issued&quot;:{&quot;date-parts&quot;:[[2013]]},&quot;abstract&quot;:&quot;User interface (UI) is point of interaction between user and computer software. The success and failure of a software application depends on User Interface Design (UID). Possibility of using a software, easily using and learning are issues influenced by UID. The UI is significant in designing of educational software (e-Learning). Principles and concepts of learning should be considered in addition to UID principles in UID for e-learning. In this regard, to specify the logical relationship between education, learning, UID and multimedia at first we readdress the issues raised in previous studies. It is followed by examining the principle concepts of e-learning and UID. Then, we will see how UID contributes to e-learning through the educational software built by authors. Also we show the way of using UI to improve learning and motivating the learners and to improve the time efficiency of using e-learning software.&quot;,&quot;issue&quot;:&quot;3&quot;,&quot;volume&quot;:&quot;3&quot;,&quot;container-title-short&quot;:&quot;&quot;},&quot;isTemporary&quot;:false,&quot;suppress-author&quot;:false,&quot;composite&quot;:false,&quot;author-only&quot;:false}]},{&quot;citationID&quot;:&quot;MENDELEY_CITATION_d9a82660-5da7-4d10-a1dc-57b40bbb39a8&quot;,&quot;properties&quot;:{&quot;noteIndex&quot;:0},&quot;isEdited&quot;:false,&quot;manualOverride&quot;:{&quot;isManuallyOverridden&quot;:false,&quot;citeprocText&quot;:&quot;[17]&quot;,&quot;manualOverrideText&quot;:&quot;&quot;},&quot;citationTag&quot;:&quot;MENDELEY_CITATION_v3_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&quot;,&quot;citationItems&quot;:[{&quot;id&quot;:&quot;c9ca61b3-497f-3e0a-b574-433534e3dc13&quot;,&quot;itemData&quot;:{&quot;type&quot;:&quot;article-journal&quot;,&quot;id&quot;:&quot;c9ca61b3-497f-3e0a-b574-433534e3dc13&quot;,&quot;title&quot;:&quot;Álgebra y Trigonometría con Geometría Analítica&quot;,&quot;author&quot;:[{&quot;family&quot;:&quot;EARL W. SWOKOWSKI&quot;,&quot;given&quot;:&quot;&quot;,&quot;parse-names&quot;:false,&quot;dropping-particle&quot;:&quot;&quot;,&quot;non-dropping-particle&quot;:&quot;&quot;},{&quot;family&quot;:&quot;JEFFERY A. COLE&quot;,&quot;given&quot;:&quot;&quot;,&quot;parse-names&quot;:false,&quot;dropping-particle&quot;:&quot;&quot;,&quot;non-dropping-particle&quot;:&quot;&quot;}],&quot;accessed&quot;:{&quot;date-parts&quot;:[[2025,8,28]]},&quot;translator&quot;:[{&quot;family&quot;:&quot;Jorge Humberto Romo Muñoz&quot;,&quot;given&quot;:&quot;&quot;,&quot;parse-names&quot;:false,&quot;dropping-particle&quot;:&quot;&quot;,&quot;non-dropping-particle&quot;:&quot;&quot;}],&quot;ISBN&quot;:&quot;978-607-481-186-5&quot;,&quot;ISSN&quot;:&quot;607-481-186-5&quot;,&quot;URL&quot;:&quot;https://tuaulavirtual.educatic.unam.mx/pluginfile.php/977649/mod_resource/content/0/Swokowski.pdf&quot;,&quot;issued&quot;:{&quot;date-parts&quot;:[[2009]]},&quot;volume&quot;:&quot;12a. edición&quot;,&quot;container-title-short&quot;:&quot;&quot;},&quot;isTemporary&quot;:false,&quot;suppress-author&quot;:false,&quot;composite&quot;:false,&quot;author-only&quot;:false}]},{&quot;citationID&quot;:&quot;MENDELEY_CITATION_32f973b1-eabc-4afe-8fa5-453215a8c6dc&quot;,&quot;properties&quot;:{&quot;noteIndex&quot;:0},&quot;isEdited&quot;:false,&quot;manualOverride&quot;:{&quot;isManuallyOverridden&quot;:false,&quot;citeprocText&quot;:&quot;[18]&quot;,&quot;manualOverrideText&quot;:&quot;&quot;},&quot;citationTag&quot;:&quot;MENDELEY_CITATION_v3_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&quot;,&quot;citationItems&quot;:[{&quot;id&quot;:&quot;732c933d-ec2e-39a1-863e-a0f42fc93486&quot;,&quot;itemData&quot;:{&quot;type&quot;:&quot;article-journal&quot;,&quot;id&quot;:&quot;732c933d-ec2e-39a1-863e-a0f42fc93486&quot;,&quot;title&quot;:&quot;Programación de aplicaciones web: historia, principios básicos y clientes web&quot;,&quot;author&quot;:[{&quot;family&quot;:&quot;Luján Mora&quot;,&quot;given&quot;:&quot;Sergio&quot;,&quot;parse-names&quot;:false,&quot;dropping-particle&quot;:&quot;&quot;,&quot;non-dropping-particle&quot;:&quot;&quot;}],&quot;accessed&quot;:{&quot;date-parts&quot;:[[2025,8,28]]},&quot;ISBN&quot;:&quot;84-8454-206-8&quot;,&quot;URL&quot;:&quot;https://dialnet.unirioja.es/servlet/libro?codigo=204176&amp;info=resumen&amp;idioma=SPA&quot;,&quot;issued&quot;:{&quot;date-parts&quot;:[[2002,10,31]]},&quot;abstract&quot;:&quot;Aunque los inicios de Internet se remontan a los años sesenta, no ha sido hasta los años noventa cuando, gracias a la Web, se ha extendido su uso por todo el mundo. En pocos años la Web ha evolucionado enormemente: se ha pasado de páginas sencillas, con pocas imágenes y contenidos estáticos a páginas complejas con contenidos dinámicos que provienen de bases de datos, lo que permite la creación de \&quot;aplicaciones web\&quot;.De forma breve, una aplicación Web se puede definir como una aplicación en la cual el usuario por medio de un navegador realiza peticiones a una aplicación remota accesible a través de Internet (o a través de una Intranet) y que recibe una respuesta que se muestra en el propio navegador. El contenido de este libro se estructura en dos partes. En la primera parte del libro se tratan temas introductorios a la programación de aplicaciones Web: un breve repaso de la historia de Internet y de la web, características de las arquitecturas cliente/servidor, el concepto de aplicación Web y la estructura de un sitio web tanto a nivel físico como lógico. La segunda parte del libro se centra en la programación de la parte cliente de las aplicaciones web. En el \&quot;mundo Internet\&quot; existen muchas tecnologías que se pueden emplear para programar los clientes web, como ActiveX, applet, Flash, VRML, etc., pero sólo dos son las tecnología más extendidas y se pueden considerar \&quot;el estándar\&quot;: HTML y JavaScript. Este libro se centra en estas dos tecnologías y presta una especial atención a la creación de formularios, la base para cualquier aplicación web. Sergio Luján Mora es Ingeniero en Informática por la Universidad de Alicante. Ha impartido diversos cursos sobre Internet y las diversas tecnologías que se emplean en la programación de aplicaciones web (HTML, JavaScript, ASP y Java). Durante un año ha trabajado en el Laboratorio Multimedia (mmlab) de la Universidad de Alicante, desarrollando aplicaciones para Internet e Intranets. Ha escrito los libros \&quot;Programación en Internet: Clientes Web\&quot; y \&quot;Programación de servidores web con CGI, SSI e IDC\&quot; publicados por la Editorial Club Universitario. Desde 1999 forma parte del Departamento de Lenguajes y Sistemas Informáticos de la Universidad de Alicante. Las asignaturas que imparte en la actualidad son \&quot;Programación en Internet\&quot; y \&quot;Programación y Estructuras de Datos\&quot;.&quot;,&quot;publisher&quot;:&quot;Editorial Club Universitario (ECU)&quot;,&quot;container-title-short&quot;:&quot;&quot;},&quot;isTemporary&quot;:false,&quot;suppress-author&quot;:false,&quot;composite&quot;:false,&quot;author-only&quot;:false}]},{&quot;citationID&quot;:&quot;MENDELEY_CITATION_33bf8c3c-817d-402f-96ae-68947dfa23c7&quot;,&quot;properties&quot;:{&quot;noteIndex&quot;:0},&quot;isEdited&quot;:false,&quot;manualOverride&quot;:{&quot;isManuallyOverridden&quot;:false,&quot;citeprocText&quot;:&quot;[19]&quot;,&quot;manualOverrideText&quot;:&quot;&quot;},&quot;citationTag&quot;:&quot;MENDELEY_CITATION_v3_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&quot;,&quot;citationItems&quot;:[{&quot;id&quot;:&quot;ea6812f3-e3b2-3e87-8109-036dbffad5af&quot;,&quot;itemData&quot;:{&quot;type&quot;:&quot;article-journal&quot;,&quot;id&quot;:&quot;ea6812f3-e3b2-3e87-8109-036dbffad5af&quot;,&quot;title&quot;:&quot;Comparación de tendencias tecnológicas en aplicaciones web&quot;,&quot;author&quot;:[{&quot;family&quot;:&quot;Valarezo Pardo&quot;,&quot;given&quot;:&quot;Milton Rafael&quot;,&quot;parse-names&quot;:false,&quot;dropping-particle&quot;:&quot;&quot;,&quot;non-dropping-particle&quot;:&quot;&quot;},{&quot;family&quot;:&quot;Honores Tapia&quot;,&quot;given&quot;:&quot;Joofre Antonio&quot;,&quot;parse-names&quot;:false,&quot;dropping-particle&quot;:&quot;&quot;,&quot;non-dropping-particle&quot;:&quot;&quot;},{&quot;family&quot;:&quot;Gómez Moreno&quot;,&quot;given&quot;:&quot;Antonio Steeven&quot;,&quot;parse-names&quot;:false,&quot;dropping-particle&quot;:&quot;&quot;,&quot;non-dropping-particle&quot;:&quot;&quot;},{&quot;family&quot;:&quot;Vinces Sánchez&quot;,&quot;given&quot;:&quot;Luis Fernando&quot;,&quot;parse-names&quot;:false,&quot;dropping-particle&quot;:&quot;&quot;,&quot;non-dropping-particle&quot;:&quot;&quot;}],&quot;container-title&quot;:&quot;3c Tecnología: glosas de innovación aplicadas a la pyme, ISSN-e 2254-4143, Vol. 7, Nº. 3, 2018, págs. 28-49&quot;,&quot;accessed&quot;:{&quot;date-parts&quot;:[[2025,8,28]]},&quot;DOI&quot;:&quot;10.17993/3ctecno.2018.v7n3e27.28-49/30&quot;,&quot;ISSN&quot;:&quot;2254-4143&quot;,&quot;URL&quot;:&quot;https://dialnet.unirioja.es/servlet/articulo?codigo=6551743&amp;info=resumen&amp;idioma=SPA&quot;,&quot;issued&quot;:{&quot;date-parts&quot;:[[2018]]},&quot;page&quot;:&quot;28-49&quot;,&quot;abstract&quot;:&quot;Hoy en día el Internet es un gran medio de comunicación, en mayor medida, un medio de influencias que se ve reflejado en los avances y la continua adaptación tanto de los usuarios, como de los desarrolladores hacia él, por ello han surgido tendencias para el desarrollo Web como medio para establecer un modelo a seguir, así como para ofrecer unos mejores servicios a los usuarios. En las tendencias tecnológicas mencionadas existen diversos lenguajes de programación, herramientas y plataformas que sirve para darnos un claro entendimiento del cómo nos brindan una velocidad eficaz al momento de desarrollar una aplicación Web las cuales ofrecen una gran ventaja al grupo de trabajo en reducción de tiempo que se basan en requerimientos pre-establecidos usados en la creación de sistemas Web. Tomando en cuenta la información investigada se obtiene información acerca de los lenguajes de programación además plataformas, herramientas entre otras tecnologías que han mejorado de manera general; los mismos que permiten a los desarrolladores crear un sistema con un margen de error muy reducido en comparación con sus procesos. Para el desarrollo se orienta en los nuevos ambientes de trabajo que han agilizado el progreso software. En el presente documento se muestra algunas de las tecnologías que se han establecido para el óptimo desarrollo de aplicaciones Web, en la cual se empleó una investigación de tipo analítica, bibliográfica y documental, la cual brinda información confiable, verídica y proporciona criterios que ayudarán al desarrollo del documento.&quot;,&quot;publisher&quot;:&quot;3ciencias&quot;,&quot;issue&quot;:&quot;3&quot;,&quot;volume&quot;:&quot;7&quot;,&quot;container-title-short&quot;:&quot;&quot;},&quot;isTemporary&quot;:false,&quot;suppress-author&quot;:false,&quot;composite&quot;:false,&quot;author-only&quot;:false}]},{&quot;citationID&quot;:&quot;MENDELEY_CITATION_b63ece5d-61e3-428b-9e4f-e80e66b2e965&quot;,&quot;properties&quot;:{&quot;noteIndex&quot;:0},&quot;isEdited&quot;:false,&quot;manualOverride&quot;:{&quot;isManuallyOverridden&quot;:false,&quot;citeprocText&quot;:&quot;[20]&quot;,&quot;manualOverrideText&quot;:&quot;&quot;},&quot;citationTag&quot;:&quot;MENDELEY_CITATION_v3_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&quot;,&quot;citationItems&quot;:[{&quot;id&quot;:&quot;350b747e-8dad-3e1f-a4b1-d6435d9e6b57&quot;,&quot;itemData&quot;:{&quot;type&quot;:&quot;article-journal&quot;,&quot;id&quot;:&quot;350b747e-8dad-3e1f-a4b1-d6435d9e6b57&quot;,&quot;title&quot;:&quot;Aplicaciones web Aplicaciones Web Aplicaciones web Materiales del proyecto&quot;,&quot;author&quot;:[{&quot;family&quot;:&quot;Lerma-Blasco&quot;,&quot;given&quot;:&quot;Raül&quot;,&quot;parse-names&quot;:false,&quot;dropping-particle&quot;:&quot;V&quot;,&quot;non-dropping-particle&quot;:&quot;&quot;},{&quot;family&quot;:&quot;Alfredo&quot;,&quot;given&quot;:&quot;José&quot;,&quot;parse-names&quot;:false,&quot;dropping-particle&quot;:&quot;&quot;,&quot;non-dropping-particle&quot;:&quot;&quot;},{&quot;family&quot;:&quot;Andrés&quot;,&quot;given&quot;:&quot;Murcia&quot;,&quot;parse-names&quot;:false,&quot;dropping-particle&quot;:&quot;&quot;,&quot;non-dropping-particle&quot;:&quot;&quot;},{&quot;family&quot;:&quot;Mifsud&quot;,&quot;given&quot;:&quot;Elvira&quot;,&quot;parse-names&quot;:false,&quot;dropping-particle&quot;:&quot;&quot;,&quot;non-dropping-particle&quot;:&quot;&quot;},{&quot;family&quot;:&quot;Lerma-Blasco&quot;,&quot;given&quot;:&quot;Talón R&quot;,&quot;parse-names&quot;:false,&quot;dropping-particle&quot;:&quot;V&quot;,&quot;non-dropping-particle&quot;:&quot;&quot;},{&quot;family&quot;:&quot;Murcia&quot;,&quot;given&quot;:&quot;J A&quot;,&quot;parse-names&quot;:false,&quot;dropping-particle&quot;:&quot;&quot;,&quot;non-dropping-particle&quot;:&quot;&quot;},{&quot;family&quot;:&quot;Mifsud&quot;,&quot;given&quot;:&quot;E&quot;,&quot;parse-names&quot;:false,&quot;dropping-particle&quot;:&quot;&quot;,&quot;non-dropping-particle&quot;:&quot;&quot;}],&quot;accessed&quot;:{&quot;date-parts&quot;:[[2025,8,28]]},&quot;ISBN&quot;:&quot;978-84-481-8392-9&quot;,&quot;URL&quot;:&quot;www.mhe.es/cf/informatica&quot;,&quot;issued&quot;:{&quot;date-parts&quot;:[[2013]]},&quot;abstract&quot;:&quot;«La base de tu futuro» Ésta es la filosofía del proyecto editorial de McGraw-Hill para Ciclos Formativos, una etapa decisiva en la formación de profesionales. El proyecto para el módulo Aplicaciones web, incluido en el nuevo ciclo formativo Técnico en Sistemas Microinformáticos y Redes, y que está estructu-rado en dos niveles de uso, para el alumno y para el profesor, ha sido desarrollado según tres principios básicos: • Una metodología basada en la práctica y en la adecuación de contenidos y procedimientos a la realidad profesional. • Unos materiales desarrollados para conseguir las destrezas, habilidades y resultados de aprendizaje que necesitarás para conseguir tu título y desenvolverte en el mercado laboral. • Una presentación de los contenidos clara y atractiva, con variedad de recursos gráficos y multimedia que facilitarán tu aprendizaje. Para el alumno Para el profesor CEO del alumno Guía didáctica en CEO del profesor Confiamos en que esta obra sea una herramienta útil y eficaz, y que contribuya a tu formación como profesional.&quot;,&quot;container-title-short&quot;:&quot;&quot;},&quot;isTemporary&quot;:false,&quot;suppress-author&quot;:false,&quot;composite&quot;:false,&quot;author-only&quot;:false}]},{&quot;citationID&quot;:&quot;MENDELEY_CITATION_55bc22b0-f33c-4e4b-96d4-b5142fd6b3fa&quot;,&quot;properties&quot;:{&quot;noteIndex&quot;:0},&quot;isEdited&quot;:false,&quot;manualOverride&quot;:{&quot;isManuallyOverridden&quot;:false,&quot;citeprocText&quot;:&quot;[21]&quot;,&quot;manualOverrideText&quot;:&quot;&quot;},&quot;citationTag&quot;:&quot;MENDELEY_CITATION_v3_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&quot;,&quot;citationItems&quot;:[{&quot;id&quot;:&quot;29905e68-0b58-3a55-83fd-b47c93cd49cf&quot;,&quot;itemData&quot;:{&quot;type&quot;:&quot;article-journal&quot;,&quot;id&quot;:&quot;29905e68-0b58-3a55-83fd-b47c93cd49cf&quot;,&quot;title&quot;:&quot;Software educativos&quot;,&quot;author&quot;:[{&quot;family&quot;:&quot;Vidal&quot;,&quot;given&quot;:&quot;María&quot;,&quot;parse-names&quot;:false,&quot;dropping-particle&quot;:&quot;&quot;,&quot;non-dropping-particle&quot;:&quot;&quot;},{&quot;family&quot;:&quot;Gómez&quot;,&quot;given&quot;:&quot;Freddy&quot;,&quot;parse-names&quot;:false,&quot;dropping-particle&quot;:&quot;&quot;,&quot;non-dropping-particle&quot;:&quot;&quot;},{&quot;family&quot;:&quot;Ii&quot;,&quot;given&quot;:&quot;Martínez&quot;,&quot;parse-names&quot;:false,&quot;dropping-particle&quot;:&quot;&quot;,&quot;non-dropping-particle&quot;:&quot;&quot;},{&quot;family&quot;:&quot;Ruiz&quot;,&quot;given&quot;:&quot;Alina M&quot;,&quot;parse-names&quot;:false,&quot;dropping-particle&quot;:&quot;&quot;,&quot;non-dropping-particle&quot;:&quot;&quot;},{&quot;family&quot;:&quot;Iii&quot;,&quot;given&quot;:&quot;Piedra&quot;,&quot;parse-names&quot;:false,&quot;dropping-particle&quot;:&quot;&quot;,&quot;non-dropping-particle&quot;:&quot;&quot;}],&quot;container-title&quot;:&quot;Educación Médica Superior&quot;,&quot;accessed&quot;:{&quot;date-parts&quot;:[[2025,8,28]]},&quot;ISSN&quot;:&quot;0864-2141&quot;,&quot;URL&quot;:&quot;http://scielo.sld.cu/scielo.php?script=sci_arttext&amp;pid=S0864-21412010000100012&amp;lng=es&amp;nrm=iso&amp;tlng=en&quot;,&quot;issued&quot;:{&quot;date-parts&quot;:[[2010]]},&quot;page&quot;:&quot;97-110&quot;,&quot;abstract&quot;:&quot;El tema que les ofrecemos en este número, da continuidad al que revisamos sobre Plataformas Didácticas como Tecnología Educativa, 1 ya que forman parte de estas como recursos de la enseñanza y el aprendizaje. Los software educativos (SE), se definen de forma genérica como aplicaciones o programas computacionales que faciliten el proceso de enseñanza aprendizaje. Algunos autores lo conceptualizan como cualquier programa computacional cuyas características estructurales y funcionales sirvan de apoyo al proceso de enseñar, aprender y administrar, o el que está destinado a la enseñanza y el autoaprendizaje y además permite el desarrollo de ciertas habilidades cognitivas; 2-5 términos que seguramente se replantearán en la medida que se introduzcan nuevos desarrollos tecnológicos para el trabajo en red en Internet. Las características más generalizadas en los SE son: 5-7-Finalidad: orientados a la enseñanza-aprendizaje en todas sus formas.-Utilización del computador: el medio utilizado como soporte es el computador.-Facilidad de uso: son intuitivos y aplica reglas generales de uso y de fácil comprensión para su navegabilidad o desplazamiento y recursividad o posibilidad de regreso a temáticas de interés desde cualquier punto en el ambiente virtual.-Interactividad: permite un intercambio efectivo de información con el estudiante.&quot;,&quot;publisher&quot;:&quot;Los autores conservan todos los derechos sobre sus obras, las cuales pueden reproducir y distribuir siempre y cuando citen la fuente primaria de publicación y lo hagan con fines no comerciales.&quot;,&quot;issue&quot;:&quot;1&quot;,&quot;volume&quot;:&quot;24&quot;,&quot;container-title-short&quot;:&quot;&quot;},&quot;isTemporary&quot;:false,&quot;suppress-author&quot;:false,&quot;composite&quot;:false,&quot;author-only&quot;:false}]},{&quot;citationID&quot;:&quot;MENDELEY_CITATION_c6e5b687-8285-45cf-a355-5eca4de1a487&quot;,&quot;properties&quot;:{&quot;noteIndex&quot;:0},&quot;isEdited&quot;:false,&quot;manualOverride&quot;:{&quot;isManuallyOverridden&quot;:false,&quot;citeprocText&quot;:&quot;[22]&quot;,&quot;manualOverrideText&quot;:&quot;&quot;},&quot;citationTag&quot;:&quot;MENDELEY_CITATION_v3_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&quot;,&quot;citationItems&quot;:[{&quot;id&quot;:&quot;cca4c128-5866-3c4d-a9e5-827e680f436c&quot;,&quot;itemData&quot;:{&quot;type&quot;:&quot;report&quot;,&quot;id&quot;:&quot;cca4c128-5866-3c4d-a9e5-827e680f436c&quot;,&quot;title&quot;:&quot;Software educativo o recurso educativo Educational software oreducationalresource&quot;,&quot;author&quot;:[{&quot;family&quot;:&quot;Sc José Salvador Márquez Cundú ProfesorAuxiliar&quot;,&quot;given&quot;:&quot;M&quot;,&quot;parse-names&quot;:false,&quot;dropping-particle&quot;:&quot;&quot;,&quot;non-dropping-particle&quot;:&quot;&quot;}],&quot;issued&quot;:{&quot;date-parts&quot;:[[2018]]},&quot;abstract&quot;:&quot;E l impacto que están causando los avances in-formáticos sobre el mundo educativo se ve en incremento por la presión ejercida por el mundo del trabajo, que cada vez necesita y demanda una mayor formación en muchos campos, pero con más énfasis en el de la informática. Ante esta situación es inminente la necesidad de que los programas docentes de formación y superación, a cualquier nivel, tengan que incorporar los software educativos dentro de su contenido. Por tal motivo se hace imprescindible hacer comprender a nuestros educadores la importancia de su apli-cación, lo cual no debe ser visto como un medio de enseñanza o una herramienta de trabajo utili-zada en la enseñanza, sino como un eslabón fundamental para incrementar la calidad del proceso educativo. A partir del cambio de tecnologías y la intro-ducción de la computación en los diferentes niveles de educación se implementan acciones concretas RESUMEN. El software educativo es una categoría muy empleada en los espacios de formación pues claramente se pueden observar las potencialidades que para la mediación de los procesos comunicativos propiciadores del aprendizaje ofrece. Hoy surgen múltiples categorías y deno-minaciones para tan importante herramienta, sin embargo, cada una de esas denominaciones tienen elementos idiográficos que los diferencian. El presente trabajo va dirigido a aportar detalles importantes del software educativo que lo identifican y diferencian de los recursos educativos, aunque esté contenido en este grupo de clasificación. Para esto se realiza una sistematización de estos conceptos aplicando métodos deductivos e inductivos, el análisis y la síntesis entre otros. Cómo resultado se obtiene una definición de software educativo que deja claramente ex-puesta cada una de las características por la cual se define de esta manera. Palabras clave: software, software educativo, recurso educativo, recurso educativo digital. ABSTRACT. Educational software is a category widely used in training spaces because clearly you can see the potential for mediation of communicative processes conducive to learning offers. Today there are multiple categories and denominations for such an important tool, however each of these denominations have idiographic elements that differentiate them. This work is aimed at providing important details of educational software that identify it and differentiate it from educational resources, even if it is contained in this classification group. For this, a systematization of these concepts is carried out applying deductive and inductive methods, analysis and synthesis among others. As a result, a definition of educational software is obtained that clearly exposes each one of the characteristics by which it is defined in this way.&quot;,&quot;issue&quot;:&quot;67&quot;,&quot;container-title-short&quot;:&quot;&quot;},&quot;isTemporary&quot;:false,&quot;suppress-author&quot;:false,&quot;composite&quot;:false,&quot;author-only&quot;:false}]},{&quot;citationID&quot;:&quot;MENDELEY_CITATION_8f3f3c15-8b60-426e-a0da-9c788e587971&quot;,&quot;properties&quot;:{&quot;noteIndex&quot;:0},&quot;isEdited&quot;:false,&quot;manualOverride&quot;:{&quot;isManuallyOverridden&quot;:false,&quot;citeprocText&quot;:&quot;[23]&quot;,&quot;manualOverrideText&quot;:&quot;&quot;},&quot;citationTag&quot;:&quot;MENDELEY_CITATION_v3_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&quot;,&quot;citationItems&quot;:[{&quot;id&quot;:&quot;9dab0b7d-9d5c-391b-91b5-9ccbe19d7a26&quot;,&quot;itemData&quot;:{&quot;type&quot;:&quot;article-journal&quot;,&quot;id&quot;:&quot;9dab0b7d-9d5c-391b-91b5-9ccbe19d7a26&quot;,&quot;title&quot;:&quot;An overview of the CellML API and its implementation&quot;,&quot;author&quot;:[{&quot;family&quot;:&quot;Miller&quot;,&quot;given&quot;:&quot;Andrew K.&quot;,&quot;parse-names&quot;:false,&quot;dropping-particle&quot;:&quot;&quot;,&quot;non-dropping-particle&quot;:&quot;&quot;},{&quot;family&quot;:&quot;Marsh&quot;,&quot;given&quot;:&quot;Justin&quot;,&quot;parse-names&quot;:false,&quot;dropping-particle&quot;:&quot;&quot;,&quot;non-dropping-particle&quot;:&quot;&quot;},{&quot;family&quot;:&quot;Reeve&quot;,&quot;given&quot;:&quot;Adam&quot;,&quot;parse-names&quot;:false,&quot;dropping-particle&quot;:&quot;&quot;,&quot;non-dropping-particle&quot;:&quot;&quot;},{&quot;family&quot;:&quot;Garny&quot;,&quot;given&quot;:&quot;Alan&quot;,&quot;parse-names&quot;:false,&quot;dropping-particle&quot;:&quot;&quot;,&quot;non-dropping-particle&quot;:&quot;&quot;},{&quot;family&quot;:&quot;Britten&quot;,&quot;given&quot;:&quot;Randall&quot;,&quot;parse-names&quot;:false,&quot;dropping-particle&quot;:&quot;&quot;,&quot;non-dropping-particle&quot;:&quot;&quot;},{&quot;family&quot;:&quot;Halstead&quot;,&quot;given&quot;:&quot;Matt&quot;,&quot;parse-names&quot;:false,&quot;dropping-particle&quot;:&quot;&quot;,&quot;non-dropping-particle&quot;:&quot;&quot;},{&quot;family&quot;:&quot;Cooper&quot;,&quot;given&quot;:&quot;Jonathan&quot;,&quot;parse-names&quot;:false,&quot;dropping-particle&quot;:&quot;&quot;,&quot;non-dropping-particle&quot;:&quot;&quot;},{&quot;family&quot;:&quot;Nickerson&quot;,&quot;given&quot;:&quot;David P.&quot;,&quot;parse-names&quot;:false,&quot;dropping-particle&quot;:&quot;&quot;,&quot;non-dropping-particle&quot;:&quot;&quot;},{&quot;family&quot;:&quot;Nielsen&quot;,&quot;given&quot;:&quot;Poul F.&quot;,&quot;parse-names&quot;:false,&quot;dropping-particle&quot;:&quot;&quot;,&quot;non-dropping-particle&quot;:&quot;&quot;}],&quot;container-title&quot;:&quot;BMC Bioinformatics&quot;,&quot;container-title-short&quot;:&quot;BMC Bioinformatics&quot;,&quot;accessed&quot;:{&quot;date-parts&quot;:[[2025,8,28]]},&quot;DOI&quot;:&quot;10.1186/1471-2105-11-178/FIGURES/1&quot;,&quot;ISSN&quot;:&quot;14712105&quot;,&quot;PMID&quot;:&quot;20377909&quot;,&quot;URL&quot;:&quot;https://link.springer.com/articles/10.1186/1471-2105-11-178&quot;,&quot;issued&quot;:{&quot;date-parts&quot;:[[2010,4,8]]},&quot;page&quot;:&quot;1-12&quot;,&quot;abstract&quot;:&quot;Background: CellML is an XML based language for representing mathematical models, in a machine-independent form which is suitable for their exchange between different authors, and for archival in a model repository. Allowing for the exchange and archival of models in a computer readable form is a key strategic goal in bioinformatics, because of the associated improvements in scientific record accuracy, the faster iterative process of scientific development, and the ability to combine models into large integrative models.However, for CellML models to be useful, tools which can process them correctly are needed. Due to some of the more complex features present in CellML models, such as imports, developing code ab initio to correctly process models can be an onerous task. For this reason, there is a clear and pressing need for an application programming interface (API), and a good implementation of that API, upon which tools can base their support for CellML.Results: We developed an API which allows the information in CellML models to be retrieved and/or modified. We also developed a series of optional extension APIs, for tasks such as simplifying the handling of connections between variables, dealing with physical units, validating models, and translating models into different procedural languages.We have also provided a Free/Open Source implementation of this application programming interface, optimised to achieve good performance.Conclusions: Tools have been developed using the API which are mature enough for widespread use. The API has the potential to accelerate the development of additional tools capable of processing CellML, and ultimately lead to an increased level of sharing of mathematical model descriptions. © 2010 Miller et al; licensee BioMed Central Ltd.&quot;,&quot;publisher&quot;:&quot;BioMed Central&quot;,&quot;issue&quot;:&quot;1&quot;,&quot;volume&quot;:&quot;11&quot;},&quot;isTemporary&quot;:false,&quot;suppress-author&quot;:false,&quot;composite&quot;:false,&quot;author-only&quot;:false}]},{&quot;citationID&quot;:&quot;MENDELEY_CITATION_6eeef895-1c60-48f2-bda7-7f94c704174b&quot;,&quot;properties&quot;:{&quot;noteIndex&quot;:0},&quot;isEdited&quot;:false,&quot;manualOverride&quot;:{&quot;isManuallyOverridden&quot;:false,&quot;citeprocText&quot;:&quot;[24]&quot;,&quot;manualOverrideText&quot;:&quot;&quot;},&quot;citationTag&quot;:&quot;MENDELEY_CITATION_v3_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&quot;,&quot;citationItems&quot;:[{&quot;id&quot;:&quot;9b1d2aa2-510e-3889-8acc-50bc11b16caa&quot;,&quot;itemData&quot;:{&quot;type&quot;:&quot;article-journal&quot;,&quot;id&quot;:&quot;9b1d2aa2-510e-3889-8acc-50bc11b16caa&quot;,&quot;title&quot;:&quot;A Systematic Review of API Evolution Literature&quot;,&quot;author&quot;:[{&quot;family&quot;:&quot;Lamothe&quot;,&quot;given&quot;:&quot;Maxime&quot;,&quot;parse-names&quot;:false,&quot;dropping-particle&quot;:&quot;&quot;,&quot;non-dropping-particle&quot;:&quot;&quot;},{&quot;family&quot;:&quot;Guéhéneuc&quot;,&quot;given&quot;:&quot;Yann Gaël&quot;,&quot;parse-names&quot;:false,&quot;dropping-particle&quot;:&quot;&quot;,&quot;non-dropping-particle&quot;:&quot;&quot;},{&quot;family&quot;:&quot;Shang&quot;,&quot;given&quot;:&quot;Weiyi&quot;,&quot;parse-names&quot;:false,&quot;dropping-particle&quot;:&quot;&quot;,&quot;non-dropping-particle&quot;:&quot;&quot;}],&quot;container-title&quot;:&quot;ACM Computing Surveys&quot;,&quot;container-title-short&quot;:&quot;ACM Comput Surv&quot;,&quot;accessed&quot;:{&quot;date-parts&quot;:[[2025,8,28]]},&quot;DOI&quot;:&quot;10.1145/3470133;SERIALTOPIC:TOPIC:ACM-PUBTYPE&gt;JOURNAL;PAGE:STRING:ARTICLE/CHAPTER&quot;,&quot;ISSN&quot;:&quot;15577341&quot;,&quot;URL&quot;:&quot;/doi/pdf/10.1145/3470133?download=true&quot;,&quot;issued&quot;:{&quot;date-parts&quot;:[[2022,11,30]]},&quot;abstract&quot;:&quot;Recent software advances have led to an expansion of the development and usage of application programming interfaces (APIs). From millions of Android packages (APKs) available on Google Store to millions of open-source packages available in Maven, PyPI, and npm, APIs have become an integral part of software development.Like any software artifact, software APIs evolve and suffer from this evolution. Prior research has uncovered many challenges to the development, usage, and evolution of APIs. While some challenges have been studied and solved, many remain. These challenges are scattered in the literature, which hides advances and cloaks the remaining challenges.In this systematic literature review on APIs and API evolution, we uncover and describe publication trends and trending topics. We compile common research goals, evaluation methods, metrics, and subjects. We summarize the current state-of-the-art and outline known existing challenges as well as new challenges uncovered during this review.We conclude that the main remaining challenges related to APIs and API evolution are (1) automatically identifying and leveraging factors that drive API changes, (2) creating and using uniform benchmarks for research evaluation, and (3) understanding the impact of API evolution on API developers and users with respect to various programming languages.&quot;,&quot;publisher&quot;:&quot;Association for Computing Machinery&quot;,&quot;issue&quot;:&quot;8&quot;,&quot;volume&quot;:&quot;54&quot;},&quot;isTemporary&quot;:false,&quot;suppress-author&quot;:false,&quot;composite&quot;:false,&quot;author-only&quot;:false}]},{&quot;citationID&quot;:&quot;MENDELEY_CITATION_efedfa8d-f481-4d26-803f-b46a0fbbe2b0&quot;,&quot;properties&quot;:{&quot;noteIndex&quot;:0},&quot;isEdited&quot;:false,&quot;manualOverride&quot;:{&quot;isManuallyOverridden&quot;:false,&quot;citeprocText&quot;:&quot;[25]&quot;,&quot;manualOverrideText&quot;:&quot;&quot;},&quot;citationTag&quot;:&quot;MENDELEY_CITATION_v3_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&quot;,&quot;citationItems&quot;:[{&quot;id&quot;:&quot;37c1f89b-0ce4-30eb-b7cf-2d8943ec72f5&quot;,&quot;itemData&quot;:{&quot;type&quot;:&quot;article-journal&quot;,&quot;id&quot;:&quot;37c1f89b-0ce4-30eb-b7cf-2d8943ec72f5&quot;,&quot;title&quot;:&quot;A Prompt Pattern Catalog to Enhance Prompt Engineering with ChatGPT&quot;,&quot;author&quot;:[{&quot;family&quot;:&quot;White&quot;,&quot;given&quot;:&quot;Jules&quot;,&quot;parse-names&quot;:false,&quot;dropping-particle&quot;:&quot;&quot;,&quot;non-dropping-particle&quot;:&quot;&quot;},{&quot;family&quot;:&quot;Fu&quot;,&quot;given&quot;:&quot;Quchen&quot;,&quot;parse-names&quot;:false,&quot;dropping-particle&quot;:&quot;&quot;,&quot;non-dropping-particle&quot;:&quot;&quot;},{&quot;family&quot;:&quot;Hays&quot;,&quot;given&quot;:&quot;Sam&quot;,&quot;parse-names&quot;:false,&quot;dropping-particle&quot;:&quot;&quot;,&quot;non-dropping-particle&quot;:&quot;&quot;},{&quot;family&quot;:&quot;Sandborn&quot;,&quot;given&quot;:&quot;Michael&quot;,&quot;parse-names&quot;:false,&quot;dropping-particle&quot;:&quot;&quot;,&quot;non-dropping-particle&quot;:&quot;&quot;},{&quot;family&quot;:&quot;Olea&quot;,&quot;given&quot;:&quot;Carlos&quot;,&quot;parse-names&quot;:false,&quot;dropping-particle&quot;:&quot;&quot;,&quot;non-dropping-particle&quot;:&quot;&quot;},{&quot;family&quot;:&quot;Gilbert&quot;,&quot;given&quot;:&quot;Henry&quot;,&quot;parse-names&quot;:false,&quot;dropping-particle&quot;:&quot;&quot;,&quot;non-dropping-particle&quot;:&quot;&quot;},{&quot;family&quot;:&quot;Elnashar&quot;,&quot;given&quot;:&quot;Ashraf&quot;,&quot;parse-names&quot;:false,&quot;dropping-particle&quot;:&quot;&quot;,&quot;non-dropping-particle&quot;:&quot;&quot;},{&quot;family&quot;:&quot;Spencer-Smith&quot;,&quot;given&quot;:&quot;Jesse&quot;,&quot;parse-names&quot;:false,&quot;dropping-particle&quot;:&quot;&quot;,&quot;non-dropping-particle&quot;:&quot;&quot;},{&quot;family&quot;:&quot;Schmidt&quot;,&quot;given&quot;:&quot;Douglas C&quot;,&quot;parse-names&quot;:false,&quot;dropping-particle&quot;:&quot;&quot;,&quot;non-dropping-particle&quot;:&quot;&quot;}],&quot;accessed&quot;:{&quot;date-parts&quot;:[[2025,8,28]]},&quot;URL&quot;:&quot;https://omekas-test.sba.unipi.it/files/original/9473424cea8d562f876a4bca4bedd9e2336910af.pdf&quot;,&quot;issued&quot;:{&quot;date-parts&quot;:[[2023]]},&quot;abstract&quot;:&quot;Prompt engineering is an increasingly important skill set needed to converse effectively with large language models (LLMs), such as ChatGPT. Prompts are instructions given to an LLM to enforce rules, automate processes, and ensure specific qualities (and quantities) of generated output. Prompts are also a form of programming that can customize the outputs and interactions with an LLM.&quot;,&quot;container-title-short&quot;:&quot;&quot;},&quot;isTemporary&quot;:false,&quot;suppress-author&quot;:false,&quot;composite&quot;:false,&quot;author-only&quot;:false}]},{&quot;citationID&quot;:&quot;MENDELEY_CITATION_0e2e9eba-ef5f-48bb-ad6a-d7c01b2e1c64&quot;,&quot;properties&quot;:{&quot;noteIndex&quot;:0},&quot;isEdited&quot;:false,&quot;manualOverride&quot;:{&quot;isManuallyOverridden&quot;:false,&quot;citeprocText&quot;:&quot;[26]&quot;,&quot;manualOverrideText&quot;:&quot;&quot;},&quot;citationTag&quot;:&quot;MENDELEY_CITATION_v3_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&quot;,&quot;citationItems&quot;:[{&quot;id&quot;:&quot;67672574-8d09-3c8a-acea-08c3d27ba58e&quot;,&quot;itemData&quot;:{&quot;type&quot;:&quot;article-journal&quot;,&quot;id&quot;:&quot;67672574-8d09-3c8a-acea-08c3d27ba58e&quot;,&quot;title&quot;:&quot;Prompt Engineering For ChatGPT: A Quick Guide To Techniques, Tips, And Best Practices&quot;,&quot;author&quot;:[{&quot;family&quot;:&quot;Ekin&quot;,&quot;given&quot;:&quot;Sabit&quot;,&quot;parse-names&quot;:false,&quot;dropping-particle&quot;:&quot;&quot;,&quot;non-dropping-particle&quot;:&quot;&quot;}],&quot;container-title&quot;:&quot;Authorea Preprints&quot;,&quot;accessed&quot;:{&quot;date-parts&quot;:[[2025,8,28]]},&quot;DOI&quot;:&quot;10.36227/TECHRXIV.22683919.V1&quot;,&quot;URL&quot;:&quot;https://www.techrxiv.org/doi/pdf/10.36227/techrxiv.22683919.v1/v1&quot;,&quot;issued&quot;:{&quot;date-parts&quot;:[[2023,10,30]]},&quot;abstract&quot;:&quot;In the rapidly evolving landscape of natural language processing (NLP), ChatGPT has emerged as a powerful tool for various industries and applications. To fully harness the potential of ChatGPT, it is crucial to understand and master the art of prompt engineering-the process of designing and refining input prompts to elicit desired responses from an AI NLP model. This article provides a comprehensive guide to mastering prompt engineering techniques, tips, and best practices to achieve optimal outcomes with ChatGPT. The discussion begins with an introduction to ChatGPT and the fundamentals of prompt engineering, followed by an exploration of techniques for effective prompt crafting, such as clarity, explicit constraints, experimentation, and leveraging different types of questions. The article also covers best practices, including iterative refinement, balancing user intent, harnessing external resources, and ensuring ethical usage. Advanced strategies, such as temperature and token control, prompt chaining, domain-specific adaptations, and handling ambiguous inputs, are also addressed. Real-world case studies demonstrate the practical applications of prompt engineering in customer support, content generation, domain-specific knowledge retrieval, and interactive storytelling. The article concludes by highlighting the impact of effective prompt engineering on ChatGPT performance, future research directions, and the importance of fostering creativity and collaboration within the ChatGPT community.&quot;,&quot;publisher&quot;:&quot;Authorea&quot;,&quot;container-title-short&quot;:&quot;&quot;},&quot;isTemporary&quot;:false,&quot;suppress-author&quot;:false,&quot;composite&quot;:false,&quot;author-only&quot;:false}]},{&quot;citationID&quot;:&quot;MENDELEY_CITATION_1c6b4394-f6f9-4952-9099-0218c3c2336a&quot;,&quot;properties&quot;:{&quot;noteIndex&quot;:0},&quot;isEdited&quot;:false,&quot;manualOverride&quot;:{&quot;isManuallyOverridden&quot;:false,&quot;citeprocText&quot;:&quot;[27]&quot;,&quot;manualOverrideText&quot;:&quot;&quot;},&quot;citationTag&quot;:&quot;MENDELEY_CITATION_v3_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&quot;,&quot;citationItems&quot;:[{&quot;id&quot;:&quot;dca70e98-091b-3b25-a31e-8ea8dbed5c74&quot;,&quot;itemData&quot;:{&quot;type&quot;:&quot;article-journal&quot;,&quot;id&quot;:&quot;dca70e98-091b-3b25-a31e-8ea8dbed5c74&quot;,&quot;title&quot;:&quot;A Systematic Survey of Prompt Engineering in Large Language Models: Techniques and Applications&quot;,&quot;author&quot;:[{&quot;family&quot;:&quot;Sahoo&quot;,&quot;given&quot;:&quot;Pranab&quot;,&quot;parse-names&quot;:false,&quot;dropping-particle&quot;:&quot;&quot;,&quot;non-dropping-particle&quot;:&quot;&quot;},{&quot;family&quot;:&quot;Singh&quot;,&quot;given&quot;:&quot;Ayush Kumar&quot;,&quot;parse-names&quot;:false,&quot;dropping-particle&quot;:&quot;&quot;,&quot;non-dropping-particle&quot;:&quot;&quot;},{&quot;family&quot;:&quot;Saha&quot;,&quot;given&quot;:&quot;Sriparna&quot;,&quot;parse-names&quot;:false,&quot;dropping-particle&quot;:&quot;&quot;,&quot;non-dropping-particle&quot;:&quot;&quot;},{&quot;family&quot;:&quot;Jain&quot;,&quot;given&quot;:&quot;Vinija&quot;,&quot;parse-names&quot;:false,&quot;dropping-particle&quot;:&quot;&quot;,&quot;non-dropping-particle&quot;:&quot;&quot;},{&quot;family&quot;:&quot;Mondal&quot;,&quot;given&quot;:&quot;Samrat&quot;,&quot;parse-names&quot;:false,&quot;dropping-particle&quot;:&quot;&quot;,&quot;non-dropping-particle&quot;:&quot;&quot;},{&quot;family&quot;:&quot;Chadha&quot;,&quot;given&quot;:&quot;Aman&quot;,&quot;parse-names&quot;:false,&quot;dropping-particle&quot;:&quot;&quot;,&quot;non-dropping-particle&quot;:&quot;&quot;}],&quot;accessed&quot;:{&quot;date-parts&quot;:[[2025,8,28]]},&quot;abstract&quot;:&quot;Prompt engineering has emerged as an indispensable technique for extending the capabilities of large language models (LLMs) and vision-language models (VLMs). This approach leverages task-specific instructions, known as prompts, to enhance model efficacy without modifying the core model parameters. Rather than updating the model parameters, prompts allow seamless integration of pre-trained models into downstream tasks by eliciting desired model behaviors solely based on the given prompt. Prompts can be natural language instructions that provide context to guide the model or learned vector representations that activate relevant knowledge. This burgeoning field has enabled success across various applications, from question-answering to commonsense reasoning. However, there remains a lack of systematic organization and understanding of the diverse prompt engineering methods and techniques. This survey paper addresses the gap by providing a structured overview of recent advancements in prompt engineering, categorized by application area. For each prompting approach, we provide a summary detailing the prompting methodology, its applications, the models involved, and the datasets utilized. We also delve into the strengths and limitations of each approach and include a taxonomy diagram and table summarizing datasets, models, and critical points of each prompting technique. This systematic analysis enables a better understanding of this rapidly developing field and facilitates future research by illuminating open challenges and opportunities for prompt engineering.&quot;},&quot;isTemporary&quot;:false,&quot;suppress-author&quot;:false,&quot;composite&quot;:false,&quot;author-only&quot;:false}]},{&quot;citationID&quot;:&quot;MENDELEY_CITATION_db017f6e-1f77-4e7b-b112-f564875ce92a&quot;,&quot;properties&quot;:{&quot;noteIndex&quot;:0},&quot;isEdited&quot;:false,&quot;manualOverride&quot;:{&quot;isManuallyOverridden&quot;:false,&quot;citeprocText&quot;:&quot;[28]&quot;,&quot;manualOverrideText&quot;:&quot;&quot;},&quot;citationTag&quot;:&quot;MENDELEY_CITATION_v3_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&quot;,&quot;citationItems&quot;:[{&quot;id&quot;:&quot;d887930f-7638-3202-967f-7b05dc021b5a&quot;,&quot;itemData&quot;:{&quot;type&quot;:&quot;article-journal&quot;,&quot;id&quot;:&quot;d887930f-7638-3202-967f-7b05dc021b5a&quot;,&quot;title&quot;:&quot;Scaffolding: Teaching and Learning in Language and Literacy Education.&quot;,&quot;author&quot;:[{&quot;family&quot;:&quot;Hammond&quot;,&quot;given&quot;:&quot;Jennifer, Ed.&quot;,&quot;parse-names&quot;:false,&quot;dropping-particle&quot;:&quot;&quot;,&quot;non-dropping-particle&quot;:&quot;&quot;}],&quot;accessed&quot;:{&quot;date-parts&quot;:[[2025,8,28]]},&quot;ISBN&quot;:&quot;1-875622-43-8&quot;,&quot;URL&quot;:&quot;http://www.peta.edu.au.&quot;,&quot;issued&quot;:{&quot;date-parts&quot;:[[2001,7]]},&quot;page&quot;:&quot;116&quot;,&quot;abstract&quot;:&quot;This book presents six essays that explain where the educational term&quot;,&quot;publisher&quot;:&quot;Primary English Teaching Assoc., P.O. Box 3106, Marrickville, New South Wales, 2204, Australia. Tel: (02) 9565 1277; Fax: (02) 9565 1070; e-mail: info@peta.edu.au; Web site: http://www.peta.edu.au.&quot;,&quot;container-title-short&quot;:&quot;&quot;},&quot;isTemporary&quot;:false,&quot;suppress-author&quot;:false,&quot;composite&quot;:false,&quot;author-only&quot;:false}]},{&quot;citationID&quot;:&quot;MENDELEY_CITATION_456d2559-42cc-49d3-8459-c804f4d47cd7&quot;,&quot;properties&quot;:{&quot;noteIndex&quot;:0},&quot;isEdited&quot;:false,&quot;manualOverride&quot;:{&quot;isManuallyOverridden&quot;:false,&quot;citeprocText&quot;:&quot;[29]&quot;,&quot;manualOverrideText&quot;:&quot;&quot;},&quot;citationTag&quot;:&quot;MENDELEY_CITATION_v3_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&quot;,&quot;citationItems&quot;:[{&quot;id&quot;:&quot;8d9f69d1-31d9-3048-9874-23efb5103f36&quot;,&quot;itemData&quot;:{&quot;type&quot;:&quot;article-journal&quot;,&quot;id&quot;:&quot;8d9f69d1-31d9-3048-9874-23efb5103f36&quot;,&quot;title&quot;:&quot;Scaffolding and dialogic teaching in mathematics education: introduction and review&quot;,&quot;author&quot;:[{&quot;family&quot;:&quot;Bakker&quot;,&quot;given&quot;:&quot;Arthur&quot;,&quot;parse-names&quot;:false,&quot;dropping-particle&quot;:&quot;&quot;,&quot;non-dropping-particle&quot;:&quot;&quot;},{&quot;family&quot;:&quot;Smit&quot;,&quot;given&quot;:&quot;Jantien&quot;,&quot;parse-names&quot;:false,&quot;dropping-particle&quot;:&quot;&quot;,&quot;non-dropping-particle&quot;:&quot;&quot;},{&quot;family&quot;:&quot;Wegerif&quot;,&quot;given&quot;:&quot;Rupert&quot;,&quot;parse-names&quot;:false,&quot;dropping-particle&quot;:&quot;&quot;,&quot;non-dropping-particle&quot;:&quot;&quot;}],&quot;container-title&quot;:&quot;ZDM - Mathematics Education&quot;,&quot;accessed&quot;:{&quot;date-parts&quot;:[[2025,8,28]]},&quot;DOI&quot;:&quot;10.1007/S11858-015-0738-8/FIGURES/2&quot;,&quot;ISSN&quot;:&quot;18639704&quot;,&quot;URL&quot;:&quot;https://link.springer.com/article/10.1007/s11858-015-0738-8&quot;,&quot;issued&quot;:{&quot;date-parts&quot;:[[2015,11,1]]},&quot;page&quot;:&quot;1047-1065&quot;,&quot;abstract&quot;:&quot;This article has two purposes: firstly to introduce this special issue on scaffolding and dialogic teaching in mathematics education and secondly to review the recent literature on these topics as well as the articles in this special issue. First we define and characterise scaffolding and dialogic teaching and provide a brief historical overview of the scaffolding metaphor. Then we present a review study of the recent scaffolding literature in mathematics education (2010–2015) based on 21 publications that fulfilled our criteria and 14 articles in this special issue that have scaffolding as a central focus. This is complemented with a brief review of the recent literature on dialogic teaching. We critically discuss some of the issues emerging from these reviews and provide some recommendations. We argue that scaffolding has the potential to be a useful integrative concept within mathematics education, especially when taking advantage of the insights from the dialogic teaching literature.&quot;,&quot;publisher&quot;:&quot;Springer Verlag&quot;,&quot;issue&quot;:&quot;7&quot;,&quot;volume&quot;:&quot;47&quot;,&quot;container-title-short&quot;:&quot;&quot;},&quot;isTemporary&quot;:false,&quot;suppress-author&quot;:false,&quot;composite&quot;:false,&quot;author-only&quot;:false}]},{&quot;citationID&quot;:&quot;MENDELEY_CITATION_217b93a3-ac1f-4d37-ab86-3054aead02cc&quot;,&quot;properties&quot;:{&quot;noteIndex&quot;:0},&quot;isEdited&quot;:false,&quot;manualOverride&quot;:{&quot;isManuallyOverridden&quot;:false,&quot;citeprocText&quot;:&quot;[30]&quot;,&quot;manualOverrideText&quot;:&quot;&quot;},&quot;citationTag&quot;:&quot;MENDELEY_CITATION_v3_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&quot;,&quot;citationItems&quot;:[{&quot;id&quot;:&quot;59ad901e-025f-3300-8467-1914e286dd2c&quot;,&quot;itemData&quot;:{&quot;type&quot;:&quot;article-journal&quot;,&quot;id&quot;:&quot;59ad901e-025f-3300-8467-1914e286dd2c&quot;,&quot;title&quot;:&quot;Aprendizaje adaptativo&quot;,&quot;author&quot;:[{&quot;family&quot;:&quot;María&quot;,&quot;given&quot;:&quot;Dª&quot;,&quot;parse-names&quot;:false,&quot;dropping-particle&quot;:&quot;&quot;,&quot;non-dropping-particle&quot;:&quot;&quot;},{&quot;family&quot;:&quot;Carmen&quot;,&quot;given&quot;:&quot;Del&quot;,&quot;parse-names&quot;:false,&quot;dropping-particle&quot;:&quot;&quot;,&quot;non-dropping-particle&quot;:&quot;&quot;},{&quot;family&quot;:&quot;Lozano&quot;,&quot;given&quot;:&quot;Morillo&quot;,&quot;parse-names&quot;:false,&quot;dropping-particle&quot;:&quot;&quot;,&quot;non-dropping-particle&quot;:&quot;&quot;}],&quot;accessed&quot;:{&quot;date-parts&quot;:[[2025,8,28]]},&quot;URL&quot;:&quot;https://uvadoc.uva.es/handle/10324/21000&quot;,&quot;issued&quot;:{&quot;date-parts&quot;:[[2016]]},&quot;abstract&quot;:&quot;Departamento de Química Orgánica&quot;,&quot;container-title-short&quot;:&quot;&quot;},&quot;isTemporary&quot;:false,&quot;suppress-author&quot;:false,&quot;composite&quot;:false,&quot;author-only&quot;:false}]},{&quot;citationID&quot;:&quot;MENDELEY_CITATION_69a923c5-0414-4dd4-a8a0-779d62e40eaa&quot;,&quot;properties&quot;:{&quot;noteIndex&quot;:0},&quot;isEdited&quot;:false,&quot;manualOverride&quot;:{&quot;isManuallyOverridden&quot;:false,&quot;citeprocText&quot;:&quot;[31]&quot;,&quot;manualOverrideText&quot;:&quot;&quot;},&quot;citationTag&quot;:&quot;MENDELEY_CITATION_v3_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&quot;,&quot;citationItems&quot;:[{&quot;id&quot;:&quot;ea128e7c-b5ed-37be-aeb3-e7dcb81acb96&quot;,&quot;itemData&quot;:{&quot;type&quot;:&quot;article&quot;,&quot;id&quot;:&quot;ea128e7c-b5ed-37be-aeb3-e7dcb81acb96&quot;,&quot;title&quot;:&quot;The Impact of AI-Driven Application Programming Interfaces (APIs) on Educational Information Management&quot;,&quot;author&quot;:[{&quot;family&quot;:&quot;Pérez-Jorge&quot;,&quot;given&quot;:&quot;David&quot;,&quot;parse-names&quot;:false,&quot;dropping-particle&quot;:&quot;&quot;,&quot;non-dropping-particle&quot;:&quot;&quot;},{&quot;family&quot;:&quot;González-Afonso&quot;,&quot;given&quot;:&quot;Miriam Catalina&quot;,&quot;parse-names&quot;:false,&quot;dropping-particle&quot;:&quot;&quot;,&quot;non-dropping-particle&quot;:&quot;&quot;},{&quot;family&quot;:&quot;Santos-Álvarez&quot;,&quot;given&quot;:&quot;Anthea Gara&quot;,&quot;parse-names&quot;:false,&quot;dropping-particle&quot;:&quot;&quot;,&quot;non-dropping-particle&quot;:&quot;&quot;},{&quot;family&quot;:&quot;Plasencia-Carballo&quot;,&quot;given&quot;:&quot;Zeus&quot;,&quot;parse-names&quot;:false,&quot;dropping-particle&quot;:&quot;&quot;,&quot;non-dropping-particle&quot;:&quot;&quot;},{&quot;family&quot;:&quot;Perdomo-López&quot;,&quot;given&quot;:&quot;Carmen de los Ángeles&quot;,&quot;parse-names&quot;:false,&quot;dropping-particle&quot;:&quot;&quot;,&quot;non-dropping-particle&quot;:&quot;&quot;}],&quot;container-title&quot;:&quot;Information (Switzerland)&quot;,&quot;DOI&quot;:&quot;10.3390/info16070540&quot;,&quot;ISSN&quot;:&quot;20782489&quot;,&quot;issued&quot;:{&quot;date-parts&quot;:[[2025,7,1]]},&quot;abstract&quot;:&quot;In today’s digitalized educational landscape, the intelligent use of information is essential for personalizing learning, improving assessment accuracy, and supporting data-driven pedagogical decisions. This systematic review examines the integration of Application Programming Interfaces (APIs) powered by Artificial Intelligence (AI) to enhance educational information management and learning processes. A total of 27 peer-reviewed studies published between 2013 and 2025 were analyzed. First, a general description of the selected works was provided, followed by a breakdown by dimensions in order to identify recurring patterns, stated interests and gaps in the current scientific literature on the use of AI-driven APIs in Education. The findings highlight five main benefits: data interoperability, personalized learning, automated feedback, real-time student monitoring, and predictive performance analytics. All studies addressed personalization, 74.1% focused on platform integration, and 37% examined automated feedback. Reported outcomes include improvements in engagement (63%), comprehension (55.6%), and academic achievement (48.1%). However, the review also identifies concerns about privacy, algorithmic bias, and limited methodological rigor in existing research. The study concludes with a conceptual model that synthesizes these findings from pedagogical, technological, and ethical perspectives, providing guidance for more adaptive, inclusive, and responsible uses of AI in education.&quot;,&quot;publisher&quot;:&quot;Multidisciplinary Digital Publishing Institute (MDPI)&quot;,&quot;issue&quot;:&quot;7&quot;,&quot;volume&quot;:&quot;16&quot;,&quot;container-title-short&quot;:&quot;&quot;},&quot;isTemporary&quot;:false,&quot;suppress-author&quot;:false,&quot;composite&quot;:false,&quot;author-only&quot;:false}]},{&quot;citationID&quot;:&quot;MENDELEY_CITATION_6e829d03-6009-4382-8fe9-37cd15585abb&quot;,&quot;properties&quot;:{&quot;noteIndex&quot;:0},&quot;isEdited&quot;:false,&quot;manualOverride&quot;:{&quot;isManuallyOverridden&quot;:false,&quot;citeprocText&quot;:&quot;[31]&quot;,&quot;manualOverrideText&quot;:&quot;&quot;},&quot;citationTag&quot;:&quot;MENDELEY_CITATION_v3_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&quot;,&quot;citationItems&quot;:[{&quot;id&quot;:&quot;ea128e7c-b5ed-37be-aeb3-e7dcb81acb96&quot;,&quot;itemData&quot;:{&quot;type&quot;:&quot;article&quot;,&quot;id&quot;:&quot;ea128e7c-b5ed-37be-aeb3-e7dcb81acb96&quot;,&quot;title&quot;:&quot;The Impact of AI-Driven Application Programming Interfaces (APIs) on Educational Information Management&quot;,&quot;author&quot;:[{&quot;family&quot;:&quot;Pérez-Jorge&quot;,&quot;given&quot;:&quot;David&quot;,&quot;parse-names&quot;:false,&quot;dropping-particle&quot;:&quot;&quot;,&quot;non-dropping-particle&quot;:&quot;&quot;},{&quot;family&quot;:&quot;González-Afonso&quot;,&quot;given&quot;:&quot;Miriam Catalina&quot;,&quot;parse-names&quot;:false,&quot;dropping-particle&quot;:&quot;&quot;,&quot;non-dropping-particle&quot;:&quot;&quot;},{&quot;family&quot;:&quot;Santos-Álvarez&quot;,&quot;given&quot;:&quot;Anthea Gara&quot;,&quot;parse-names&quot;:false,&quot;dropping-particle&quot;:&quot;&quot;,&quot;non-dropping-particle&quot;:&quot;&quot;},{&quot;family&quot;:&quot;Plasencia-Carballo&quot;,&quot;given&quot;:&quot;Zeus&quot;,&quot;parse-names&quot;:false,&quot;dropping-particle&quot;:&quot;&quot;,&quot;non-dropping-particle&quot;:&quot;&quot;},{&quot;family&quot;:&quot;Perdomo-López&quot;,&quot;given&quot;:&quot;Carmen de los Ángeles&quot;,&quot;parse-names&quot;:false,&quot;dropping-particle&quot;:&quot;&quot;,&quot;non-dropping-particle&quot;:&quot;&quot;}],&quot;container-title&quot;:&quot;Information (Switzerland)&quot;,&quot;DOI&quot;:&quot;10.3390/info16070540&quot;,&quot;ISSN&quot;:&quot;20782489&quot;,&quot;issued&quot;:{&quot;date-parts&quot;:[[2025,7,1]]},&quot;abstract&quot;:&quot;In today’s digitalized educational landscape, the intelligent use of information is essential for personalizing learning, improving assessment accuracy, and supporting data-driven pedagogical decisions. This systematic review examines the integration of Application Programming Interfaces (APIs) powered by Artificial Intelligence (AI) to enhance educational information management and learning processes. A total of 27 peer-reviewed studies published between 2013 and 2025 were analyzed. First, a general description of the selected works was provided, followed by a breakdown by dimensions in order to identify recurring patterns, stated interests and gaps in the current scientific literature on the use of AI-driven APIs in Education. The findings highlight five main benefits: data interoperability, personalized learning, automated feedback, real-time student monitoring, and predictive performance analytics. All studies addressed personalization, 74.1% focused on platform integration, and 37% examined automated feedback. Reported outcomes include improvements in engagement (63%), comprehension (55.6%), and academic achievement (48.1%). However, the review also identifies concerns about privacy, algorithmic bias, and limited methodological rigor in existing research. The study concludes with a conceptual model that synthesizes these findings from pedagogical, technological, and ethical perspectives, providing guidance for more adaptive, inclusive, and responsible uses of AI in education.&quot;,&quot;publisher&quot;:&quot;Multidisciplinary Digital Publishing Institute (MDPI)&quot;,&quot;issue&quot;:&quot;7&quot;,&quot;volume&quot;:&quot;16&quot;,&quot;container-title-short&quot;:&quot;&quot;},&quot;isTemporary&quot;:false,&quot;suppress-author&quot;:false,&quot;composite&quot;:false,&quot;author-only&quot;:false}]},{&quot;citationID&quot;:&quot;MENDELEY_CITATION_acdca407-0223-48a6-aed2-58b570171bca&quot;,&quot;properties&quot;:{&quot;noteIndex&quot;:0},&quot;isEdited&quot;:false,&quot;manualOverride&quot;:{&quot;isManuallyOverridden&quot;:false,&quot;citeprocText&quot;:&quot;[32]&quot;,&quot;manualOverrideText&quot;:&quot;&quot;},&quot;citationTag&quot;:&quot;MENDELEY_CITATION_v3_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&quot;,&quot;citationItems&quot;:[{&quot;id&quot;:&quot;81e15701-7714-3a69-b46a-ee6f3af4e953&quot;,&quot;itemData&quot;:{&quot;type&quot;:&quot;article-journal&quot;,&quot;id&quot;:&quot;81e15701-7714-3a69-b46a-ee6f3af4e953&quot;,&quot;title&quot;:&quot;Challenges and Opportunities for Sustainable Development Education Sector United Nations Educational, Scientific and Cultural Organization&quot;,&quot;author&quot;:[{&quot;family&quot;:&quot;Francesc Pedró&quot;,&quot;given&quot;:&quot;&quot;,&quot;parse-names&quot;:false,&quot;dropping-particle&quot;:&quot;&quot;,&quot;non-dropping-particle&quot;:&quot;&quot;},{&quot;family&quot;:&quot;Paula Valverde&quot;,&quot;given&quot;:&quot;&quot;,&quot;parse-names&quot;:false,&quot;dropping-particle&quot;:&quot;&quot;,&quot;non-dropping-particle&quot;:&quot;&quot;},{&quot;family&quot;:&quot;Axel Rivas&quot;,&quot;given&quot;:&quot;&quot;,&quot;parse-names&quot;:false,&quot;dropping-particle&quot;:&quot;&quot;,&quot;non-dropping-particle&quot;:&quot;&quot;},{&quot;family&quot;:&quot;Miguel Subosa&quot;,&quot;given&quot;:&quot;&quot;,&quot;parse-names&quot;:false,&quot;dropping-particle&quot;:&quot;&quot;,&quot;non-dropping-particle&quot;:&quot;&quot;}],&quot;container-title&quot;:&quot;Organización de las Naciones Unidas para la Educación, la Ciencia y la Cultura (UNESCO)&quot;,&quot;accessed&quot;:{&quot;date-parts&quot;:[[2025,9,6]]},&quot;URL&quot;:&quot;https://en.unesco.org/themes/education-policy-&quot;,&quot;issued&quot;:{&quot;date-parts&quot;:[[2019]]},&quot;container-title-short&quot;:&quot;&quot;},&quot;isTemporary&quot;:false,&quot;suppress-author&quot;:false,&quot;composite&quot;:false,&quot;author-only&quot;:false}]},{&quot;citationID&quot;:&quot;MENDELEY_CITATION_befffba0-4f26-41c0-b29e-75b5dca0c800&quot;,&quot;properties&quot;:{&quot;noteIndex&quot;:0},&quot;isEdited&quot;:false,&quot;manualOverride&quot;:{&quot;isManuallyOverridden&quot;:false,&quot;citeprocText&quot;:&quot;[33]&quot;,&quot;manualOverrideText&quot;:&quot;&quot;},&quot;citationTag&quot;:&quot;MENDELEY_CITATION_v3_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&quot;,&quot;citationItems&quot;:[{&quot;id&quot;:&quot;e3345c0d-2f69-3d90-832a-66ca79360893&quot;,&quot;itemData&quot;:{&quot;type&quot;:&quot;article-journal&quot;,&quot;id&quot;:&quot;e3345c0d-2f69-3d90-832a-66ca79360893&quot;,&quot;title&quot;:&quot;El impacto de la inteligencia artificial en la educación: transformación de la forma de enseñar y de aprender&quot;,&quot;author&quot;:[{&quot;family&quot;:&quot;González-González&quot;,&quot;given&quot;:&quot;Carina S.&quot;,&quot;parse-names&quot;:false,&quot;dropping-particle&quot;:&quot;&quot;,&quot;non-dropping-particle&quot;:&quot;&quot;}],&quot;container-title&quot;:&quot;Qurriculum. Revista de Teoría,Investigación y Práctica educativa&quot;,&quot;DOI&quot;:&quot;10.25145/j.qurricul.2023.36.03&quot;,&quot;ISSN&quot;:&quot;11305371&quot;,&quot;URL&quot;:&quot;https://riull.ull.es/xmlui/bitstream/handle/915/32719/Q_36_%20%282023%29_03.pdf?sequence=1&amp;isAllowed=y&quot;,&quot;issued&quot;:{&quot;date-parts&quot;:[[2023]]},&quot;page&quot;:&quot;51-60&quot;,&quot;abstract&quot;:&quot;&lt;p&gt;Artificial intelligence (AI) has demonstrated its potential to transform numerous fields and education is no exception. In today’s digital age, AI has emerged as a powerful tool that is revolutionizing teaching and learning. In this article, we will explore the impact of artificial intelligence in education and how it is transforming the educational landscape at all levels. From personalizing learning to improving feedback and developing interactive resources, we will examine how AI is changing how we acquire knowledge and skills.&lt;/p&gt;&quot;,&quot;issue&quot;:&quot;36&quot;,&quot;container-title-short&quot;:&quot;&quot;},&quot;isTemporary&quot;:false,&quot;suppress-author&quot;:false,&quot;composite&quot;:false,&quot;author-only&quot;:false}]},{&quot;citationID&quot;:&quot;MENDELEY_CITATION_fb719cc6-75e1-4bf8-9807-0a5d8f0fbb39&quot;,&quot;properties&quot;:{&quot;noteIndex&quot;:0},&quot;isEdited&quot;:false,&quot;manualOverride&quot;:{&quot;isManuallyOverridden&quot;:false,&quot;citeprocText&quot;:&quot;[34]&quot;,&quot;manualOverrideText&quot;:&quot;&quot;},&quot;citationTag&quot;:&quot;MENDELEY_CITATION_v3_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&quot;,&quot;citationItems&quot;:[{&quot;id&quot;:&quot;11ec537f-340a-36ab-9571-bd3a2dcd74d9&quot;,&quot;itemData&quot;:{&quot;type&quot;:&quot;article-journal&quot;,&quot;id&quot;:&quot;11ec537f-340a-36ab-9571-bd3a2dcd74d9&quot;,&quot;title&quot;:&quot;CONSTITUCIÓN DE LA REPÚBLICA DEL ECUADOR&quot;,&quot;author&quot;:[{&quot;family&quot;:&quot;CONSTITUCIÓN DE LA REPÚBLICA DEL ECUADOR&quot;,&quot;given&quot;:&quot;&quot;,&quot;parse-names&quot;:false,&quot;dropping-particle&quot;:&quot;&quot;,&quot;non-dropping-particle&quot;:&quot;&quot;}],&quot;container-title&quot;:&quot;Registro Oficial&quot;,&quot;accessed&quot;:{&quot;date-parts&quot;:[[2025,8,28]]},&quot;URL&quot;:&quot;https://www.defensa.gob.ec/wp-content/uploads/downloads/2021/02/Constitucion-de-la-Republica-del-Ecuador_act_ene-2021.pdf&quot;,&quot;issued&quot;:{&quot;date-parts&quot;:[[2008]]},&quot;page&quot;:&quot;25-2021&quot;,&quot;issue&quot;:&quot;20&quot;,&quot;volume&quot;:&quot;449&quot;,&quot;container-title-short&quot;:&quot;&quot;},&quot;isTemporary&quot;:false,&quot;suppress-author&quot;:false,&quot;composite&quot;:false,&quot;author-only&quot;:false}]},{&quot;citationID&quot;:&quot;MENDELEY_CITATION_994555f3-bc0b-4102-836e-a9945b73fad0&quot;,&quot;properties&quot;:{&quot;noteIndex&quot;:0},&quot;isEdited&quot;:false,&quot;manualOverride&quot;:{&quot;isManuallyOverridden&quot;:false,&quot;citeprocText&quot;:&quot;[35]&quot;,&quot;manualOverrideText&quot;:&quot;&quot;},&quot;citationTag&quot;:&quot;MENDELEY_CITATION_v3_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&quot;,&quot;citationItems&quot;:[{&quot;id&quot;:&quot;e6ee36d0-4dc8-38e4-9406-21b25e83aa08&quot;,&quot;itemData&quot;:{&quot;type&quot;:&quot;article-journal&quot;,&quot;id&quot;:&quot;e6ee36d0-4dc8-38e4-9406-21b25e83aa08&quot;,&quot;title&quot;:&quot;LEY ORGÁNICA DE EDUCACIÓN INTERCULTURAL&quot;,&quot;author&quot;:[{&quot;family&quot;:&quot;Ley Orgánica De Educación Intercultural&quot;,&quot;given&quot;:&quot;&quot;,&quot;parse-names&quot;:false,&quot;dropping-particle&quot;:&quot;&quot;,&quot;non-dropping-particle&quot;:&quot;&quot;}],&quot;accessed&quot;:{&quot;date-parts&quot;:[[2025,8,28]]},&quot;URL&quot;:&quot;https://educacion.gob.ec/wp-content/uploads/downloads/2017/02/Ley_Organica_de_Educacion_Intercultural_LOEI_codificado.pdf&quot;,&quot;abstract&quot;:&quot;ASAMBLEA NACIONAL EN PLENO Considerando: Que, el Artículo 26 de la Constitución de la República reconoce a la educación como un derecho que las personas lo ejercen a largo de su vida y un deber ineludible e inexcusable del Estado. Constituye un área prioritaria de la política pública y de la inversión estatal, garantía de la igualdad e inclusión social y condición indispensable para el buen vivir. Las personas, las familias y la sociedad tienen el derecho y la responsabilidad de participar en el proceso educativo; Que, el Art. 27 de la Constitución de la República establece que la educación debe estar centrada en el ser humano y garantizará su desarrollo holístico, en el marco del respeto a los derechos humanos, al medio ambiente sustentable y a la democracia; será participativa, obligatoria, intercultural, democrática, incluyente y diversa, de calidad y calidez; impulsará la equidad de género, la justicia, la solidaridad y la paz; estimulará el sentido crítico, el arte y la cultura física, la iniciativa individual y comunitaria, y el desarrollo de competencias y capacidades para crear y trabajar. La educación es indispensable para el conocimiento, el ejercicio de los derechos y la construcción de un país soberano, y constituye un eje estratégico para el desarrollo nacional; Que, el Artículo 28 de la Constitución de la República establece que la educación responderá al interés público y no estará al servicio de intereses individuales y corporativos. Se garantizará el acceso universal, permanencia, movilidad y egreso sin discriminación alguna y la obligatoriedad en el nivel inicial, básico y bachillerato o su equivalente. Es derecho de toda persona y comunidad interactuar entre culturas y participar en una sociedad que aprende. El Estado promoverá el diálogo intercultural en sus múltiples dimensiones. El aprendizaje se desarrollará de forma escolarizada y no escolarizada. La educación pública será universal y laica en todos sus niveles, y gratuita hasta el tercer nivel de educación superior inclusive. Que, el Artículo 29 de la Constitución de la República declara que el Estado garantizará la libertad de enseñanza, y el derecho de las personas de aprender en su propia lengua y ámbito cultural. Donde las madres y padres o sus representantes tendrán la libertad de escoger para sus hijas e hijos una educación acorde con sus principios, creencias y opciones pedagógicas.&quot;,&quot;container-title-short&quot;:&quot;&quot;},&quot;isTemporary&quot;:false,&quot;suppress-author&quot;:false,&quot;composite&quot;:false,&quot;author-only&quot;:false}]},{&quot;citationID&quot;:&quot;MENDELEY_CITATION_5a20bf12-12ae-4194-9c09-0e6de8ab6798&quot;,&quot;properties&quot;:{&quot;noteIndex&quot;:0},&quot;isEdited&quot;:false,&quot;manualOverride&quot;:{&quot;isManuallyOverridden&quot;:false,&quot;citeprocText&quot;:&quot;[36]&quot;,&quot;manualOverrideText&quot;:&quot;&quot;},&quot;citationTag&quot;:&quot;MENDELEY_CITATION_v3_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&quot;,&quot;citationItems&quot;:[{&quot;id&quot;:&quot;eb698d52-078f-3b28-b7e1-65aea2e0c42f&quot;,&quot;itemData&quot;:{&quot;type&quot;:&quot;article-journal&quot;,&quot;id&quot;:&quot;eb698d52-078f-3b28-b7e1-65aea2e0c42f&quot;,&quot;title&quot;:&quot;LEY ORGÁNICA DE PROTECCIÓN DE DATOS PERSONALES&quot;,&quot;author&quot;:[{&quot;family&quot;:&quot;LEY ORGÁNICA DE PROTECCIÓN DE DATOS PERSONALES&quot;,&quot;given&quot;:&quot;&quot;,&quot;parse-names&quot;:false,&quot;dropping-particle&quot;:&quot;&quot;,&quot;non-dropping-particle&quot;:&quot;&quot;}],&quot;accessed&quot;:{&quot;date-parts&quot;:[[2025,8,28]]},&quot;URL&quot;:&quot;https://www.finanzaspopulares.gob.ec/wp-content/uploads/2021/07/ley_organica_de_proteccion_de_datos_personales.pdf&quot;,&quot;container-title-short&quot;:&quot;&quot;},&quot;isTemporary&quot;:false,&quot;suppress-author&quot;:false,&quot;composite&quot;:false,&quot;author-only&quot;:false}]},{&quot;citationID&quot;:&quot;MENDELEY_CITATION_e10a4cf7-b013-402b-b833-c06cfee2f794&quot;,&quot;properties&quot;:{&quot;noteIndex&quot;:0},&quot;isEdited&quot;:false,&quot;manualOverride&quot;:{&quot;isManuallyOverridden&quot;:false,&quot;citeprocText&quot;:&quot;[37]&quot;,&quot;manualOverrideText&quot;:&quot;&quot;},&quot;citationTag&quot;:&quot;MENDELEY_CITATION_v3_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&quot;,&quot;citationItems&quot;:[{&quot;id&quot;:&quot;301c8898-d927-3460-a55c-a44c9aa53949&quot;,&quot;itemData&quot;:{&quot;type&quot;:&quot;article-journal&quot;,&quot;id&quot;:&quot;301c8898-d927-3460-a55c-a44c9aa53949&quot;,&quot;title&quot;:&quot;Codigo-Organico-de-la-Economia-Social-de-los-Conocimientos-Creatividad-e-Innovacion&quot;,&quot;author&quot;:[{&quot;family&quot;:&quot;ING. HUGO DEL POZO BARREZUETA DIRECTOR&quot;,&quot;given&quot;:&quot;&quot;,&quot;parse-names&quot;:false,&quot;dropping-particle&quot;:&quot;&quot;,&quot;non-dropping-particle&quot;:&quot;&quot;}],&quot;accessed&quot;:{&quot;date-parts&quot;:[[2025,8,28]]},&quot;URL&quot;:&quot;https://www.gobiernoelectronico.gob.ec/wp-content/uploads/2018/10/Codigo-Organico-de-la-Economia-Social-de-los-Conocimientos-Creatividad-e-Innovacion.pdf&quot;,&quot;container-title-short&quot;:&quot;&quot;},&quot;isTemporary&quot;:false,&quot;suppress-author&quot;:false,&quot;composite&quot;:false,&quot;author-only&quot;:false}]},{&quot;citationID&quot;:&quot;MENDELEY_CITATION_cf071099-c744-41ac-bc6d-122bca160fe5&quot;,&quot;properties&quot;:{&quot;noteIndex&quot;:0},&quot;isEdited&quot;:false,&quot;manualOverride&quot;:{&quot;isManuallyOverridden&quot;:false,&quot;citeprocText&quot;:&quot;[38]&quot;,&quot;manualOverrideText&quot;:&quot;&quot;},&quot;citationTag&quot;:&quot;MENDELEY_CITATION_v3_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&quot;,&quot;citationItems&quot;:[{&quot;id&quot;:&quot;8c40244a-ab1a-3336-a712-3509719a704e&quot;,&quot;itemData&quot;:{&quot;type&quot;:&quot;article-journal&quot;,&quot;id&quot;:&quot;8c40244a-ab1a-3336-a712-3509719a704e&quot;,&quot;title&quot;:&quot;Integration of technology and pedagogy in intelligent tutoring systems&quot;,&quot;author&quot;:[{&quot;family&quot;:&quot;Muñoz&quot;,&quot;given&quot;:&quot;Geovanny Francisco Ruiz&quot;,&quot;parse-names&quot;:false,&quot;dropping-particle&quot;:&quot;&quot;,&quot;non-dropping-particle&quot;:&quot;&quot;}],&quot;container-title&quot;:&quot;Edutec&quot;,&quot;DOI&quot;:&quot;10.21556/edutec.2024.89.3199&quot;,&quot;ISSN&quot;:&quot;11359250&quot;,&quot;issued&quot;:{&quot;date-parts&quot;:[[2024,9,1]]},&quot;page&quot;:&quot;144-155&quot;,&quot;abstract&quot;:&quot;Intelligent Tutoring Systems (ITS) have demonstrated their potential to enhance the teaching-learning process by providing personalized and adaptive instruction. However, effectively integrating technology and pedagogy within these systems remains a challenge. This study aimed to analyze the most effective approaches and strategies for achieving this integration. A mixed-method methodology was employed, combining bibliometric analysis, text mining, content analysis, and expert interviews. The results highlight the importance of using accurate student models, incorporating constructivist and multimedia learning approaches, applying adaptive feedback and scaffolding, and designing engaging interfaces. Challenges related to accessibility, scalability, and ethical considerations were also identified. The study concludes that an optimal combination of technological advancements, sound pedagogical principles, and a deep understanding of individual student needs is crucial for the success of ITS in improving learning outcomes.&quot;,&quot;publisher&quot;:&quot;GTE-Educational Technology Group, University of the Balearic Islands&quot;,&quot;issue&quot;:&quot;89&quot;},&quot;isTemporary&quot;:false,&quot;suppress-author&quot;:false,&quot;composite&quot;:false,&quot;author-only&quot;:false}]},{&quot;citationID&quot;:&quot;MENDELEY_CITATION_1232acd2-e162-42a1-b772-3e2e5b9180ab&quot;,&quot;properties&quot;:{&quot;noteIndex&quot;:0},&quot;isEdited&quot;:false,&quot;manualOverride&quot;:{&quot;isManuallyOverridden&quot;:false,&quot;citeprocText&quot;:&quot;[27]&quot;,&quot;manualOverrideText&quot;:&quot;&quot;},&quot;citationTag&quot;:&quot;MENDELEY_CITATION_v3_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&quot;,&quot;citationItems&quot;:[{&quot;id&quot;:&quot;dca70e98-091b-3b25-a31e-8ea8dbed5c74&quot;,&quot;itemData&quot;:{&quot;type&quot;:&quot;article-journal&quot;,&quot;id&quot;:&quot;dca70e98-091b-3b25-a31e-8ea8dbed5c74&quot;,&quot;title&quot;:&quot;A Systematic Survey of Prompt Engineering in Large Language Models: Techniques and Applications&quot;,&quot;author&quot;:[{&quot;family&quot;:&quot;Sahoo&quot;,&quot;given&quot;:&quot;Pranab&quot;,&quot;parse-names&quot;:false,&quot;dropping-particle&quot;:&quot;&quot;,&quot;non-dropping-particle&quot;:&quot;&quot;},{&quot;family&quot;:&quot;Singh&quot;,&quot;given&quot;:&quot;Ayush Kumar&quot;,&quot;parse-names&quot;:false,&quot;dropping-particle&quot;:&quot;&quot;,&quot;non-dropping-particle&quot;:&quot;&quot;},{&quot;family&quot;:&quot;Saha&quot;,&quot;given&quot;:&quot;Sriparna&quot;,&quot;parse-names&quot;:false,&quot;dropping-particle&quot;:&quot;&quot;,&quot;non-dropping-particle&quot;:&quot;&quot;},{&quot;family&quot;:&quot;Jain&quot;,&quot;given&quot;:&quot;Vinija&quot;,&quot;parse-names&quot;:false,&quot;dropping-particle&quot;:&quot;&quot;,&quot;non-dropping-particle&quot;:&quot;&quot;},{&quot;family&quot;:&quot;Mondal&quot;,&quot;given&quot;:&quot;Samrat&quot;,&quot;parse-names&quot;:false,&quot;dropping-particle&quot;:&quot;&quot;,&quot;non-dropping-particle&quot;:&quot;&quot;},{&quot;family&quot;:&quot;Chadha&quot;,&quot;given&quot;:&quot;Aman&quot;,&quot;parse-names&quot;:false,&quot;dropping-particle&quot;:&quot;&quot;,&quot;non-dropping-particle&quot;:&quot;&quot;}],&quot;accessed&quot;:{&quot;date-parts&quot;:[[2025,8,28]]},&quot;abstract&quot;:&quot;Prompt engineering has emerged as an indispensable technique for extending the capabilities of large language models (LLMs) and vision-language models (VLMs). This approach leverages task-specific instructions, known as prompts, to enhance model efficacy without modifying the core model parameters. Rather than updating the model parameters, prompts allow seamless integration of pre-trained models into downstream tasks by eliciting desired model behaviors solely based on the given prompt. Prompts can be natural language instructions that provide context to guide the model or learned vector representations that activate relevant knowledge. This burgeoning field has enabled success across various applications, from question-answering to commonsense reasoning. However, there remains a lack of systematic organization and understanding of the diverse prompt engineering methods and techniques. This survey paper addresses the gap by providing a structured overview of recent advancements in prompt engineering, categorized by application area. For each prompting approach, we provide a summary detailing the prompting methodology, its applications, the models involved, and the datasets utilized. We also delve into the strengths and limitations of each approach and include a taxonomy diagram and table summarizing datasets, models, and critical points of each prompting technique. This systematic analysis enables a better understanding of this rapidly developing field and facilitates future research by illuminating open challenges and opportunities for prompt engineering.&quot;},&quot;isTemporary&quot;:false,&quot;suppress-author&quot;:false,&quot;composite&quot;:false,&quot;author-only&quot;:false}]},{&quot;citationID&quot;:&quot;MENDELEY_CITATION_d5249e27-0f30-49fc-a8b9-e949d835c1f8&quot;,&quot;properties&quot;:{&quot;noteIndex&quot;:0},&quot;isEdited&quot;:false,&quot;manualOverride&quot;:{&quot;isManuallyOverridden&quot;:false,&quot;citeprocText&quot;:&quot;[39]&quot;,&quot;manualOverrideText&quot;:&quot;&quot;},&quot;citationTag&quot;:&quot;MENDELEY_CITATION_v3_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&quot;,&quot;citationItems&quot;:[{&quot;id&quot;:&quot;18a0d745-1c3c-3d60-b8f0-06aef3cf0f37&quot;,&quot;itemData&quot;:{&quot;type&quot;:&quot;article-journal&quot;,&quot;id&quot;:&quot;18a0d745-1c3c-3d60-b8f0-06aef3cf0f37&quot;,&quot;title&quot;:&quot;Interface design: A neglected issue in educational software&quot;,&quot;author&quot;:[{&quot;family&quot;:&quot;Frye&quot;,&quot;given&quot;:&quot;D&quot;,&quot;parse-names&quot;:false,&quot;dropping-particle&quot;:&quot;&quot;,&quot;non-dropping-particle&quot;:&quot;&quot;},{&quot;family&quot;:&quot;Bulletin&quot;,&quot;given&quot;:&quot;E Soloway - ACM SIGCHI&quot;,&quot;parse-names&quot;:false,&quot;dropping-particle&quot;:&quot;&quot;,&quot;non-dropping-particle&quot;:&quot;&quot;},{&quot;family&quot;:&quot;1986&quot;,&quot;given&quot;:&quot;undefined&quot;,&quot;parse-names&quot;:false,&quot;dropping-particle&quot;:&quot;&quot;,&quot;non-dropping-particle&quot;:&quot;&quot;}],&quot;container-title&quot;:&quot;dl.acm.org&quot;,&quot;accessed&quot;:{&quot;date-parts&quot;:[[2025,9,13]]},&quot;DOI&quot;:&quot;10.1145/30851.30865&quot;,&quot;ISSN&quot;:&quot;0736-6906&quot;,&quot;URL&quot;:&quot;https://dl.acm.org/doi/abs/10.1145/30851.30865&quot;,&quot;issued&quot;:{&quot;date-parts&quot;:[[1986,5]]},&quot;page&quot;:&quot;93-97&quot;,&quot;abstract&quot;:&quot;The user interface is particularly important for educational software because 1) it must provide an entry to the content domain of the program rather than vice versa and 2) it must be sensitive to the general skill and/or developmental level of the user. In spite of these special characteristics, interface design for educational software has been given little attention. This study evaluates a representative interface from arithmetic software now used in the schools. It was found that the interface caused students a large number of difficulties. These difficulties were sufficient to interfere with the instructional effectiveness of the software. Designing interfaces that will benefit educational software will require careful study of the users of these programs along with an in-depth understanding of the domains being taught.&quot;,&quot;publisher&quot;:&quot;Association for Computing Machinery (ACM)&quot;,&quot;issue&quot;:&quot;SI&quot;,&quot;volume&quot;:&quot;17&quot;,&quot;container-title-short&quot;:&quot;&quot;},&quot;isTemporary&quot;:false,&quot;suppress-author&quot;:false,&quot;composite&quot;:false,&quot;author-only&quot;:false}]},{&quot;citationID&quot;:&quot;MENDELEY_CITATION_5c86261a-075e-4d15-aef7-fd16ba99cc01&quot;,&quot;properties&quot;:{&quot;noteIndex&quot;:0},&quot;isEdited&quot;:false,&quot;manualOverride&quot;:{&quot;isManuallyOverridden&quot;:false,&quot;citeprocText&quot;:&quot;[40]&quot;,&quot;manualOverrideText&quot;:&quot;&quot;},&quot;citationTag&quot;:&quot;MENDELEY_CITATION_v3_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&quot;,&quot;citationItems&quot;:[{&quot;id&quot;:&quot;68e91740-a484-31b2-a2fd-d41f257c2cd2&quot;,&quot;itemData&quot;:{&quot;type&quot;:&quot;article-journal&quot;,&quot;id&quot;:&quot;68e91740-a484-31b2-a2fd-d41f257c2cd2&quot;,&quot;title&quot;:&quot;AI literacy and its implications for prompt engineering strategies&quot;,&quot;author&quot;:[{&quot;family&quot;:&quot;Knoth&quot;,&quot;given&quot;:&quot;Nils&quot;,&quot;parse-names&quot;:false,&quot;dropping-particle&quot;:&quot;&quot;,&quot;non-dropping-particle&quot;:&quot;&quot;},{&quot;family&quot;:&quot;Tolzin&quot;,&quot;given&quot;:&quot;Antonia&quot;,&quot;parse-names&quot;:false,&quot;dropping-particle&quot;:&quot;&quot;,&quot;non-dropping-particle&quot;:&quot;&quot;},{&quot;family&quot;:&quot;Janson&quot;,&quot;given&quot;:&quot;Andreas&quot;,&quot;parse-names&quot;:false,&quot;dropping-particle&quot;:&quot;&quot;,&quot;non-dropping-particle&quot;:&quot;&quot;},{&quot;family&quot;:&quot;Leimeister&quot;,&quot;given&quot;:&quot;Jan Marco&quot;,&quot;parse-names&quot;:false,&quot;dropping-particle&quot;:&quot;&quot;,&quot;non-dropping-particle&quot;:&quot;&quot;}],&quot;container-title&quot;:&quot;Computers and Education: Artificial Intelligence&quot;,&quot;accessed&quot;:{&quot;date-parts&quot;:[[2025,8,11]]},&quot;DOI&quot;:&quot;10.1016/J.CAEAI.2024.100225&quot;,&quot;ISSN&quot;:&quot;2666-920X&quot;,&quot;URL&quot;:&quot;https://www.sciencedirect.com/science/article/pii/S2666920X24000262?via%3Dihub&quot;,&quot;issued&quot;:{&quot;date-parts&quot;:[[2024,6,1]]},&quot;page&quot;:&quot;100225&quot;,&quot;abstract&quot;:&quot;Artificial intelligence technologies are rapidly advancing. As part of this development, large language models (LLMs) are increasingly being used when humans interact with systems based on artificial intelligence (AI), posing both new opportunities and challenges. When interacting with LLM-based AI system in a goal-directed manner, prompt engineering has evolved as a skill of formulating precise and well-structured instructions to elicit desired responses or information from the LLM, optimizing the effectiveness of the interaction. However, research on the perspectives of non-experts using LLM-based AI systems through prompt engineering and on how AI literacy affects prompting behavior is lacking. This aspect is particularly important when considering the implications of LLMs in the context of higher education. In this present study, we address this issue, introduce a skill-based approach to prompt engineering, and explicitly consider the role of non-experts' AI literacy (students) in their prompt engineering skills. We also provide qualitative insights into students’ intuitive behaviors towards LLM-based AI systems. The results show that higher-quality prompt engineering skills predict the quality of LLM output, suggesting that prompt engineering is indeed a required skill for the goal-directed use of generative AI tools. In addition, the results show that certain aspects of AI literacy can play a role in higher quality prompt engineering and targeted adaptation of LLMs within education. We, therefore, argue for the integration of AI educational content into current curricula to enable a hybrid intelligent society in which students can effectively use generative AI tools such as ChatGPT.&quot;,&quot;publisher&quot;:&quot;Elsevier&quot;,&quot;volume&quot;:&quot;6&quot;,&quot;container-title-short&quot;:&quot;&quot;},&quot;isTemporary&quot;:false,&quot;suppress-author&quot;:false,&quot;composite&quot;:false,&quot;author-only&quot;:false}]},{&quot;citationID&quot;:&quot;MENDELEY_CITATION_0d085d9a-e987-4e62-86d1-7b5acd17fd2f&quot;,&quot;properties&quot;:{&quot;noteIndex&quot;:0},&quot;isEdited&quot;:false,&quot;manualOverride&quot;:{&quot;isManuallyOverridden&quot;:false,&quot;citeprocText&quot;:&quot;[41]&quot;,&quot;manualOverrideText&quot;:&quot;&quot;},&quot;citationTag&quot;:&quot;MENDELEY_CITATION_v3_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&quot;,&quot;citationItems&quot;:[{&quot;id&quot;:&quot;7161ae98-ae72-3870-9ed7-1aa77800d86c&quot;,&quot;itemData&quot;:{&quot;type&quot;:&quot;article-journal&quot;,&quot;id&quot;:&quot;7161ae98-ae72-3870-9ed7-1aa77800d86c&quot;,&quot;title&quot;:&quot;Scaffolding Technique Framing the Issue&quot;,&quot;author&quot;:[{&quot;family&quot;:&quot;Gonulal&quot;,&quot;given&quot;:&quot;Talip&quot;,&quot;parse-names&quot;:false,&quot;dropping-particle&quot;:&quot;&quot;,&quot;non-dropping-particle&quot;:&quot;&quot;},{&quot;family&quot;:&quot;Loewen&quot;,&quot;given&quot;:&quot;Shawn&quot;,&quot;parse-names&quot;:false,&quot;dropping-particle&quot;:&quot;&quot;,&quot;non-dropping-particle&quot;:&quot;&quot;}],&quot;accessed&quot;:{&quot;date-parts&quot;:[[2025,8,28]]},&quot;DOI&quot;:&quot;10.1002/9781118784235.eelt0180&quot;,&quot;URL&quot;:&quot;https://talipgonulal.wordpress.com/wp-content/uploads/2018/02/gonulal-loewen-2018.pdf&quot;,&quot;issued&quot;:{&quot;date-parts&quot;:[[2018]]}},&quot;isTemporary&quot;:false,&quot;suppress-author&quot;:false,&quot;composite&quot;:false,&quot;author-only&quot;:false}]},{&quot;citationID&quot;:&quot;MENDELEY_CITATION_91ef33d2-d4fd-4b83-a0ef-6f4ac2d62eb4&quot;,&quot;properties&quot;:{&quot;noteIndex&quot;:0},&quot;isEdited&quot;:false,&quot;manualOverride&quot;:{&quot;isManuallyOverridden&quot;:false,&quot;citeprocText&quot;:&quot;[42]&quot;,&quot;manualOverrideText&quot;:&quot;&quot;},&quot;citationTag&quot;:&quot;MENDELEY_CITATION_v3_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&quot;,&quot;citationItems&quot;:[{&quot;id&quot;:&quot;5c26cac5-4c7c-3b24-8910-04d63f4e7f60&quot;,&quot;itemData&quot;:{&quot;type&quot;:&quot;webpage&quot;,&quot;id&quot;:&quot;5c26cac5-4c7c-3b24-8910-04d63f4e7f60&quot;,&quot;title&quot;:&quot;TrigTutor IA - Tesis UTEQ&quot;,&quot;accessed&quot;:{&quot;date-parts&quot;:[[2025,9,6]]},&quot;URL&quot;:&quot;https://aitrigonometria.web.app/&quot;,&quot;container-title-short&quot;:&quot;&quot;},&quot;isTemporary&quot;:false,&quot;suppress-author&quot;:false,&quot;composite&quot;:false,&quot;author-only&quot;:false}]}]"/>
+    <we:property name="MENDELEY_BIBLIOGRAPHY_IS_DIRTY" value="false"/>
+    <we:property name="MENDELEY_BIBLIOGRAPHY_LAST_MODIFIED" value="1757995230224"/>
+    <we:property name="MENDELEY_CITATIONS" value="[{&quot;citationID&quot;:&quot;MENDELEY_CITATION_f28c964d-17bc-458d-a527-1c1e9395ce36&quot;,&quot;properties&quot;:{&quot;noteIndex&quot;:0},&quot;isEdited&quot;:false,&quot;manualOverride&quot;:{&quot;isManuallyOverridden&quot;:false,&quot;citeprocText&quot;:&quot;[1]&quot;,&quot;manualOverrideText&quot;:&quot;&quot;},&quot;citationTag&quot;:&quot;MENDELEY_CITATION_v3_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&quot;,&quot;citationItems&quot;:[{&quot;id&quot;:&quot;c25252e4-a07b-3e36-a85f-416432921fd5&quot;,&quot;itemData&quot;:{&quot;type&quot;:&quot;article-journal&quot;,&quot;id&quot;:&quot;c25252e4-a07b-3e36-a85f-416432921fd5&quot;,&quot;title&quot;:&quot;Artificial Intelligence and the Future of Work: Job Shifting Not Job Loss&quot;,&quot;author&quot;:[{&quot;family&quot;:&quot;George&quot;,&quot;given&quot;:&quot;A Shaji&quot;,&quot;parse-names&quot;:false,&quot;dropping-particle&quot;:&quot;&quot;,&quot;non-dropping-particle&quot;:&quot;&quot;}],&quot;DOI&quot;:&quot;10.5281/zenodo.10936490&quot;,&quot;URL&quot;:&quot;www.puirp.com&quot;,&quot;issued&quot;:{&quot;date-parts&quot;:[[2024]]},&quot;abstract&quot;:&quot;As artificial intelligence (AI) and automation technologies advance fast, substantial discussion remains about their influence on jobs and employment. Some expect enormous job losses and structural unemployment as computers and algorithms replace human workers in a variety of industries. However, the prevailing scholarly viewpoint is that, while AI will revolutionize work, it will not result in long-term job losses. AI is projected to have a net impact of job shifting rather than job loss by increasing productivity, accelerating economic growth, changing the structure of jobs, and allowing sectoral employment transitions. Detailed productivity evaluations show a strong correlation between productivity gains and net job creation. A 2022 meta-analysis of 127 papers indicated that productivity increases consistently improve employment and wages. Additional crosscountry data from the OECD shows this association across a wide range of industrialized and emerging countries. Meanwhile, long-term data reveal that working hours have steadily decreased in recent decades without causing significant job losses, while productivity and earnings have increased in parallel. Integrating AI to automate monotonous jobs and improve human capabilities could fuel this trend. Displaced workers can transfer into new occupational jobs with adequate skilling and transition support rather than facing long periods of unemployment. Sectoral shifts have also characterized historical labor market evolutions following technology disruptions. As innovative industries outcompete legacy ones, economies undergo structural transformations. Current trends show that services are expanding while manufacturing is contracting in most sophisticated countries. AI and automation will most certainly speed the shift of occupations from manual production to skilled service roles, hence facilitating this transition. With appropriate government provisions such as retraining programs and educational expansions, the necessary employment transitions between sectors can occur smoothly rather than disruptively. In summary, while the AI revolution will fundamentally alter labor markets, effective governmental measures can ensure that job shifting outpaces loss. Workers must be supported in regularly adapting their skill sets and transitioning into new roles. Firms should invest in personnel skill development as well as smart technology integration. And governments should develop multiple ways to assist different groups in navigating the transitions, including the extension of social safety nets where appropriate. With coordinated efforts to optimize human-AI collaboration, this technology tsunami does not have to result in negative job impacts, but can instead place people in more rewarding, higher-value jobs. The view remains cautiously encouraging, providing stakeholders focus on boosting human talents to share in the AI-driven productivity windfall rather than simply displacing them.&quot;,&quot;container-title-short&quot;:&quot;&quot;},&quot;isTemporary&quot;:false,&quot;suppress-author&quot;:false,&quot;composite&quot;:false,&quot;author-only&quot;:false}]},{&quot;citationID&quot;:&quot;MENDELEY_CITATION_8dfcf854-6ba4-433d-8326-861463938067&quot;,&quot;properties&quot;:{&quot;noteIndex&quot;:0},&quot;isEdited&quot;:false,&quot;manualOverride&quot;:{&quot;isManuallyOverridden&quot;:false,&quot;citeprocText&quot;:&quot;[2]&quot;,&quot;manualOverrideText&quot;:&quot;&quot;},&quot;citationTag&quot;:&quot;MENDELEY_CITATION_v3_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&quot;,&quot;citationItems&quot;:[{&quot;id&quot;:&quot;fc44d4d6-d406-3b0d-9047-f22566bd0362&quot;,&quot;itemData&quot;:{&quot;type&quot;:&quot;article&quot;,&quot;id&quot;:&quot;fc44d4d6-d406-3b0d-9047-f22566bd0362&quot;,&quot;title&quot;:&quot;DeepSeek and GPT Fall Behind: Claude Leads in Zero-Shot Consumer Complaints Classification&quot;,&quot;author&quot;:[{&quot;family&quot;:&quot;Roumeliotis&quot;,&quot;given&quot;:&quot;Konstantinos I.&quot;,&quot;parse-names&quot;:false,&quot;dropping-particle&quot;:&quot;&quot;,&quot;non-dropping-particle&quot;:&quot;&quot;},{&quot;family&quot;:&quot;Tselikas&quot;,&quot;given&quot;:&quot;Nikolaos D.&quot;,&quot;parse-names&quot;:false,&quot;dropping-particle&quot;:&quot;&quot;,&quot;non-dropping-particle&quot;:&quot;&quot;},{&quot;family&quot;:&quot;Nasiopoulos&quot;,&quot;given&quot;:&quot;Dimitrios K.&quot;,&quot;parse-names&quot;:false,&quot;dropping-particle&quot;:&quot;&quot;,&quot;non-dropping-particle&quot;:&quot;&quot;}],&quot;DOI&quot;:&quot;10.20944/preprints202502.0720.v1&quot;,&quot;URL&quot;:&quot;https://www.preprints.org/manuscript/202502.0720/v1&quot;,&quot;issued&quot;:{&quot;date-parts&quot;:[[2025,2,10]]},&quot;abstract&quot;:&quot;&lt;p&gt;Large language models (LLMs) have demonstrated remarkable capabilities in various natural language processing (NLP) tasks, but their effectiveness in real-world consumer complaint classification without fine-tuning remains uncertain. Zero-shot classification is particularly challenging in finance, where complaint categories often overlap, requiring a deep understanding of nuanced language. In this study, we evaluate the zero-shot classification performance of leading LLMs— DeepSeek-V3, OpenAI’s GPT-4o and GPT-4o mini, and Anthropic’s Claude 3.5 Sonnet and Claude 3.5 Haiku—on consumer complaints submitted to the Consumer Financial Protection Bureau (CFPB). These models were tasked with categorizing complaints into five predefined financial classes based solely on complaint text. Performance was measured using accuracy, precision, recall, F1-score, and heatmaps to identify classification patterns. While DeepSeek Chat and GPT-4o produced competitive results, Claude 3.5 Sonnet consistently outperformed all models, demonstrating superior classification accuracy and efficiency. These findings highlight the relative strengths and limitations of DeepSeek-V3 and other top-tier models in financial text processing, providing valuable insights into their practical applications.&lt;/p&gt;&quot;,&quot;container-title-short&quot;:&quot;&quot;},&quot;isTemporary&quot;:false,&quot;suppress-author&quot;:false,&quot;composite&quot;:false,&quot;author-only&quot;:false}]},{&quot;citationID&quot;:&quot;MENDELEY_CITATION_87b9dfdf-fd2a-44be-8bd3-a3e8e237b739&quot;,&quot;properties&quot;:{&quot;noteIndex&quot;:0},&quot;isEdited&quot;:false,&quot;manualOverride&quot;:{&quot;isManuallyOverridden&quot;:false,&quot;citeprocText&quot;:&quot;[3]&quot;,&quot;manualOverrideText&quot;:&quot;&quot;},&quot;citationTag&quot;:&quot;MENDELEY_CITATION_v3_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&quot;,&quot;citationItems&quot;:[{&quot;id&quot;:&quot;e0330f39-09fd-3be8-8a3f-0989b0c4966c&quot;,&quot;itemData&quot;:{&quot;type&quot;:&quot;article-journal&quot;,&quot;id&quot;:&quot;e0330f39-09fd-3be8-8a3f-0989b0c4966c&quot;,&quot;title&quot;:&quot;Inteligencia Artificial en la Educación: Estado del Arte&quot;,&quot;author&quot;:[{&quot;family&quot;:&quot;Sambola&quot;,&quot;given&quot;:&quot;Dexon-Mckensy&quot;,&quot;parse-names&quot;:false,&quot;dropping-particle&quot;:&quot;&quot;,&quot;non-dropping-particle&quot;:&quot;&quot;}],&quot;container-title&quot;:&quot;Wani&quot;,&quot;DOI&quot;:&quot;10.5377/wani.v39i79.16806&quot;,&quot;ISSN&quot;:&quot;1813-369X&quot;,&quot;issued&quot;:{&quot;date-parts&quot;:[[2023,10,11]]},&quot;abstract&quot;:&quot;La Inteligencia Artificial en la Educación es un campo de investigación científica que ha surgido a lo largo de 3 décadas, está particularmente interesada en el desarrollo de herramientas basadas en IA para apoyar y comprender los procesos educativos. Esta investigación tiene como objetivo presentar el estado de la Inteligencia Artificial en la Educación, utilizando un método de revisión exhaustiva de la literatura. Comprendió 3 etapas principales: selección, clasificación y análisis de la literatura. Esto permitió identificar las aplicaciones, tecnologías, desafíos e implicaciones éticas de la Inteligencia Artificial en la Educación&quot;,&quot;publisher&quot;:&quot;Consejo Nacional de Universidades&quot;,&quot;issue&quot;:&quot;79&quot;,&quot;container-title-short&quot;:&quot;&quot;},&quot;isTemporary&quot;:false}]},{&quot;citationID&quot;:&quot;MENDELEY_CITATION_18ca400e-4fcb-42c5-82bc-033d3d56f058&quot;,&quot;properties&quot;:{&quot;noteIndex&quot;:0},&quot;isEdited&quot;:false,&quot;manualOverride&quot;:{&quot;isManuallyOverridden&quot;:false,&quot;citeprocText&quot;:&quot;[4]&quot;,&quot;manualOverrideText&quot;:&quot;&quot;},&quot;citationTag&quot;:&quot;MENDELEY_CITATION_v3_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&quot;,&quot;citationItems&quot;:[{&quot;id&quot;:&quot;d60509d4-c1c4-3bc5-b29e-e615e26af0d4&quot;,&quot;itemData&quot;:{&quot;type&quot;:&quot;report&quot;,&quot;id&quot;:&quot;d60509d4-c1c4-3bc5-b29e-e615e26af0d4&quot;,&quot;title&quot;:&quot;Um Estudo Acerca do Uso de IA Generativa no Apoio à Aprendizagem de Programação&quot;,&quot;author&quot;:[{&quot;family&quot;:&quot;Almeida de Bem&quot;,&quot;given&quot;:&quot;Rafael&quot;,&quot;parse-names&quot;:false,&quot;dropping-particle&quot;:&quot;&quot;,&quot;non-dropping-particle&quot;:&quot;&quot;},{&quot;family&quot;:&quot;Aparecida Konzen&quot;,&quot;given&quot;:&quot;Andréa&quot;,&quot;parse-names&quot;:false,&quot;dropping-particle&quot;:&quot;&quot;,&quot;non-dropping-particle&quot;:&quot;&quot;}],&quot;URL&quot;:&quot;https://github.com/huggingface/transformers&quot;,&quot;issued&quot;:{&quot;date-parts&quot;:[[2024,6]]},&quot;language&quot;:&quot;portugués&quot;,&quot;abstract&quot;:&quot;Resumo-Avanços recentes em Inteligência Artificial (IA) têm transformado sua aplicação de uma explora-ção teórica para implementação prática, criando novas oportunidades e desafios em ambientes de aprendiza-gem. Este trabalho de conclusão de curso, realizado na Pontifícia Universidade Católica do Rio Grande do Sul, explora como a IA Generativa pode aprimorar experi-ências de aprendizagem na disciplina de Fundamentos da Programação. O sistema desenvolvido utiliza gran-des modelos de linguagem e emprega conceitos-chave como transformers, zero-shot prompting e Retrieval-Augmented Generation para fornecer assistência perso-nalizada aos estudantes, gerando respostas relevantes e sensíveis ao contexto. Os resultados destacam tanto os benefícios quanto as limitações da IA Generativa em âmbitos de aprendizagem. Palavras-chave-Inteligência Artificial Generativa, aprendizado em ciência da computação, grandes mo-delos de linguagem, transformers, Retrieval-Augmented Generation, respostas sensíveis ao contexto. Abstract-Recent advances in artificial intelligence (AI) have transformed its application from theoretical exploration to practical implementation, creating new opportunities and challenges in learning environments. This undergraduate thesis, conducted at the Pontifícia Universidade Católica do Rio Grande do Sul, explores how generative AI can enhance learning experiences in the Fundamentals of Programming course. The developed system utilizes large language models and employs key concepts such as transformers, zero-shot prompting, and Retrieval-Augmented Generation to provide personalized assistance to students, generating relevant and context-aware responses. The results highlight both the benefits and limitations of generative AI in improving learning outcomes.&quot;},&quot;isTemporary&quot;:false,&quot;suppress-author&quot;:false,&quot;composite&quot;:false,&quot;author-only&quot;:false}]},{&quot;citationID&quot;:&quot;MENDELEY_CITATION_f29cf598-0c7e-4283-885d-081b23b87f6f&quot;,&quot;properties&quot;:{&quot;noteIndex&quot;:0},&quot;isEdited&quot;:false,&quot;manualOverride&quot;:{&quot;isManuallyOverridden&quot;:false,&quot;citeprocText&quot;:&quot;[5]&quot;,&quot;manualOverrideText&quot;:&quot;&quot;},&quot;citationTag&quot;:&quot;MENDELEY_CITATION_v3_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&quot;,&quot;citationItems&quot;:[{&quot;id&quot;:&quot;3b30d636-f4f6-39fc-9195-d6ac1038d075&quot;,&quot;itemData&quot;:{&quot;type&quot;:&quot;article-journal&quot;,&quot;id&quot;:&quot;3b30d636-f4f6-39fc-9195-d6ac1038d075&quot;,&quot;title&quot;:&quot;Benefits, Challenges, and Methods of Artificial Intelligence (AI) Chatbots in Education: A Systematic Literature Review&quot;,&quot;author&quot;:[{&quot;family&quot;:&quot;Gökçearslan&quot;,&quot;given&quot;:&quot;Şahin&quot;,&quot;parse-names&quot;:false,&quot;dropping-particle&quot;:&quot;&quot;,&quot;non-dropping-particle&quot;:&quot;&quot;},{&quot;family&quot;:&quot;Tosun&quot;,&quot;given&quot;:&quot;Cansel&quot;,&quot;parse-names&quot;:false,&quot;dropping-particle&quot;:&quot;&quot;,&quot;non-dropping-particle&quot;:&quot;&quot;},{&quot;family&quot;:&quot;Erdemir&quot;,&quot;given&quot;:&quot;Zeynep Gizem&quot;,&quot;parse-names&quot;:false,&quot;dropping-particle&quot;:&quot;&quot;,&quot;non-dropping-particle&quot;:&quot;&quot;}],&quot;container-title&quot;:&quot;International Journal of Technology in Education&quot;,&quot;DOI&quot;:&quot;10.46328/ijte.600&quot;,&quot;issued&quot;:{&quot;date-parts&quot;:[[2024,2,4]]},&quot;page&quot;:&quot;19-39&quot;,&quot;abstract&quot;:&quot;In many fields, AI chatbots continue to be popular with new tools and attract the attention of universities, K12 schools, educational organizations, and researchers. The aim of this research is to review the research on AI chatbots by restricting it to the category of education and to examine this research from a methodological point of view. Therefore, we performed a systematic literature review with a sample of 37 SSCI articles published in the educational context. Within the scope of the selected studies, the advantages and disadvantages of AI chatbots in education for students and educators, as well as the types of chatbots used, year, keywords, and method were analyzed. According to the research results, increased motivation to learn and language skill development are advantages for students, while cost-effectiveness and reduced workload are advantages for educators. Limited interaction, misleading answers for learners, originality, and plagiarism are the most common disadvantages for educators. The study also includes research results and recommendations related to the methodological review.&quot;,&quot;publisher&quot;:&quot;ISTES Organization&quot;,&quot;issue&quot;:&quot;1&quot;,&quot;volume&quot;:&quot;7&quot;,&quot;container-title-short&quot;:&quot;&quot;},&quot;isTemporary&quot;:false,&quot;suppress-author&quot;:false,&quot;composite&quot;:false,&quot;author-only&quot;:false}]},{&quot;citationID&quot;:&quot;MENDELEY_CITATION_dbc60ebf-740b-4b00-a6d4-d6aa8fe54c63&quot;,&quot;properties&quot;:{&quot;noteIndex&quot;:0},&quot;isEdited&quot;:false,&quot;manualOverride&quot;:{&quot;isManuallyOverridden&quot;:false,&quot;citeprocText&quot;:&quot;[6]&quot;,&quot;manualOverrideText&quot;:&quot;&quot;},&quot;citationTag&quot;:&quot;MENDELEY_CITATION_v3_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&quot;,&quot;citationItems&quot;:[{&quot;id&quot;:&quot;fdaca172-7bec-3f78-83a1-fe7bc6dc07b5&quot;,&quot;itemData&quot;:{&quot;type&quot;:&quot;webpage&quot;,&quot;id&quot;:&quot;fdaca172-7bec-3f78-83a1-fe7bc6dc07b5&quot;,&quot;title&quot;:&quot;INFORME GENERAL DE PISA-D 2018&quot;,&quot;author&quot;:[{&quot;family&quot;:&quot;Josette Arévalo Gross&quot;,&quot;given&quot;:&quot;&quot;,&quot;parse-names&quot;:false,&quot;dropping-particle&quot;:&quot;&quot;,&quot;non-dropping-particle&quot;:&quot;&quot;}],&quot;accessed&quot;:{&quot;date-parts&quot;:[[2024,12,9]]},&quot;URL&quot;:&quot;https://issuu.com/ineval/docs/cie_informegeneralpisa18_20181123&quot;,&quot;issued&quot;:{&quot;date-parts&quot;:[[2018,12,11]]},&quot;page&quot;:&quot;1-152&quot;,&quot;container-title-short&quot;:&quot;&quot;},&quot;isTemporary&quot;:false,&quot;suppress-author&quot;:false,&quot;composite&quot;:false,&quot;author-only&quot;:false}]},{&quot;citationID&quot;:&quot;MENDELEY_CITATION_66addef9-3cf0-4f6d-a9e4-490c23fdf78c&quot;,&quot;properties&quot;:{&quot;noteIndex&quot;:0},&quot;isEdited&quot;:false,&quot;manualOverride&quot;:{&quot;isManuallyOverridden&quot;:false,&quot;citeprocText&quot;:&quot;[6]&quot;,&quot;manualOverrideText&quot;:&quot;&quot;},&quot;citationTag&quot;:&quot;MENDELEY_CITATION_v3_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&quot;,&quot;citationItems&quot;:[{&quot;id&quot;:&quot;fdaca172-7bec-3f78-83a1-fe7bc6dc07b5&quot;,&quot;itemData&quot;:{&quot;type&quot;:&quot;webpage&quot;,&quot;id&quot;:&quot;fdaca172-7bec-3f78-83a1-fe7bc6dc07b5&quot;,&quot;title&quot;:&quot;INFORME GENERAL DE PISA-D 2018&quot;,&quot;author&quot;:[{&quot;family&quot;:&quot;Josette Arévalo Gross&quot;,&quot;given&quot;:&quot;&quot;,&quot;parse-names&quot;:false,&quot;dropping-particle&quot;:&quot;&quot;,&quot;non-dropping-particle&quot;:&quot;&quot;}],&quot;accessed&quot;:{&quot;date-parts&quot;:[[2024,12,9]]},&quot;URL&quot;:&quot;https://issuu.com/ineval/docs/cie_informegeneralpisa18_20181123&quot;,&quot;issued&quot;:{&quot;date-parts&quot;:[[2018,12,11]]},&quot;page&quot;:&quot;1-152&quot;,&quot;container-title-short&quot;:&quot;&quot;},&quot;isTemporary&quot;:false,&quot;suppress-author&quot;:false,&quot;composite&quot;:false,&quot;author-only&quot;:false}]},{&quot;citationID&quot;:&quot;MENDELEY_CITATION_672db128-b738-439d-9135-a845cbcddc48&quot;,&quot;properties&quot;:{&quot;noteIndex&quot;:0},&quot;isEdited&quot;:false,&quot;manualOverride&quot;:{&quot;isManuallyOverridden&quot;:false,&quot;citeprocText&quot;:&quot;[7]&quot;,&quot;manualOverrideText&quot;:&quot;&quot;},&quot;citationTag&quot;:&quot;MENDELEY_CITATION_v3_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&quot;,&quot;citationItems&quot;:[{&quot;id&quot;:&quot;45374eae-2cc4-3c9b-a601-9e01c15ca3fc&quot;,&quot;itemData&quot;:{&quot;type&quot;:&quot;article-journal&quot;,&quot;id&quot;:&quot;45374eae-2cc4-3c9b-a601-9e01c15ca3fc&quot;,&quot;title&quot;:&quot;Los recursos tecnológicos y su influencia en el desempeño de los docentes&quot;,&quot;author&quot;:[{&quot;family&quot;:&quot;Jama Zambrano&quot;,&quot;given&quot;:&quot;Víctor R.&quot;,&quot;parse-names&quot;:false,&quot;dropping-particle&quot;:&quot;&quot;,&quot;non-dropping-particle&quot;:&quot;&quot;},{&quot;family&quot;:&quot;Cornejo Zambrano&quot;,&quot;given&quot;:&quot;Jeovana K.&quot;,&quot;parse-names&quot;:false,&quot;dropping-particle&quot;:&quot;&quot;,&quot;non-dropping-particle&quot;:&quot;&quot;}],&quot;container-title&quot;:&quot;Dominio de las Ciencias, ISSN-e 2477-8818, Vol. 2, Nº. Extra 3, 2016 (Ejemplar dedicado a: Monográfico de Ciencias de la Salud), págs. 201-219&quot;,&quot;accessed&quot;:{&quot;date-parts&quot;:[[2025,8,28]]},&quot;ISSN&quot;:&quot;2477-8818&quot;,&quot;URL&quot;:&quot;https://dialnet.unirioja.es/servlet/articulo?codigo=6324010&amp;info=resumen&amp;idioma=ENG&quot;,&quot;issued&quot;:{&quot;date-parts&quot;:[[2016]]},&quot;page&quot;:&quot;201-219&quot;,&quot;abstract&quot;:&quot;A quantitative and qualitative, descriptive and transversal study was carried out in the \&quot;Cinco de\nMayo\&quot; Private Education Unit of the city of Chone, an institution attached to the \&quot;Eloy Alfaro\&quot;\nLaica University of Manabí, Ecuador, in a population of 134 students from Basic general higher\neducation and 33 teachers, with a view to demonstrating how technological resources influence the\nperformance of teachers. The results of the series showed that the use of technological resources has\na significant level of importance with respect to the performance of teachers in the development of\ntheir work within the classroom, as demonstrated by the results of the research instruments that were\napplied , Since the percentages showed that the use of technological resources has a positive impact\non the motivation and interest of the student towards teaching and learning therefore contribute to\nimprove the performance of the teacher who applies them in their classes.&quot;,&quot;publisher&quot;:&quot;Polo de Capacitación, Investigación y Publicación (POCAIP)&quot;,&quot;issue&quot;:&quot;3&quot;,&quot;volume&quot;:&quot;2&quot;,&quot;container-title-short&quot;:&quot;&quot;},&quot;isTemporary&quot;:false,&quot;suppress-author&quot;:false,&quot;composite&quot;:false,&quot;author-only&quot;:false}]},{&quot;citationID&quot;:&quot;MENDELEY_CITATION_66e36815-5ffa-4212-9ff7-671e9ed2b041&quot;,&quot;properties&quot;:{&quot;noteIndex&quot;:0},&quot;isEdited&quot;:false,&quot;manualOverride&quot;:{&quot;isManuallyOverridden&quot;:false,&quot;citeprocText&quot;:&quot;[8]&quot;,&quot;manualOverrideText&quot;:&quot;&quot;},&quot;citationTag&quot;:&quot;MENDELEY_CITATION_v3_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&quot;,&quot;citationItems&quot;:[{&quot;id&quot;:&quot;0c91b55a-e2f3-3d74-bf57-be07508860c4&quot;,&quot;itemData&quot;:{&quot;type&quot;:&quot;article-journal&quot;,&quot;id&quot;:&quot;0c91b55a-e2f3-3d74-bf57-be07508860c4&quot;,&quot;title&quot;:&quot;Análisis de la Brecha Digital y el Acceso a Recursos Tecnológicos en las Instituciones de Educación Secundaria en Ecuador&quot;,&quot;author&quot;:[{&quot;family&quot;:&quot;Yanine&quot;,&quot;given&quot;:&quot;Evelin&quot;,&quot;parse-names&quot;:false,&quot;dropping-particle&quot;:&quot;&quot;,&quot;non-dropping-particle&quot;:&quot;&quot;},{&quot;family&quot;:&quot;Olvera&quot;,&quot;given&quot;:&quot;Muñoz&quot;,&quot;parse-names&quot;:false,&quot;dropping-particle&quot;:&quot;&quot;,&quot;non-dropping-particle&quot;:&quot;&quot;},{&quot;family&quot;:&quot;Georgina&quot;,&quot;given&quot;:&quot;Elsa&quot;,&quot;parse-names&quot;:false,&quot;dropping-particle&quot;:&quot;&quot;,&quot;non-dropping-particle&quot;:&quot;&quot;},{&quot;family&quot;:&quot;Bastidas&quot;,&quot;given&quot;:&quot;Jacome&quot;,&quot;parse-names&quot;:false,&quot;dropping-particle&quot;:&quot;&quot;,&quot;non-dropping-particle&quot;:&quot;&quot;},{&quot;family&quot;:&quot;Janet&quot;,&quot;given&quot;:&quot;Guadalupe&quot;,&quot;parse-names&quot;:false,&quot;dropping-particle&quot;:&quot;&quot;,&quot;non-dropping-particle&quot;:&quot;&quot;},{&quot;family&quot;:&quot;Espinoza&quot;,&quot;given&quot;:&quot;Medina&quot;,&quot;parse-names&quot;:false,&quot;dropping-particle&quot;:&quot;&quot;,&quot;non-dropping-particle&quot;:&quot;&quot;}],&quot;container-title&quot;:&quot;Ciencia Latina Revista Científica Multidisciplinar&quot;,&quot;accessed&quot;:{&quot;date-parts&quot;:[[2025,8,28]]},&quot;DOI&quot;:&quot;10.37811/CL_RCM.V8I2.11086&quot;,&quot;ISSN&quot;:&quot;2707-2215&quot;,&quot;URL&quot;:&quot;https://ciencialatina.org/index.php/cienciala/article/view/11086/16273&quot;,&quot;issued&quot;:{&quot;date-parts&quot;:[[2024,5,20]]},&quot;page&quot;:&quot;6698-6719&quot;,&quot;abstract&quot;:&quot;This study aimed to analyze the digital divide and access to technological resources in secondary education institutions in Ecuador. A descriptive and cross-sectional research design was employed, with a mixed approach combining quantitative and qualitative methods. The sample consisted of 360 educational institutions selected through stratified sampling. Structured questionnaires, semi-structured interviews, and documentary analysis were applied to collect data on technological infrastructure, connectivity, available devices, the use of ICT in the teaching-learning process, and factors influencing the digital divide. The results revealed significant differences in access to and use of technological resources between public and private institutions, as well as between urban and rural areas. Challenges related to teacher training, digital competencies, and the effective integration of ICT in the curriculum were identified. Recommendations are proposed to strengthen digital inclusion programs, promote teacher training, and articulate educational policies with digital inclusion policies at the national level. This study contributes to the understanding of the digital divide in Ecuadorian education and provides inputs for the design of public policies aimed at promoting equity and educational quality in the digital era.&quot;,&quot;publisher&quot;:&quot;Asociacion Latinoamericana para el Avance de la Ciencia&quot;,&quot;issue&quot;:&quot;2&quot;,&quot;volume&quot;:&quot;8&quot;,&quot;container-title-short&quot;:&quot;&quot;},&quot;isTemporary&quot;:false,&quot;suppress-author&quot;:false,&quot;composite&quot;:false,&quot;author-only&quot;:false}]},{&quot;citationID&quot;:&quot;MENDELEY_CITATION_f4f2cd47-c4a2-4bbf-a39f-35cb83db892a&quot;,&quot;properties&quot;:{&quot;noteIndex&quot;:0},&quot;isEdited&quot;:false,&quot;manualOverride&quot;:{&quot;isManuallyOverridden&quot;:false,&quot;citeprocText&quot;:&quot;[9]&quot;,&quot;manualOverrideText&quot;:&quot;&quot;},&quot;citationTag&quot;:&quot;MENDELEY_CITATION_v3_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&quot;,&quot;citationItems&quot;:[{&quot;id&quot;:&quot;45f625d5-b48d-33c8-8ac0-a70b15d9caac&quot;,&quot;itemData&quot;:{&quot;type&quot;:&quot;article-journal&quot;,&quot;id&quot;:&quot;45f625d5-b48d-33c8-8ac0-a70b15d9caac&quot;,&quot;title&quot;:&quot;Recursos tecnológicos para el aprendizaje en el marco de la educación inclusiva ecuatoriana&quot;,&quot;author&quot;:[{&quot;family&quot;:&quot;Arteaga-Tuba&quot;,&quot;given&quot;:&quot;Guillermo José&quot;,&quot;parse-names&quot;:false,&quot;dropping-particle&quot;:&quot;&quot;,&quot;non-dropping-particle&quot;:&quot;&quot;},{&quot;family&quot;:&quot;Arteaga-Tuba&quot;,&quot;given&quot;:&quot;Guillermo José&quot;,&quot;parse-names&quot;:false,&quot;dropping-particle&quot;:&quot;&quot;,&quot;non-dropping-particle&quot;:&quot;&quot;}],&quot;container-title&quot;:&quot;Cienciamatria. Revista Interdisciplinaria de Humanidades, Educación, Ciencia y Tecnología&quot;,&quot;accessed&quot;:{&quot;date-parts&quot;:[[2025,8,28]]},&quot;DOI&quot;:&quot;10.35381/CM.V10I18.1272&quot;,&quot;ISSN&quot;:&quot;2542-3029&quot;,&quot;URL&quot;:&quot;http://ve.scielo.org/scielo.php?script=sci_arttext&amp;pid=S2542-30292024000100289&amp;lng=es&amp;nrm=iso&amp;tlng=es&quot;,&quot;issued&quot;:{&quot;date-parts&quot;:[[2024,1,1]]},&quot;page&quot;:&quot;289-312&quot;,&quot;abstract&quot;:&quot;Se expone este artículo con el propósito de indagar cómo se ha dado la educación inclusiva en Ecuador y explorar cómo los recursos tecnológicos aparecen coligados para el fomento del aprendizaje inclusivo. Se corresponde con un estudio de naturaleza documental desarrollado mediante un diseño bibliográfico. A partir de los resultados, se pudo enunciar que Ecuador, muestra avances significativos en la promoción de la educación para todos, ya que, progresivamente ha implementado políticas y programas, aunados a un marco normativo, con el que que busca garantizar el acceso equitativo a la educación, especialmente para aquellos con discapacidades y/o necesidades especiales. Sin embargo, aún enfrenta desafíos importantes en función de lograr una verdadera educación inclusiva y de calidad en todo el sistema educativo.&quot;,&quot;publisher&quot;:&quot;Los autores&quot;,&quot;issue&quot;:&quot;18&quot;,&quot;volume&quot;:&quot;10&quot;,&quot;container-title-short&quot;:&quot;&quot;},&quot;isTemporary&quot;:false,&quot;suppress-author&quot;:false,&quot;composite&quot;:false,&quot;author-only&quot;:false}]},{&quot;citationID&quot;:&quot;MENDELEY_CITATION_a6cee5f9-fd2b-4b70-a86f-908cd824a894&quot;,&quot;properties&quot;:{&quot;noteIndex&quot;:0},&quot;isEdited&quot;:false,&quot;manualOverride&quot;:{&quot;isManuallyOverridden&quot;:false,&quot;citeprocText&quot;:&quot;[6]&quot;,&quot;manualOverrideText&quot;:&quot;&quot;},&quot;citationTag&quot;:&quot;MENDELEY_CITATION_v3_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&quot;,&quot;citationItems&quot;:[{&quot;id&quot;:&quot;fdaca172-7bec-3f78-83a1-fe7bc6dc07b5&quot;,&quot;itemData&quot;:{&quot;type&quot;:&quot;webpage&quot;,&quot;id&quot;:&quot;fdaca172-7bec-3f78-83a1-fe7bc6dc07b5&quot;,&quot;title&quot;:&quot;INFORME GENERAL DE PISA-D 2018&quot;,&quot;author&quot;:[{&quot;family&quot;:&quot;Josette Arévalo Gross&quot;,&quot;given&quot;:&quot;&quot;,&quot;parse-names&quot;:false,&quot;dropping-particle&quot;:&quot;&quot;,&quot;non-dropping-particle&quot;:&quot;&quot;}],&quot;accessed&quot;:{&quot;date-parts&quot;:[[2024,12,9]]},&quot;URL&quot;:&quot;https://issuu.com/ineval/docs/cie_informegeneralpisa18_20181123&quot;,&quot;issued&quot;:{&quot;date-parts&quot;:[[2018,12,11]]},&quot;page&quot;:&quot;1-152&quot;,&quot;container-title-short&quot;:&quot;&quot;},&quot;isTemporary&quot;:false,&quot;suppress-author&quot;:false,&quot;composite&quot;:false,&quot;author-only&quot;:false}]},{&quot;citationID&quot;:&quot;MENDELEY_CITATION_13683c1b-9ea0-41a2-b5d2-93531a6b0129&quot;,&quot;properties&quot;:{&quot;noteIndex&quot;:0},&quot;isEdited&quot;:false,&quot;manualOverride&quot;:{&quot;isManuallyOverridden&quot;:false,&quot;citeprocText&quot;:&quot;[10]&quot;,&quot;manualOverrideText&quot;:&quot;&quot;},&quot;citationTag&quot;:&quot;MENDELEY_CITATION_v3_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&quot;,&quot;citationItems&quot;:[{&quot;id&quot;:&quot;e37207eb-1ea6-3f0f-b3a9-1c64e74925da&quot;,&quot;itemData&quot;:{&quot;type&quot;:&quot;article-journal&quot;,&quot;id&quot;:&quot;e37207eb-1ea6-3f0f-b3a9-1c64e74925da&quot;,&quot;title&quot;:&quot;Plataformas de Aprendizaje Adaptativo: Aprovechando la IA para una Educación Personalizada&quot;,&quot;author&quot;:[{&quot;family&quot;:&quot;Agurto&quot;,&quot;given&quot;:&quot;Stefanie Antonella Torres&quot;,&quot;parse-names&quot;:false,&quot;dropping-particle&quot;:&quot;&quot;,&quot;non-dropping-particle&quot;:&quot;&quot;},{&quot;family&quot;:&quot;Agurto&quot;,&quot;given&quot;:&quot;Stefanie Antonella Torres&quot;,&quot;parse-names&quot;:false,&quot;dropping-particle&quot;:&quot;&quot;,&quot;non-dropping-particle&quot;:&quot;&quot;},{&quot;family&quot;:&quot;Córdova&quot;,&quot;given&quot;:&quot;Nora Raquel González&quot;,&quot;parse-names&quot;:false,&quot;dropping-particle&quot;:&quot;&quot;,&quot;non-dropping-particle&quot;:&quot;&quot;},{&quot;family&quot;:&quot;Pignataro&quot;,&quot;given&quot;:&quot;Daniella Francesa Alvarado&quot;,&quot;parse-names&quot;:false,&quot;dropping-particle&quot;:&quot;&quot;,&quot;non-dropping-particle&quot;:&quot;&quot;},{&quot;family&quot;:&quot;Merchan&quot;,&quot;given&quot;:&quot;Mayra Alejandra Sarmiento&quot;,&quot;parse-names&quot;:false,&quot;dropping-particle&quot;:&quot;&quot;,&quot;non-dropping-particle&quot;:&quot;&quot;}],&quot;container-title&quot;:&quot;Polo del Conocimiento&quot;,&quot;accessed&quot;:{&quot;date-parts&quot;:[[2025,8,28]]},&quot;DOI&quot;:&quot;10.23857/pc.v10i1.8994&quot;,&quot;ISSN&quot;:&quot;2550-682X&quot;,&quot;URL&quot;:&quot;https://www.polodelconocimiento.com/ojs/index.php/es/article/view/8994&quot;,&quot;issued&quot;:{&quot;date-parts&quot;:[[2025,2,22]]},&quot;page&quot;:&quot;2457-2470&quot;,&quot;abstract&quot;:&quot;La formación continua de los educadores no solo mejora su capacidad para utilizar estas herramientas, sino que también fomenta una cultura educativa más inclusiva y adaptativa. La colaboración entre instituciones educativas, desarrolladores de tecnología y responsables políticos será crucial para crear un marco que apoye la integración efectiva de estas innovaciones en el aula. La implementación de políticas que promuevan la equidad en el acceso a la tecnología educativa permitirá cerrar la brecha digital y asegurar que todos los estudiantes, independientemente de su contexto socioeconómico, puedan beneficiarse plenamente de estas oportunidades de aprendizaje.&quot;,&quot;issue&quot;:&quot;1&quot;,&quot;volume&quot;:&quot;10&quot;,&quot;container-title-short&quot;:&quot;&quot;},&quot;isTemporary&quot;:false,&quot;suppress-author&quot;:false,&quot;composite&quot;:false,&quot;author-only&quot;:false}]},{&quot;citationID&quot;:&quot;MENDELEY_CITATION_ff458023-734f-486e-9038-ac3bc0abdd05&quot;,&quot;properties&quot;:{&quot;noteIndex&quot;:0},&quot;isEdited&quot;:false,&quot;manualOverride&quot;:{&quot;isManuallyOverridden&quot;:false,&quot;citeprocText&quot;:&quot;[11]&quot;,&quot;manualOverrideText&quot;:&quot;&quot;},&quot;citationTag&quot;:&quot;MENDELEY_CITATION_v3_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&quot;,&quot;citationItems&quot;:[{&quot;id&quot;:&quot;12296d5e-b4a7-3cd1-88e7-e0d5f4a1a811&quot;,&quot;itemData&quot;:{&quot;type&quot;:&quot;article-journal&quot;,&quot;id&quot;:&quot;12296d5e-b4a7-3cd1-88e7-e0d5f4a1a811&quot;,&quot;title&quot;:&quot;The SAGE Handbook of Qualitative Research&quot;,&quot;accessed&quot;:{&quot;date-parts&quot;:[[2025,7,31]]},&quot;URL&quot;:&quot;https://dl1.cuni.cz/pluginfile.php/1143325/mod_resource/content/1/Norman%20K.%20Denzin%2C%20Yvonna%20S.%20Lincoln%20-%20The%20SAGE%20Handbook%20of%20Qualitative%20Research-SAGE%20Publications%2C%20Inc%20%282017%29.pdf&quot;,&quot;container-title-short&quot;:&quot;&quot;},&quot;isTemporary&quot;:false,&quot;suppress-author&quot;:false,&quot;composite&quot;:false,&quot;author-only&quot;:false}]},{&quot;citationID&quot;:&quot;MENDELEY_CITATION_667abf76-2ba5-4eee-987d-51fa645d8e8c&quot;,&quot;properties&quot;:{&quot;noteIndex&quot;:0},&quot;isEdited&quot;:false,&quot;manualOverride&quot;:{&quot;isManuallyOverridden&quot;:false,&quot;citeprocText&quot;:&quot;[12]&quot;,&quot;manualOverrideText&quot;:&quot;&quot;},&quot;citationTag&quot;:&quot;MENDELEY_CITATION_v3_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&quot;,&quot;citationItems&quot;:[{&quot;id&quot;:&quot;31cef1d1-0961-3c67-9146-6af7b3bdcc9d&quot;,&quot;itemData&quot;:{&quot;type&quot;:&quot;article-journal&quot;,&quot;id&quot;:&quot;31cef1d1-0961-3c67-9146-6af7b3bdcc9d&quot;,&quot;title&quot;:&quot;Introduccion-a-Los-Metodos-Cualitativos-de-Investigacion-Taylor-S-J-Bogdan-R&quot;,&quot;accessed&quot;:{&quot;date-parts&quot;:[[2025,7,31]]},&quot;URL&quot;:&quot;https://pics.unison.mx/maestria/wp-content/uploads/2020/05/Introduccion-a-Los-Metodos-Cualitativos-de-Investigacion-Taylor-S-J-Bogdan-R.pdf&quot;,&quot;container-title-short&quot;:&quot;&quot;},&quot;isTemporary&quot;:false,&quot;suppress-author&quot;:false,&quot;composite&quot;:false,&quot;author-only&quot;:false}]},{&quot;citationID&quot;:&quot;MENDELEY_CITATION_e2bf823c-6f90-4f0e-8e4b-07f1de8753f7&quot;,&quot;properties&quot;:{&quot;noteIndex&quot;:0},&quot;isEdited&quot;:false,&quot;manualOverride&quot;:{&quot;isManuallyOverridden&quot;:false,&quot;citeprocText&quot;:&quot;[13]&quot;,&quot;manualOverrideText&quot;:&quot;&quot;},&quot;citationTag&quot;:&quot;MENDELEY_CITATION_v3_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&quot;,&quot;citationItems&quot;:[{&quot;id&quot;:&quot;c520e764-cfbd-3743-bd8f-3f961907a12c&quot;,&quot;itemData&quot;:{&quot;type&quot;:&quot;article-journal&quot;,&quot;id&quot;:&quot;c520e764-cfbd-3743-bd8f-3f961907a12c&quot;,&quot;title&quot;:&quot;the discovery of gorunded theory&quot;,&quot;container-title-short&quot;:&quot;&quot;},&quot;isTemporary&quot;:false,&quot;suppress-author&quot;:false,&quot;composite&quot;:false,&quot;author-only&quot;:false}]},{&quot;citationID&quot;:&quot;MENDELEY_CITATION_409f9b05-c583-4a8e-b6b2-968fed9d32bd&quot;,&quot;properties&quot;:{&quot;noteIndex&quot;:0},&quot;isEdited&quot;:false,&quot;manualOverride&quot;:{&quot;isManuallyOverridden&quot;:false,&quot;citeprocText&quot;:&quot;[14]&quot;,&quot;manualOverrideText&quot;:&quot;&quot;},&quot;citationTag&quot;:&quot;MENDELEY_CITATION_v3_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&quot;,&quot;citationItems&quot;:[{&quot;id&quot;:&quot;23a4c59b-2580-3d79-aaf9-6703b48fdd48&quot;,&quot;itemData&quot;:{&quot;type&quot;:&quot;article&quot;,&quot;id&quot;:&quot;23a4c59b-2580-3d79-aaf9-6703b48fdd48&quot;,&quot;title&quot;:&quot;Use of Generative Artificial Intelligence, Including Large Language Models Such as ChatGPT, in Scientific Publications: Policies of KJR and Prominent Authorities&quot;,&quot;author&quot;:[{&quot;family&quot;:&quot;Park&quot;,&quot;given&quot;:&quot;Seong Ho&quot;,&quot;parse-names&quot;:false,&quot;dropping-particle&quot;:&quot;&quot;,&quot;non-dropping-particle&quot;:&quot;&quot;}],&quot;container-title&quot;:&quot;Korean Journal of Radiology&quot;,&quot;container-title-short&quot;:&quot;Korean J Radiol&quot;,&quot;accessed&quot;:{&quot;date-parts&quot;:[[2025,8,28]]},&quot;DOI&quot;:&quot;10.3348/kjr.2023.0643&quot;,&quot;ISSN&quot;:&quot;12296929&quot;,&quot;PMID&quot;:&quot;37500572&quot;,&quot;URL&quot;:&quot;https://kjronline.org/Synapse/Data/PDFData/0068KJR/kjr-24-715.pdf&quot;,&quot;issued&quot;:{&quot;date-parts&quot;:[[2023,8,1]]},&quot;page&quot;:&quot;715-718&quot;,&quot;publisher&quot;:&quot;Korean Radiological Society&quot;,&quot;issue&quot;:&quot;8&quot;,&quot;volume&quot;:&quot;24&quot;},&quot;isTemporary&quot;:false,&quot;suppress-author&quot;:false,&quot;composite&quot;:false,&quot;author-only&quot;:false}]},{&quot;citationID&quot;:&quot;MENDELEY_CITATION_58518b0a-68f9-464d-a498-b30f585f718d&quot;,&quot;properties&quot;:{&quot;noteIndex&quot;:0},&quot;isEdited&quot;:false,&quot;manualOverride&quot;:{&quot;isManuallyOverridden&quot;:false,&quot;citeprocText&quot;:&quot;[15]&quot;,&quot;manualOverrideText&quot;:&quot;&quot;},&quot;citationTag&quot;:&quot;MENDELEY_CITATION_v3_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&quot;,&quot;citationItems&quot;:[{&quot;id&quot;:&quot;7c54a495-f93c-36bf-af95-df68fbac9313&quot;,&quot;itemData&quot;:{&quot;type&quot;:&quot;article-journal&quot;,&quot;id&quot;:&quot;7c54a495-f93c-36bf-af95-df68fbac9313&quot;,&quot;title&quot;:&quot;Análisis comparativo de patrones de diseño de interfaz de usuario para el desarrollo de aplicaciones educativas Comparative Analysis of User Interface Design Patterns for Developing Educational Applications&quot;,&quot;author&quot;:[{&quot;family&quot;:&quot;Cortes-Camarillo&quot;,&quot;given&quot;:&quot;Cesar Augusto&quot;,&quot;parse-names&quot;:false,&quot;dropping-particle&quot;:&quot;&quot;,&quot;non-dropping-particle&quot;:&quot;&quot;},{&quot;family&quot;:&quot;Alor-Hernández&quot;,&quot;given&quot;:&quot;Giner&quot;,&quot;parse-names&quot;:false,&quot;dropping-particle&quot;:&quot;&quot;,&quot;non-dropping-particle&quot;:&quot;&quot;},{&quot;family&quot;:&quot;Olivares-Zepahua&quot;,&quot;given&quot;:&quot;Beatriz Alejandra&quot;,&quot;parse-names&quot;:false,&quot;dropping-particle&quot;:&quot;&quot;,&quot;non-dropping-particle&quot;:&quot;&quot;},{&quot;family&quot;:&quot;Rodríguez-Mazahua&quot;,&quot;given&quot;:&quot;Lisbeth&quot;,&quot;parse-names&quot;:false,&quot;dropping-particle&quot;:&quot;&quot;,&quot;non-dropping-particle&quot;:&quot;&quot;},{&quot;family&quot;:&quot;Gustavo Peláez-Camarena&quot;,&quot;given&quot;:&quot;Silvestre&quot;,&quot;parse-names&quot;:false,&quot;dropping-particle&quot;:&quot;&quot;,&quot;non-dropping-particle&quot;:&quot;&quot;}],&quot;container-title&quot;:&quot;Research in Computing Science&quot;,&quot;accessed&quot;:{&quot;date-parts&quot;:[[2025,8,28]]},&quot;URL&quot;:&quot;https://www.rcs.cic.ipn.mx/2016_126/Analisis%20comparativo%20de%20patrones%20de%20diseno%20de%20interfaz%20de%20usuario%20para%20el%20desarrollo.pdf&quot;,&quot;issued&quot;:{&quot;date-parts&quot;:[[2016]]},&quot;page&quot;:&quot;31-41&quot;,&quot;abstract&quot;:&quot;Resumen. En la actualidad las tabletas, teléfonos inteligentes y televisores inteligentes se encuentran al alcance de la mayoría de personas, estos dispositivos tienen diversos usos, por esta razón diseñar aplicaciones se ha vuelto una tarea tediosa y difícil de realizar, debido a los diferentes dispositivos y plataformas existentes en el mercado. Los patrones de diseño de interfaz de usuario permiten facilitar el desarrollo de aplicaciones, debido a que cada plataforma tiene su propia interacción entre el usuario y el dispositivo, porque dependiendo del dispositivo se utiliza un patrón de diseño distinto para su interfaz de usuario. Por esta razón se propone un análisis comparativo de patrones de diseño de interfaz de usuario, para generar contextos de uso orientados al ámbito educativo. Se diseñaron contextos de uso para establecer qué patrones de diseño de interfaz de usuario son recomendables para un dispositivo en específico, facilitando el desarrollo de aplicaciones educativas multi-dispositivos. Palabras clave: Ámbito educativo, contexto de uso, interfaz de usuario, multi-dispositivo, patrones de diseño. Abstract. Actually, most people have at their disposal different devices including tablets, smartphones and smart TVs, for this reason the design of this kind of applications has become a tedious and difficult task to do, by the different devices and platforms that exist in the market. The UIDPs (User Interface Design Patterns) facilitate the development of the kind of applications by, considering that on each platform the user interacts differently with the device because UIDPs 31&quot;,&quot;volume&quot;:&quot;126&quot;,&quot;container-title-short&quot;:&quot;&quot;},&quot;isTemporary&quot;:false,&quot;suppress-author&quot;:false,&quot;composite&quot;:false,&quot;author-only&quot;:false}]},{&quot;citationID&quot;:&quot;MENDELEY_CITATION_ba639e28-cd7d-45a3-9ed6-a0f42c0f6f9a&quot;,&quot;properties&quot;:{&quot;noteIndex&quot;:0},&quot;isEdited&quot;:false,&quot;manualOverride&quot;:{&quot;isManuallyOverridden&quot;:false,&quot;citeprocText&quot;:&quot;[16]&quot;,&quot;manualOverrideText&quot;:&quot;&quot;},&quot;citationTag&quot;:&quot;MENDELEY_CITATION_v3_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&quot;,&quot;citationItems&quot;:[{&quot;id&quot;:&quot;0b3822e3-b914-3e90-860f-5e34fcd0e5a9&quot;,&quot;itemData&quot;:{&quot;type&quot;:&quot;article-journal&quot;,&quot;id&quot;:&quot;0b3822e3-b914-3e90-860f-5e34fcd0e5a9&quot;,&quot;title&quot;:&quot;User Interface Design for E-Learning Software&quot;,&quot;author&quot;:[{&quot;family&quot;:&quot;Faghih&quot;,&quot;given&quot;:&quot;Behnam&quot;,&quot;parse-names&quot;:false,&quot;dropping-particle&quot;:&quot;&quot;,&quot;non-dropping-particle&quot;:&quot;&quot;},{&quot;family&quot;:&quot;Reza Azadehfar&quot;,&quot;given&quot;:&quot;Mohammad&quot;,&quot;parse-names&quot;:false,&quot;dropping-particle&quot;:&quot;&quot;,&quot;non-dropping-particle&quot;:&quot;&quot;},{&quot;family&quot;:&quot;Katebi&quot;,&quot;given&quot;:&quot;S D&quot;,&quot;parse-names&quot;:false,&quot;dropping-particle&quot;:&quot;&quot;,&quot;non-dropping-particle&quot;:&quot;&quot;}],&quot;container-title&quot;:&quot;JSCSE]&quot;,&quot;accessed&quot;:{&quot;date-parts&quot;:[[2025,8,28]]},&quot;DOI&quot;:&quot;10.7321/jscse.v3.n3.119&quot;,&quot;URL&quot;:&quot;https://arxiv.org/pdf/1401.6365&quot;,&quot;issued&quot;:{&quot;date-parts&quot;:[[2013]]},&quot;abstract&quot;:&quot;User interface (UI) is point of interaction between user and computer software. The success and failure of a software application depends on User Interface Design (UID). Possibility of using a software, easily using and learning are issues influenced by UID. The UI is significant in designing of educational software (e-Learning). Principles and concepts of learning should be considered in addition to UID principles in UID for e-learning. In this regard, to specify the logical relationship between education, learning, UID and multimedia at first we readdress the issues raised in previous studies. It is followed by examining the principle concepts of e-learning and UID. Then, we will see how UID contributes to e-learning through the educational software built by authors. Also we show the way of using UI to improve learning and motivating the learners and to improve the time efficiency of using e-learning software.&quot;,&quot;issue&quot;:&quot;3&quot;,&quot;volume&quot;:&quot;3&quot;,&quot;container-title-short&quot;:&quot;&quot;},&quot;isTemporary&quot;:false,&quot;suppress-author&quot;:false,&quot;composite&quot;:false,&quot;author-only&quot;:false}]},{&quot;citationID&quot;:&quot;MENDELEY_CITATION_d9a82660-5da7-4d10-a1dc-57b40bbb39a8&quot;,&quot;properties&quot;:{&quot;noteIndex&quot;:0},&quot;isEdited&quot;:false,&quot;manualOverride&quot;:{&quot;isManuallyOverridden&quot;:false,&quot;citeprocText&quot;:&quot;[17]&quot;,&quot;manualOverrideText&quot;:&quot;&quot;},&quot;citationTag&quot;:&quot;MENDELEY_CITATION_v3_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&quot;,&quot;citationItems&quot;:[{&quot;id&quot;:&quot;c9ca61b3-497f-3e0a-b574-433534e3dc13&quot;,&quot;itemData&quot;:{&quot;type&quot;:&quot;article-journal&quot;,&quot;id&quot;:&quot;c9ca61b3-497f-3e0a-b574-433534e3dc13&quot;,&quot;title&quot;:&quot;Álgebra y Trigonometría con Geometría Analítica&quot;,&quot;author&quot;:[{&quot;family&quot;:&quot;EARL W. SWOKOWSKI&quot;,&quot;given&quot;:&quot;&quot;,&quot;parse-names&quot;:false,&quot;dropping-particle&quot;:&quot;&quot;,&quot;non-dropping-particle&quot;:&quot;&quot;},{&quot;family&quot;:&quot;JEFFERY A. COLE&quot;,&quot;given&quot;:&quot;&quot;,&quot;parse-names&quot;:false,&quot;dropping-particle&quot;:&quot;&quot;,&quot;non-dropping-particle&quot;:&quot;&quot;}],&quot;accessed&quot;:{&quot;date-parts&quot;:[[2025,8,28]]},&quot;translator&quot;:[{&quot;family&quot;:&quot;Jorge Humberto Romo Muñoz&quot;,&quot;given&quot;:&quot;&quot;,&quot;parse-names&quot;:false,&quot;dropping-particle&quot;:&quot;&quot;,&quot;non-dropping-particle&quot;:&quot;&quot;}],&quot;ISBN&quot;:&quot;978-607-481-186-5&quot;,&quot;ISSN&quot;:&quot;607-481-186-5&quot;,&quot;URL&quot;:&quot;https://tuaulavirtual.educatic.unam.mx/pluginfile.php/977649/mod_resource/content/0/Swokowski.pdf&quot;,&quot;issued&quot;:{&quot;date-parts&quot;:[[2009]]},&quot;volume&quot;:&quot;12a. edición&quot;,&quot;container-title-short&quot;:&quot;&quot;},&quot;isTemporary&quot;:false,&quot;suppress-author&quot;:false,&quot;composite&quot;:false,&quot;author-only&quot;:false}]},{&quot;citationID&quot;:&quot;MENDELEY_CITATION_32f973b1-eabc-4afe-8fa5-453215a8c6dc&quot;,&quot;properties&quot;:{&quot;noteIndex&quot;:0},&quot;isEdited&quot;:false,&quot;manualOverride&quot;:{&quot;isManuallyOverridden&quot;:false,&quot;citeprocText&quot;:&quot;[18]&quot;,&quot;manualOverrideText&quot;:&quot;&quot;},&quot;citationTag&quot;:&quot;MENDELEY_CITATION_v3_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&quot;,&quot;citationItems&quot;:[{&quot;id&quot;:&quot;732c933d-ec2e-39a1-863e-a0f42fc93486&quot;,&quot;itemData&quot;:{&quot;type&quot;:&quot;article-journal&quot;,&quot;id&quot;:&quot;732c933d-ec2e-39a1-863e-a0f42fc93486&quot;,&quot;title&quot;:&quot;Programación de aplicaciones web: historia, principios básicos y clientes web&quot;,&quot;author&quot;:[{&quot;family&quot;:&quot;Luján Mora&quot;,&quot;given&quot;:&quot;Sergio&quot;,&quot;parse-names&quot;:false,&quot;dropping-particle&quot;:&quot;&quot;,&quot;non-dropping-particle&quot;:&quot;&quot;}],&quot;accessed&quot;:{&quot;date-parts&quot;:[[2025,8,28]]},&quot;ISBN&quot;:&quot;84-8454-206-8&quot;,&quot;URL&quot;:&quot;https://dialnet.unirioja.es/servlet/libro?codigo=204176&amp;info=resumen&amp;idioma=SPA&quot;,&quot;issued&quot;:{&quot;date-parts&quot;:[[2002,10,31]]},&quot;abstract&quot;:&quot;Aunque los inicios de Internet se remontan a los años sesenta, no ha sido hasta los años noventa cuando, gracias a la Web, se ha extendido su uso por todo el mundo. En pocos años la Web ha evolucionado enormemente: se ha pasado de páginas sencillas, con pocas imágenes y contenidos estáticos a páginas complejas con contenidos dinámicos que provienen de bases de datos, lo que permite la creación de \&quot;aplicaciones web\&quot;.De forma breve, una aplicación Web se puede definir como una aplicación en la cual el usuario por medio de un navegador realiza peticiones a una aplicación remota accesible a través de Internet (o a través de una Intranet) y que recibe una respuesta que se muestra en el propio navegador. El contenido de este libro se estructura en dos partes. En la primera parte del libro se tratan temas introductorios a la programación de aplicaciones Web: un breve repaso de la historia de Internet y de la web, características de las arquitecturas cliente/servidor, el concepto de aplicación Web y la estructura de un sitio web tanto a nivel físico como lógico. La segunda parte del libro se centra en la programación de la parte cliente de las aplicaciones web. En el \&quot;mundo Internet\&quot; existen muchas tecnologías que se pueden emplear para programar los clientes web, como ActiveX, applet, Flash, VRML, etc., pero sólo dos son las tecnología más extendidas y se pueden considerar \&quot;el estándar\&quot;: HTML y JavaScript. Este libro se centra en estas dos tecnologías y presta una especial atención a la creación de formularios, la base para cualquier aplicación web. Sergio Luján Mora es Ingeniero en Informática por la Universidad de Alicante. Ha impartido diversos cursos sobre Internet y las diversas tecnologías que se emplean en la programación de aplicaciones web (HTML, JavaScript, ASP y Java). Durante un año ha trabajado en el Laboratorio Multimedia (mmlab) de la Universidad de Alicante, desarrollando aplicaciones para Internet e Intranets. Ha escrito los libros \&quot;Programación en Internet: Clientes Web\&quot; y \&quot;Programación de servidores web con CGI, SSI e IDC\&quot; publicados por la Editorial Club Universitario. Desde 1999 forma parte del Departamento de Lenguajes y Sistemas Informáticos de la Universidad de Alicante. Las asignaturas que imparte en la actualidad son \&quot;Programación en Internet\&quot; y \&quot;Programación y Estructuras de Datos\&quot;.&quot;,&quot;publisher&quot;:&quot;Editorial Club Universitario (ECU)&quot;,&quot;container-title-short&quot;:&quot;&quot;},&quot;isTemporary&quot;:false,&quot;suppress-author&quot;:false,&quot;composite&quot;:false,&quot;author-only&quot;:false}]},{&quot;citationID&quot;:&quot;MENDELEY_CITATION_33bf8c3c-817d-402f-96ae-68947dfa23c7&quot;,&quot;properties&quot;:{&quot;noteIndex&quot;:0},&quot;isEdited&quot;:false,&quot;manualOverride&quot;:{&quot;isManuallyOverridden&quot;:false,&quot;citeprocText&quot;:&quot;[19]&quot;,&quot;manualOverrideText&quot;:&quot;&quot;},&quot;citationTag&quot;:&quot;MENDELEY_CITATION_v3_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&quot;,&quot;citationItems&quot;:[{&quot;id&quot;:&quot;ea6812f3-e3b2-3e87-8109-036dbffad5af&quot;,&quot;itemData&quot;:{&quot;type&quot;:&quot;article-journal&quot;,&quot;id&quot;:&quot;ea6812f3-e3b2-3e87-8109-036dbffad5af&quot;,&quot;title&quot;:&quot;Comparación de tendencias tecnológicas en aplicaciones web&quot;,&quot;author&quot;:[{&quot;family&quot;:&quot;Valarezo Pardo&quot;,&quot;given&quot;:&quot;Milton Rafael&quot;,&quot;parse-names&quot;:false,&quot;dropping-particle&quot;:&quot;&quot;,&quot;non-dropping-particle&quot;:&quot;&quot;},{&quot;family&quot;:&quot;Honores Tapia&quot;,&quot;given&quot;:&quot;Joofre Antonio&quot;,&quot;parse-names&quot;:false,&quot;dropping-particle&quot;:&quot;&quot;,&quot;non-dropping-particle&quot;:&quot;&quot;},{&quot;family&quot;:&quot;Gómez Moreno&quot;,&quot;given&quot;:&quot;Antonio Steeven&quot;,&quot;parse-names&quot;:false,&quot;dropping-particle&quot;:&quot;&quot;,&quot;non-dropping-particle&quot;:&quot;&quot;},{&quot;family&quot;:&quot;Vinces Sánchez&quot;,&quot;given&quot;:&quot;Luis Fernando&quot;,&quot;parse-names&quot;:false,&quot;dropping-particle&quot;:&quot;&quot;,&quot;non-dropping-particle&quot;:&quot;&quot;}],&quot;container-title&quot;:&quot;3c Tecnología: glosas de innovación aplicadas a la pyme, ISSN-e 2254-4143, Vol. 7, Nº. 3, 2018, págs. 28-49&quot;,&quot;accessed&quot;:{&quot;date-parts&quot;:[[2025,8,28]]},&quot;DOI&quot;:&quot;10.17993/3ctecno.2018.v7n3e27.28-49/30&quot;,&quot;ISSN&quot;:&quot;2254-4143&quot;,&quot;URL&quot;:&quot;https://dialnet.unirioja.es/servlet/articulo?codigo=6551743&amp;info=resumen&amp;idioma=SPA&quot;,&quot;issued&quot;:{&quot;date-parts&quot;:[[2018]]},&quot;page&quot;:&quot;28-49&quot;,&quot;abstract&quot;:&quot;Hoy en día el Internet es un gran medio de comunicación, en mayor medida, un medio de influencias que se ve reflejado en los avances y la continua adaptación tanto de los usuarios, como de los desarrolladores hacia él, por ello han surgido tendencias para el desarrollo Web como medio para establecer un modelo a seguir, así como para ofrecer unos mejores servicios a los usuarios. En las tendencias tecnológicas mencionadas existen diversos lenguajes de programación, herramientas y plataformas que sirve para darnos un claro entendimiento del cómo nos brindan una velocidad eficaz al momento de desarrollar una aplicación Web las cuales ofrecen una gran ventaja al grupo de trabajo en reducción de tiempo que se basan en requerimientos pre-establecidos usados en la creación de sistemas Web. Tomando en cuenta la información investigada se obtiene información acerca de los lenguajes de programación además plataformas, herramientas entre otras tecnologías que han mejorado de manera general; los mismos que permiten a los desarrolladores crear un sistema con un margen de error muy reducido en comparación con sus procesos. Para el desarrollo se orienta en los nuevos ambientes de trabajo que han agilizado el progreso software. En el presente documento se muestra algunas de las tecnologías que se han establecido para el óptimo desarrollo de aplicaciones Web, en la cual se empleó una investigación de tipo analítica, bibliográfica y documental, la cual brinda información confiable, verídica y proporciona criterios que ayudarán al desarrollo del documento.&quot;,&quot;publisher&quot;:&quot;3ciencias&quot;,&quot;issue&quot;:&quot;3&quot;,&quot;volume&quot;:&quot;7&quot;,&quot;container-title-short&quot;:&quot;&quot;},&quot;isTemporary&quot;:false,&quot;suppress-author&quot;:false,&quot;composite&quot;:false,&quot;author-only&quot;:false}]},{&quot;citationID&quot;:&quot;MENDELEY_CITATION_b63ece5d-61e3-428b-9e4f-e80e66b2e965&quot;,&quot;properties&quot;:{&quot;noteIndex&quot;:0},&quot;isEdited&quot;:false,&quot;manualOverride&quot;:{&quot;isManuallyOverridden&quot;:false,&quot;citeprocText&quot;:&quot;[20]&quot;,&quot;manualOverrideText&quot;:&quot;&quot;},&quot;citationTag&quot;:&quot;MENDELEY_CITATION_v3_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&quot;,&quot;citationItems&quot;:[{&quot;id&quot;:&quot;350b747e-8dad-3e1f-a4b1-d6435d9e6b57&quot;,&quot;itemData&quot;:{&quot;type&quot;:&quot;article-journal&quot;,&quot;id&quot;:&quot;350b747e-8dad-3e1f-a4b1-d6435d9e6b57&quot;,&quot;title&quot;:&quot;Aplicaciones web Aplicaciones Web Aplicaciones web Materiales del proyecto&quot;,&quot;author&quot;:[{&quot;family&quot;:&quot;Lerma-Blasco&quot;,&quot;given&quot;:&quot;Raül&quot;,&quot;parse-names&quot;:false,&quot;dropping-particle&quot;:&quot;V&quot;,&quot;non-dropping-particle&quot;:&quot;&quot;},{&quot;family&quot;:&quot;Alfredo&quot;,&quot;given&quot;:&quot;José&quot;,&quot;parse-names&quot;:false,&quot;dropping-particle&quot;:&quot;&quot;,&quot;non-dropping-particle&quot;:&quot;&quot;},{&quot;family&quot;:&quot;Andrés&quot;,&quot;given&quot;:&quot;Murcia&quot;,&quot;parse-names&quot;:false,&quot;dropping-particle&quot;:&quot;&quot;,&quot;non-dropping-particle&quot;:&quot;&quot;},{&quot;family&quot;:&quot;Mifsud&quot;,&quot;given&quot;:&quot;Elvira&quot;,&quot;parse-names&quot;:false,&quot;dropping-particle&quot;:&quot;&quot;,&quot;non-dropping-particle&quot;:&quot;&quot;},{&quot;family&quot;:&quot;Lerma-Blasco&quot;,&quot;given&quot;:&quot;Talón R&quot;,&quot;parse-names&quot;:false,&quot;dropping-particle&quot;:&quot;V&quot;,&quot;non-dropping-particle&quot;:&quot;&quot;},{&quot;family&quot;:&quot;Murcia&quot;,&quot;given&quot;:&quot;J A&quot;,&quot;parse-names&quot;:false,&quot;dropping-particle&quot;:&quot;&quot;,&quot;non-dropping-particle&quot;:&quot;&quot;},{&quot;family&quot;:&quot;Mifsud&quot;,&quot;given&quot;:&quot;E&quot;,&quot;parse-names&quot;:false,&quot;dropping-particle&quot;:&quot;&quot;,&quot;non-dropping-particle&quot;:&quot;&quot;}],&quot;accessed&quot;:{&quot;date-parts&quot;:[[2025,8,28]]},&quot;ISBN&quot;:&quot;978-84-481-8392-9&quot;,&quot;URL&quot;:&quot;www.mhe.es/cf/informatica&quot;,&quot;issued&quot;:{&quot;date-parts&quot;:[[2013]]},&quot;abstract&quot;:&quot;«La base de tu futuro» Ésta es la filosofía del proyecto editorial de McGraw-Hill para Ciclos Formativos, una etapa decisiva en la formación de profesionales. El proyecto para el módulo Aplicaciones web, incluido en el nuevo ciclo formativo Técnico en Sistemas Microinformáticos y Redes, y que está estructu-rado en dos niveles de uso, para el alumno y para el profesor, ha sido desarrollado según tres principios básicos: • Una metodología basada en la práctica y en la adecuación de contenidos y procedimientos a la realidad profesional. • Unos materiales desarrollados para conseguir las destrezas, habilidades y resultados de aprendizaje que necesitarás para conseguir tu título y desenvolverte en el mercado laboral. • Una presentación de los contenidos clara y atractiva, con variedad de recursos gráficos y multimedia que facilitarán tu aprendizaje. Para el alumno Para el profesor CEO del alumno Guía didáctica en CEO del profesor Confiamos en que esta obra sea una herramienta útil y eficaz, y que contribuya a tu formación como profesional.&quot;,&quot;container-title-short&quot;:&quot;&quot;},&quot;isTemporary&quot;:false,&quot;suppress-author&quot;:false,&quot;composite&quot;:false,&quot;author-only&quot;:false}]},{&quot;citationID&quot;:&quot;MENDELEY_CITATION_55bc22b0-f33c-4e4b-96d4-b5142fd6b3fa&quot;,&quot;properties&quot;:{&quot;noteIndex&quot;:0},&quot;isEdited&quot;:false,&quot;manualOverride&quot;:{&quot;isManuallyOverridden&quot;:false,&quot;citeprocText&quot;:&quot;[21]&quot;,&quot;manualOverrideText&quot;:&quot;&quot;},&quot;citationTag&quot;:&quot;MENDELEY_CITATION_v3_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&quot;,&quot;citationItems&quot;:[{&quot;id&quot;:&quot;29905e68-0b58-3a55-83fd-b47c93cd49cf&quot;,&quot;itemData&quot;:{&quot;type&quot;:&quot;article-journal&quot;,&quot;id&quot;:&quot;29905e68-0b58-3a55-83fd-b47c93cd49cf&quot;,&quot;title&quot;:&quot;Software educativos&quot;,&quot;author&quot;:[{&quot;family&quot;:&quot;Vidal&quot;,&quot;given&quot;:&quot;María&quot;,&quot;parse-names&quot;:false,&quot;dropping-particle&quot;:&quot;&quot;,&quot;non-dropping-particle&quot;:&quot;&quot;},{&quot;family&quot;:&quot;Gómez&quot;,&quot;given&quot;:&quot;Freddy&quot;,&quot;parse-names&quot;:false,&quot;dropping-particle&quot;:&quot;&quot;,&quot;non-dropping-particle&quot;:&quot;&quot;},{&quot;family&quot;:&quot;Ii&quot;,&quot;given&quot;:&quot;Martínez&quot;,&quot;parse-names&quot;:false,&quot;dropping-particle&quot;:&quot;&quot;,&quot;non-dropping-particle&quot;:&quot;&quot;},{&quot;family&quot;:&quot;Ruiz&quot;,&quot;given&quot;:&quot;Alina M&quot;,&quot;parse-names&quot;:false,&quot;dropping-particle&quot;:&quot;&quot;,&quot;non-dropping-particle&quot;:&quot;&quot;},{&quot;family&quot;:&quot;Iii&quot;,&quot;given&quot;:&quot;Piedra&quot;,&quot;parse-names&quot;:false,&quot;dropping-particle&quot;:&quot;&quot;,&quot;non-dropping-particle&quot;:&quot;&quot;}],&quot;container-title&quot;:&quot;Educación Médica Superior&quot;,&quot;accessed&quot;:{&quot;date-parts&quot;:[[2025,8,28]]},&quot;ISSN&quot;:&quot;0864-2141&quot;,&quot;URL&quot;:&quot;http://scielo.sld.cu/scielo.php?script=sci_arttext&amp;pid=S0864-21412010000100012&amp;lng=es&amp;nrm=iso&amp;tlng=en&quot;,&quot;issued&quot;:{&quot;date-parts&quot;:[[2010]]},&quot;page&quot;:&quot;97-110&quot;,&quot;abstract&quot;:&quot;El tema que les ofrecemos en este número, da continuidad al que revisamos sobre Plataformas Didácticas como Tecnología Educativa, 1 ya que forman parte de estas como recursos de la enseñanza y el aprendizaje. Los software educativos (SE), se definen de forma genérica como aplicaciones o programas computacionales que faciliten el proceso de enseñanza aprendizaje. Algunos autores lo conceptualizan como cualquier programa computacional cuyas características estructurales y funcionales sirvan de apoyo al proceso de enseñar, aprender y administrar, o el que está destinado a la enseñanza y el autoaprendizaje y además permite el desarrollo de ciertas habilidades cognitivas; 2-5 términos que seguramente se replantearán en la medida que se introduzcan nuevos desarrollos tecnológicos para el trabajo en red en Internet. Las características más generalizadas en los SE son: 5-7-Finalidad: orientados a la enseñanza-aprendizaje en todas sus formas.-Utilización del computador: el medio utilizado como soporte es el computador.-Facilidad de uso: son intuitivos y aplica reglas generales de uso y de fácil comprensión para su navegabilidad o desplazamiento y recursividad o posibilidad de regreso a temáticas de interés desde cualquier punto en el ambiente virtual.-Interactividad: permite un intercambio efectivo de información con el estudiante.&quot;,&quot;publisher&quot;:&quot;Los autores conservan todos los derechos sobre sus obras, las cuales pueden reproducir y distribuir siempre y cuando citen la fuente primaria de publicación y lo hagan con fines no comerciales.&quot;,&quot;issue&quot;:&quot;1&quot;,&quot;volume&quot;:&quot;24&quot;,&quot;container-title-short&quot;:&quot;&quot;},&quot;isTemporary&quot;:false,&quot;suppress-author&quot;:false,&quot;composite&quot;:false,&quot;author-only&quot;:false}]},{&quot;citationID&quot;:&quot;MENDELEY_CITATION_c6e5b687-8285-45cf-a355-5eca4de1a487&quot;,&quot;properties&quot;:{&quot;noteIndex&quot;:0},&quot;isEdited&quot;:false,&quot;manualOverride&quot;:{&quot;isManuallyOverridden&quot;:false,&quot;citeprocText&quot;:&quot;[22]&quot;,&quot;manualOverrideText&quot;:&quot;&quot;},&quot;citationTag&quot;:&quot;MENDELEY_CITATION_v3_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&quot;,&quot;citationItems&quot;:[{&quot;id&quot;:&quot;cca4c128-5866-3c4d-a9e5-827e680f436c&quot;,&quot;itemData&quot;:{&quot;type&quot;:&quot;report&quot;,&quot;id&quot;:&quot;cca4c128-5866-3c4d-a9e5-827e680f436c&quot;,&quot;title&quot;:&quot;Software educativo o recurso educativo Educational software oreducationalresource&quot;,&quot;author&quot;:[{&quot;family&quot;:&quot;Sc José Salvador Márquez Cundú ProfesorAuxiliar&quot;,&quot;given&quot;:&quot;M&quot;,&quot;parse-names&quot;:false,&quot;dropping-particle&quot;:&quot;&quot;,&quot;non-dropping-particle&quot;:&quot;&quot;}],&quot;issued&quot;:{&quot;date-parts&quot;:[[2018]]},&quot;abstract&quot;:&quot;E l impacto que están causando los avances in-formáticos sobre el mundo educativo se ve en incremento por la presión ejercida por el mundo del trabajo, que cada vez necesita y demanda una mayor formación en muchos campos, pero con más énfasis en el de la informática. Ante esta situación es inminente la necesidad de que los programas docentes de formación y superación, a cualquier nivel, tengan que incorporar los software educativos dentro de su contenido. Por tal motivo se hace imprescindible hacer comprender a nuestros educadores la importancia de su apli-cación, lo cual no debe ser visto como un medio de enseñanza o una herramienta de trabajo utili-zada en la enseñanza, sino como un eslabón fundamental para incrementar la calidad del proceso educativo. A partir del cambio de tecnologías y la intro-ducción de la computación en los diferentes niveles de educación se implementan acciones concretas RESUMEN. El software educativo es una categoría muy empleada en los espacios de formación pues claramente se pueden observar las potencialidades que para la mediación de los procesos comunicativos propiciadores del aprendizaje ofrece. Hoy surgen múltiples categorías y deno-minaciones para tan importante herramienta, sin embargo, cada una de esas denominaciones tienen elementos idiográficos que los diferencian. El presente trabajo va dirigido a aportar detalles importantes del software educativo que lo identifican y diferencian de los recursos educativos, aunque esté contenido en este grupo de clasificación. Para esto se realiza una sistematización de estos conceptos aplicando métodos deductivos e inductivos, el análisis y la síntesis entre otros. Cómo resultado se obtiene una definición de software educativo que deja claramente ex-puesta cada una de las características por la cual se define de esta manera. Palabras clave: software, software educativo, recurso educativo, recurso educativo digital. ABSTRACT. Educational software is a category widely used in training spaces because clearly you can see the potential for mediation of communicative processes conducive to learning offers. Today there are multiple categories and denominations for such an important tool, however each of these denominations have idiographic elements that differentiate them. This work is aimed at providing important details of educational software that identify it and differentiate it from educational resources, even if it is contained in this classification group. For this, a systematization of these concepts is carried out applying deductive and inductive methods, analysis and synthesis among others. As a result, a definition of educational software is obtained that clearly exposes each one of the characteristics by which it is defined in this way.&quot;,&quot;issue&quot;:&quot;67&quot;,&quot;container-title-short&quot;:&quot;&quot;},&quot;isTemporary&quot;:false,&quot;suppress-author&quot;:false,&quot;composite&quot;:false,&quot;author-only&quot;:false}]},{&quot;citationID&quot;:&quot;MENDELEY_CITATION_8f3f3c15-8b60-426e-a0da-9c788e587971&quot;,&quot;properties&quot;:{&quot;noteIndex&quot;:0},&quot;isEdited&quot;:false,&quot;manualOverride&quot;:{&quot;isManuallyOverridden&quot;:false,&quot;citeprocText&quot;:&quot;[23]&quot;,&quot;manualOverrideText&quot;:&quot;&quot;},&quot;citationTag&quot;:&quot;MENDELEY_CITATION_v3_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&quot;,&quot;citationItems&quot;:[{&quot;id&quot;:&quot;9dab0b7d-9d5c-391b-91b5-9ccbe19d7a26&quot;,&quot;itemData&quot;:{&quot;type&quot;:&quot;article-journal&quot;,&quot;id&quot;:&quot;9dab0b7d-9d5c-391b-91b5-9ccbe19d7a26&quot;,&quot;title&quot;:&quot;An overview of the CellML API and its implementation&quot;,&quot;author&quot;:[{&quot;family&quot;:&quot;Miller&quot;,&quot;given&quot;:&quot;Andrew K.&quot;,&quot;parse-names&quot;:false,&quot;dropping-particle&quot;:&quot;&quot;,&quot;non-dropping-particle&quot;:&quot;&quot;},{&quot;family&quot;:&quot;Marsh&quot;,&quot;given&quot;:&quot;Justin&quot;,&quot;parse-names&quot;:false,&quot;dropping-particle&quot;:&quot;&quot;,&quot;non-dropping-particle&quot;:&quot;&quot;},{&quot;family&quot;:&quot;Reeve&quot;,&quot;given&quot;:&quot;Adam&quot;,&quot;parse-names&quot;:false,&quot;dropping-particle&quot;:&quot;&quot;,&quot;non-dropping-particle&quot;:&quot;&quot;},{&quot;family&quot;:&quot;Garny&quot;,&quot;given&quot;:&quot;Alan&quot;,&quot;parse-names&quot;:false,&quot;dropping-particle&quot;:&quot;&quot;,&quot;non-dropping-particle&quot;:&quot;&quot;},{&quot;family&quot;:&quot;Britten&quot;,&quot;given&quot;:&quot;Randall&quot;,&quot;parse-names&quot;:false,&quot;dropping-particle&quot;:&quot;&quot;,&quot;non-dropping-particle&quot;:&quot;&quot;},{&quot;family&quot;:&quot;Halstead&quot;,&quot;given&quot;:&quot;Matt&quot;,&quot;parse-names&quot;:false,&quot;dropping-particle&quot;:&quot;&quot;,&quot;non-dropping-particle&quot;:&quot;&quot;},{&quot;family&quot;:&quot;Cooper&quot;,&quot;given&quot;:&quot;Jonathan&quot;,&quot;parse-names&quot;:false,&quot;dropping-particle&quot;:&quot;&quot;,&quot;non-dropping-particle&quot;:&quot;&quot;},{&quot;family&quot;:&quot;Nickerson&quot;,&quot;given&quot;:&quot;David P.&quot;,&quot;parse-names&quot;:false,&quot;dropping-particle&quot;:&quot;&quot;,&quot;non-dropping-particle&quot;:&quot;&quot;},{&quot;family&quot;:&quot;Nielsen&quot;,&quot;given&quot;:&quot;Poul F.&quot;,&quot;parse-names&quot;:false,&quot;dropping-particle&quot;:&quot;&quot;,&quot;non-dropping-particle&quot;:&quot;&quot;}],&quot;container-title&quot;:&quot;BMC Bioinformatics&quot;,&quot;container-title-short&quot;:&quot;BMC Bioinformatics&quot;,&quot;accessed&quot;:{&quot;date-parts&quot;:[[2025,8,28]]},&quot;DOI&quot;:&quot;10.1186/1471-2105-11-178/FIGURES/1&quot;,&quot;ISSN&quot;:&quot;14712105&quot;,&quot;PMID&quot;:&quot;20377909&quot;,&quot;URL&quot;:&quot;https://link.springer.com/articles/10.1186/1471-2105-11-178&quot;,&quot;issued&quot;:{&quot;date-parts&quot;:[[2010,4,8]]},&quot;page&quot;:&quot;1-12&quot;,&quot;abstract&quot;:&quot;Background: CellML is an XML based language for representing mathematical models, in a machine-independent form which is suitable for their exchange between different authors, and for archival in a model repository. Allowing for the exchange and archival of models in a computer readable form is a key strategic goal in bioinformatics, because of the associated improvements in scientific record accuracy, the faster iterative process of scientific development, and the ability to combine models into large integrative models.However, for CellML models to be useful, tools which can process them correctly are needed. Due to some of the more complex features present in CellML models, such as imports, developing code ab initio to correctly process models can be an onerous task. For this reason, there is a clear and pressing need for an application programming interface (API), and a good implementation of that API, upon which tools can base their support for CellML.Results: We developed an API which allows the information in CellML models to be retrieved and/or modified. We also developed a series of optional extension APIs, for tasks such as simplifying the handling of connections between variables, dealing with physical units, validating models, and translating models into different procedural languages.We have also provided a Free/Open Source implementation of this application programming interface, optimised to achieve good performance.Conclusions: Tools have been developed using the API which are mature enough for widespread use. The API has the potential to accelerate the development of additional tools capable of processing CellML, and ultimately lead to an increased level of sharing of mathematical model descriptions. © 2010 Miller et al; licensee BioMed Central Ltd.&quot;,&quot;publisher&quot;:&quot;BioMed Central&quot;,&quot;issue&quot;:&quot;1&quot;,&quot;volume&quot;:&quot;11&quot;},&quot;isTemporary&quot;:false,&quot;suppress-author&quot;:false,&quot;composite&quot;:false,&quot;author-only&quot;:false}]},{&quot;citationID&quot;:&quot;MENDELEY_CITATION_6eeef895-1c60-48f2-bda7-7f94c704174b&quot;,&quot;properties&quot;:{&quot;noteIndex&quot;:0},&quot;isEdited&quot;:false,&quot;manualOverride&quot;:{&quot;isManuallyOverridden&quot;:false,&quot;citeprocText&quot;:&quot;[24]&quot;,&quot;manualOverrideText&quot;:&quot;&quot;},&quot;citationTag&quot;:&quot;MENDELEY_CITATION_v3_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&quot;,&quot;citationItems&quot;:[{&quot;id&quot;:&quot;9b1d2aa2-510e-3889-8acc-50bc11b16caa&quot;,&quot;itemData&quot;:{&quot;type&quot;:&quot;article-journal&quot;,&quot;id&quot;:&quot;9b1d2aa2-510e-3889-8acc-50bc11b16caa&quot;,&quot;title&quot;:&quot;A Systematic Review of API Evolution Literature&quot;,&quot;author&quot;:[{&quot;family&quot;:&quot;Lamothe&quot;,&quot;given&quot;:&quot;Maxime&quot;,&quot;parse-names&quot;:false,&quot;dropping-particle&quot;:&quot;&quot;,&quot;non-dropping-particle&quot;:&quot;&quot;},{&quot;family&quot;:&quot;Guéhéneuc&quot;,&quot;given&quot;:&quot;Yann Gaël&quot;,&quot;parse-names&quot;:false,&quot;dropping-particle&quot;:&quot;&quot;,&quot;non-dropping-particle&quot;:&quot;&quot;},{&quot;family&quot;:&quot;Shang&quot;,&quot;given&quot;:&quot;Weiyi&quot;,&quot;parse-names&quot;:false,&quot;dropping-particle&quot;:&quot;&quot;,&quot;non-dropping-particle&quot;:&quot;&quot;}],&quot;container-title&quot;:&quot;ACM Computing Surveys&quot;,&quot;container-title-short&quot;:&quot;ACM Comput Surv&quot;,&quot;accessed&quot;:{&quot;date-parts&quot;:[[2025,8,28]]},&quot;DOI&quot;:&quot;10.1145/3470133;SERIALTOPIC:TOPIC:ACM-PUBTYPE&gt;JOURNAL;PAGE:STRING:ARTICLE/CHAPTER&quot;,&quot;ISSN&quot;:&quot;15577341&quot;,&quot;URL&quot;:&quot;/doi/pdf/10.1145/3470133?download=true&quot;,&quot;issued&quot;:{&quot;date-parts&quot;:[[2022,11,30]]},&quot;abstract&quot;:&quot;Recent software advances have led to an expansion of the development and usage of application programming interfaces (APIs). From millions of Android packages (APKs) available on Google Store to millions of open-source packages available in Maven, PyPI, and npm, APIs have become an integral part of software development.Like any software artifact, software APIs evolve and suffer from this evolution. Prior research has uncovered many challenges to the development, usage, and evolution of APIs. While some challenges have been studied and solved, many remain. These challenges are scattered in the literature, which hides advances and cloaks the remaining challenges.In this systematic literature review on APIs and API evolution, we uncover and describe publication trends and trending topics. We compile common research goals, evaluation methods, metrics, and subjects. We summarize the current state-of-the-art and outline known existing challenges as well as new challenges uncovered during this review.We conclude that the main remaining challenges related to APIs and API evolution are (1) automatically identifying and leveraging factors that drive API changes, (2) creating and using uniform benchmarks for research evaluation, and (3) understanding the impact of API evolution on API developers and users with respect to various programming languages.&quot;,&quot;publisher&quot;:&quot;Association for Computing Machinery&quot;,&quot;issue&quot;:&quot;8&quot;,&quot;volume&quot;:&quot;54&quot;},&quot;isTemporary&quot;:false,&quot;suppress-author&quot;:false,&quot;composite&quot;:false,&quot;author-only&quot;:false}]},{&quot;citationID&quot;:&quot;MENDELEY_CITATION_efedfa8d-f481-4d26-803f-b46a0fbbe2b0&quot;,&quot;properties&quot;:{&quot;noteIndex&quot;:0},&quot;isEdited&quot;:false,&quot;manualOverride&quot;:{&quot;isManuallyOverridden&quot;:false,&quot;citeprocText&quot;:&quot;[25]&quot;,&quot;manualOverrideText&quot;:&quot;&quot;},&quot;citationTag&quot;:&quot;MENDELEY_CITATION_v3_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&quot;,&quot;citationItems&quot;:[{&quot;id&quot;:&quot;37c1f89b-0ce4-30eb-b7cf-2d8943ec72f5&quot;,&quot;itemData&quot;:{&quot;type&quot;:&quot;article-journal&quot;,&quot;id&quot;:&quot;37c1f89b-0ce4-30eb-b7cf-2d8943ec72f5&quot;,&quot;title&quot;:&quot;A Prompt Pattern Catalog to Enhance Prompt Engineering with ChatGPT&quot;,&quot;author&quot;:[{&quot;family&quot;:&quot;White&quot;,&quot;given&quot;:&quot;Jules&quot;,&quot;parse-names&quot;:false,&quot;dropping-particle&quot;:&quot;&quot;,&quot;non-dropping-particle&quot;:&quot;&quot;},{&quot;family&quot;:&quot;Fu&quot;,&quot;given&quot;:&quot;Quchen&quot;,&quot;parse-names&quot;:false,&quot;dropping-particle&quot;:&quot;&quot;,&quot;non-dropping-particle&quot;:&quot;&quot;},{&quot;family&quot;:&quot;Hays&quot;,&quot;given&quot;:&quot;Sam&quot;,&quot;parse-names&quot;:false,&quot;dropping-particle&quot;:&quot;&quot;,&quot;non-dropping-particle&quot;:&quot;&quot;},{&quot;family&quot;:&quot;Sandborn&quot;,&quot;given&quot;:&quot;Michael&quot;,&quot;parse-names&quot;:false,&quot;dropping-particle&quot;:&quot;&quot;,&quot;non-dropping-particle&quot;:&quot;&quot;},{&quot;family&quot;:&quot;Olea&quot;,&quot;given&quot;:&quot;Carlos&quot;,&quot;parse-names&quot;:false,&quot;dropping-particle&quot;:&quot;&quot;,&quot;non-dropping-particle&quot;:&quot;&quot;},{&quot;family&quot;:&quot;Gilbert&quot;,&quot;given&quot;:&quot;Henry&quot;,&quot;parse-names&quot;:false,&quot;dropping-particle&quot;:&quot;&quot;,&quot;non-dropping-particle&quot;:&quot;&quot;},{&quot;family&quot;:&quot;Elnashar&quot;,&quot;given&quot;:&quot;Ashraf&quot;,&quot;parse-names&quot;:false,&quot;dropping-particle&quot;:&quot;&quot;,&quot;non-dropping-particle&quot;:&quot;&quot;},{&quot;family&quot;:&quot;Spencer-Smith&quot;,&quot;given&quot;:&quot;Jesse&quot;,&quot;parse-names&quot;:false,&quot;dropping-particle&quot;:&quot;&quot;,&quot;non-dropping-particle&quot;:&quot;&quot;},{&quot;family&quot;:&quot;Schmidt&quot;,&quot;given&quot;:&quot;Douglas C&quot;,&quot;parse-names&quot;:false,&quot;dropping-particle&quot;:&quot;&quot;,&quot;non-dropping-particle&quot;:&quot;&quot;}],&quot;accessed&quot;:{&quot;date-parts&quot;:[[2025,8,28]]},&quot;URL&quot;:&quot;https://omekas-test.sba.unipi.it/files/original/9473424cea8d562f876a4bca4bedd9e2336910af.pdf&quot;,&quot;issued&quot;:{&quot;date-parts&quot;:[[2023]]},&quot;abstract&quot;:&quot;Prompt engineering is an increasingly important skill set needed to converse effectively with large language models (LLMs), such as ChatGPT. Prompts are instructions given to an LLM to enforce rules, automate processes, and ensure specific qualities (and quantities) of generated output. Prompts are also a form of programming that can customize the outputs and interactions with an LLM.&quot;},&quot;isTemporary&quot;:false,&quot;suppress-author&quot;:false,&quot;composite&quot;:false,&quot;author-only&quot;:false}]},{&quot;citationID&quot;:&quot;MENDELEY_CITATION_0e2e9eba-ef5f-48bb-ad6a-d7c01b2e1c64&quot;,&quot;properties&quot;:{&quot;noteIndex&quot;:0},&quot;isEdited&quot;:false,&quot;manualOverride&quot;:{&quot;isManuallyOverridden&quot;:false,&quot;citeprocText&quot;:&quot;[26]&quot;,&quot;manualOverrideText&quot;:&quot;&quot;},&quot;citationTag&quot;:&quot;MENDELEY_CITATION_v3_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&quot;,&quot;citationItems&quot;:[{&quot;id&quot;:&quot;67672574-8d09-3c8a-acea-08c3d27ba58e&quot;,&quot;itemData&quot;:{&quot;type&quot;:&quot;article-journal&quot;,&quot;id&quot;:&quot;67672574-8d09-3c8a-acea-08c3d27ba58e&quot;,&quot;title&quot;:&quot;Prompt Engineering For ChatGPT: A Quick Guide To Techniques, Tips, And Best Practices&quot;,&quot;author&quot;:[{&quot;family&quot;:&quot;Ekin&quot;,&quot;given&quot;:&quot;Sabit&quot;,&quot;parse-names&quot;:false,&quot;dropping-particle&quot;:&quot;&quot;,&quot;non-dropping-particle&quot;:&quot;&quot;}],&quot;container-title&quot;:&quot;Authorea Preprints&quot;,&quot;accessed&quot;:{&quot;date-parts&quot;:[[2025,8,28]]},&quot;DOI&quot;:&quot;10.36227/TECHRXIV.22683919.V1&quot;,&quot;URL&quot;:&quot;https://www.techrxiv.org/doi/pdf/10.36227/techrxiv.22683919.v1/v1&quot;,&quot;issued&quot;:{&quot;date-parts&quot;:[[2023,10,30]]},&quot;abstract&quot;:&quot;In the rapidly evolving landscape of natural language processing (NLP), ChatGPT has emerged as a powerful tool for various industries and applications. To fully harness the potential of ChatGPT, it is crucial to understand and master the art of prompt engineering-the process of designing and refining input prompts to elicit desired responses from an AI NLP model. This article provides a comprehensive guide to mastering prompt engineering techniques, tips, and best practices to achieve optimal outcomes with ChatGPT. The discussion begins with an introduction to ChatGPT and the fundamentals of prompt engineering, followed by an exploration of techniques for effective prompt crafting, such as clarity, explicit constraints, experimentation, and leveraging different types of questions. The article also covers best practices, including iterative refinement, balancing user intent, harnessing external resources, and ensuring ethical usage. Advanced strategies, such as temperature and token control, prompt chaining, domain-specific adaptations, and handling ambiguous inputs, are also addressed. Real-world case studies demonstrate the practical applications of prompt engineering in customer support, content generation, domain-specific knowledge retrieval, and interactive storytelling. The article concludes by highlighting the impact of effective prompt engineering on ChatGPT performance, future research directions, and the importance of fostering creativity and collaboration within the ChatGPT community.&quot;,&quot;publisher&quot;:&quot;Authorea&quot;},&quot;isTemporary&quot;:false,&quot;suppress-author&quot;:false,&quot;composite&quot;:false,&quot;author-only&quot;:false}]},{&quot;citationID&quot;:&quot;MENDELEY_CITATION_1c6b4394-f6f9-4952-9099-0218c3c2336a&quot;,&quot;properties&quot;:{&quot;noteIndex&quot;:0},&quot;isEdited&quot;:false,&quot;manualOverride&quot;:{&quot;isManuallyOverridden&quot;:false,&quot;citeprocText&quot;:&quot;[27]&quot;,&quot;manualOverrideText&quot;:&quot;&quot;},&quot;citationTag&quot;:&quot;MENDELEY_CITATION_v3_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&quot;,&quot;citationItems&quot;:[{&quot;id&quot;:&quot;dca70e98-091b-3b25-a31e-8ea8dbed5c74&quot;,&quot;itemData&quot;:{&quot;type&quot;:&quot;article-journal&quot;,&quot;id&quot;:&quot;dca70e98-091b-3b25-a31e-8ea8dbed5c74&quot;,&quot;title&quot;:&quot;A Systematic Survey of Prompt Engineering in Large Language Models: Techniques and Applications&quot;,&quot;author&quot;:[{&quot;family&quot;:&quot;Sahoo&quot;,&quot;given&quot;:&quot;Pranab&quot;,&quot;parse-names&quot;:false,&quot;dropping-particle&quot;:&quot;&quot;,&quot;non-dropping-particle&quot;:&quot;&quot;},{&quot;family&quot;:&quot;Singh&quot;,&quot;given&quot;:&quot;Ayush Kumar&quot;,&quot;parse-names&quot;:false,&quot;dropping-particle&quot;:&quot;&quot;,&quot;non-dropping-particle&quot;:&quot;&quot;},{&quot;family&quot;:&quot;Saha&quot;,&quot;given&quot;:&quot;Sriparna&quot;,&quot;parse-names&quot;:false,&quot;dropping-particle&quot;:&quot;&quot;,&quot;non-dropping-particle&quot;:&quot;&quot;},{&quot;family&quot;:&quot;Jain&quot;,&quot;given&quot;:&quot;Vinija&quot;,&quot;parse-names&quot;:false,&quot;dropping-particle&quot;:&quot;&quot;,&quot;non-dropping-particle&quot;:&quot;&quot;},{&quot;family&quot;:&quot;Mondal&quot;,&quot;given&quot;:&quot;Samrat&quot;,&quot;parse-names&quot;:false,&quot;dropping-particle&quot;:&quot;&quot;,&quot;non-dropping-particle&quot;:&quot;&quot;},{&quot;family&quot;:&quot;Chadha&quot;,&quot;given&quot;:&quot;Aman&quot;,&quot;parse-names&quot;:false,&quot;dropping-particle&quot;:&quot;&quot;,&quot;non-dropping-particle&quot;:&quot;&quot;}],&quot;accessed&quot;:{&quot;date-parts&quot;:[[2025,8,28]]},&quot;URL&quot;:&quot;http://arxiv.org/abs/2402.07927&quot;,&quot;issued&quot;:{&quot;date-parts&quot;:[[2025,3,16]]},&quot;abstract&quot;:&quot;Prompt engineering has emerged as an indispensable technique for extending the capabilities of large language models (LLMs) and vision-language models (VLMs). This approach leverages task-specific instructions, known as prompts, to enhance model efficacy without modifying the core model parameters. Rather than updating the model parameters, prompts allow seamless integration of pre-trained models into downstream tasks by eliciting desired model behaviors solely based on the given prompt. Prompts can be natural language instructions that provide context to guide the model or learned vector representations that activate relevant knowledge. This burgeoning field has enabled success across various applications, from question-answering to commonsense reasoning. However, there remains a lack of systematic organization and understanding of the diverse prompt engineering methods and techniques. This survey paper addresses the gap by providing a structured overview of recent advancements in prompt engineering, categorized by application area. For each prompting approach, we provide a summary detailing the prompting methodology, its applications, the models involved, and the datasets utilized. We also delve into the strengths and limitations of each approach and include a taxonomy diagram and table summarizing datasets, models, and critical points of each prompting technique. This systematic analysis enables a better understanding of this rapidly developing field and facilitates future research by illuminating open challenges and opportunities for prompt engineering.&quot;},&quot;isTemporary&quot;:false,&quot;suppress-author&quot;:false,&quot;composite&quot;:false,&quot;author-only&quot;:false}]},{&quot;citationID&quot;:&quot;MENDELEY_CITATION_db017f6e-1f77-4e7b-b112-f564875ce92a&quot;,&quot;properties&quot;:{&quot;noteIndex&quot;:0},&quot;isEdited&quot;:false,&quot;manualOverride&quot;:{&quot;isManuallyOverridden&quot;:false,&quot;citeprocText&quot;:&quot;[28]&quot;,&quot;manualOverrideText&quot;:&quot;&quot;},&quot;citationTag&quot;:&quot;MENDELEY_CITATION_v3_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&quot;,&quot;citationItems&quot;:[{&quot;id&quot;:&quot;d887930f-7638-3202-967f-7b05dc021b5a&quot;,&quot;itemData&quot;:{&quot;type&quot;:&quot;article-journal&quot;,&quot;id&quot;:&quot;d887930f-7638-3202-967f-7b05dc021b5a&quot;,&quot;title&quot;:&quot;Scaffolding: Teaching and Learning in Language and Literacy Education.&quot;,&quot;author&quot;:[{&quot;family&quot;:&quot;Hammond&quot;,&quot;given&quot;:&quot;Jennifer, Ed.&quot;,&quot;parse-names&quot;:false,&quot;dropping-particle&quot;:&quot;&quot;,&quot;non-dropping-particle&quot;:&quot;&quot;}],&quot;accessed&quot;:{&quot;date-parts&quot;:[[2025,8,28]]},&quot;ISBN&quot;:&quot;1-875622-43-8&quot;,&quot;URL&quot;:&quot;http://www.peta.edu.au.&quot;,&quot;issued&quot;:{&quot;date-parts&quot;:[[2001,7]]},&quot;page&quot;:&quot;116&quot;,&quot;abstract&quot;:&quot;This book presents six essays that explain where the educational term&quot;,&quot;publisher&quot;:&quot;Primary English Teaching Assoc., P.O. Box 3106, Marrickville, New South Wales, 2204, Australia. Tel: (02) 9565 1277; Fax: (02) 9565 1070; e-mail: info@peta.edu.au; Web site: http://www.peta.edu.au.&quot;,&quot;container-title-short&quot;:&quot;&quot;},&quot;isTemporary&quot;:false,&quot;suppress-author&quot;:false,&quot;composite&quot;:false,&quot;author-only&quot;:false}]},{&quot;citationID&quot;:&quot;MENDELEY_CITATION_456d2559-42cc-49d3-8459-c804f4d47cd7&quot;,&quot;properties&quot;:{&quot;noteIndex&quot;:0},&quot;isEdited&quot;:false,&quot;manualOverride&quot;:{&quot;isManuallyOverridden&quot;:false,&quot;citeprocText&quot;:&quot;[29]&quot;,&quot;manualOverrideText&quot;:&quot;&quot;},&quot;citationTag&quot;:&quot;MENDELEY_CITATION_v3_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&quot;,&quot;citationItems&quot;:[{&quot;id&quot;:&quot;8d9f69d1-31d9-3048-9874-23efb5103f36&quot;,&quot;itemData&quot;:{&quot;type&quot;:&quot;article-journal&quot;,&quot;id&quot;:&quot;8d9f69d1-31d9-3048-9874-23efb5103f36&quot;,&quot;title&quot;:&quot;Scaffolding and dialogic teaching in mathematics education: introduction and review&quot;,&quot;author&quot;:[{&quot;family&quot;:&quot;Bakker&quot;,&quot;given&quot;:&quot;Arthur&quot;,&quot;parse-names&quot;:false,&quot;dropping-particle&quot;:&quot;&quot;,&quot;non-dropping-particle&quot;:&quot;&quot;},{&quot;family&quot;:&quot;Smit&quot;,&quot;given&quot;:&quot;Jantien&quot;,&quot;parse-names&quot;:false,&quot;dropping-particle&quot;:&quot;&quot;,&quot;non-dropping-particle&quot;:&quot;&quot;},{&quot;family&quot;:&quot;Wegerif&quot;,&quot;given&quot;:&quot;Rupert&quot;,&quot;parse-names&quot;:false,&quot;dropping-particle&quot;:&quot;&quot;,&quot;non-dropping-particle&quot;:&quot;&quot;}],&quot;container-title&quot;:&quot;ZDM - Mathematics Education&quot;,&quot;accessed&quot;:{&quot;date-parts&quot;:[[2025,8,28]]},&quot;DOI&quot;:&quot;10.1007/S11858-015-0738-8/FIGURES/2&quot;,&quot;ISSN&quot;:&quot;18639704&quot;,&quot;URL&quot;:&quot;https://link.springer.com/article/10.1007/s11858-015-0738-8&quot;,&quot;issued&quot;:{&quot;date-parts&quot;:[[2015,11,1]]},&quot;page&quot;:&quot;1047-1065&quot;,&quot;abstract&quot;:&quot;This article has two purposes: firstly to introduce this special issue on scaffolding and dialogic teaching in mathematics education and secondly to review the recent literature on these topics as well as the articles in this special issue. First we define and characterise scaffolding and dialogic teaching and provide a brief historical overview of the scaffolding metaphor. Then we present a review study of the recent scaffolding literature in mathematics education (2010–2015) based on 21 publications that fulfilled our criteria and 14 articles in this special issue that have scaffolding as a central focus. This is complemented with a brief review of the recent literature on dialogic teaching. We critically discuss some of the issues emerging from these reviews and provide some recommendations. We argue that scaffolding has the potential to be a useful integrative concept within mathematics education, especially when taking advantage of the insights from the dialogic teaching literature.&quot;,&quot;publisher&quot;:&quot;Springer Verlag&quot;,&quot;issue&quot;:&quot;7&quot;,&quot;volume&quot;:&quot;47&quot;,&quot;container-title-short&quot;:&quot;&quot;},&quot;isTemporary&quot;:false,&quot;suppress-author&quot;:false,&quot;composite&quot;:false,&quot;author-only&quot;:false}]},{&quot;citationID&quot;:&quot;MENDELEY_CITATION_217b93a3-ac1f-4d37-ab86-3054aead02cc&quot;,&quot;properties&quot;:{&quot;noteIndex&quot;:0},&quot;isEdited&quot;:false,&quot;manualOverride&quot;:{&quot;isManuallyOverridden&quot;:false,&quot;citeprocText&quot;:&quot;[30]&quot;,&quot;manualOverrideText&quot;:&quot;&quot;},&quot;citationTag&quot;:&quot;MENDELEY_CITATION_v3_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&quot;,&quot;citationItems&quot;:[{&quot;id&quot;:&quot;59ad901e-025f-3300-8467-1914e286dd2c&quot;,&quot;itemData&quot;:{&quot;type&quot;:&quot;article-journal&quot;,&quot;id&quot;:&quot;59ad901e-025f-3300-8467-1914e286dd2c&quot;,&quot;title&quot;:&quot;Aprendizaje adaptativo&quot;,&quot;author&quot;:[{&quot;family&quot;:&quot;María&quot;,&quot;given&quot;:&quot;Dª&quot;,&quot;parse-names&quot;:false,&quot;dropping-particle&quot;:&quot;&quot;,&quot;non-dropping-particle&quot;:&quot;&quot;},{&quot;family&quot;:&quot;Carmen&quot;,&quot;given&quot;:&quot;Del&quot;,&quot;parse-names&quot;:false,&quot;dropping-particle&quot;:&quot;&quot;,&quot;non-dropping-particle&quot;:&quot;&quot;},{&quot;family&quot;:&quot;Lozano&quot;,&quot;given&quot;:&quot;Morillo&quot;,&quot;parse-names&quot;:false,&quot;dropping-particle&quot;:&quot;&quot;,&quot;non-dropping-particle&quot;:&quot;&quot;}],&quot;accessed&quot;:{&quot;date-parts&quot;:[[2025,8,28]]},&quot;URL&quot;:&quot;https://uvadoc.uva.es/handle/10324/21000&quot;,&quot;issued&quot;:{&quot;date-parts&quot;:[[2016]]},&quot;abstract&quot;:&quot;Departamento de Química Orgánica&quot;,&quot;container-title-short&quot;:&quot;&quot;},&quot;isTemporary&quot;:false,&quot;suppress-author&quot;:false,&quot;composite&quot;:false,&quot;author-only&quot;:false}]},{&quot;citationID&quot;:&quot;MENDELEY_CITATION_69a923c5-0414-4dd4-a8a0-779d62e40eaa&quot;,&quot;properties&quot;:{&quot;noteIndex&quot;:0},&quot;isEdited&quot;:false,&quot;manualOverride&quot;:{&quot;isManuallyOverridden&quot;:false,&quot;citeprocText&quot;:&quot;[31]&quot;,&quot;manualOverrideText&quot;:&quot;&quot;},&quot;citationTag&quot;:&quot;MENDELEY_CITATION_v3_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&quot;,&quot;citationItems&quot;:[{&quot;id&quot;:&quot;ea128e7c-b5ed-37be-aeb3-e7dcb81acb96&quot;,&quot;itemData&quot;:{&quot;type&quot;:&quot;article&quot;,&quot;id&quot;:&quot;ea128e7c-b5ed-37be-aeb3-e7dcb81acb96&quot;,&quot;title&quot;:&quot;The Impact of AI-Driven Application Programming Interfaces (APIs) on Educational Information Management&quot;,&quot;author&quot;:[{&quot;family&quot;:&quot;Pérez-Jorge&quot;,&quot;given&quot;:&quot;David&quot;,&quot;parse-names&quot;:false,&quot;dropping-particle&quot;:&quot;&quot;,&quot;non-dropping-particle&quot;:&quot;&quot;},{&quot;family&quot;:&quot;González-Afonso&quot;,&quot;given&quot;:&quot;Miriam Catalina&quot;,&quot;parse-names&quot;:false,&quot;dropping-particle&quot;:&quot;&quot;,&quot;non-dropping-particle&quot;:&quot;&quot;},{&quot;family&quot;:&quot;Santos-Álvarez&quot;,&quot;given&quot;:&quot;Anthea Gara&quot;,&quot;parse-names&quot;:false,&quot;dropping-particle&quot;:&quot;&quot;,&quot;non-dropping-particle&quot;:&quot;&quot;},{&quot;family&quot;:&quot;Plasencia-Carballo&quot;,&quot;given&quot;:&quot;Zeus&quot;,&quot;parse-names&quot;:false,&quot;dropping-particle&quot;:&quot;&quot;,&quot;non-dropping-particle&quot;:&quot;&quot;},{&quot;family&quot;:&quot;Perdomo-López&quot;,&quot;given&quot;:&quot;Carmen de los Ángeles&quot;,&quot;parse-names&quot;:false,&quot;dropping-particle&quot;:&quot;&quot;,&quot;non-dropping-particle&quot;:&quot;&quot;}],&quot;container-title&quot;:&quot;Information (Switzerland)&quot;,&quot;DOI&quot;:&quot;10.3390/info16070540&quot;,&quot;ISSN&quot;:&quot;20782489&quot;,&quot;issued&quot;:{&quot;date-parts&quot;:[[2025,7,1]]},&quot;abstract&quot;:&quot;In today’s digitalized educational landscape, the intelligent use of information is essential for personalizing learning, improving assessment accuracy, and supporting data-driven pedagogical decisions. This systematic review examines the integration of Application Programming Interfaces (APIs) powered by Artificial Intelligence (AI) to enhance educational information management and learning processes. A total of 27 peer-reviewed studies published between 2013 and 2025 were analyzed. First, a general description of the selected works was provided, followed by a breakdown by dimensions in order to identify recurring patterns, stated interests and gaps in the current scientific literature on the use of AI-driven APIs in Education. The findings highlight five main benefits: data interoperability, personalized learning, automated feedback, real-time student monitoring, and predictive performance analytics. All studies addressed personalization, 74.1% focused on platform integration, and 37% examined automated feedback. Reported outcomes include improvements in engagement (63%), comprehension (55.6%), and academic achievement (48.1%). However, the review also identifies concerns about privacy, algorithmic bias, and limited methodological rigor in existing research. The study concludes with a conceptual model that synthesizes these findings from pedagogical, technological, and ethical perspectives, providing guidance for more adaptive, inclusive, and responsible uses of AI in education.&quot;,&quot;publisher&quot;:&quot;Multidisciplinary Digital Publishing Institute (MDPI)&quot;,&quot;issue&quot;:&quot;7&quot;,&quot;volume&quot;:&quot;16&quot;,&quot;container-title-short&quot;:&quot;&quot;},&quot;isTemporary&quot;:false,&quot;suppress-author&quot;:false,&quot;composite&quot;:false,&quot;author-only&quot;:false}]},{&quot;citationID&quot;:&quot;MENDELEY_CITATION_6e829d03-6009-4382-8fe9-37cd15585abb&quot;,&quot;properties&quot;:{&quot;noteIndex&quot;:0},&quot;isEdited&quot;:false,&quot;manualOverride&quot;:{&quot;isManuallyOverridden&quot;:false,&quot;citeprocText&quot;:&quot;[31]&quot;,&quot;manualOverrideText&quot;:&quot;&quot;},&quot;citationTag&quot;:&quot;MENDELEY_CITATION_v3_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&quot;,&quot;citationItems&quot;:[{&quot;id&quot;:&quot;ea128e7c-b5ed-37be-aeb3-e7dcb81acb96&quot;,&quot;itemData&quot;:{&quot;type&quot;:&quot;article&quot;,&quot;id&quot;:&quot;ea128e7c-b5ed-37be-aeb3-e7dcb81acb96&quot;,&quot;title&quot;:&quot;The Impact of AI-Driven Application Programming Interfaces (APIs) on Educational Information Management&quot;,&quot;author&quot;:[{&quot;family&quot;:&quot;Pérez-Jorge&quot;,&quot;given&quot;:&quot;David&quot;,&quot;parse-names&quot;:false,&quot;dropping-particle&quot;:&quot;&quot;,&quot;non-dropping-particle&quot;:&quot;&quot;},{&quot;family&quot;:&quot;González-Afonso&quot;,&quot;given&quot;:&quot;Miriam Catalina&quot;,&quot;parse-names&quot;:false,&quot;dropping-particle&quot;:&quot;&quot;,&quot;non-dropping-particle&quot;:&quot;&quot;},{&quot;family&quot;:&quot;Santos-Álvarez&quot;,&quot;given&quot;:&quot;Anthea Gara&quot;,&quot;parse-names&quot;:false,&quot;dropping-particle&quot;:&quot;&quot;,&quot;non-dropping-particle&quot;:&quot;&quot;},{&quot;family&quot;:&quot;Plasencia-Carballo&quot;,&quot;given&quot;:&quot;Zeus&quot;,&quot;parse-names&quot;:false,&quot;dropping-particle&quot;:&quot;&quot;,&quot;non-dropping-particle&quot;:&quot;&quot;},{&quot;family&quot;:&quot;Perdomo-López&quot;,&quot;given&quot;:&quot;Carmen de los Ángeles&quot;,&quot;parse-names&quot;:false,&quot;dropping-particle&quot;:&quot;&quot;,&quot;non-dropping-particle&quot;:&quot;&quot;}],&quot;container-title&quot;:&quot;Information (Switzerland)&quot;,&quot;DOI&quot;:&quot;10.3390/info16070540&quot;,&quot;ISSN&quot;:&quot;20782489&quot;,&quot;issued&quot;:{&quot;date-parts&quot;:[[2025,7,1]]},&quot;abstract&quot;:&quot;In today’s digitalized educational landscape, the intelligent use of information is essential for personalizing learning, improving assessment accuracy, and supporting data-driven pedagogical decisions. This systematic review examines the integration of Application Programming Interfaces (APIs) powered by Artificial Intelligence (AI) to enhance educational information management and learning processes. A total of 27 peer-reviewed studies published between 2013 and 2025 were analyzed. First, a general description of the selected works was provided, followed by a breakdown by dimensions in order to identify recurring patterns, stated interests and gaps in the current scientific literature on the use of AI-driven APIs in Education. The findings highlight five main benefits: data interoperability, personalized learning, automated feedback, real-time student monitoring, and predictive performance analytics. All studies addressed personalization, 74.1% focused on platform integration, and 37% examined automated feedback. Reported outcomes include improvements in engagement (63%), comprehension (55.6%), and academic achievement (48.1%). However, the review also identifies concerns about privacy, algorithmic bias, and limited methodological rigor in existing research. The study concludes with a conceptual model that synthesizes these findings from pedagogical, technological, and ethical perspectives, providing guidance for more adaptive, inclusive, and responsible uses of AI in education.&quot;,&quot;publisher&quot;:&quot;Multidisciplinary Digital Publishing Institute (MDPI)&quot;,&quot;issue&quot;:&quot;7&quot;,&quot;volume&quot;:&quot;16&quot;,&quot;container-title-short&quot;:&quot;&quot;},&quot;isTemporary&quot;:false,&quot;suppress-author&quot;:false,&quot;composite&quot;:false,&quot;author-only&quot;:false}]},{&quot;citationID&quot;:&quot;MENDELEY_CITATION_acdca407-0223-48a6-aed2-58b570171bca&quot;,&quot;properties&quot;:{&quot;noteIndex&quot;:0},&quot;isEdited&quot;:false,&quot;manualOverride&quot;:{&quot;isManuallyOverridden&quot;:false,&quot;citeprocText&quot;:&quot;[32]&quot;,&quot;manualOverrideText&quot;:&quot;&quot;},&quot;citationTag&quot;:&quot;MENDELEY_CITATION_v3_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&quot;,&quot;citationItems&quot;:[{&quot;id&quot;:&quot;81e15701-7714-3a69-b46a-ee6f3af4e953&quot;,&quot;itemData&quot;:{&quot;type&quot;:&quot;article-journal&quot;,&quot;id&quot;:&quot;81e15701-7714-3a69-b46a-ee6f3af4e953&quot;,&quot;title&quot;:&quot;Challenges and Opportunities for Sustainable Development Education Sector United Nations Educational, Scientific and Cultural Organization&quot;,&quot;author&quot;:[{&quot;family&quot;:&quot;Francesc Pedró&quot;,&quot;given&quot;:&quot;&quot;,&quot;parse-names&quot;:false,&quot;dropping-particle&quot;:&quot;&quot;,&quot;non-dropping-particle&quot;:&quot;&quot;},{&quot;family&quot;:&quot;Paula Valverde&quot;,&quot;given&quot;:&quot;&quot;,&quot;parse-names&quot;:false,&quot;dropping-particle&quot;:&quot;&quot;,&quot;non-dropping-particle&quot;:&quot;&quot;},{&quot;family&quot;:&quot;Axel Rivas&quot;,&quot;given&quot;:&quot;&quot;,&quot;parse-names&quot;:false,&quot;dropping-particle&quot;:&quot;&quot;,&quot;non-dropping-particle&quot;:&quot;&quot;},{&quot;family&quot;:&quot;Miguel Subosa&quot;,&quot;given&quot;:&quot;&quot;,&quot;parse-names&quot;:false,&quot;dropping-particle&quot;:&quot;&quot;,&quot;non-dropping-particle&quot;:&quot;&quot;}],&quot;container-title&quot;:&quot;Organización de las Naciones Unidas para la Educación, la Ciencia y la Cultura (UNESCO)&quot;,&quot;accessed&quot;:{&quot;date-parts&quot;:[[2025,9,6]]},&quot;URL&quot;:&quot;https://en.unesco.org/themes/education-policy-&quot;,&quot;issued&quot;:{&quot;date-parts&quot;:[[2019]]},&quot;container-title-short&quot;:&quot;&quot;},&quot;isTemporary&quot;:false,&quot;suppress-author&quot;:false,&quot;composite&quot;:false,&quot;author-only&quot;:false}]},{&quot;citationID&quot;:&quot;MENDELEY_CITATION_befffba0-4f26-41c0-b29e-75b5dca0c800&quot;,&quot;properties&quot;:{&quot;noteIndex&quot;:0},&quot;isEdited&quot;:false,&quot;manualOverride&quot;:{&quot;isManuallyOverridden&quot;:false,&quot;citeprocText&quot;:&quot;[33]&quot;,&quot;manualOverrideText&quot;:&quot;&quot;},&quot;citationTag&quot;:&quot;MENDELEY_CITATION_v3_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&quot;,&quot;citationItems&quot;:[{&quot;id&quot;:&quot;e3345c0d-2f69-3d90-832a-66ca79360893&quot;,&quot;itemData&quot;:{&quot;type&quot;:&quot;article-journal&quot;,&quot;id&quot;:&quot;e3345c0d-2f69-3d90-832a-66ca79360893&quot;,&quot;title&quot;:&quot;El impacto de la inteligencia artificial en la educación: transformación de la forma de enseñar y de aprender&quot;,&quot;author&quot;:[{&quot;family&quot;:&quot;González-González&quot;,&quot;given&quot;:&quot;Carina S.&quot;,&quot;parse-names&quot;:false,&quot;dropping-particle&quot;:&quot;&quot;,&quot;non-dropping-particle&quot;:&quot;&quot;}],&quot;container-title&quot;:&quot;Qurriculum. Revista de Teoría,Investigación y Práctica educativa&quot;,&quot;DOI&quot;:&quot;10.25145/j.qurricul.2023.36.03&quot;,&quot;ISSN&quot;:&quot;11305371&quot;,&quot;URL&quot;:&quot;https://riull.ull.es/xmlui/bitstream/handle/915/32719/Q_36_%20%282023%29_03.pdf?sequence=1&amp;isAllowed=y&quot;,&quot;issued&quot;:{&quot;date-parts&quot;:[[2023]]},&quot;page&quot;:&quot;51-60&quot;,&quot;abstract&quot;:&quot;&lt;p&gt;Artificial intelligence (AI) has demonstrated its potential to transform numerous fields and education is no exception. In today’s digital age, AI has emerged as a powerful tool that is revolutionizing teaching and learning. In this article, we will explore the impact of artificial intelligence in education and how it is transforming the educational landscape at all levels. From personalizing learning to improving feedback and developing interactive resources, we will examine how AI is changing how we acquire knowledge and skills.&lt;/p&gt;&quot;,&quot;issue&quot;:&quot;36&quot;,&quot;container-title-short&quot;:&quot;&quot;},&quot;isTemporary&quot;:false,&quot;suppress-author&quot;:false,&quot;composite&quot;:false,&quot;author-only&quot;:false}]},{&quot;citationID&quot;:&quot;MENDELEY_CITATION_fb719cc6-75e1-4bf8-9807-0a5d8f0fbb39&quot;,&quot;properties&quot;:{&quot;noteIndex&quot;:0},&quot;isEdited&quot;:false,&quot;manualOverride&quot;:{&quot;isManuallyOverridden&quot;:false,&quot;citeprocText&quot;:&quot;[34]&quot;,&quot;manualOverrideText&quot;:&quot;&quot;},&quot;citationTag&quot;:&quot;MENDELEY_CITATION_v3_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&quot;,&quot;citationItems&quot;:[{&quot;id&quot;:&quot;11ec537f-340a-36ab-9571-bd3a2dcd74d9&quot;,&quot;itemData&quot;:{&quot;type&quot;:&quot;article-journal&quot;,&quot;id&quot;:&quot;11ec537f-340a-36ab-9571-bd3a2dcd74d9&quot;,&quot;title&quot;:&quot;CONSTITUCIÓN DE LA REPÚBLICA DEL ECUADOR&quot;,&quot;author&quot;:[{&quot;family&quot;:&quot;CONSTITUCIÓN DE LA REPÚBLICA DEL ECUADOR&quot;,&quot;given&quot;:&quot;&quot;,&quot;parse-names&quot;:false,&quot;dropping-particle&quot;:&quot;&quot;,&quot;non-dropping-particle&quot;:&quot;&quot;}],&quot;container-title&quot;:&quot;Registro Oficial&quot;,&quot;accessed&quot;:{&quot;date-parts&quot;:[[2025,8,28]]},&quot;URL&quot;:&quot;https://www.defensa.gob.ec/wp-content/uploads/downloads/2021/02/Constitucion-de-la-Republica-del-Ecuador_act_ene-2021.pdf&quot;,&quot;issued&quot;:{&quot;date-parts&quot;:[[2008]]},&quot;page&quot;:&quot;25-2021&quot;,&quot;issue&quot;:&quot;20&quot;,&quot;volume&quot;:&quot;449&quot;,&quot;container-title-short&quot;:&quot;&quot;},&quot;isTemporary&quot;:false,&quot;suppress-author&quot;:false,&quot;composite&quot;:false,&quot;author-only&quot;:false}]},{&quot;citationID&quot;:&quot;MENDELEY_CITATION_994555f3-bc0b-4102-836e-a9945b73fad0&quot;,&quot;properties&quot;:{&quot;noteIndex&quot;:0},&quot;isEdited&quot;:false,&quot;manualOverride&quot;:{&quot;isManuallyOverridden&quot;:false,&quot;citeprocText&quot;:&quot;[35]&quot;,&quot;manualOverrideText&quot;:&quot;&quot;},&quot;citationTag&quot;:&quot;MENDELEY_CITATION_v3_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&quot;,&quot;citationItems&quot;:[{&quot;id&quot;:&quot;e6ee36d0-4dc8-38e4-9406-21b25e83aa08&quot;,&quot;itemData&quot;:{&quot;type&quot;:&quot;article-journal&quot;,&quot;id&quot;:&quot;e6ee36d0-4dc8-38e4-9406-21b25e83aa08&quot;,&quot;title&quot;:&quot;LEY ORGÁNICA DE EDUCACIÓN INTERCULTURAL&quot;,&quot;author&quot;:[{&quot;family&quot;:&quot;Ley Orgánica De Educación Intercultural&quot;,&quot;given&quot;:&quot;&quot;,&quot;parse-names&quot;:false,&quot;dropping-particle&quot;:&quot;&quot;,&quot;non-dropping-particle&quot;:&quot;&quot;}],&quot;accessed&quot;:{&quot;date-parts&quot;:[[2025,8,28]]},&quot;URL&quot;:&quot;https://educacion.gob.ec/wp-content/uploads/downloads/2017/02/Ley_Organica_de_Educacion_Intercultural_LOEI_codificado.pdf&quot;,&quot;abstract&quot;:&quot;ASAMBLEA NACIONAL EN PLENO Considerando: Que, el Artículo 26 de la Constitución de la República reconoce a la educación como un derecho que las personas lo ejercen a largo de su vida y un deber ineludible e inexcusable del Estado. Constituye un área prioritaria de la política pública y de la inversión estatal, garantía de la igualdad e inclusión social y condición indispensable para el buen vivir. Las personas, las familias y la sociedad tienen el derecho y la responsabilidad de participar en el proceso educativo; Que, el Art. 27 de la Constitución de la República establece que la educación debe estar centrada en el ser humano y garantizará su desarrollo holístico, en el marco del respeto a los derechos humanos, al medio ambiente sustentable y a la democracia; será participativa, obligatoria, intercultural, democrática, incluyente y diversa, de calidad y calidez; impulsará la equidad de género, la justicia, la solidaridad y la paz; estimulará el sentido crítico, el arte y la cultura física, la iniciativa individual y comunitaria, y el desarrollo de competencias y capacidades para crear y trabajar. La educación es indispensable para el conocimiento, el ejercicio de los derechos y la construcción de un país soberano, y constituye un eje estratégico para el desarrollo nacional; Que, el Artículo 28 de la Constitución de la República establece que la educación responderá al interés público y no estará al servicio de intereses individuales y corporativos. Se garantizará el acceso universal, permanencia, movilidad y egreso sin discriminación alguna y la obligatoriedad en el nivel inicial, básico y bachillerato o su equivalente. Es derecho de toda persona y comunidad interactuar entre culturas y participar en una sociedad que aprende. El Estado promoverá el diálogo intercultural en sus múltiples dimensiones. El aprendizaje se desarrollará de forma escolarizada y no escolarizada. La educación pública será universal y laica en todos sus niveles, y gratuita hasta el tercer nivel de educación superior inclusive. Que, el Artículo 29 de la Constitución de la República declara que el Estado garantizará la libertad de enseñanza, y el derecho de las personas de aprender en su propia lengua y ámbito cultural. Donde las madres y padres o sus representantes tendrán la libertad de escoger para sus hijas e hijos una educación acorde con sus principios, creencias y opciones pedagógicas.&quot;,&quot;container-title-short&quot;:&quot;&quot;},&quot;isTemporary&quot;:false,&quot;suppress-author&quot;:false,&quot;composite&quot;:false,&quot;author-only&quot;:false}]},{&quot;citationID&quot;:&quot;MENDELEY_CITATION_5a20bf12-12ae-4194-9c09-0e6de8ab6798&quot;,&quot;properties&quot;:{&quot;noteIndex&quot;:0},&quot;isEdited&quot;:false,&quot;manualOverride&quot;:{&quot;isManuallyOverridden&quot;:false,&quot;citeprocText&quot;:&quot;[36]&quot;,&quot;manualOverrideText&quot;:&quot;&quot;},&quot;citationTag&quot;:&quot;MENDELEY_CITATION_v3_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&quot;,&quot;citationItems&quot;:[{&quot;id&quot;:&quot;eb698d52-078f-3b28-b7e1-65aea2e0c42f&quot;,&quot;itemData&quot;:{&quot;type&quot;:&quot;article-journal&quot;,&quot;id&quot;:&quot;eb698d52-078f-3b28-b7e1-65aea2e0c42f&quot;,&quot;title&quot;:&quot;LEY ORGÁNICA DE PROTECCIÓN DE DATOS PERSONALES&quot;,&quot;author&quot;:[{&quot;family&quot;:&quot;LEY ORGÁNICA DE PROTECCIÓN DE DATOS PERSONALES&quot;,&quot;given&quot;:&quot;&quot;,&quot;parse-names&quot;:false,&quot;dropping-particle&quot;:&quot;&quot;,&quot;non-dropping-particle&quot;:&quot;&quot;}],&quot;accessed&quot;:{&quot;date-parts&quot;:[[2025,8,28]]},&quot;URL&quot;:&quot;https://www.finanzaspopulares.gob.ec/wp-content/uploads/2021/07/ley_organica_de_proteccion_de_datos_personales.pdf&quot;,&quot;container-title-short&quot;:&quot;&quot;},&quot;isTemporary&quot;:false,&quot;suppress-author&quot;:false,&quot;composite&quot;:false,&quot;author-only&quot;:false}]},{&quot;citationID&quot;:&quot;MENDELEY_CITATION_e10a4cf7-b013-402b-b833-c06cfee2f794&quot;,&quot;properties&quot;:{&quot;noteIndex&quot;:0},&quot;isEdited&quot;:false,&quot;manualOverride&quot;:{&quot;isManuallyOverridden&quot;:false,&quot;citeprocText&quot;:&quot;[37]&quot;,&quot;manualOverrideText&quot;:&quot;&quot;},&quot;citationTag&quot;:&quot;MENDELEY_CITATION_v3_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&quot;,&quot;citationItems&quot;:[{&quot;id&quot;:&quot;301c8898-d927-3460-a55c-a44c9aa53949&quot;,&quot;itemData&quot;:{&quot;type&quot;:&quot;article-journal&quot;,&quot;id&quot;:&quot;301c8898-d927-3460-a55c-a44c9aa53949&quot;,&quot;title&quot;:&quot;Codigo-Organico-de-la-Economia-Social-de-los-Conocimientos-Creatividad-e-Innovacion&quot;,&quot;author&quot;:[{&quot;family&quot;:&quot;ING. HUGO DEL POZO BARREZUETA DIRECTOR&quot;,&quot;given&quot;:&quot;&quot;,&quot;parse-names&quot;:false,&quot;dropping-particle&quot;:&quot;&quot;,&quot;non-dropping-particle&quot;:&quot;&quot;}],&quot;accessed&quot;:{&quot;date-parts&quot;:[[2025,8,28]]},&quot;URL&quot;:&quot;https://www.gobiernoelectronico.gob.ec/wp-content/uploads/2018/10/Codigo-Organico-de-la-Economia-Social-de-los-Conocimientos-Creatividad-e-Innovacion.pdf&quot;,&quot;container-title-short&quot;:&quot;&quot;},&quot;isTemporary&quot;:false,&quot;suppress-author&quot;:false,&quot;composite&quot;:false,&quot;author-only&quot;:false}]},{&quot;citationID&quot;:&quot;MENDELEY_CITATION_cf071099-c744-41ac-bc6d-122bca160fe5&quot;,&quot;properties&quot;:{&quot;noteIndex&quot;:0},&quot;isEdited&quot;:false,&quot;manualOverride&quot;:{&quot;isManuallyOverridden&quot;:false,&quot;citeprocText&quot;:&quot;[38]&quot;,&quot;manualOverrideText&quot;:&quot;&quot;},&quot;citationTag&quot;:&quot;MENDELEY_CITATION_v3_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&quot;,&quot;citationItems&quot;:[{&quot;id&quot;:&quot;8c40244a-ab1a-3336-a712-3509719a704e&quot;,&quot;itemData&quot;:{&quot;type&quot;:&quot;article-journal&quot;,&quot;id&quot;:&quot;8c40244a-ab1a-3336-a712-3509719a704e&quot;,&quot;title&quot;:&quot;Integration of technology and pedagogy in intelligent tutoring systems&quot;,&quot;author&quot;:[{&quot;family&quot;:&quot;Muñoz&quot;,&quot;given&quot;:&quot;Geovanny Francisco Ruiz&quot;,&quot;parse-names&quot;:false,&quot;dropping-particle&quot;:&quot;&quot;,&quot;non-dropping-particle&quot;:&quot;&quot;}],&quot;container-title&quot;:&quot;Edutec&quot;,&quot;DOI&quot;:&quot;10.21556/edutec.2024.89.3199&quot;,&quot;ISSN&quot;:&quot;11359250&quot;,&quot;issued&quot;:{&quot;date-parts&quot;:[[2024,9,1]]},&quot;page&quot;:&quot;144-155&quot;,&quot;abstract&quot;:&quot;Intelligent Tutoring Systems (ITS) have demonstrated their potential to enhance the teaching-learning process by providing personalized and adaptive instruction. However, effectively integrating technology and pedagogy within these systems remains a challenge. This study aimed to analyze the most effective approaches and strategies for achieving this integration. A mixed-method methodology was employed, combining bibliometric analysis, text mining, content analysis, and expert interviews. The results highlight the importance of using accurate student models, incorporating constructivist and multimedia learning approaches, applying adaptive feedback and scaffolding, and designing engaging interfaces. Challenges related to accessibility, scalability, and ethical considerations were also identified. The study concludes that an optimal combination of technological advancements, sound pedagogical principles, and a deep understanding of individual student needs is crucial for the success of ITS in improving learning outcomes.&quot;,&quot;publisher&quot;:&quot;GTE-Educational Technology Group, University of the Balearic Islands&quot;,&quot;issue&quot;:&quot;89&quot;,&quot;container-title-short&quot;:&quot;&quot;},&quot;isTemporary&quot;:false,&quot;suppress-author&quot;:false,&quot;composite&quot;:false,&quot;author-only&quot;:false}]},{&quot;citationID&quot;:&quot;MENDELEY_CITATION_1232acd2-e162-42a1-b772-3e2e5b9180ab&quot;,&quot;properties&quot;:{&quot;noteIndex&quot;:0},&quot;isEdited&quot;:false,&quot;manualOverride&quot;:{&quot;isManuallyOverridden&quot;:false,&quot;citeprocText&quot;:&quot;[27]&quot;,&quot;manualOverrideText&quot;:&quot;&quot;},&quot;citationTag&quot;:&quot;MENDELEY_CITATION_v3_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&quot;,&quot;citationItems&quot;:[{&quot;id&quot;:&quot;dca70e98-091b-3b25-a31e-8ea8dbed5c74&quot;,&quot;itemData&quot;:{&quot;type&quot;:&quot;article-journal&quot;,&quot;id&quot;:&quot;dca70e98-091b-3b25-a31e-8ea8dbed5c74&quot;,&quot;title&quot;:&quot;A Systematic Survey of Prompt Engineering in Large Language Models: Techniques and Applications&quot;,&quot;author&quot;:[{&quot;family&quot;:&quot;Sahoo&quot;,&quot;given&quot;:&quot;Pranab&quot;,&quot;parse-names&quot;:false,&quot;dropping-particle&quot;:&quot;&quot;,&quot;non-dropping-particle&quot;:&quot;&quot;},{&quot;family&quot;:&quot;Singh&quot;,&quot;given&quot;:&quot;Ayush Kumar&quot;,&quot;parse-names&quot;:false,&quot;dropping-particle&quot;:&quot;&quot;,&quot;non-dropping-particle&quot;:&quot;&quot;},{&quot;family&quot;:&quot;Saha&quot;,&quot;given&quot;:&quot;Sriparna&quot;,&quot;parse-names&quot;:false,&quot;dropping-particle&quot;:&quot;&quot;,&quot;non-dropping-particle&quot;:&quot;&quot;},{&quot;family&quot;:&quot;Jain&quot;,&quot;given&quot;:&quot;Vinija&quot;,&quot;parse-names&quot;:false,&quot;dropping-particle&quot;:&quot;&quot;,&quot;non-dropping-particle&quot;:&quot;&quot;},{&quot;family&quot;:&quot;Mondal&quot;,&quot;given&quot;:&quot;Samrat&quot;,&quot;parse-names&quot;:false,&quot;dropping-particle&quot;:&quot;&quot;,&quot;non-dropping-particle&quot;:&quot;&quot;},{&quot;family&quot;:&quot;Chadha&quot;,&quot;given&quot;:&quot;Aman&quot;,&quot;parse-names&quot;:false,&quot;dropping-particle&quot;:&quot;&quot;,&quot;non-dropping-particle&quot;:&quot;&quot;}],&quot;accessed&quot;:{&quot;date-parts&quot;:[[2025,8,28]]},&quot;URL&quot;:&quot;http://arxiv.org/abs/2402.07927&quot;,&quot;issued&quot;:{&quot;date-parts&quot;:[[2025,3,16]]},&quot;abstract&quot;:&quot;Prompt engineering has emerged as an indispensable technique for extending the capabilities of large language models (LLMs) and vision-language models (VLMs). This approach leverages task-specific instructions, known as prompts, to enhance model efficacy without modifying the core model parameters. Rather than updating the model parameters, prompts allow seamless integration of pre-trained models into downstream tasks by eliciting desired model behaviors solely based on the given prompt. Prompts can be natural language instructions that provide context to guide the model or learned vector representations that activate relevant knowledge. This burgeoning field has enabled success across various applications, from question-answering to commonsense reasoning. However, there remains a lack of systematic organization and understanding of the diverse prompt engineering methods and techniques. This survey paper addresses the gap by providing a structured overview of recent advancements in prompt engineering, categorized by application area. For each prompting approach, we provide a summary detailing the prompting methodology, its applications, the models involved, and the datasets utilized. We also delve into the strengths and limitations of each approach and include a taxonomy diagram and table summarizing datasets, models, and critical points of each prompting technique. This systematic analysis enables a better understanding of this rapidly developing field and facilitates future research by illuminating open challenges and opportunities for prompt engineering.&quot;},&quot;isTemporary&quot;:false,&quot;suppress-author&quot;:false,&quot;composite&quot;:false,&quot;author-only&quot;:false}]},{&quot;citationID&quot;:&quot;MENDELEY_CITATION_d5249e27-0f30-49fc-a8b9-e949d835c1f8&quot;,&quot;properties&quot;:{&quot;noteIndex&quot;:0},&quot;isEdited&quot;:false,&quot;manualOverride&quot;:{&quot;isManuallyOverridden&quot;:false,&quot;citeprocText&quot;:&quot;[39]&quot;,&quot;manualOverrideText&quot;:&quot;&quot;},&quot;citationTag&quot;:&quot;MENDELEY_CITATION_v3_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&quot;,&quot;citationItems&quot;:[{&quot;id&quot;:&quot;18a0d745-1c3c-3d60-b8f0-06aef3cf0f37&quot;,&quot;itemData&quot;:{&quot;type&quot;:&quot;article-journal&quot;,&quot;id&quot;:&quot;18a0d745-1c3c-3d60-b8f0-06aef3cf0f37&quot;,&quot;title&quot;:&quot;Interface design: A neglected issue in educational software&quot;,&quot;author&quot;:[{&quot;family&quot;:&quot;Frye&quot;,&quot;given&quot;:&quot;D&quot;,&quot;parse-names&quot;:false,&quot;dropping-particle&quot;:&quot;&quot;,&quot;non-dropping-particle&quot;:&quot;&quot;},{&quot;family&quot;:&quot;Bulletin&quot;,&quot;given&quot;:&quot;E Soloway - ACM SIGCHI&quot;,&quot;parse-names&quot;:false,&quot;dropping-particle&quot;:&quot;&quot;,&quot;non-dropping-particle&quot;:&quot;&quot;},{&quot;family&quot;:&quot;1986&quot;,&quot;given&quot;:&quot;undefined&quot;,&quot;parse-names&quot;:false,&quot;dropping-particle&quot;:&quot;&quot;,&quot;non-dropping-particle&quot;:&quot;&quot;}],&quot;container-title&quot;:&quot;dl.acm.org&quot;,&quot;accessed&quot;:{&quot;date-parts&quot;:[[2025,9,13]]},&quot;DOI&quot;:&quot;10.1145/30851.30865&quot;,&quot;ISSN&quot;:&quot;0736-6906&quot;,&quot;URL&quot;:&quot;https://dl.acm.org/doi/abs/10.1145/30851.30865&quot;,&quot;issued&quot;:{&quot;date-parts&quot;:[[1986,5]]},&quot;page&quot;:&quot;93-97&quot;,&quot;abstract&quot;:&quot;The user interface is particularly important for educational software because 1) it must provide an entry to the content domain of the program rather than vice versa and 2) it must be sensitive to the general skill and/or developmental level of the user. In spite of these special characteristics, interface design for educational software has been given little attention. This study evaluates a representative interface from arithmetic software now used in the schools. It was found that the interface caused students a large number of difficulties. These difficulties were sufficient to interfere with the instructional effectiveness of the software. Designing interfaces that will benefit educational software will require careful study of the users of these programs along with an in-depth understanding of the domains being taught.&quot;,&quot;publisher&quot;:&quot;Association for Computing Machinery (ACM)&quot;,&quot;issue&quot;:&quot;SI&quot;,&quot;volume&quot;:&quot;17&quot;,&quot;container-title-short&quot;:&quot;&quot;},&quot;isTemporary&quot;:false,&quot;suppress-author&quot;:false,&quot;composite&quot;:false,&quot;author-only&quot;:false}]},{&quot;citationID&quot;:&quot;MENDELEY_CITATION_5c86261a-075e-4d15-aef7-fd16ba99cc01&quot;,&quot;properties&quot;:{&quot;noteIndex&quot;:0},&quot;isEdited&quot;:false,&quot;manualOverride&quot;:{&quot;isManuallyOverridden&quot;:false,&quot;citeprocText&quot;:&quot;[40]&quot;,&quot;manualOverrideText&quot;:&quot;&quot;},&quot;citationTag&quot;:&quot;MENDELEY_CITATION_v3_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&quot;,&quot;citationItems&quot;:[{&quot;id&quot;:&quot;68e91740-a484-31b2-a2fd-d41f257c2cd2&quot;,&quot;itemData&quot;:{&quot;type&quot;:&quot;article-journal&quot;,&quot;id&quot;:&quot;68e91740-a484-31b2-a2fd-d41f257c2cd2&quot;,&quot;title&quot;:&quot;AI literacy and its implications for prompt engineering strategies&quot;,&quot;author&quot;:[{&quot;family&quot;:&quot;Knoth&quot;,&quot;given&quot;:&quot;Nils&quot;,&quot;parse-names&quot;:false,&quot;dropping-particle&quot;:&quot;&quot;,&quot;non-dropping-particle&quot;:&quot;&quot;},{&quot;family&quot;:&quot;Tolzin&quot;,&quot;given&quot;:&quot;Antonia&quot;,&quot;parse-names&quot;:false,&quot;dropping-particle&quot;:&quot;&quot;,&quot;non-dropping-particle&quot;:&quot;&quot;},{&quot;family&quot;:&quot;Janson&quot;,&quot;given&quot;:&quot;Andreas&quot;,&quot;parse-names&quot;:false,&quot;dropping-particle&quot;:&quot;&quot;,&quot;non-dropping-particle&quot;:&quot;&quot;},{&quot;family&quot;:&quot;Leimeister&quot;,&quot;given&quot;:&quot;Jan Marco&quot;,&quot;parse-names&quot;:false,&quot;dropping-particle&quot;:&quot;&quot;,&quot;non-dropping-particle&quot;:&quot;&quot;}],&quot;container-title&quot;:&quot;Computers and Education: Artificial Intelligence&quot;,&quot;accessed&quot;:{&quot;date-parts&quot;:[[2025,8,11]]},&quot;DOI&quot;:&quot;10.1016/J.CAEAI.2024.100225&quot;,&quot;ISSN&quot;:&quot;2666-920X&quot;,&quot;URL&quot;:&quot;https://www.sciencedirect.com/science/article/pii/S2666920X24000262?via%3Dihub&quot;,&quot;issued&quot;:{&quot;date-parts&quot;:[[2024,6,1]]},&quot;page&quot;:&quot;100225&quot;,&quot;abstract&quot;:&quot;Artificial intelligence technologies are rapidly advancing. As part of this development, large language models (LLMs) are increasingly being used when humans interact with systems based on artificial intelligence (AI), posing both new opportunities and challenges. When interacting with LLM-based AI system in a goal-directed manner, prompt engineering has evolved as a skill of formulating precise and well-structured instructions to elicit desired responses or information from the LLM, optimizing the effectiveness of the interaction. However, research on the perspectives of non-experts using LLM-based AI systems through prompt engineering and on how AI literacy affects prompting behavior is lacking. This aspect is particularly important when considering the implications of LLMs in the context of higher education. In this present study, we address this issue, introduce a skill-based approach to prompt engineering, and explicitly consider the role of non-experts' AI literacy (students) in their prompt engineering skills. We also provide qualitative insights into students’ intuitive behaviors towards LLM-based AI systems. The results show that higher-quality prompt engineering skills predict the quality of LLM output, suggesting that prompt engineering is indeed a required skill for the goal-directed use of generative AI tools. In addition, the results show that certain aspects of AI literacy can play a role in higher quality prompt engineering and targeted adaptation of LLMs within education. We, therefore, argue for the integration of AI educational content into current curricula to enable a hybrid intelligent society in which students can effectively use generative AI tools such as ChatGPT.&quot;,&quot;publisher&quot;:&quot;Elsevier&quot;,&quot;volume&quot;:&quot;6&quot;,&quot;container-title-short&quot;:&quot;&quot;},&quot;isTemporary&quot;:false,&quot;suppress-author&quot;:false,&quot;composite&quot;:false,&quot;author-only&quot;:false}]},{&quot;citationID&quot;:&quot;MENDELEY_CITATION_0d085d9a-e987-4e62-86d1-7b5acd17fd2f&quot;,&quot;properties&quot;:{&quot;noteIndex&quot;:0},&quot;isEdited&quot;:false,&quot;manualOverride&quot;:{&quot;isManuallyOverridden&quot;:false,&quot;citeprocText&quot;:&quot;[41]&quot;,&quot;manualOverrideText&quot;:&quot;&quot;},&quot;citationTag&quot;:&quot;MENDELEY_CITATION_v3_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&quot;,&quot;citationItems&quot;:[{&quot;id&quot;:&quot;7161ae98-ae72-3870-9ed7-1aa77800d86c&quot;,&quot;itemData&quot;:{&quot;type&quot;:&quot;article-journal&quot;,&quot;id&quot;:&quot;7161ae98-ae72-3870-9ed7-1aa77800d86c&quot;,&quot;title&quot;:&quot;Scaffolding Technique Framing the Issue&quot;,&quot;author&quot;:[{&quot;family&quot;:&quot;Gonulal&quot;,&quot;given&quot;:&quot;Talip&quot;,&quot;parse-names&quot;:false,&quot;dropping-particle&quot;:&quot;&quot;,&quot;non-dropping-particle&quot;:&quot;&quot;},{&quot;family&quot;:&quot;Loewen&quot;,&quot;given&quot;:&quot;Shawn&quot;,&quot;parse-names&quot;:false,&quot;dropping-particle&quot;:&quot;&quot;,&quot;non-dropping-particle&quot;:&quot;&quot;}],&quot;accessed&quot;:{&quot;date-parts&quot;:[[2025,8,28]]},&quot;DOI&quot;:&quot;10.1002/9781118784235.eelt0180&quot;,&quot;URL&quot;:&quot;https://talipgonulal.wordpress.com/wp-content/uploads/2018/02/gonulal-loewen-2018.pdf&quot;,&quot;issued&quot;:{&quot;date-parts&quot;:[[2018]]},&quot;container-title-short&quot;:&quot;&quot;},&quot;isTemporary&quot;:false,&quot;suppress-author&quot;:false,&quot;composite&quot;:false,&quot;author-only&quot;:false}]},{&quot;citationID&quot;:&quot;MENDELEY_CITATION_504b3955-6ea7-41bb-b994-f8451ab7b5af&quot;,&quot;properties&quot;:{&quot;noteIndex&quot;:0},&quot;isEdited&quot;:false,&quot;manualOverride&quot;:{&quot;isManuallyOverridden&quot;:false,&quot;citeprocText&quot;:&quot;[42]&quot;,&quot;manualOverrideText&quot;:&quot;&quot;},&quot;citationTag&quot;:&quot;MENDELEY_CITATION_v3_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&quot;,&quot;citationItems&quot;:[{&quot;id&quot;:&quot;6a79146b-a49c-3c45-b015-f73e43230afe&quot;,&quot;itemData&quot;:{&quot;type&quot;:&quot;article-journal&quot;,&quot;id&quot;:&quot;6a79146b-a49c-3c45-b015-f73e43230afe&quot;,&quot;title&quot;:&quot;FRAMEWORK KARANGTURI UNTUK PROMPT ENGINEERING: ANALISIS KOMPARATIF DENGAN RTF, COT, DAN REACT PADA MODEL AI GENERATIF&quot;,&quot;author&quot;:[{&quot;family&quot;:&quot;Pangan&quot;,&quot;given&quot;:&quot;Teknologi&quot;,&quot;parse-names&quot;:false,&quot;dropping-particle&quot;:&quot;&quot;,&quot;non-dropping-particle&quot;:&quot;&quot;},{&quot;family&quot;:&quot;Sains Dan Teknologi&quot;,&quot;given&quot;:&quot;Fakultas&quot;,&quot;parse-names&quot;:false,&quot;dropping-particle&quot;:&quot;&quot;,&quot;non-dropping-particle&quot;:&quot;&quot;}],&quot;container-title&quot;:&quot;Science Technology and Management Journal&quot;,&quot;accessed&quot;:{&quot;date-parts&quot;:[[2025,9,14]]},&quot;DOI&quot;:&quot;10.53416/STMJ.V5I2.353&quot;,&quot;ISSN&quot;:&quot;2807-7865&quot;,&quot;URL&quot;:&quot;https://unkartur.ac.id/journal/index.php/stmj/article/view/353&quot;,&quot;issued&quot;:{&quot;date-parts&quot;:[[2025,8,28]]},&quot;page&quot;:&quot;133-138&quot;,&quot;abstract&quot;:&quot;This study aims to perform a comparative analysis of four prompt engineering frameworks: KARANGTURI, RTF (Role-Task-Format), CoT (Chain-of-Thought), and ReAct. These frameworks play a crucial role in assisting users in designing effective instructions for Large Language Models (LLMs). A descriptive-comparative approach is employed to examine each framework in terms of structure, focus, complexity, strengths, limitations, and practical application. KARANGTURI, a locally developed framework, consists of four key elements: Character, Summary, Goal, and Constraint. RTF offers a simple structure based on three core components, making it suitable for straightforward tasks. CoT emphasizes step-by-step reasoning and is effective for complex and logical challenges. ReAct integrates reasoning with actions and supports interaction with external tools for advanced tasks. The analysis reveals that the choice of framework depends on task type, complexity level, and the need for reasoning or access to external information. KARANGTURI is viewed as a comprehensive and flexible approach with promising potential, though it requires further empirical validation. The findings are expected to help AI practitioners select the most appropriate prompting strategy based on their specific needs.&quot;,&quot;issue&quot;:&quot;2&quot;,&quot;volume&quot;:&quot;5&quot;,&quot;container-title-short&quot;:&quot;&quot;},&quot;isTemporary&quot;:false,&quot;suppress-author&quot;:false,&quot;composite&quot;:false,&quot;author-only&quot;:false}]},{&quot;citationID&quot;:&quot;MENDELEY_CITATION_91ef33d2-d4fd-4b83-a0ef-6f4ac2d62eb4&quot;,&quot;properties&quot;:{&quot;noteIndex&quot;:0},&quot;isEdited&quot;:false,&quot;manualOverride&quot;:{&quot;isManuallyOverridden&quot;:false,&quot;citeprocText&quot;:&quot;[43]&quot;,&quot;manualOverrideText&quot;:&quot;&quot;},&quot;citationTag&quot;:&quot;MENDELEY_CITATION_v3_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&quot;,&quot;citationItems&quot;:[{&quot;id&quot;:&quot;5c26cac5-4c7c-3b24-8910-04d63f4e7f60&quot;,&quot;itemData&quot;:{&quot;type&quot;:&quot;webpage&quot;,&quot;id&quot;:&quot;5c26cac5-4c7c-3b24-8910-04d63f4e7f60&quot;,&quot;title&quot;:&quot;TrigTutor IA - Tesis UTEQ&quot;,&quot;accessed&quot;:{&quot;date-parts&quot;:[[2025,9,6]]},&quot;URL&quot;:&quot;https://aitrigonometria.web.app/&quot;,&quot;container-title-short&quot;:&quot;&quot;},&quot;isTemporary&quot;:false,&quot;suppress-author&quot;:false,&quot;composite&quot;:false,&quot;author-only&quot;:false}]}]"/>
     <we:property name="MENDELEY_CITATIONS_STYLE" value="{&quot;id&quot;:&quot;https://www.zotero.org/styles/ieee&quot;,&quot;title&quot;:&quot;IEEE&quot;,&quot;format&quot;:&quot;numeric&quot;,&quot;defaultLocale&quot;:null,&quot;isLocaleCodeValid&quot;:true}"/>
   </we:properties>
   <we:bindings/>

</xml_diff>